<commit_message>
Update Laravel notes:events,Listener,Jobs and Queue
</commit_message>
<xml_diff>
--- a/Laravel notes.docx
+++ b/Laravel notes.docx
@@ -923,7 +923,7 @@
           <w:color w:val="FF0000"/>
         </w:rPr>
       </w:pPr>
-      <w:hyperlink r:id="R7d418d94d90441ff">
+      <w:hyperlink r:id="Rcc5b0481114248d8">
         <w:r>
           <w:rPr>
             <w:rStyle w:val="Hyperlink"/>
@@ -1132,6 +1132,8 @@
     <w:p>
       <w:pPr>
         <w:pStyle w:val="Normal"/>
+      </w:pPr>
+      <w:r>
         <w:rPr>
           <w:rFonts w:ascii="system-ui" w:hAnsi="system-ui" w:eastAsia="system-ui" w:cs="system-ui"/>
           <w:b w:val="1"/>
@@ -1146,8 +1148,12 @@
           <w:szCs w:val="24"/>
           <w:lang w:val="en-GB"/>
         </w:rPr>
-      </w:pPr>
-      <w:r>
+        <w:t>You can run multiple projects using these commands on different ports</w:t>
+      </w:r>
+    </w:p>
+    <w:p>
+      <w:pPr>
+        <w:pStyle w:val="Normal"/>
         <w:rPr>
           <w:rFonts w:ascii="system-ui" w:hAnsi="system-ui" w:eastAsia="system-ui" w:cs="system-ui"/>
           <w:b w:val="1"/>
@@ -1162,8 +1168,1802 @@
           <w:szCs w:val="24"/>
           <w:lang w:val="en-GB"/>
         </w:rPr>
-        <w:t>You can run multiple projects using these commands on different ports</w:t>
-      </w:r>
+      </w:pPr>
+    </w:p>
+    <w:p>
+      <w:pPr>
+        <w:pStyle w:val="Normal"/>
+      </w:pPr>
+      <w:r>
+        <w:rPr>
+          <w:rFonts w:ascii="system-ui" w:hAnsi="system-ui" w:eastAsia="system-ui" w:cs="system-ui"/>
+          <w:b w:val="1"/>
+          <w:bCs w:val="1"/>
+          <w:i w:val="1"/>
+          <w:iCs w:val="1"/>
+          <w:caps w:val="0"/>
+          <w:smallCaps w:val="0"/>
+          <w:noProof w:val="0"/>
+          <w:color w:val="FF0000"/>
+          <w:sz w:val="32"/>
+          <w:szCs w:val="32"/>
+          <w:u w:val="single"/>
+          <w:lang w:val="en-GB"/>
+        </w:rPr>
+        <w:t>Event Directory or folder:</w:t>
+      </w:r>
+    </w:p>
+    <w:p>
+      <w:pPr>
+        <w:pStyle w:val="Normal"/>
+        <w:rPr>
+          <w:rFonts w:ascii="Calibri" w:hAnsi="Calibri" w:eastAsia="Calibri" w:cs="Calibri" w:asciiTheme="minorAscii" w:hAnsiTheme="minorAscii" w:eastAsiaTheme="minorAscii" w:cstheme="minorAscii"/>
+          <w:noProof w:val="0"/>
+          <w:sz w:val="32"/>
+          <w:szCs w:val="32"/>
+          <w:lang w:val="en-GB"/>
+        </w:rPr>
+      </w:pPr>
+      <w:r>
+        <w:rPr>
+          <w:rFonts w:ascii="Calibri" w:hAnsi="Calibri" w:eastAsia="Calibri" w:cs="Calibri" w:asciiTheme="minorAscii" w:hAnsiTheme="minorAscii" w:eastAsiaTheme="minorAscii" w:cstheme="minorAscii"/>
+          <w:b w:val="0"/>
+          <w:bCs w:val="0"/>
+          <w:i w:val="0"/>
+          <w:iCs w:val="0"/>
+          <w:caps w:val="0"/>
+          <w:smallCaps w:val="0"/>
+          <w:noProof w:val="0"/>
+          <w:color w:val="364153"/>
+          <w:sz w:val="24"/>
+          <w:szCs w:val="24"/>
+          <w:lang w:val="en-GB"/>
+        </w:rPr>
+        <w:t>This directory does not exist by default, but will be created for you by the</w:t>
+      </w:r>
+      <w:r>
+        <w:rPr>
+          <w:rFonts w:ascii="Calibri" w:hAnsi="Calibri" w:eastAsia="Calibri" w:cs="Calibri" w:asciiTheme="minorAscii" w:hAnsiTheme="minorAscii" w:eastAsiaTheme="minorAscii" w:cstheme="minorAscii"/>
+          <w:b w:val="0"/>
+          <w:bCs w:val="0"/>
+          <w:i w:val="0"/>
+          <w:iCs w:val="0"/>
+          <w:caps w:val="0"/>
+          <w:smallCaps w:val="0"/>
+          <w:noProof w:val="0"/>
+          <w:color w:val="4C94D8" w:themeColor="text2" w:themeTint="80" w:themeShade="FF"/>
+          <w:sz w:val="24"/>
+          <w:szCs w:val="24"/>
+          <w:lang w:val="en-GB"/>
+        </w:rPr>
+        <w:t xml:space="preserve"> </w:t>
+      </w:r>
+      <w:r>
+        <w:rPr>
+          <w:rFonts w:ascii="Calibri" w:hAnsi="Calibri" w:eastAsia="Calibri" w:cs="Calibri" w:asciiTheme="minorAscii" w:hAnsiTheme="minorAscii" w:eastAsiaTheme="minorAscii" w:cstheme="minorAscii"/>
+          <w:b w:val="0"/>
+          <w:bCs w:val="0"/>
+          <w:i w:val="0"/>
+          <w:iCs w:val="0"/>
+          <w:caps w:val="0"/>
+          <w:smallCaps w:val="0"/>
+          <w:noProof w:val="0"/>
+          <w:color w:val="4C94D8" w:themeColor="text2" w:themeTint="80" w:themeShade="FF"/>
+          <w:sz w:val="32"/>
+          <w:szCs w:val="32"/>
+          <w:lang w:val="en-GB"/>
+        </w:rPr>
+        <w:t>event:generate</w:t>
+      </w:r>
+      <w:r>
+        <w:rPr>
+          <w:rFonts w:ascii="Calibri" w:hAnsi="Calibri" w:eastAsia="Calibri" w:cs="Calibri" w:asciiTheme="minorAscii" w:hAnsiTheme="minorAscii" w:eastAsiaTheme="minorAscii" w:cstheme="minorAscii"/>
+          <w:b w:val="0"/>
+          <w:bCs w:val="0"/>
+          <w:i w:val="0"/>
+          <w:iCs w:val="0"/>
+          <w:caps w:val="0"/>
+          <w:smallCaps w:val="0"/>
+          <w:noProof w:val="0"/>
+          <w:color w:val="364153"/>
+          <w:sz w:val="24"/>
+          <w:szCs w:val="24"/>
+          <w:lang w:val="en-GB"/>
+        </w:rPr>
+        <w:t xml:space="preserve"> and </w:t>
+      </w:r>
+      <w:r>
+        <w:rPr>
+          <w:rFonts w:ascii="Calibri" w:hAnsi="Calibri" w:eastAsia="Calibri" w:cs="Calibri" w:asciiTheme="minorAscii" w:hAnsiTheme="minorAscii" w:eastAsiaTheme="minorAscii" w:cstheme="minorAscii"/>
+          <w:b w:val="0"/>
+          <w:bCs w:val="0"/>
+          <w:i w:val="0"/>
+          <w:iCs w:val="0"/>
+          <w:caps w:val="0"/>
+          <w:smallCaps w:val="0"/>
+          <w:noProof w:val="0"/>
+          <w:color w:val="4C94D8" w:themeColor="text2" w:themeTint="80" w:themeShade="FF"/>
+          <w:sz w:val="32"/>
+          <w:szCs w:val="32"/>
+          <w:lang w:val="en-GB"/>
+        </w:rPr>
+        <w:t>make:event</w:t>
+      </w:r>
+      <w:r>
+        <w:rPr>
+          <w:rFonts w:ascii="Calibri" w:hAnsi="Calibri" w:eastAsia="Calibri" w:cs="Calibri" w:asciiTheme="minorAscii" w:hAnsiTheme="minorAscii" w:eastAsiaTheme="minorAscii" w:cstheme="minorAscii"/>
+          <w:b w:val="0"/>
+          <w:bCs w:val="0"/>
+          <w:i w:val="0"/>
+          <w:iCs w:val="0"/>
+          <w:caps w:val="0"/>
+          <w:smallCaps w:val="0"/>
+          <w:noProof w:val="0"/>
+          <w:color w:val="364153"/>
+          <w:sz w:val="24"/>
+          <w:szCs w:val="24"/>
+          <w:lang w:val="en-GB"/>
+        </w:rPr>
+        <w:t xml:space="preserve"> Artisan commands.</w:t>
+      </w:r>
+    </w:p>
+    <w:p>
+      <w:pPr>
+        <w:pStyle w:val="ListParagraph"/>
+        <w:numPr>
+          <w:ilvl w:val="0"/>
+          <w:numId w:val="1"/>
+        </w:numPr>
+        <w:spacing w:before="240" w:beforeAutospacing="off" w:after="240" w:afterAutospacing="off"/>
+        <w:rPr>
+          <w:rFonts w:ascii="Calibri" w:hAnsi="Calibri" w:eastAsia="Calibri" w:cs="Calibri" w:asciiTheme="minorAscii" w:hAnsiTheme="minorAscii" w:eastAsiaTheme="minorAscii" w:cstheme="minorAscii"/>
+          <w:noProof w:val="0"/>
+          <w:sz w:val="32"/>
+          <w:szCs w:val="32"/>
+          <w:lang w:val="en-GB"/>
+        </w:rPr>
+      </w:pPr>
+      <w:r>
+        <w:rPr>
+          <w:rFonts w:ascii="Calibri" w:hAnsi="Calibri" w:eastAsia="Calibri" w:cs="Calibri" w:asciiTheme="minorAscii" w:hAnsiTheme="minorAscii" w:eastAsiaTheme="minorAscii" w:cstheme="minorAscii"/>
+          <w:b w:val="1"/>
+          <w:bCs w:val="1"/>
+          <w:noProof w:val="0"/>
+          <w:sz w:val="32"/>
+          <w:szCs w:val="32"/>
+          <w:lang w:val="en-GB"/>
+        </w:rPr>
+        <w:t>What is an event in Laravel?</w:t>
+      </w:r>
+      <w:r>
+        <w:br/>
+      </w:r>
+      <w:r>
+        <w:rPr>
+          <w:rFonts w:ascii="Calibri" w:hAnsi="Calibri" w:eastAsia="Calibri" w:cs="Calibri" w:asciiTheme="minorAscii" w:hAnsiTheme="minorAscii" w:eastAsiaTheme="minorAscii" w:cstheme="minorAscii"/>
+          <w:noProof w:val="0"/>
+          <w:sz w:val="32"/>
+          <w:szCs w:val="32"/>
+          <w:lang w:val="en-GB"/>
+        </w:rPr>
+        <w:t xml:space="preserve">It’s a way to say “something happened” (like </w:t>
+      </w:r>
+      <w:r>
+        <w:rPr>
+          <w:rFonts w:ascii="Calibri" w:hAnsi="Calibri" w:eastAsia="Calibri" w:cs="Calibri" w:asciiTheme="minorAscii" w:hAnsiTheme="minorAscii" w:eastAsiaTheme="minorAscii" w:cstheme="minorAscii"/>
+          <w:i w:val="1"/>
+          <w:iCs w:val="1"/>
+          <w:noProof w:val="0"/>
+          <w:sz w:val="32"/>
+          <w:szCs w:val="32"/>
+          <w:lang w:val="en-GB"/>
+        </w:rPr>
+        <w:t>OrderPlaced</w:t>
+      </w:r>
+      <w:r>
+        <w:rPr>
+          <w:rFonts w:ascii="Calibri" w:hAnsi="Calibri" w:eastAsia="Calibri" w:cs="Calibri" w:asciiTheme="minorAscii" w:hAnsiTheme="minorAscii" w:eastAsiaTheme="minorAscii" w:cstheme="minorAscii"/>
+          <w:noProof w:val="0"/>
+          <w:sz w:val="32"/>
+          <w:szCs w:val="32"/>
+          <w:lang w:val="en-GB"/>
+        </w:rPr>
+        <w:t xml:space="preserve"> or </w:t>
+      </w:r>
+      <w:r>
+        <w:rPr>
+          <w:rFonts w:ascii="Calibri" w:hAnsi="Calibri" w:eastAsia="Calibri" w:cs="Calibri" w:asciiTheme="minorAscii" w:hAnsiTheme="minorAscii" w:eastAsiaTheme="minorAscii" w:cstheme="minorAscii"/>
+          <w:i w:val="1"/>
+          <w:iCs w:val="1"/>
+          <w:noProof w:val="0"/>
+          <w:sz w:val="32"/>
+          <w:szCs w:val="32"/>
+          <w:lang w:val="en-GB"/>
+        </w:rPr>
+        <w:t>UserRegistered</w:t>
+      </w:r>
+      <w:r>
+        <w:rPr>
+          <w:rFonts w:ascii="Calibri" w:hAnsi="Calibri" w:eastAsia="Calibri" w:cs="Calibri" w:asciiTheme="minorAscii" w:hAnsiTheme="minorAscii" w:eastAsiaTheme="minorAscii" w:cstheme="minorAscii"/>
+          <w:noProof w:val="0"/>
+          <w:sz w:val="32"/>
+          <w:szCs w:val="32"/>
+          <w:lang w:val="en-GB"/>
+        </w:rPr>
+        <w:t>) so other parts of your app can react to it.laravelmagazine+1</w:t>
+      </w:r>
+    </w:p>
+    <w:p>
+      <w:pPr>
+        <w:pStyle w:val="ListParagraph"/>
+        <w:numPr>
+          <w:ilvl w:val="0"/>
+          <w:numId w:val="1"/>
+        </w:numPr>
+        <w:spacing w:before="240" w:beforeAutospacing="off" w:after="240" w:afterAutospacing="off"/>
+        <w:rPr>
+          <w:rFonts w:ascii="Calibri" w:hAnsi="Calibri" w:eastAsia="Calibri" w:cs="Calibri" w:asciiTheme="minorAscii" w:hAnsiTheme="minorAscii" w:eastAsiaTheme="minorAscii" w:cstheme="minorAscii"/>
+          <w:noProof w:val="0"/>
+          <w:sz w:val="32"/>
+          <w:szCs w:val="32"/>
+          <w:lang w:val="en-GB"/>
+        </w:rPr>
+      </w:pPr>
+      <w:r>
+        <w:rPr>
+          <w:rFonts w:ascii="Calibri" w:hAnsi="Calibri" w:eastAsia="Calibri" w:cs="Calibri" w:asciiTheme="minorAscii" w:hAnsiTheme="minorAscii" w:eastAsiaTheme="minorAscii" w:cstheme="minorAscii"/>
+          <w:b w:val="1"/>
+          <w:bCs w:val="1"/>
+          <w:noProof w:val="0"/>
+          <w:sz w:val="32"/>
+          <w:szCs w:val="32"/>
+          <w:lang w:val="en-GB"/>
+        </w:rPr>
+        <w:t>Why use it?</w:t>
+      </w:r>
+      <w:r>
+        <w:br/>
+      </w:r>
+      <w:r>
+        <w:rPr>
+          <w:rFonts w:ascii="Calibri" w:hAnsi="Calibri" w:eastAsia="Calibri" w:cs="Calibri" w:asciiTheme="minorAscii" w:hAnsiTheme="minorAscii" w:eastAsiaTheme="minorAscii" w:cstheme="minorAscii"/>
+          <w:noProof w:val="0"/>
+          <w:sz w:val="32"/>
+          <w:szCs w:val="32"/>
+          <w:lang w:val="en-GB"/>
+        </w:rPr>
+        <w:t xml:space="preserve">To </w:t>
+      </w:r>
+      <w:r>
+        <w:rPr>
+          <w:rFonts w:ascii="Calibri" w:hAnsi="Calibri" w:eastAsia="Calibri" w:cs="Calibri" w:asciiTheme="minorAscii" w:hAnsiTheme="minorAscii" w:eastAsiaTheme="minorAscii" w:cstheme="minorAscii"/>
+          <w:b w:val="1"/>
+          <w:bCs w:val="1"/>
+          <w:noProof w:val="0"/>
+          <w:sz w:val="32"/>
+          <w:szCs w:val="32"/>
+          <w:lang w:val="en-GB"/>
+        </w:rPr>
+        <w:t>separate</w:t>
+      </w:r>
+      <w:r>
+        <w:rPr>
+          <w:rFonts w:ascii="Calibri" w:hAnsi="Calibri" w:eastAsia="Calibri" w:cs="Calibri" w:asciiTheme="minorAscii" w:hAnsiTheme="minorAscii" w:eastAsiaTheme="minorAscii" w:cstheme="minorAscii"/>
+          <w:noProof w:val="0"/>
+          <w:sz w:val="32"/>
+          <w:szCs w:val="32"/>
+          <w:lang w:val="en-GB"/>
+        </w:rPr>
+        <w:t xml:space="preserve"> “what happened” from “what should happen next,” so your code is cleaner, easier to change, and can run slow tasks in the background.laravelmagazine+2</w:t>
+      </w:r>
+    </w:p>
+    <w:p>
+      <w:pPr>
+        <w:pStyle w:val="ListParagraph"/>
+        <w:numPr>
+          <w:ilvl w:val="0"/>
+          <w:numId w:val="1"/>
+        </w:numPr>
+        <w:spacing w:before="240" w:beforeAutospacing="off" w:after="240" w:afterAutospacing="off"/>
+        <w:rPr>
+          <w:rFonts w:ascii="Calibri" w:hAnsi="Calibri" w:eastAsia="Calibri" w:cs="Calibri" w:asciiTheme="minorAscii" w:hAnsiTheme="minorAscii" w:eastAsiaTheme="minorAscii" w:cstheme="minorAscii"/>
+          <w:noProof w:val="0"/>
+          <w:sz w:val="32"/>
+          <w:szCs w:val="32"/>
+          <w:lang w:val="en-GB"/>
+        </w:rPr>
+      </w:pPr>
+      <w:r>
+        <w:rPr>
+          <w:rFonts w:ascii="Calibri" w:hAnsi="Calibri" w:eastAsia="Calibri" w:cs="Calibri" w:asciiTheme="minorAscii" w:hAnsiTheme="minorAscii" w:eastAsiaTheme="minorAscii" w:cstheme="minorAscii"/>
+          <w:b w:val="1"/>
+          <w:bCs w:val="1"/>
+          <w:noProof w:val="0"/>
+          <w:sz w:val="32"/>
+          <w:szCs w:val="32"/>
+          <w:lang w:val="en-GB"/>
+        </w:rPr>
+        <w:t>When to use events?</w:t>
+      </w:r>
+      <w:r>
+        <w:br/>
+      </w:r>
+      <w:r>
+        <w:rPr>
+          <w:rFonts w:ascii="Calibri" w:hAnsi="Calibri" w:eastAsia="Calibri" w:cs="Calibri" w:asciiTheme="minorAscii" w:hAnsiTheme="minorAscii" w:eastAsiaTheme="minorAscii" w:cstheme="minorAscii"/>
+          <w:noProof w:val="0"/>
+          <w:sz w:val="32"/>
+          <w:szCs w:val="32"/>
+          <w:lang w:val="en-GB"/>
+        </w:rPr>
+        <w:t>Use them when:</w:t>
+      </w:r>
+    </w:p>
+    <w:p>
+      <w:pPr>
+        <w:pStyle w:val="ListParagraph"/>
+        <w:numPr>
+          <w:ilvl w:val="0"/>
+          <w:numId w:val="1"/>
+        </w:numPr>
+        <w:spacing w:before="240" w:beforeAutospacing="off" w:after="240" w:afterAutospacing="off"/>
+        <w:rPr>
+          <w:rFonts w:ascii="Calibri" w:hAnsi="Calibri" w:eastAsia="Calibri" w:cs="Calibri" w:asciiTheme="minorAscii" w:hAnsiTheme="minorAscii" w:eastAsiaTheme="minorAscii" w:cstheme="minorAscii"/>
+          <w:noProof w:val="0"/>
+          <w:sz w:val="32"/>
+          <w:szCs w:val="32"/>
+          <w:lang w:val="en-GB"/>
+        </w:rPr>
+      </w:pPr>
+      <w:r>
+        <w:rPr>
+          <w:rFonts w:ascii="Calibri" w:hAnsi="Calibri" w:eastAsia="Calibri" w:cs="Calibri" w:asciiTheme="minorAscii" w:hAnsiTheme="minorAscii" w:eastAsiaTheme="minorAscii" w:cstheme="minorAscii"/>
+          <w:noProof w:val="0"/>
+          <w:sz w:val="32"/>
+          <w:szCs w:val="32"/>
+          <w:lang w:val="en-GB"/>
+        </w:rPr>
+        <w:t>Multiple things should happen after one action (send email, update analytics, call webhook, etc.)</w:t>
+      </w:r>
+      <w:r>
+        <w:rPr>
+          <w:rFonts w:ascii="Calibri" w:hAnsi="Calibri" w:eastAsia="Calibri" w:cs="Calibri" w:asciiTheme="minorAscii" w:hAnsiTheme="minorAscii" w:eastAsiaTheme="minorAscii" w:cstheme="minorAscii"/>
+          <w:b w:val="1"/>
+          <w:bCs w:val="1"/>
+          <w:noProof w:val="0"/>
+          <w:color w:val="C00000"/>
+          <w:sz w:val="32"/>
+          <w:szCs w:val="32"/>
+          <w:lang w:val="en-GB"/>
+        </w:rPr>
+        <w:t>// by listener directory</w:t>
+      </w:r>
+    </w:p>
+    <w:p>
+      <w:pPr>
+        <w:spacing w:before="240" w:beforeAutospacing="off" w:after="240" w:afterAutospacing="off"/>
+        <w:rPr>
+          <w:rFonts w:ascii="Calibri" w:hAnsi="Calibri" w:eastAsia="Calibri" w:cs="Calibri"/>
+          <w:noProof w:val="0"/>
+          <w:color w:val="C00000"/>
+          <w:sz w:val="32"/>
+          <w:szCs w:val="32"/>
+          <w:lang w:val="en-GB"/>
+        </w:rPr>
+      </w:pPr>
+    </w:p>
+    <w:p>
+      <w:pPr>
+        <w:spacing w:before="240" w:beforeAutospacing="off" w:after="240" w:afterAutospacing="off"/>
+        <w:rPr>
+          <w:rFonts w:ascii="Calibri" w:hAnsi="Calibri" w:eastAsia="Calibri" w:cs="Calibri"/>
+          <w:noProof w:val="0"/>
+          <w:color w:val="C00000"/>
+          <w:sz w:val="32"/>
+          <w:szCs w:val="32"/>
+          <w:lang w:val="en-GB"/>
+        </w:rPr>
+      </w:pPr>
+      <w:r>
+        <w:rPr>
+          <w:rFonts w:ascii="Calibri" w:hAnsi="Calibri" w:eastAsia="Calibri" w:cs="Calibri"/>
+          <w:noProof w:val="0"/>
+          <w:color w:val="C00000"/>
+          <w:sz w:val="32"/>
+          <w:szCs w:val="32"/>
+          <w:lang w:val="en-GB"/>
+        </w:rPr>
+        <w:t>Examples in a healthcare site:</w:t>
+      </w:r>
+    </w:p>
+    <w:p>
+      <w:pPr>
+        <w:pStyle w:val="ListParagraph"/>
+        <w:numPr>
+          <w:ilvl w:val="0"/>
+          <w:numId w:val="5"/>
+        </w:numPr>
+        <w:spacing w:before="240" w:beforeAutospacing="off" w:after="240" w:afterAutospacing="off"/>
+        <w:rPr>
+          <w:rFonts w:ascii="Calibri" w:hAnsi="Calibri" w:eastAsia="Calibri" w:cs="Calibri" w:asciiTheme="minorAscii" w:hAnsiTheme="minorAscii" w:eastAsiaTheme="minorAscii" w:cstheme="minorAscii"/>
+          <w:noProof w:val="0"/>
+          <w:sz w:val="24"/>
+          <w:szCs w:val="24"/>
+          <w:lang w:val="en-GB"/>
+        </w:rPr>
+      </w:pPr>
+      <w:r>
+        <w:rPr>
+          <w:rFonts w:ascii="Calibri" w:hAnsi="Calibri" w:eastAsia="Calibri" w:cs="Calibri" w:asciiTheme="minorAscii" w:hAnsiTheme="minorAscii" w:eastAsiaTheme="minorAscii" w:cstheme="minorAscii"/>
+          <w:noProof w:val="0"/>
+          <w:sz w:val="24"/>
+          <w:szCs w:val="24"/>
+          <w:lang w:val="en-GB"/>
+        </w:rPr>
+        <w:t>ClaimSubmitted,</w:t>
+      </w:r>
+      <w:r>
+        <w:rPr>
+          <w:rFonts w:ascii="Calibri" w:hAnsi="Calibri" w:eastAsia="Calibri" w:cs="Calibri" w:asciiTheme="minorAscii" w:hAnsiTheme="minorAscii" w:eastAsiaTheme="minorAscii" w:cstheme="minorAscii"/>
+          <w:noProof w:val="0"/>
+          <w:sz w:val="24"/>
+          <w:szCs w:val="24"/>
+          <w:lang w:val="en-GB"/>
+        </w:rPr>
+        <w:t>PaymentPosted</w:t>
+      </w:r>
+      <w:r>
+        <w:rPr>
+          <w:rFonts w:ascii="Calibri" w:hAnsi="Calibri" w:eastAsia="Calibri" w:cs="Calibri" w:asciiTheme="minorAscii" w:hAnsiTheme="minorAscii" w:eastAsiaTheme="minorAscii" w:cstheme="minorAscii"/>
+          <w:noProof w:val="0"/>
+          <w:sz w:val="24"/>
+          <w:szCs w:val="24"/>
+          <w:lang w:val="en-GB"/>
+        </w:rPr>
+        <w:t>,PatientRegistered,</w:t>
+      </w:r>
+      <w:r>
+        <w:rPr>
+          <w:rFonts w:ascii="Calibri" w:hAnsi="Calibri" w:eastAsia="Calibri" w:cs="Calibri" w:asciiTheme="minorAscii" w:hAnsiTheme="minorAscii" w:eastAsiaTheme="minorAscii" w:cstheme="minorAscii"/>
+          <w:noProof w:val="0"/>
+          <w:sz w:val="24"/>
+          <w:szCs w:val="24"/>
+          <w:lang w:val="en-GB"/>
+        </w:rPr>
+        <w:t>EligibilityCheckCompleted,</w:t>
+      </w:r>
+      <w:r>
+        <w:rPr>
+          <w:rFonts w:ascii="Calibri" w:hAnsi="Calibri" w:eastAsia="Calibri" w:cs="Calibri" w:asciiTheme="minorAscii" w:hAnsiTheme="minorAscii" w:eastAsiaTheme="minorAscii" w:cstheme="minorAscii"/>
+          <w:noProof w:val="0"/>
+          <w:sz w:val="24"/>
+          <w:szCs w:val="24"/>
+          <w:lang w:val="en-GB"/>
+        </w:rPr>
+        <w:t>PriorAuthorizationApproved</w:t>
+      </w:r>
+    </w:p>
+    <w:p>
+      <w:pPr>
+        <w:pStyle w:val="Normal"/>
+        <w:spacing w:before="240" w:beforeAutospacing="off" w:after="240" w:afterAutospacing="off"/>
+        <w:ind w:left="0"/>
+        <w:rPr>
+          <w:rFonts w:ascii="Calibri" w:hAnsi="Calibri" w:eastAsia="Calibri" w:cs="Calibri" w:asciiTheme="minorAscii" w:hAnsiTheme="minorAscii" w:eastAsiaTheme="minorAscii" w:cstheme="minorAscii"/>
+          <w:noProof w:val="0"/>
+          <w:sz w:val="32"/>
+          <w:szCs w:val="32"/>
+          <w:lang w:val="en-GB"/>
+        </w:rPr>
+      </w:pPr>
+    </w:p>
+    <w:p>
+      <w:pPr>
+        <w:pStyle w:val="Normal"/>
+        <w:spacing w:before="240" w:beforeAutospacing="off" w:after="240" w:afterAutospacing="off"/>
+        <w:rPr>
+          <w:rFonts w:ascii="Calibri" w:hAnsi="Calibri" w:eastAsia="Calibri" w:cs="Calibri" w:asciiTheme="minorAscii" w:hAnsiTheme="minorAscii" w:eastAsiaTheme="minorAscii" w:cstheme="minorAscii"/>
+          <w:b w:val="1"/>
+          <w:bCs w:val="1"/>
+          <w:noProof w:val="0"/>
+          <w:sz w:val="32"/>
+          <w:szCs w:val="32"/>
+          <w:lang w:val="en-GB"/>
+        </w:rPr>
+      </w:pPr>
+    </w:p>
+    <w:p>
+      <w:pPr>
+        <w:pStyle w:val="Heading3"/>
+        <w:shd w:val="clear" w:color="auto" w:fill="FFFFFF" w:themeFill="background1"/>
+        <w:spacing w:before="600" w:beforeAutospacing="off" w:after="225" w:afterAutospacing="off"/>
+      </w:pPr>
+      <w:hyperlink r:id="R98471b1df7e64c2e">
+        <w:r>
+          <w:rPr>
+            <w:rStyle w:val="Hyperlink"/>
+            <w:b w:val="1"/>
+            <w:bCs w:val="1"/>
+            <w:i w:val="1"/>
+            <w:iCs w:val="1"/>
+            <w:caps w:val="0"/>
+            <w:smallCaps w:val="0"/>
+            <w:strike w:val="0"/>
+            <w:dstrike w:val="0"/>
+            <w:noProof w:val="0"/>
+            <w:color w:val="FF0000"/>
+            <w:sz w:val="32"/>
+            <w:szCs w:val="32"/>
+            <w:u w:val="single"/>
+            <w:lang w:val="en-GB"/>
+          </w:rPr>
+          <w:t>Listeners Directory</w:t>
+        </w:r>
+      </w:hyperlink>
+      <w:r>
+        <w:rPr>
+          <w:rFonts w:ascii="Calibri" w:hAnsi="Calibri" w:eastAsia="Calibri" w:cs="Calibri" w:asciiTheme="minorAscii" w:hAnsiTheme="minorAscii" w:eastAsiaTheme="minorAscii" w:cstheme="minorAscii"/>
+          <w:b w:val="1"/>
+          <w:bCs w:val="1"/>
+          <w:i w:val="1"/>
+          <w:iCs w:val="1"/>
+          <w:noProof w:val="0"/>
+          <w:color w:val="FF0000"/>
+          <w:sz w:val="32"/>
+          <w:szCs w:val="32"/>
+          <w:u w:val="single"/>
+          <w:lang w:val="en-GB"/>
+        </w:rPr>
+        <w:t xml:space="preserve"> or folder:</w:t>
+      </w:r>
+    </w:p>
+    <w:p>
+      <w:pPr>
+        <w:spacing w:before="240" w:beforeAutospacing="off" w:after="240" w:afterAutospacing="off"/>
+      </w:pPr>
+      <w:r>
+        <w:rPr>
+          <w:rFonts w:ascii="Calibri" w:hAnsi="Calibri" w:eastAsia="Calibri" w:cs="Calibri"/>
+          <w:noProof w:val="0"/>
+          <w:sz w:val="24"/>
+          <w:szCs w:val="24"/>
+          <w:lang w:val="en-GB"/>
+        </w:rPr>
+        <w:t>listeners are directly related to events. They’re the “reactors” that run when an event happens.</w:t>
+      </w:r>
+    </w:p>
+    <w:p>
+      <w:pPr>
+        <w:pStyle w:val="Heading2"/>
+        <w:spacing w:before="299" w:beforeAutospacing="off" w:after="299" w:afterAutospacing="off"/>
+      </w:pPr>
+      <w:r>
+        <w:rPr>
+          <w:rFonts w:ascii="Calibri" w:hAnsi="Calibri" w:eastAsia="Calibri" w:cs="Calibri"/>
+          <w:b w:val="1"/>
+          <w:bCs w:val="1"/>
+          <w:noProof w:val="0"/>
+          <w:sz w:val="36"/>
+          <w:szCs w:val="36"/>
+          <w:lang w:val="en-GB"/>
+        </w:rPr>
+        <w:t>What is a listener in Laravel?</w:t>
+      </w:r>
+    </w:p>
+    <w:p>
+      <w:pPr>
+        <w:pStyle w:val="ListParagraph"/>
+        <w:numPr>
+          <w:ilvl w:val="0"/>
+          <w:numId w:val="6"/>
+        </w:numPr>
+        <w:spacing w:before="240" w:beforeAutospacing="off" w:after="240" w:afterAutospacing="off"/>
+        <w:rPr>
+          <w:rFonts w:ascii="Calibri" w:hAnsi="Calibri" w:eastAsia="Calibri" w:cs="Calibri"/>
+          <w:noProof w:val="0"/>
+          <w:sz w:val="24"/>
+          <w:szCs w:val="24"/>
+          <w:lang w:val="en-GB"/>
+        </w:rPr>
+      </w:pPr>
+      <w:r>
+        <w:rPr>
+          <w:rFonts w:ascii="Calibri" w:hAnsi="Calibri" w:eastAsia="Calibri" w:cs="Calibri"/>
+          <w:noProof w:val="0"/>
+          <w:sz w:val="24"/>
+          <w:szCs w:val="24"/>
+          <w:lang w:val="en-GB"/>
+        </w:rPr>
+        <w:t xml:space="preserve">A </w:t>
+      </w:r>
+      <w:r>
+        <w:rPr>
+          <w:rFonts w:ascii="Calibri" w:hAnsi="Calibri" w:eastAsia="Calibri" w:cs="Calibri"/>
+          <w:b w:val="1"/>
+          <w:bCs w:val="1"/>
+          <w:noProof w:val="0"/>
+          <w:sz w:val="24"/>
+          <w:szCs w:val="24"/>
+          <w:lang w:val="en-GB"/>
+        </w:rPr>
+        <w:t>listener</w:t>
+      </w:r>
+      <w:r>
+        <w:rPr>
+          <w:rFonts w:ascii="Calibri" w:hAnsi="Calibri" w:eastAsia="Calibri" w:cs="Calibri"/>
+          <w:noProof w:val="0"/>
+          <w:sz w:val="24"/>
+          <w:szCs w:val="24"/>
+          <w:lang w:val="en-GB"/>
+        </w:rPr>
+        <w:t xml:space="preserve"> is a class that </w:t>
+      </w:r>
+      <w:r>
+        <w:rPr>
+          <w:rFonts w:ascii="Calibri" w:hAnsi="Calibri" w:eastAsia="Calibri" w:cs="Calibri"/>
+          <w:b w:val="1"/>
+          <w:bCs w:val="1"/>
+          <w:noProof w:val="0"/>
+          <w:sz w:val="24"/>
+          <w:szCs w:val="24"/>
+          <w:lang w:val="en-GB"/>
+        </w:rPr>
+        <w:t>listens for a specific event</w:t>
+      </w:r>
+      <w:r>
+        <w:rPr>
+          <w:rFonts w:ascii="Calibri" w:hAnsi="Calibri" w:eastAsia="Calibri" w:cs="Calibri"/>
+          <w:noProof w:val="0"/>
+          <w:sz w:val="24"/>
+          <w:szCs w:val="24"/>
+          <w:lang w:val="en-GB"/>
+        </w:rPr>
+        <w:t xml:space="preserve"> and runs some code when that event is dispatched.laravelmagazine+1</w:t>
+      </w:r>
+    </w:p>
+    <w:p>
+      <w:pPr>
+        <w:pStyle w:val="ListParagraph"/>
+        <w:numPr>
+          <w:ilvl w:val="0"/>
+          <w:numId w:val="6"/>
+        </w:numPr>
+        <w:spacing w:before="240" w:beforeAutospacing="off" w:after="240" w:afterAutospacing="off"/>
+        <w:rPr>
+          <w:rFonts w:ascii="Calibri" w:hAnsi="Calibri" w:eastAsia="Calibri" w:cs="Calibri"/>
+          <w:noProof w:val="0"/>
+          <w:sz w:val="24"/>
+          <w:szCs w:val="24"/>
+          <w:lang w:val="en-GB"/>
+        </w:rPr>
+      </w:pPr>
+      <w:r>
+        <w:rPr>
+          <w:rFonts w:ascii="Calibri" w:hAnsi="Calibri" w:eastAsia="Calibri" w:cs="Calibri"/>
+          <w:noProof w:val="0"/>
+          <w:sz w:val="24"/>
+          <w:szCs w:val="24"/>
+          <w:lang w:val="en-GB"/>
+        </w:rPr>
+        <w:t>Think of it like:</w:t>
+      </w:r>
+    </w:p>
+    <w:p>
+      <w:pPr>
+        <w:pStyle w:val="ListParagraph"/>
+        <w:numPr>
+          <w:ilvl w:val="1"/>
+          <w:numId w:val="6"/>
+        </w:numPr>
+        <w:spacing w:before="240" w:beforeAutospacing="off" w:after="240" w:afterAutospacing="off"/>
+        <w:rPr>
+          <w:rFonts w:ascii="Calibri" w:hAnsi="Calibri" w:eastAsia="Calibri" w:cs="Calibri"/>
+          <w:noProof w:val="0"/>
+          <w:sz w:val="24"/>
+          <w:szCs w:val="24"/>
+          <w:lang w:val="en-GB"/>
+        </w:rPr>
+      </w:pPr>
+      <w:r>
+        <w:rPr>
+          <w:rFonts w:ascii="Calibri" w:hAnsi="Calibri" w:eastAsia="Calibri" w:cs="Calibri"/>
+          <w:b w:val="1"/>
+          <w:bCs w:val="1"/>
+          <w:noProof w:val="0"/>
+          <w:sz w:val="24"/>
+          <w:szCs w:val="24"/>
+          <w:lang w:val="en-GB"/>
+        </w:rPr>
+        <w:t>Event</w:t>
+      </w:r>
+      <w:r>
+        <w:rPr>
+          <w:rFonts w:ascii="Calibri" w:hAnsi="Calibri" w:eastAsia="Calibri" w:cs="Calibri"/>
+          <w:noProof w:val="0"/>
+          <w:sz w:val="24"/>
+          <w:szCs w:val="24"/>
+          <w:lang w:val="en-GB"/>
+        </w:rPr>
+        <w:t xml:space="preserve"> = “Something happened” (e.g., </w:t>
+      </w:r>
+      <w:r>
+        <w:rPr>
+          <w:rFonts w:ascii="Consolas" w:hAnsi="Consolas" w:eastAsia="Consolas" w:cs="Consolas"/>
+          <w:noProof w:val="0"/>
+          <w:sz w:val="24"/>
+          <w:szCs w:val="24"/>
+          <w:lang w:val="en-GB"/>
+        </w:rPr>
+        <w:t>ClaimSubmitted</w:t>
+      </w:r>
+      <w:r>
+        <w:rPr>
+          <w:rFonts w:ascii="Calibri" w:hAnsi="Calibri" w:eastAsia="Calibri" w:cs="Calibri"/>
+          <w:noProof w:val="0"/>
+          <w:sz w:val="24"/>
+          <w:szCs w:val="24"/>
+          <w:lang w:val="en-GB"/>
+        </w:rPr>
+        <w:t>)</w:t>
+      </w:r>
+    </w:p>
+    <w:p>
+      <w:pPr>
+        <w:pStyle w:val="ListParagraph"/>
+        <w:numPr>
+          <w:ilvl w:val="1"/>
+          <w:numId w:val="6"/>
+        </w:numPr>
+        <w:spacing w:before="240" w:beforeAutospacing="off" w:after="240" w:afterAutospacing="off"/>
+        <w:rPr>
+          <w:noProof w:val="0"/>
+          <w:lang w:val="en-GB"/>
+        </w:rPr>
+      </w:pPr>
+      <w:r>
+        <w:rPr>
+          <w:rFonts w:ascii="Calibri" w:hAnsi="Calibri" w:eastAsia="Calibri" w:cs="Calibri"/>
+          <w:b w:val="1"/>
+          <w:bCs w:val="1"/>
+          <w:noProof w:val="0"/>
+          <w:sz w:val="24"/>
+          <w:szCs w:val="24"/>
+          <w:lang w:val="en-GB"/>
+        </w:rPr>
+        <w:t>Listener</w:t>
+      </w:r>
+      <w:r>
+        <w:rPr>
+          <w:rFonts w:ascii="Calibri" w:hAnsi="Calibri" w:eastAsia="Calibri" w:cs="Calibri"/>
+          <w:noProof w:val="0"/>
+          <w:sz w:val="24"/>
+          <w:szCs w:val="24"/>
+          <w:lang w:val="en-GB"/>
+        </w:rPr>
+        <w:t xml:space="preserve"> = “Okay, I’ll handle what needs to be done because of that” (e.g., send email, call API, log audit)</w:t>
+      </w:r>
+      <w:r>
+        <w:rPr>
+          <w:rFonts w:ascii="Calibri" w:hAnsi="Calibri" w:eastAsia="Calibri" w:cs="Calibri"/>
+          <w:noProof w:val="0"/>
+          <w:sz w:val="24"/>
+          <w:szCs w:val="24"/>
+          <w:lang w:val="en-GB"/>
+        </w:rPr>
+        <w:t>.</w:t>
+      </w:r>
+    </w:p>
+    <w:p>
+      <w:pPr>
+        <w:pStyle w:val="Normal"/>
+        <w:spacing w:before="240" w:beforeAutospacing="off" w:after="240" w:afterAutospacing="off"/>
+        <w:ind w:left="0"/>
+        <w:rPr>
+          <w:noProof w:val="0"/>
+          <w:lang w:val="en-GB"/>
+        </w:rPr>
+      </w:pPr>
+    </w:p>
+    <w:p>
+      <w:pPr>
+        <w:pStyle w:val="Normal"/>
+        <w:spacing w:before="240" w:beforeAutospacing="off" w:after="240" w:afterAutospacing="off"/>
+        <w:ind w:left="0"/>
+        <w:rPr>
+          <w:b w:val="1"/>
+          <w:bCs w:val="1"/>
+          <w:i w:val="1"/>
+          <w:iCs w:val="1"/>
+          <w:noProof w:val="0"/>
+          <w:color w:val="FF0000"/>
+          <w:sz w:val="32"/>
+          <w:szCs w:val="32"/>
+          <w:u w:val="single"/>
+          <w:lang w:val="en-GB"/>
+        </w:rPr>
+      </w:pPr>
+      <w:r>
+        <w:rPr>
+          <w:b w:val="1"/>
+          <w:bCs w:val="1"/>
+          <w:i w:val="1"/>
+          <w:iCs w:val="1"/>
+          <w:noProof w:val="0"/>
+          <w:color w:val="FF0000"/>
+          <w:sz w:val="32"/>
+          <w:szCs w:val="32"/>
+          <w:u w:val="single"/>
+          <w:lang w:val="en-GB"/>
+        </w:rPr>
+        <w:t>Job Directory:</w:t>
+      </w:r>
+    </w:p>
+    <w:p>
+      <w:pPr>
+        <w:pStyle w:val="Heading2"/>
+        <w:spacing w:before="299" w:beforeAutospacing="off" w:after="299" w:afterAutospacing="off"/>
+      </w:pPr>
+      <w:r>
+        <w:rPr>
+          <w:rFonts w:ascii="Calibri" w:hAnsi="Calibri" w:eastAsia="Calibri" w:cs="Calibri"/>
+          <w:b w:val="1"/>
+          <w:bCs w:val="1"/>
+          <w:noProof w:val="0"/>
+          <w:sz w:val="36"/>
+          <w:szCs w:val="36"/>
+          <w:lang w:val="en-GB"/>
+        </w:rPr>
+        <w:t>Event → Listener → Job (asynchronous, recommended for heavy work)</w:t>
+      </w:r>
+    </w:p>
+    <w:p>
+      <w:pPr>
+        <w:spacing w:before="240" w:beforeAutospacing="off" w:after="240" w:afterAutospacing="off"/>
+      </w:pPr>
+      <w:r>
+        <w:rPr>
+          <w:rFonts w:ascii="Calibri" w:hAnsi="Calibri" w:eastAsia="Calibri" w:cs="Calibri"/>
+          <w:noProof w:val="0"/>
+          <w:sz w:val="24"/>
+          <w:szCs w:val="24"/>
+          <w:lang w:val="en-GB"/>
+        </w:rPr>
+        <w:t>Flow:</w:t>
+      </w:r>
+    </w:p>
+    <w:p>
+      <w:pPr>
+        <w:pStyle w:val="ListParagraph"/>
+        <w:numPr>
+          <w:ilvl w:val="0"/>
+          <w:numId w:val="7"/>
+        </w:numPr>
+        <w:spacing w:before="240" w:beforeAutospacing="off" w:after="240" w:afterAutospacing="off"/>
+        <w:rPr>
+          <w:rFonts w:ascii="Calibri" w:hAnsi="Calibri" w:eastAsia="Calibri" w:cs="Calibri"/>
+          <w:noProof w:val="0"/>
+          <w:sz w:val="24"/>
+          <w:szCs w:val="24"/>
+          <w:lang w:val="en-GB"/>
+        </w:rPr>
+      </w:pPr>
+      <w:r>
+        <w:rPr>
+          <w:rFonts w:ascii="Calibri" w:hAnsi="Calibri" w:eastAsia="Calibri" w:cs="Calibri"/>
+          <w:noProof w:val="0"/>
+          <w:sz w:val="24"/>
+          <w:szCs w:val="24"/>
+          <w:lang w:val="en-GB"/>
+        </w:rPr>
+        <w:t xml:space="preserve">Your code dispatches an </w:t>
+      </w:r>
+      <w:r>
+        <w:rPr>
+          <w:rFonts w:ascii="Calibri" w:hAnsi="Calibri" w:eastAsia="Calibri" w:cs="Calibri"/>
+          <w:b w:val="1"/>
+          <w:bCs w:val="1"/>
+          <w:noProof w:val="0"/>
+          <w:sz w:val="24"/>
+          <w:szCs w:val="24"/>
+          <w:lang w:val="en-GB"/>
+        </w:rPr>
+        <w:t>event</w:t>
+      </w:r>
+      <w:r>
+        <w:rPr>
+          <w:rFonts w:ascii="Calibri" w:hAnsi="Calibri" w:eastAsia="Calibri" w:cs="Calibri"/>
+          <w:noProof w:val="0"/>
+          <w:sz w:val="24"/>
+          <w:szCs w:val="24"/>
+          <w:lang w:val="en-GB"/>
+        </w:rPr>
+        <w:t>:</w:t>
+      </w:r>
+    </w:p>
+    <w:p>
+      <w:pPr>
+        <w:spacing w:before="0" w:beforeAutospacing="off" w:after="0" w:afterAutospacing="off"/>
+      </w:pPr>
+      <w:r>
+        <w:rPr>
+          <w:rFonts w:ascii="Consolas" w:hAnsi="Consolas" w:eastAsia="Consolas" w:cs="Consolas"/>
+          <w:noProof w:val="0"/>
+          <w:sz w:val="24"/>
+          <w:szCs w:val="24"/>
+          <w:lang w:val="en-GB"/>
+        </w:rPr>
+        <w:t>php</w:t>
+      </w:r>
+    </w:p>
+    <w:p>
+      <w:pPr>
+        <w:spacing w:before="0" w:beforeAutospacing="off" w:after="0" w:afterAutospacing="off"/>
+        <w:jc w:val="right"/>
+      </w:pPr>
+      <w:r>
+        <w:rPr>
+          <w:rFonts w:ascii="Consolas" w:hAnsi="Consolas" w:eastAsia="Consolas" w:cs="Consolas"/>
+          <w:noProof w:val="0"/>
+          <w:sz w:val="24"/>
+          <w:szCs w:val="24"/>
+          <w:lang w:val="en-GB"/>
+        </w:rPr>
+        <w:t>event(new ClaimSubmitted($claim));</w:t>
+      </w:r>
+    </w:p>
+    <w:p>
+      <w:pPr>
+        <w:pStyle w:val="ListParagraph"/>
+        <w:numPr>
+          <w:ilvl w:val="0"/>
+          <w:numId w:val="7"/>
+        </w:numPr>
+        <w:spacing w:before="240" w:beforeAutospacing="off" w:after="240" w:afterAutospacing="off"/>
+        <w:rPr>
+          <w:rFonts w:ascii="Calibri" w:hAnsi="Calibri" w:eastAsia="Calibri" w:cs="Calibri"/>
+          <w:noProof w:val="0"/>
+          <w:sz w:val="24"/>
+          <w:szCs w:val="24"/>
+          <w:lang w:val="en-GB"/>
+        </w:rPr>
+      </w:pPr>
+      <w:r>
+        <w:rPr>
+          <w:rFonts w:ascii="Calibri" w:hAnsi="Calibri" w:eastAsia="Calibri" w:cs="Calibri"/>
+          <w:noProof w:val="0"/>
+          <w:sz w:val="24"/>
+          <w:szCs w:val="24"/>
+          <w:lang w:val="en-GB"/>
+        </w:rPr>
+        <w:t xml:space="preserve">A </w:t>
+      </w:r>
+      <w:r>
+        <w:rPr>
+          <w:rFonts w:ascii="Calibri" w:hAnsi="Calibri" w:eastAsia="Calibri" w:cs="Calibri"/>
+          <w:b w:val="1"/>
+          <w:bCs w:val="1"/>
+          <w:noProof w:val="0"/>
+          <w:sz w:val="24"/>
+          <w:szCs w:val="24"/>
+          <w:lang w:val="en-GB"/>
+        </w:rPr>
+        <w:t>listener</w:t>
+      </w:r>
+      <w:r>
+        <w:rPr>
+          <w:rFonts w:ascii="Calibri" w:hAnsi="Calibri" w:eastAsia="Calibri" w:cs="Calibri"/>
+          <w:noProof w:val="0"/>
+          <w:sz w:val="24"/>
+          <w:szCs w:val="24"/>
+          <w:lang w:val="en-GB"/>
+        </w:rPr>
+        <w:t xml:space="preserve"> catches the event.</w:t>
+      </w:r>
+    </w:p>
+    <w:p>
+      <w:pPr>
+        <w:pStyle w:val="ListParagraph"/>
+        <w:numPr>
+          <w:ilvl w:val="0"/>
+          <w:numId w:val="7"/>
+        </w:numPr>
+        <w:spacing w:before="240" w:beforeAutospacing="off" w:after="240" w:afterAutospacing="off"/>
+        <w:rPr>
+          <w:rFonts w:ascii="Calibri" w:hAnsi="Calibri" w:eastAsia="Calibri" w:cs="Calibri"/>
+          <w:noProof w:val="0"/>
+          <w:sz w:val="24"/>
+          <w:szCs w:val="24"/>
+          <w:lang w:val="en-GB"/>
+        </w:rPr>
+      </w:pPr>
+      <w:r>
+        <w:rPr>
+          <w:rFonts w:ascii="Calibri" w:hAnsi="Calibri" w:eastAsia="Calibri" w:cs="Calibri"/>
+          <w:noProof w:val="0"/>
+          <w:sz w:val="24"/>
+          <w:szCs w:val="24"/>
+          <w:lang w:val="en-GB"/>
+        </w:rPr>
+        <w:t xml:space="preserve">Inside the listener, you </w:t>
+      </w:r>
+      <w:r>
+        <w:rPr>
+          <w:rFonts w:ascii="Calibri" w:hAnsi="Calibri" w:eastAsia="Calibri" w:cs="Calibri"/>
+          <w:b w:val="1"/>
+          <w:bCs w:val="1"/>
+          <w:noProof w:val="0"/>
+          <w:sz w:val="24"/>
+          <w:szCs w:val="24"/>
+          <w:lang w:val="en-GB"/>
+        </w:rPr>
+        <w:t>dispatch a job</w:t>
+      </w:r>
+      <w:r>
+        <w:rPr>
+          <w:rFonts w:ascii="Calibri" w:hAnsi="Calibri" w:eastAsia="Calibri" w:cs="Calibri"/>
+          <w:noProof w:val="0"/>
+          <w:sz w:val="24"/>
+          <w:szCs w:val="24"/>
+          <w:lang w:val="en-GB"/>
+        </w:rPr>
+        <w:t>:</w:t>
+      </w:r>
+    </w:p>
+    <w:p>
+      <w:pPr>
+        <w:spacing w:before="0" w:beforeAutospacing="off" w:after="0" w:afterAutospacing="off"/>
+      </w:pPr>
+      <w:r>
+        <w:rPr>
+          <w:rFonts w:ascii="Consolas" w:hAnsi="Consolas" w:eastAsia="Consolas" w:cs="Consolas"/>
+          <w:noProof w:val="0"/>
+          <w:sz w:val="24"/>
+          <w:szCs w:val="24"/>
+          <w:lang w:val="en-GB"/>
+        </w:rPr>
+        <w:t>php</w:t>
+      </w:r>
+    </w:p>
+    <w:p>
+      <w:pPr>
+        <w:spacing w:before="0" w:beforeAutospacing="off" w:after="0" w:afterAutospacing="off"/>
+        <w:jc w:val="right"/>
+      </w:pPr>
+      <w:r>
+        <w:rPr>
+          <w:rFonts w:ascii="Consolas" w:hAnsi="Consolas" w:eastAsia="Consolas" w:cs="Consolas"/>
+          <w:noProof w:val="0"/>
+          <w:sz w:val="24"/>
+          <w:szCs w:val="24"/>
+          <w:lang w:val="en-GB"/>
+        </w:rPr>
+        <w:t>SendClaimSubmissionEmail::dispatch($claim);</w:t>
+      </w:r>
+    </w:p>
+    <w:p>
+      <w:pPr>
+        <w:pStyle w:val="ListParagraph"/>
+        <w:numPr>
+          <w:ilvl w:val="0"/>
+          <w:numId w:val="7"/>
+        </w:numPr>
+        <w:spacing w:before="240" w:beforeAutospacing="off" w:after="240" w:afterAutospacing="off"/>
+        <w:rPr>
+          <w:rFonts w:ascii="Calibri" w:hAnsi="Calibri" w:eastAsia="Calibri" w:cs="Calibri"/>
+          <w:noProof w:val="0"/>
+          <w:sz w:val="24"/>
+          <w:szCs w:val="24"/>
+          <w:lang w:val="en-GB"/>
+        </w:rPr>
+      </w:pPr>
+      <w:r>
+        <w:rPr>
+          <w:rFonts w:ascii="Calibri" w:hAnsi="Calibri" w:eastAsia="Calibri" w:cs="Calibri"/>
+          <w:noProof w:val="0"/>
+          <w:sz w:val="24"/>
+          <w:szCs w:val="24"/>
+          <w:lang w:val="en-GB"/>
+        </w:rPr>
+        <w:t xml:space="preserve">The job goes into the </w:t>
+      </w:r>
+      <w:r>
+        <w:rPr>
+          <w:rFonts w:ascii="Calibri" w:hAnsi="Calibri" w:eastAsia="Calibri" w:cs="Calibri"/>
+          <w:b w:val="1"/>
+          <w:bCs w:val="1"/>
+          <w:noProof w:val="0"/>
+          <w:sz w:val="24"/>
+          <w:szCs w:val="24"/>
+          <w:lang w:val="en-GB"/>
+        </w:rPr>
+        <w:t>queue</w:t>
+      </w:r>
+      <w:r>
+        <w:rPr>
+          <w:rFonts w:ascii="Calibri" w:hAnsi="Calibri" w:eastAsia="Calibri" w:cs="Calibri"/>
+          <w:noProof w:val="0"/>
+          <w:sz w:val="24"/>
+          <w:szCs w:val="24"/>
+          <w:lang w:val="en-GB"/>
+        </w:rPr>
+        <w:t>.</w:t>
+      </w:r>
+    </w:p>
+    <w:p>
+      <w:pPr>
+        <w:pStyle w:val="ListParagraph"/>
+        <w:numPr>
+          <w:ilvl w:val="0"/>
+          <w:numId w:val="7"/>
+        </w:numPr>
+        <w:spacing w:before="240" w:beforeAutospacing="off" w:after="240" w:afterAutospacing="off"/>
+        <w:rPr>
+          <w:rFonts w:ascii="Calibri" w:hAnsi="Calibri" w:eastAsia="Calibri" w:cs="Calibri"/>
+          <w:noProof w:val="0"/>
+          <w:sz w:val="24"/>
+          <w:szCs w:val="24"/>
+          <w:lang w:val="en-GB"/>
+        </w:rPr>
+      </w:pPr>
+      <w:r>
+        <w:rPr>
+          <w:rFonts w:ascii="Calibri" w:hAnsi="Calibri" w:eastAsia="Calibri" w:cs="Calibri"/>
+          <w:noProof w:val="0"/>
+          <w:sz w:val="24"/>
+          <w:szCs w:val="24"/>
+          <w:lang w:val="en-GB"/>
+        </w:rPr>
+        <w:t xml:space="preserve">A </w:t>
+      </w:r>
+      <w:r>
+        <w:rPr>
+          <w:rFonts w:ascii="Calibri" w:hAnsi="Calibri" w:eastAsia="Calibri" w:cs="Calibri"/>
+          <w:b w:val="1"/>
+          <w:bCs w:val="1"/>
+          <w:noProof w:val="0"/>
+          <w:sz w:val="24"/>
+          <w:szCs w:val="24"/>
+          <w:lang w:val="en-GB"/>
+        </w:rPr>
+        <w:t>queue worker</w:t>
+      </w:r>
+      <w:r>
+        <w:rPr>
+          <w:rFonts w:ascii="Calibri" w:hAnsi="Calibri" w:eastAsia="Calibri" w:cs="Calibri"/>
+          <w:noProof w:val="0"/>
+          <w:sz w:val="24"/>
+          <w:szCs w:val="24"/>
+          <w:lang w:val="en-GB"/>
+        </w:rPr>
+        <w:t xml:space="preserve"> later runs the job’s </w:t>
+      </w:r>
+      <w:r>
+        <w:rPr>
+          <w:rFonts w:ascii="Consolas" w:hAnsi="Consolas" w:eastAsia="Consolas" w:cs="Consolas"/>
+          <w:noProof w:val="0"/>
+          <w:sz w:val="24"/>
+          <w:szCs w:val="24"/>
+          <w:lang w:val="en-GB"/>
+        </w:rPr>
+        <w:t>handle()</w:t>
+      </w:r>
+      <w:r>
+        <w:rPr>
+          <w:rFonts w:ascii="Calibri" w:hAnsi="Calibri" w:eastAsia="Calibri" w:cs="Calibri"/>
+          <w:noProof w:val="0"/>
+          <w:sz w:val="24"/>
+          <w:szCs w:val="24"/>
+          <w:lang w:val="en-GB"/>
+        </w:rPr>
+        <w:t xml:space="preserve"> method in the background.</w:t>
+      </w:r>
+    </w:p>
+    <w:p>
+      <w:pPr>
+        <w:spacing w:before="240" w:beforeAutospacing="off" w:after="240" w:afterAutospacing="off"/>
+      </w:pPr>
+      <w:r>
+        <w:rPr>
+          <w:rFonts w:ascii="Calibri" w:hAnsi="Calibri" w:eastAsia="Calibri" w:cs="Calibri"/>
+          <w:noProof w:val="0"/>
+          <w:sz w:val="24"/>
+          <w:szCs w:val="24"/>
+          <w:lang w:val="en-GB"/>
+        </w:rPr>
+        <w:t>Here:</w:t>
+      </w:r>
+      <w:r>
+        <w:br/>
+      </w:r>
+      <w:r>
+        <w:rPr>
+          <w:rFonts w:ascii="Calibri" w:hAnsi="Calibri" w:eastAsia="Calibri" w:cs="Calibri"/>
+          <w:b w:val="1"/>
+          <w:bCs w:val="1"/>
+          <w:noProof w:val="0"/>
+          <w:sz w:val="24"/>
+          <w:szCs w:val="24"/>
+          <w:lang w:val="en-GB"/>
+        </w:rPr>
+        <w:t>Event → Listener → Job → Queue Worker</w:t>
+      </w:r>
+      <w:r>
+        <w:rPr>
+          <w:rFonts w:ascii="Calibri" w:hAnsi="Calibri" w:eastAsia="Calibri" w:cs="Calibri"/>
+          <w:noProof w:val="0"/>
+          <w:sz w:val="24"/>
+          <w:szCs w:val="24"/>
+          <w:lang w:val="en-GB"/>
+        </w:rPr>
+        <w:t>linkedin+1</w:t>
+      </w:r>
+    </w:p>
+    <w:p>
+      <w:pPr>
+        <w:spacing w:before="240" w:beforeAutospacing="off" w:after="240" w:afterAutospacing="off"/>
+      </w:pPr>
+      <w:r>
+        <w:rPr>
+          <w:rFonts w:ascii="Calibri" w:hAnsi="Calibri" w:eastAsia="Calibri" w:cs="Calibri"/>
+          <w:noProof w:val="0"/>
+          <w:sz w:val="24"/>
+          <w:szCs w:val="24"/>
+          <w:lang w:val="en-GB"/>
+        </w:rPr>
+        <w:t>This is common in healthcare systems where:</w:t>
+      </w:r>
+    </w:p>
+    <w:p>
+      <w:pPr>
+        <w:pStyle w:val="ListParagraph"/>
+        <w:numPr>
+          <w:ilvl w:val="0"/>
+          <w:numId w:val="8"/>
+        </w:numPr>
+        <w:spacing w:before="240" w:beforeAutospacing="off" w:after="240" w:afterAutospacing="off"/>
+        <w:rPr>
+          <w:rFonts w:ascii="Consolas" w:hAnsi="Consolas" w:eastAsia="Consolas" w:cs="Consolas"/>
+          <w:noProof w:val="0"/>
+          <w:sz w:val="24"/>
+          <w:szCs w:val="24"/>
+          <w:lang w:val="en-GB"/>
+        </w:rPr>
+      </w:pPr>
+      <w:r>
+        <w:rPr>
+          <w:rFonts w:ascii="Calibri" w:hAnsi="Calibri" w:eastAsia="Calibri" w:cs="Calibri"/>
+          <w:noProof w:val="0"/>
+          <w:sz w:val="24"/>
+          <w:szCs w:val="24"/>
+          <w:lang w:val="en-GB"/>
+        </w:rPr>
+        <w:t xml:space="preserve">Event = </w:t>
+      </w:r>
+      <w:r>
+        <w:rPr>
+          <w:rFonts w:ascii="Consolas" w:hAnsi="Consolas" w:eastAsia="Consolas" w:cs="Consolas"/>
+          <w:noProof w:val="0"/>
+          <w:sz w:val="24"/>
+          <w:szCs w:val="24"/>
+          <w:lang w:val="en-GB"/>
+        </w:rPr>
+        <w:t>ClaimSubmitted</w:t>
+      </w:r>
+    </w:p>
+    <w:p>
+      <w:pPr>
+        <w:pStyle w:val="ListParagraph"/>
+        <w:numPr>
+          <w:ilvl w:val="0"/>
+          <w:numId w:val="8"/>
+        </w:numPr>
+        <w:spacing w:before="240" w:beforeAutospacing="off" w:after="240" w:afterAutospacing="off"/>
+        <w:rPr>
+          <w:rFonts w:ascii="Calibri" w:hAnsi="Calibri" w:eastAsia="Calibri" w:cs="Calibri"/>
+          <w:noProof w:val="0"/>
+          <w:sz w:val="24"/>
+          <w:szCs w:val="24"/>
+          <w:lang w:val="en-GB"/>
+        </w:rPr>
+      </w:pPr>
+      <w:r>
+        <w:rPr>
+          <w:rFonts w:ascii="Calibri" w:hAnsi="Calibri" w:eastAsia="Calibri" w:cs="Calibri"/>
+          <w:noProof w:val="0"/>
+          <w:sz w:val="24"/>
+          <w:szCs w:val="24"/>
+          <w:lang w:val="en-GB"/>
+        </w:rPr>
+        <w:t>Listener = “Decide what needs to happen”</w:t>
+      </w:r>
+    </w:p>
+    <w:p>
+      <w:pPr>
+        <w:pStyle w:val="ListParagraph"/>
+        <w:numPr>
+          <w:ilvl w:val="0"/>
+          <w:numId w:val="8"/>
+        </w:numPr>
+        <w:spacing w:before="240" w:beforeAutospacing="off" w:after="240" w:afterAutospacing="off"/>
+        <w:rPr>
+          <w:rFonts w:ascii="Calibri" w:hAnsi="Calibri" w:eastAsia="Calibri" w:cs="Calibri"/>
+          <w:noProof w:val="0"/>
+          <w:sz w:val="24"/>
+          <w:szCs w:val="24"/>
+          <w:lang w:val="en-GB"/>
+        </w:rPr>
+      </w:pPr>
+      <w:r>
+        <w:rPr>
+          <w:rFonts w:ascii="Calibri" w:hAnsi="Calibri" w:eastAsia="Calibri" w:cs="Calibri"/>
+          <w:noProof w:val="0"/>
+          <w:sz w:val="24"/>
+          <w:szCs w:val="24"/>
+          <w:lang w:val="en-GB"/>
+        </w:rPr>
+        <w:t>Jobs = “Send email”, “Call clearinghouse”, “Push to analytics” (all queued)</w:t>
+      </w:r>
+    </w:p>
+    <w:p>
+      <w:pPr>
+        <w:pStyle w:val="Normal"/>
+        <w:spacing w:before="240" w:beforeAutospacing="off" w:after="240" w:afterAutospacing="off"/>
+        <w:ind w:left="0"/>
+        <w:rPr>
+          <w:rFonts w:ascii="Calibri" w:hAnsi="Calibri" w:eastAsia="Calibri" w:cs="Calibri"/>
+          <w:noProof w:val="0"/>
+          <w:sz w:val="24"/>
+          <w:szCs w:val="24"/>
+          <w:lang w:val="en-GB"/>
+        </w:rPr>
+      </w:pPr>
+    </w:p>
+    <w:p>
+      <w:pPr>
+        <w:pStyle w:val="Heading2"/>
+        <w:spacing w:before="299" w:beforeAutospacing="off" w:after="299" w:afterAutospacing="off"/>
+      </w:pPr>
+      <w:r>
+        <w:rPr>
+          <w:rFonts w:ascii="Calibri" w:hAnsi="Calibri" w:eastAsia="Calibri" w:cs="Calibri"/>
+          <w:b w:val="1"/>
+          <w:bCs w:val="1"/>
+          <w:noProof w:val="0"/>
+          <w:sz w:val="36"/>
+          <w:szCs w:val="36"/>
+          <w:lang w:val="en-GB"/>
+        </w:rPr>
+        <w:t>What is a “queue” in Laravel?</w:t>
+      </w:r>
+    </w:p>
+    <w:p>
+      <w:pPr>
+        <w:spacing w:before="240" w:beforeAutospacing="off" w:after="240" w:afterAutospacing="off"/>
+      </w:pPr>
+      <w:r>
+        <w:rPr>
+          <w:rFonts w:ascii="Calibri" w:hAnsi="Calibri" w:eastAsia="Calibri" w:cs="Calibri"/>
+          <w:noProof w:val="0"/>
+          <w:sz w:val="24"/>
+          <w:szCs w:val="24"/>
+          <w:lang w:val="en-GB"/>
+        </w:rPr>
+        <w:t xml:space="preserve">A </w:t>
+      </w:r>
+      <w:r>
+        <w:rPr>
+          <w:rFonts w:ascii="Calibri" w:hAnsi="Calibri" w:eastAsia="Calibri" w:cs="Calibri"/>
+          <w:b w:val="1"/>
+          <w:bCs w:val="1"/>
+          <w:noProof w:val="0"/>
+          <w:sz w:val="24"/>
+          <w:szCs w:val="24"/>
+          <w:lang w:val="en-GB"/>
+        </w:rPr>
+        <w:t>queue</w:t>
+      </w:r>
+      <w:r>
+        <w:rPr>
+          <w:rFonts w:ascii="Calibri" w:hAnsi="Calibri" w:eastAsia="Calibri" w:cs="Calibri"/>
+          <w:noProof w:val="0"/>
+          <w:sz w:val="24"/>
+          <w:szCs w:val="24"/>
+          <w:lang w:val="en-GB"/>
+        </w:rPr>
+        <w:t xml:space="preserve"> is just a </w:t>
+      </w:r>
+      <w:r>
+        <w:rPr>
+          <w:rFonts w:ascii="Calibri" w:hAnsi="Calibri" w:eastAsia="Calibri" w:cs="Calibri"/>
+          <w:b w:val="1"/>
+          <w:bCs w:val="1"/>
+          <w:noProof w:val="0"/>
+          <w:sz w:val="24"/>
+          <w:szCs w:val="24"/>
+          <w:lang w:val="en-GB"/>
+        </w:rPr>
+        <w:t>waiting line for jobs</w:t>
+      </w:r>
+      <w:r>
+        <w:rPr>
+          <w:rFonts w:ascii="Calibri" w:hAnsi="Calibri" w:eastAsia="Calibri" w:cs="Calibri"/>
+          <w:noProof w:val="0"/>
+          <w:sz w:val="24"/>
+          <w:szCs w:val="24"/>
+          <w:lang w:val="en-GB"/>
+        </w:rPr>
+        <w:t>.</w:t>
+      </w:r>
+    </w:p>
+    <w:p>
+      <w:pPr>
+        <w:pStyle w:val="Normal"/>
+        <w:spacing w:before="240" w:beforeAutospacing="off" w:after="240" w:afterAutospacing="off"/>
+      </w:pPr>
+      <w:r>
+        <w:rPr>
+          <w:rFonts w:ascii="Calibri" w:hAnsi="Calibri" w:eastAsia="Calibri" w:cs="Calibri"/>
+          <w:noProof w:val="0"/>
+          <w:sz w:val="24"/>
+          <w:szCs w:val="24"/>
+          <w:lang w:val="en-GB"/>
+        </w:rPr>
+        <w:t xml:space="preserve">A </w:t>
+      </w:r>
+      <w:r>
+        <w:rPr>
+          <w:rFonts w:ascii="Calibri" w:hAnsi="Calibri" w:eastAsia="Calibri" w:cs="Calibri"/>
+          <w:b w:val="1"/>
+          <w:bCs w:val="1"/>
+          <w:noProof w:val="0"/>
+          <w:sz w:val="24"/>
+          <w:szCs w:val="24"/>
+          <w:lang w:val="en-GB"/>
+        </w:rPr>
+        <w:t>queue</w:t>
+      </w:r>
+      <w:r>
+        <w:rPr>
+          <w:rFonts w:ascii="Calibri" w:hAnsi="Calibri" w:eastAsia="Calibri" w:cs="Calibri"/>
+          <w:noProof w:val="0"/>
+          <w:sz w:val="24"/>
+          <w:szCs w:val="24"/>
+          <w:lang w:val="en-GB"/>
+        </w:rPr>
+        <w:t xml:space="preserve"> is a </w:t>
+      </w:r>
+      <w:r>
+        <w:rPr>
+          <w:rFonts w:ascii="Calibri" w:hAnsi="Calibri" w:eastAsia="Calibri" w:cs="Calibri"/>
+          <w:b w:val="1"/>
+          <w:bCs w:val="1"/>
+          <w:noProof w:val="0"/>
+          <w:sz w:val="24"/>
+          <w:szCs w:val="24"/>
+          <w:lang w:val="en-GB"/>
+        </w:rPr>
+        <w:t>logical waiting line for jobs</w:t>
+      </w:r>
+      <w:r>
+        <w:rPr>
+          <w:rFonts w:ascii="Calibri" w:hAnsi="Calibri" w:eastAsia="Calibri" w:cs="Calibri"/>
+          <w:noProof w:val="0"/>
+          <w:sz w:val="24"/>
+          <w:szCs w:val="24"/>
+          <w:lang w:val="en-GB"/>
+        </w:rPr>
+        <w:t>, stored somewhere (database, Redis, AWS SQS, etc.).</w:t>
+      </w:r>
+    </w:p>
+    <w:p>
+      <w:pPr>
+        <w:pStyle w:val="ListParagraph"/>
+        <w:numPr>
+          <w:ilvl w:val="0"/>
+          <w:numId w:val="9"/>
+        </w:numPr>
+        <w:spacing w:before="240" w:beforeAutospacing="off" w:after="240" w:afterAutospacing="off"/>
+        <w:rPr>
+          <w:rFonts w:ascii="Calibri" w:hAnsi="Calibri" w:eastAsia="Calibri" w:cs="Calibri"/>
+          <w:noProof w:val="0"/>
+          <w:sz w:val="24"/>
+          <w:szCs w:val="24"/>
+          <w:lang w:val="en-GB"/>
+        </w:rPr>
+      </w:pPr>
+      <w:r>
+        <w:rPr>
+          <w:rFonts w:ascii="Calibri" w:hAnsi="Calibri" w:eastAsia="Calibri" w:cs="Calibri"/>
+          <w:noProof w:val="0"/>
+          <w:sz w:val="24"/>
+          <w:szCs w:val="24"/>
+          <w:lang w:val="en-GB"/>
+        </w:rPr>
+        <w:t xml:space="preserve">Your app </w:t>
+      </w:r>
+      <w:r>
+        <w:rPr>
+          <w:rFonts w:ascii="Calibri" w:hAnsi="Calibri" w:eastAsia="Calibri" w:cs="Calibri"/>
+          <w:b w:val="1"/>
+          <w:bCs w:val="1"/>
+          <w:noProof w:val="0"/>
+          <w:sz w:val="24"/>
+          <w:szCs w:val="24"/>
+          <w:lang w:val="en-GB"/>
+        </w:rPr>
+        <w:t>adds jobs</w:t>
+      </w:r>
+      <w:r>
+        <w:rPr>
+          <w:rFonts w:ascii="Calibri" w:hAnsi="Calibri" w:eastAsia="Calibri" w:cs="Calibri"/>
+          <w:noProof w:val="0"/>
+          <w:sz w:val="24"/>
+          <w:szCs w:val="24"/>
+          <w:lang w:val="en-GB"/>
+        </w:rPr>
+        <w:t xml:space="preserve"> to the queue (like putting tasks in a to</w:t>
+      </w:r>
+      <w:r>
+        <w:noBreakHyphen/>
+      </w:r>
+      <w:r>
+        <w:rPr>
+          <w:rFonts w:ascii="Calibri" w:hAnsi="Calibri" w:eastAsia="Calibri" w:cs="Calibri"/>
+          <w:noProof w:val="0"/>
+          <w:sz w:val="24"/>
+          <w:szCs w:val="24"/>
+          <w:lang w:val="en-GB"/>
+        </w:rPr>
+        <w:t>do list).medium+1</w:t>
+      </w:r>
+    </w:p>
+    <w:p>
+      <w:pPr>
+        <w:pStyle w:val="ListParagraph"/>
+        <w:numPr>
+          <w:ilvl w:val="0"/>
+          <w:numId w:val="9"/>
+        </w:numPr>
+        <w:spacing w:before="240" w:beforeAutospacing="off" w:after="240" w:afterAutospacing="off"/>
+        <w:rPr>
+          <w:rFonts w:ascii="Calibri" w:hAnsi="Calibri" w:eastAsia="Calibri" w:cs="Calibri"/>
+          <w:noProof w:val="0"/>
+          <w:sz w:val="24"/>
+          <w:szCs w:val="24"/>
+          <w:lang w:val="en-GB"/>
+        </w:rPr>
+      </w:pPr>
+      <w:r>
+        <w:rPr>
+          <w:rFonts w:ascii="Calibri" w:hAnsi="Calibri" w:eastAsia="Calibri" w:cs="Calibri"/>
+          <w:noProof w:val="0"/>
+          <w:sz w:val="24"/>
+          <w:szCs w:val="24"/>
+          <w:lang w:val="en-GB"/>
+        </w:rPr>
+        <w:t>A separate background process (</w:t>
+      </w:r>
+      <w:r>
+        <w:rPr>
+          <w:rFonts w:ascii="Calibri" w:hAnsi="Calibri" w:eastAsia="Calibri" w:cs="Calibri"/>
+          <w:b w:val="1"/>
+          <w:bCs w:val="1"/>
+          <w:noProof w:val="0"/>
+          <w:sz w:val="24"/>
+          <w:szCs w:val="24"/>
+          <w:lang w:val="en-GB"/>
+        </w:rPr>
+        <w:t>queue worker</w:t>
+      </w:r>
+      <w:r>
+        <w:rPr>
+          <w:rFonts w:ascii="Calibri" w:hAnsi="Calibri" w:eastAsia="Calibri" w:cs="Calibri"/>
+          <w:noProof w:val="0"/>
+          <w:sz w:val="24"/>
+          <w:szCs w:val="24"/>
+          <w:lang w:val="en-GB"/>
+        </w:rPr>
+        <w:t xml:space="preserve">) </w:t>
+      </w:r>
+      <w:r>
+        <w:rPr>
+          <w:rFonts w:ascii="Calibri" w:hAnsi="Calibri" w:eastAsia="Calibri" w:cs="Calibri"/>
+          <w:b w:val="1"/>
+          <w:bCs w:val="1"/>
+          <w:noProof w:val="0"/>
+          <w:sz w:val="24"/>
+          <w:szCs w:val="24"/>
+          <w:lang w:val="en-GB"/>
+        </w:rPr>
+        <w:t>picks jobs from the queue</w:t>
+      </w:r>
+      <w:r>
+        <w:rPr>
+          <w:rFonts w:ascii="Calibri" w:hAnsi="Calibri" w:eastAsia="Calibri" w:cs="Calibri"/>
+          <w:noProof w:val="0"/>
+          <w:sz w:val="24"/>
+          <w:szCs w:val="24"/>
+          <w:lang w:val="en-GB"/>
+        </w:rPr>
+        <w:t xml:space="preserve"> and runs them one by one.</w:t>
+      </w:r>
+    </w:p>
+    <w:p>
+      <w:pPr>
+        <w:pStyle w:val="Normal"/>
+        <w:spacing w:before="240" w:beforeAutospacing="off" w:after="240" w:afterAutospacing="off"/>
+        <w:ind w:left="0"/>
+        <w:rPr>
+          <w:rFonts w:ascii="Calibri" w:hAnsi="Calibri" w:eastAsia="Calibri" w:cs="Calibri"/>
+          <w:b w:val="1"/>
+          <w:bCs w:val="1"/>
+          <w:noProof w:val="0"/>
+          <w:color w:val="808080" w:themeColor="background1" w:themeTint="FF" w:themeShade="80"/>
+          <w:sz w:val="24"/>
+          <w:szCs w:val="24"/>
+          <w:lang w:val="en-GB"/>
+        </w:rPr>
+      </w:pPr>
+      <w:r>
+        <w:rPr>
+          <w:rFonts w:ascii="Calibri" w:hAnsi="Calibri" w:eastAsia="Calibri" w:cs="Calibri"/>
+          <w:b w:val="1"/>
+          <w:bCs w:val="1"/>
+          <w:noProof w:val="0"/>
+          <w:color w:val="808080" w:themeColor="background1" w:themeTint="FF" w:themeShade="80"/>
+          <w:sz w:val="24"/>
+          <w:szCs w:val="24"/>
+          <w:lang w:val="en-GB"/>
+        </w:rPr>
+        <w:t xml:space="preserve">// </w:t>
+      </w:r>
+      <w:r>
+        <w:rPr>
+          <w:rFonts w:ascii="Calibri" w:hAnsi="Calibri" w:eastAsia="Calibri" w:cs="Calibri"/>
+          <w:b w:val="1"/>
+          <w:bCs w:val="1"/>
+          <w:noProof w:val="0"/>
+          <w:color w:val="808080" w:themeColor="background1" w:themeTint="FF" w:themeShade="80"/>
+          <w:sz w:val="24"/>
+          <w:szCs w:val="24"/>
+          <w:lang w:val="en-GB"/>
+        </w:rPr>
+        <w:t xml:space="preserve">in </w:t>
+      </w:r>
+      <w:r>
+        <w:rPr>
+          <w:rFonts w:ascii="Calibri" w:hAnsi="Calibri" w:eastAsia="Calibri" w:cs="Calibri"/>
+          <w:b w:val="1"/>
+          <w:bCs w:val="1"/>
+          <w:noProof w:val="0"/>
+          <w:color w:val="808080" w:themeColor="background1" w:themeTint="FF" w:themeShade="80"/>
+          <w:sz w:val="24"/>
+          <w:szCs w:val="24"/>
+          <w:lang w:val="en-GB"/>
+        </w:rPr>
+        <w:t>laravel</w:t>
+      </w:r>
+      <w:r>
+        <w:rPr>
+          <w:rFonts w:ascii="Calibri" w:hAnsi="Calibri" w:eastAsia="Calibri" w:cs="Calibri"/>
+          <w:b w:val="1"/>
+          <w:bCs w:val="1"/>
+          <w:noProof w:val="0"/>
+          <w:color w:val="808080" w:themeColor="background1" w:themeTint="FF" w:themeShade="80"/>
+          <w:sz w:val="24"/>
+          <w:szCs w:val="24"/>
+          <w:lang w:val="en-GB"/>
+        </w:rPr>
+        <w:t xml:space="preserve"> </w:t>
+      </w:r>
+      <w:r>
+        <w:rPr>
+          <w:rFonts w:ascii="Calibri" w:hAnsi="Calibri" w:eastAsia="Calibri" w:cs="Calibri"/>
+          <w:b w:val="1"/>
+          <w:bCs w:val="1"/>
+          <w:noProof w:val="0"/>
+          <w:color w:val="808080" w:themeColor="background1" w:themeTint="FF" w:themeShade="80"/>
+          <w:sz w:val="24"/>
+          <w:szCs w:val="24"/>
+          <w:lang w:val="en-GB"/>
+        </w:rPr>
+        <w:t xml:space="preserve">u can find queue in </w:t>
+      </w:r>
+      <w:r>
+        <w:rPr>
+          <w:rFonts w:ascii="Calibri" w:hAnsi="Calibri" w:eastAsia="Calibri" w:cs="Calibri"/>
+          <w:b w:val="1"/>
+          <w:bCs w:val="1"/>
+          <w:noProof w:val="0"/>
+          <w:color w:val="808080" w:themeColor="background1" w:themeTint="FF" w:themeShade="80"/>
+          <w:sz w:val="24"/>
+          <w:szCs w:val="24"/>
+          <w:lang w:val="en-GB"/>
+        </w:rPr>
+        <w:t>confi</w:t>
+      </w:r>
+      <w:r>
+        <w:rPr>
+          <w:rFonts w:ascii="Calibri" w:hAnsi="Calibri" w:eastAsia="Calibri" w:cs="Calibri"/>
+          <w:b w:val="1"/>
+          <w:bCs w:val="1"/>
+          <w:noProof w:val="0"/>
+          <w:color w:val="808080" w:themeColor="background1" w:themeTint="FF" w:themeShade="80"/>
+          <w:sz w:val="24"/>
+          <w:szCs w:val="24"/>
+          <w:lang w:val="en-GB"/>
+        </w:rPr>
+        <w:t>g</w:t>
+      </w:r>
+      <w:r>
+        <w:rPr>
+          <w:rFonts w:ascii="Calibri" w:hAnsi="Calibri" w:eastAsia="Calibri" w:cs="Calibri"/>
+          <w:b w:val="1"/>
+          <w:bCs w:val="1"/>
+          <w:noProof w:val="0"/>
+          <w:color w:val="808080" w:themeColor="background1" w:themeTint="FF" w:themeShade="80"/>
+          <w:sz w:val="24"/>
+          <w:szCs w:val="24"/>
+          <w:lang w:val="en-GB"/>
+        </w:rPr>
+        <w:t>\</w:t>
+      </w:r>
+      <w:r>
+        <w:rPr>
+          <w:rFonts w:ascii="Calibri" w:hAnsi="Calibri" w:eastAsia="Calibri" w:cs="Calibri"/>
+          <w:b w:val="1"/>
+          <w:bCs w:val="1"/>
+          <w:noProof w:val="0"/>
+          <w:color w:val="808080" w:themeColor="background1" w:themeTint="FF" w:themeShade="80"/>
+          <w:sz w:val="24"/>
+          <w:szCs w:val="24"/>
+          <w:lang w:val="en-GB"/>
+        </w:rPr>
+        <w:t>queue.php</w:t>
+      </w:r>
+    </w:p>
+    <w:p>
+      <w:pPr>
+        <w:pStyle w:val="Normal"/>
+        <w:spacing w:before="240" w:beforeAutospacing="off" w:after="240" w:afterAutospacing="off"/>
+        <w:ind w:left="0"/>
+        <w:rPr>
+          <w:rFonts w:ascii="Calibri" w:hAnsi="Calibri" w:eastAsia="Calibri" w:cs="Calibri"/>
+          <w:noProof w:val="0"/>
+          <w:sz w:val="24"/>
+          <w:szCs w:val="24"/>
+          <w:lang w:val="en-GB"/>
+        </w:rPr>
+      </w:pPr>
+    </w:p>
+    <w:p>
+      <w:pPr>
+        <w:pStyle w:val="Normal"/>
+        <w:rPr>
+          <w:noProof w:val="0"/>
+          <w:lang w:val="en-GB"/>
+        </w:rPr>
+      </w:pPr>
+    </w:p>
+    <w:p>
+      <w:pPr>
+        <w:pStyle w:val="Normal"/>
+        <w:rPr>
+          <w:rFonts w:ascii="system-ui" w:hAnsi="system-ui" w:eastAsia="system-ui" w:cs="system-ui"/>
+          <w:b w:val="1"/>
+          <w:bCs w:val="1"/>
+          <w:i w:val="1"/>
+          <w:iCs w:val="1"/>
+          <w:caps w:val="0"/>
+          <w:smallCaps w:val="0"/>
+          <w:noProof w:val="0"/>
+          <w:color w:val="FF0000"/>
+          <w:sz w:val="32"/>
+          <w:szCs w:val="32"/>
+          <w:u w:val="single"/>
+          <w:lang w:val="en-GB"/>
+        </w:rPr>
+      </w:pPr>
     </w:p>
     <w:sectPr>
       <w:pgSz w:w="11906" w:h="16838" w:orient="portrait"/>
@@ -1177,6 +2977,651 @@
 
 <file path=word/numbering.xml><?xml version="1.0" encoding="utf-8"?>
 <w:numbering xmlns:w="http://schemas.openxmlformats.org/wordprocessingml/2006/main">
+  <w:abstractNum xmlns:w="http://schemas.openxmlformats.org/wordprocessingml/2006/main" w:abstractNumId="9">
+    <w:nsid w:val="2d80a573"/>
+    <w:multiLevelType xmlns:w="http://schemas.openxmlformats.org/wordprocessingml/2006/main" w:val="hybridMultilevel"/>
+    <w:lvl xmlns:w="http://schemas.openxmlformats.org/wordprocessingml/2006/main" w:ilvl="0">
+      <w:start w:val="1"/>
+      <w:numFmt w:val="bullet"/>
+      <w:lvlText w:val=""/>
+      <w:lvlJc w:val="left"/>
+      <w:pPr>
+        <w:ind w:left="720" w:hanging="360"/>
+      </w:pPr>
+      <w:rPr>
+        <w:rFonts w:hint="default" w:ascii="Symbol" w:hAnsi="Symbol"/>
+      </w:rPr>
+    </w:lvl>
+    <w:lvl xmlns:w="http://schemas.openxmlformats.org/wordprocessingml/2006/main" w:ilvl="1">
+      <w:start w:val="1"/>
+      <w:numFmt w:val="bullet"/>
+      <w:lvlText w:val="o"/>
+      <w:lvlJc w:val="left"/>
+      <w:pPr>
+        <w:ind w:left="1440" w:hanging="360"/>
+      </w:pPr>
+      <w:rPr>
+        <w:rFonts w:hint="default" w:ascii="Courier New" w:hAnsi="Courier New"/>
+      </w:rPr>
+    </w:lvl>
+    <w:lvl xmlns:w="http://schemas.openxmlformats.org/wordprocessingml/2006/main" w:ilvl="2">
+      <w:start w:val="1"/>
+      <w:numFmt w:val="bullet"/>
+      <w:lvlText w:val=""/>
+      <w:lvlJc w:val="left"/>
+      <w:pPr>
+        <w:ind w:left="2160" w:hanging="360"/>
+      </w:pPr>
+      <w:rPr>
+        <w:rFonts w:hint="default" w:ascii="Wingdings" w:hAnsi="Wingdings"/>
+      </w:rPr>
+    </w:lvl>
+    <w:lvl xmlns:w="http://schemas.openxmlformats.org/wordprocessingml/2006/main" w:ilvl="3">
+      <w:start w:val="1"/>
+      <w:numFmt w:val="bullet"/>
+      <w:lvlText w:val=""/>
+      <w:lvlJc w:val="left"/>
+      <w:pPr>
+        <w:ind w:left="2880" w:hanging="360"/>
+      </w:pPr>
+      <w:rPr>
+        <w:rFonts w:hint="default" w:ascii="Symbol" w:hAnsi="Symbol"/>
+      </w:rPr>
+    </w:lvl>
+    <w:lvl xmlns:w="http://schemas.openxmlformats.org/wordprocessingml/2006/main" w:ilvl="4">
+      <w:start w:val="1"/>
+      <w:numFmt w:val="bullet"/>
+      <w:lvlText w:val="o"/>
+      <w:lvlJc w:val="left"/>
+      <w:pPr>
+        <w:ind w:left="3600" w:hanging="360"/>
+      </w:pPr>
+      <w:rPr>
+        <w:rFonts w:hint="default" w:ascii="Courier New" w:hAnsi="Courier New"/>
+      </w:rPr>
+    </w:lvl>
+    <w:lvl xmlns:w="http://schemas.openxmlformats.org/wordprocessingml/2006/main" w:ilvl="5">
+      <w:start w:val="1"/>
+      <w:numFmt w:val="bullet"/>
+      <w:lvlText w:val=""/>
+      <w:lvlJc w:val="left"/>
+      <w:pPr>
+        <w:ind w:left="4320" w:hanging="360"/>
+      </w:pPr>
+      <w:rPr>
+        <w:rFonts w:hint="default" w:ascii="Wingdings" w:hAnsi="Wingdings"/>
+      </w:rPr>
+    </w:lvl>
+    <w:lvl xmlns:w="http://schemas.openxmlformats.org/wordprocessingml/2006/main" w:ilvl="6">
+      <w:start w:val="1"/>
+      <w:numFmt w:val="bullet"/>
+      <w:lvlText w:val=""/>
+      <w:lvlJc w:val="left"/>
+      <w:pPr>
+        <w:ind w:left="5040" w:hanging="360"/>
+      </w:pPr>
+      <w:rPr>
+        <w:rFonts w:hint="default" w:ascii="Symbol" w:hAnsi="Symbol"/>
+      </w:rPr>
+    </w:lvl>
+    <w:lvl xmlns:w="http://schemas.openxmlformats.org/wordprocessingml/2006/main" w:ilvl="7">
+      <w:start w:val="1"/>
+      <w:numFmt w:val="bullet"/>
+      <w:lvlText w:val="o"/>
+      <w:lvlJc w:val="left"/>
+      <w:pPr>
+        <w:ind w:left="5760" w:hanging="360"/>
+      </w:pPr>
+      <w:rPr>
+        <w:rFonts w:hint="default" w:ascii="Courier New" w:hAnsi="Courier New"/>
+      </w:rPr>
+    </w:lvl>
+    <w:lvl xmlns:w="http://schemas.openxmlformats.org/wordprocessingml/2006/main" w:ilvl="8">
+      <w:start w:val="1"/>
+      <w:numFmt w:val="bullet"/>
+      <w:lvlText w:val=""/>
+      <w:lvlJc w:val="left"/>
+      <w:pPr>
+        <w:ind w:left="6480" w:hanging="360"/>
+      </w:pPr>
+      <w:rPr>
+        <w:rFonts w:hint="default" w:ascii="Wingdings" w:hAnsi="Wingdings"/>
+      </w:rPr>
+    </w:lvl>
+  </w:abstractNum>
+  <w:abstractNum xmlns:w="http://schemas.openxmlformats.org/wordprocessingml/2006/main" w:abstractNumId="8">
+    <w:nsid w:val="5eb3595a"/>
+    <w:multiLevelType xmlns:w="http://schemas.openxmlformats.org/wordprocessingml/2006/main" w:val="hybridMultilevel"/>
+    <w:lvl xmlns:w="http://schemas.openxmlformats.org/wordprocessingml/2006/main" w:ilvl="0">
+      <w:start w:val="1"/>
+      <w:numFmt w:val="bullet"/>
+      <w:lvlText w:val=""/>
+      <w:lvlJc w:val="left"/>
+      <w:pPr>
+        <w:ind w:left="720" w:hanging="360"/>
+      </w:pPr>
+      <w:rPr>
+        <w:rFonts w:hint="default" w:ascii="Symbol" w:hAnsi="Symbol"/>
+      </w:rPr>
+    </w:lvl>
+    <w:lvl xmlns:w="http://schemas.openxmlformats.org/wordprocessingml/2006/main" w:ilvl="1">
+      <w:start w:val="1"/>
+      <w:numFmt w:val="bullet"/>
+      <w:lvlText w:val="o"/>
+      <w:lvlJc w:val="left"/>
+      <w:pPr>
+        <w:ind w:left="1440" w:hanging="360"/>
+      </w:pPr>
+      <w:rPr>
+        <w:rFonts w:hint="default" w:ascii="Courier New" w:hAnsi="Courier New"/>
+      </w:rPr>
+    </w:lvl>
+    <w:lvl xmlns:w="http://schemas.openxmlformats.org/wordprocessingml/2006/main" w:ilvl="2">
+      <w:start w:val="1"/>
+      <w:numFmt w:val="bullet"/>
+      <w:lvlText w:val=""/>
+      <w:lvlJc w:val="left"/>
+      <w:pPr>
+        <w:ind w:left="2160" w:hanging="360"/>
+      </w:pPr>
+      <w:rPr>
+        <w:rFonts w:hint="default" w:ascii="Wingdings" w:hAnsi="Wingdings"/>
+      </w:rPr>
+    </w:lvl>
+    <w:lvl xmlns:w="http://schemas.openxmlformats.org/wordprocessingml/2006/main" w:ilvl="3">
+      <w:start w:val="1"/>
+      <w:numFmt w:val="bullet"/>
+      <w:lvlText w:val=""/>
+      <w:lvlJc w:val="left"/>
+      <w:pPr>
+        <w:ind w:left="2880" w:hanging="360"/>
+      </w:pPr>
+      <w:rPr>
+        <w:rFonts w:hint="default" w:ascii="Symbol" w:hAnsi="Symbol"/>
+      </w:rPr>
+    </w:lvl>
+    <w:lvl xmlns:w="http://schemas.openxmlformats.org/wordprocessingml/2006/main" w:ilvl="4">
+      <w:start w:val="1"/>
+      <w:numFmt w:val="bullet"/>
+      <w:lvlText w:val="o"/>
+      <w:lvlJc w:val="left"/>
+      <w:pPr>
+        <w:ind w:left="3600" w:hanging="360"/>
+      </w:pPr>
+      <w:rPr>
+        <w:rFonts w:hint="default" w:ascii="Courier New" w:hAnsi="Courier New"/>
+      </w:rPr>
+    </w:lvl>
+    <w:lvl xmlns:w="http://schemas.openxmlformats.org/wordprocessingml/2006/main" w:ilvl="5">
+      <w:start w:val="1"/>
+      <w:numFmt w:val="bullet"/>
+      <w:lvlText w:val=""/>
+      <w:lvlJc w:val="left"/>
+      <w:pPr>
+        <w:ind w:left="4320" w:hanging="360"/>
+      </w:pPr>
+      <w:rPr>
+        <w:rFonts w:hint="default" w:ascii="Wingdings" w:hAnsi="Wingdings"/>
+      </w:rPr>
+    </w:lvl>
+    <w:lvl xmlns:w="http://schemas.openxmlformats.org/wordprocessingml/2006/main" w:ilvl="6">
+      <w:start w:val="1"/>
+      <w:numFmt w:val="bullet"/>
+      <w:lvlText w:val=""/>
+      <w:lvlJc w:val="left"/>
+      <w:pPr>
+        <w:ind w:left="5040" w:hanging="360"/>
+      </w:pPr>
+      <w:rPr>
+        <w:rFonts w:hint="default" w:ascii="Symbol" w:hAnsi="Symbol"/>
+      </w:rPr>
+    </w:lvl>
+    <w:lvl xmlns:w="http://schemas.openxmlformats.org/wordprocessingml/2006/main" w:ilvl="7">
+      <w:start w:val="1"/>
+      <w:numFmt w:val="bullet"/>
+      <w:lvlText w:val="o"/>
+      <w:lvlJc w:val="left"/>
+      <w:pPr>
+        <w:ind w:left="5760" w:hanging="360"/>
+      </w:pPr>
+      <w:rPr>
+        <w:rFonts w:hint="default" w:ascii="Courier New" w:hAnsi="Courier New"/>
+      </w:rPr>
+    </w:lvl>
+    <w:lvl xmlns:w="http://schemas.openxmlformats.org/wordprocessingml/2006/main" w:ilvl="8">
+      <w:start w:val="1"/>
+      <w:numFmt w:val="bullet"/>
+      <w:lvlText w:val=""/>
+      <w:lvlJc w:val="left"/>
+      <w:pPr>
+        <w:ind w:left="6480" w:hanging="360"/>
+      </w:pPr>
+      <w:rPr>
+        <w:rFonts w:hint="default" w:ascii="Wingdings" w:hAnsi="Wingdings"/>
+      </w:rPr>
+    </w:lvl>
+  </w:abstractNum>
+  <w:abstractNum xmlns:w="http://schemas.openxmlformats.org/wordprocessingml/2006/main" w:abstractNumId="7">
+    <w:nsid w:val="11ca1a29"/>
+    <w:multiLevelType xmlns:w="http://schemas.openxmlformats.org/wordprocessingml/2006/main" w:val="hybridMultilevel"/>
+    <w:lvl xmlns:w="http://schemas.openxmlformats.org/wordprocessingml/2006/main" w:ilvl="0">
+      <w:start w:val="1"/>
+      <w:numFmt w:val="decimal"/>
+      <w:lvlText w:val="%1."/>
+      <w:lvlJc w:val="left"/>
+      <w:pPr>
+        <w:ind w:left="720" w:hanging="360"/>
+      </w:pPr>
+    </w:lvl>
+    <w:lvl xmlns:w="http://schemas.openxmlformats.org/wordprocessingml/2006/main" w:ilvl="1">
+      <w:start w:val="1"/>
+      <w:numFmt w:val="lowerLetter"/>
+      <w:lvlText w:val="%2."/>
+      <w:lvlJc w:val="left"/>
+      <w:pPr>
+        <w:ind w:left="1440" w:hanging="360"/>
+      </w:pPr>
+    </w:lvl>
+    <w:lvl xmlns:w="http://schemas.openxmlformats.org/wordprocessingml/2006/main" w:ilvl="2">
+      <w:start w:val="1"/>
+      <w:numFmt w:val="lowerRoman"/>
+      <w:lvlText w:val="%3."/>
+      <w:lvlJc w:val="right"/>
+      <w:pPr>
+        <w:ind w:left="2160" w:hanging="180"/>
+      </w:pPr>
+    </w:lvl>
+    <w:lvl xmlns:w="http://schemas.openxmlformats.org/wordprocessingml/2006/main" w:ilvl="3">
+      <w:start w:val="1"/>
+      <w:numFmt w:val="decimal"/>
+      <w:lvlText w:val="%4."/>
+      <w:lvlJc w:val="left"/>
+      <w:pPr>
+        <w:ind w:left="2880" w:hanging="360"/>
+      </w:pPr>
+    </w:lvl>
+    <w:lvl xmlns:w="http://schemas.openxmlformats.org/wordprocessingml/2006/main" w:ilvl="4">
+      <w:start w:val="1"/>
+      <w:numFmt w:val="lowerLetter"/>
+      <w:lvlText w:val="%5."/>
+      <w:lvlJc w:val="left"/>
+      <w:pPr>
+        <w:ind w:left="3600" w:hanging="360"/>
+      </w:pPr>
+    </w:lvl>
+    <w:lvl xmlns:w="http://schemas.openxmlformats.org/wordprocessingml/2006/main" w:ilvl="5">
+      <w:start w:val="1"/>
+      <w:numFmt w:val="lowerRoman"/>
+      <w:lvlText w:val="%6."/>
+      <w:lvlJc w:val="right"/>
+      <w:pPr>
+        <w:ind w:left="4320" w:hanging="180"/>
+      </w:pPr>
+    </w:lvl>
+    <w:lvl xmlns:w="http://schemas.openxmlformats.org/wordprocessingml/2006/main" w:ilvl="6">
+      <w:start w:val="1"/>
+      <w:numFmt w:val="decimal"/>
+      <w:lvlText w:val="%7."/>
+      <w:lvlJc w:val="left"/>
+      <w:pPr>
+        <w:ind w:left="5040" w:hanging="360"/>
+      </w:pPr>
+    </w:lvl>
+    <w:lvl xmlns:w="http://schemas.openxmlformats.org/wordprocessingml/2006/main" w:ilvl="7">
+      <w:start w:val="1"/>
+      <w:numFmt w:val="lowerLetter"/>
+      <w:lvlText w:val="%8."/>
+      <w:lvlJc w:val="left"/>
+      <w:pPr>
+        <w:ind w:left="5760" w:hanging="360"/>
+      </w:pPr>
+    </w:lvl>
+    <w:lvl xmlns:w="http://schemas.openxmlformats.org/wordprocessingml/2006/main" w:ilvl="8">
+      <w:start w:val="1"/>
+      <w:numFmt w:val="lowerRoman"/>
+      <w:lvlText w:val="%9."/>
+      <w:lvlJc w:val="right"/>
+      <w:pPr>
+        <w:ind w:left="6480" w:hanging="180"/>
+      </w:pPr>
+    </w:lvl>
+  </w:abstractNum>
+  <w:abstractNum xmlns:w="http://schemas.openxmlformats.org/wordprocessingml/2006/main" w:abstractNumId="6">
+    <w:nsid w:val="7f2f9616"/>
+    <w:multiLevelType xmlns:w="http://schemas.openxmlformats.org/wordprocessingml/2006/main" w:val="hybridMultilevel"/>
+    <w:lvl xmlns:w="http://schemas.openxmlformats.org/wordprocessingml/2006/main" w:ilvl="0">
+      <w:start w:val="1"/>
+      <w:numFmt w:val="bullet"/>
+      <w:lvlText w:val=""/>
+      <w:lvlJc w:val="left"/>
+      <w:pPr>
+        <w:ind w:left="720" w:hanging="360"/>
+      </w:pPr>
+      <w:rPr>
+        <w:rFonts w:hint="default" w:ascii="Symbol" w:hAnsi="Symbol"/>
+      </w:rPr>
+    </w:lvl>
+    <w:lvl xmlns:w="http://schemas.openxmlformats.org/wordprocessingml/2006/main" w:ilvl="1">
+      <w:start w:val="1"/>
+      <w:numFmt w:val="bullet"/>
+      <w:lvlText w:val="o"/>
+      <w:lvlJc w:val="left"/>
+      <w:pPr>
+        <w:ind w:left="1440" w:hanging="360"/>
+      </w:pPr>
+      <w:rPr>
+        <w:rFonts w:hint="default" w:ascii="Courier New" w:hAnsi="Courier New"/>
+      </w:rPr>
+    </w:lvl>
+    <w:lvl xmlns:w="http://schemas.openxmlformats.org/wordprocessingml/2006/main" w:ilvl="2">
+      <w:start w:val="1"/>
+      <w:numFmt w:val="bullet"/>
+      <w:lvlText w:val=""/>
+      <w:lvlJc w:val="left"/>
+      <w:pPr>
+        <w:ind w:left="2160" w:hanging="360"/>
+      </w:pPr>
+      <w:rPr>
+        <w:rFonts w:hint="default" w:ascii="Wingdings" w:hAnsi="Wingdings"/>
+      </w:rPr>
+    </w:lvl>
+    <w:lvl xmlns:w="http://schemas.openxmlformats.org/wordprocessingml/2006/main" w:ilvl="3">
+      <w:start w:val="1"/>
+      <w:numFmt w:val="bullet"/>
+      <w:lvlText w:val=""/>
+      <w:lvlJc w:val="left"/>
+      <w:pPr>
+        <w:ind w:left="2880" w:hanging="360"/>
+      </w:pPr>
+      <w:rPr>
+        <w:rFonts w:hint="default" w:ascii="Symbol" w:hAnsi="Symbol"/>
+      </w:rPr>
+    </w:lvl>
+    <w:lvl xmlns:w="http://schemas.openxmlformats.org/wordprocessingml/2006/main" w:ilvl="4">
+      <w:start w:val="1"/>
+      <w:numFmt w:val="bullet"/>
+      <w:lvlText w:val="o"/>
+      <w:lvlJc w:val="left"/>
+      <w:pPr>
+        <w:ind w:left="3600" w:hanging="360"/>
+      </w:pPr>
+      <w:rPr>
+        <w:rFonts w:hint="default" w:ascii="Courier New" w:hAnsi="Courier New"/>
+      </w:rPr>
+    </w:lvl>
+    <w:lvl xmlns:w="http://schemas.openxmlformats.org/wordprocessingml/2006/main" w:ilvl="5">
+      <w:start w:val="1"/>
+      <w:numFmt w:val="bullet"/>
+      <w:lvlText w:val=""/>
+      <w:lvlJc w:val="left"/>
+      <w:pPr>
+        <w:ind w:left="4320" w:hanging="360"/>
+      </w:pPr>
+      <w:rPr>
+        <w:rFonts w:hint="default" w:ascii="Wingdings" w:hAnsi="Wingdings"/>
+      </w:rPr>
+    </w:lvl>
+    <w:lvl xmlns:w="http://schemas.openxmlformats.org/wordprocessingml/2006/main" w:ilvl="6">
+      <w:start w:val="1"/>
+      <w:numFmt w:val="bullet"/>
+      <w:lvlText w:val=""/>
+      <w:lvlJc w:val="left"/>
+      <w:pPr>
+        <w:ind w:left="5040" w:hanging="360"/>
+      </w:pPr>
+      <w:rPr>
+        <w:rFonts w:hint="default" w:ascii="Symbol" w:hAnsi="Symbol"/>
+      </w:rPr>
+    </w:lvl>
+    <w:lvl xmlns:w="http://schemas.openxmlformats.org/wordprocessingml/2006/main" w:ilvl="7">
+      <w:start w:val="1"/>
+      <w:numFmt w:val="bullet"/>
+      <w:lvlText w:val="o"/>
+      <w:lvlJc w:val="left"/>
+      <w:pPr>
+        <w:ind w:left="5760" w:hanging="360"/>
+      </w:pPr>
+      <w:rPr>
+        <w:rFonts w:hint="default" w:ascii="Courier New" w:hAnsi="Courier New"/>
+      </w:rPr>
+    </w:lvl>
+    <w:lvl xmlns:w="http://schemas.openxmlformats.org/wordprocessingml/2006/main" w:ilvl="8">
+      <w:start w:val="1"/>
+      <w:numFmt w:val="bullet"/>
+      <w:lvlText w:val=""/>
+      <w:lvlJc w:val="left"/>
+      <w:pPr>
+        <w:ind w:left="6480" w:hanging="360"/>
+      </w:pPr>
+      <w:rPr>
+        <w:rFonts w:hint="default" w:ascii="Wingdings" w:hAnsi="Wingdings"/>
+      </w:rPr>
+    </w:lvl>
+  </w:abstractNum>
+  <w:abstractNum xmlns:w="http://schemas.openxmlformats.org/wordprocessingml/2006/main" w:abstractNumId="5">
+    <w:nsid w:val="60bfbf27"/>
+    <w:multiLevelType xmlns:w="http://schemas.openxmlformats.org/wordprocessingml/2006/main" w:val="hybridMultilevel"/>
+    <w:lvl xmlns:w="http://schemas.openxmlformats.org/wordprocessingml/2006/main" w:ilvl="0">
+      <w:start w:val="1"/>
+      <w:numFmt w:val="bullet"/>
+      <w:lvlText w:val=""/>
+      <w:lvlJc w:val="left"/>
+      <w:pPr>
+        <w:ind w:left="720" w:hanging="360"/>
+      </w:pPr>
+      <w:rPr>
+        <w:rFonts w:hint="default" w:ascii="Symbol" w:hAnsi="Symbol"/>
+      </w:rPr>
+    </w:lvl>
+    <w:lvl xmlns:w="http://schemas.openxmlformats.org/wordprocessingml/2006/main" w:ilvl="1">
+      <w:start w:val="1"/>
+      <w:numFmt w:val="bullet"/>
+      <w:lvlText w:val="o"/>
+      <w:lvlJc w:val="left"/>
+      <w:pPr>
+        <w:ind w:left="1440" w:hanging="360"/>
+      </w:pPr>
+      <w:rPr>
+        <w:rFonts w:hint="default" w:ascii="Courier New" w:hAnsi="Courier New"/>
+      </w:rPr>
+    </w:lvl>
+    <w:lvl xmlns:w="http://schemas.openxmlformats.org/wordprocessingml/2006/main" w:ilvl="2">
+      <w:start w:val="1"/>
+      <w:numFmt w:val="bullet"/>
+      <w:lvlText w:val=""/>
+      <w:lvlJc w:val="left"/>
+      <w:pPr>
+        <w:ind w:left="2160" w:hanging="360"/>
+      </w:pPr>
+      <w:rPr>
+        <w:rFonts w:hint="default" w:ascii="Wingdings" w:hAnsi="Wingdings"/>
+      </w:rPr>
+    </w:lvl>
+    <w:lvl xmlns:w="http://schemas.openxmlformats.org/wordprocessingml/2006/main" w:ilvl="3">
+      <w:start w:val="1"/>
+      <w:numFmt w:val="bullet"/>
+      <w:lvlText w:val=""/>
+      <w:lvlJc w:val="left"/>
+      <w:pPr>
+        <w:ind w:left="2880" w:hanging="360"/>
+      </w:pPr>
+      <w:rPr>
+        <w:rFonts w:hint="default" w:ascii="Symbol" w:hAnsi="Symbol"/>
+      </w:rPr>
+    </w:lvl>
+    <w:lvl xmlns:w="http://schemas.openxmlformats.org/wordprocessingml/2006/main" w:ilvl="4">
+      <w:start w:val="1"/>
+      <w:numFmt w:val="bullet"/>
+      <w:lvlText w:val="o"/>
+      <w:lvlJc w:val="left"/>
+      <w:pPr>
+        <w:ind w:left="3600" w:hanging="360"/>
+      </w:pPr>
+      <w:rPr>
+        <w:rFonts w:hint="default" w:ascii="Courier New" w:hAnsi="Courier New"/>
+      </w:rPr>
+    </w:lvl>
+    <w:lvl xmlns:w="http://schemas.openxmlformats.org/wordprocessingml/2006/main" w:ilvl="5">
+      <w:start w:val="1"/>
+      <w:numFmt w:val="bullet"/>
+      <w:lvlText w:val=""/>
+      <w:lvlJc w:val="left"/>
+      <w:pPr>
+        <w:ind w:left="4320" w:hanging="360"/>
+      </w:pPr>
+      <w:rPr>
+        <w:rFonts w:hint="default" w:ascii="Wingdings" w:hAnsi="Wingdings"/>
+      </w:rPr>
+    </w:lvl>
+    <w:lvl xmlns:w="http://schemas.openxmlformats.org/wordprocessingml/2006/main" w:ilvl="6">
+      <w:start w:val="1"/>
+      <w:numFmt w:val="bullet"/>
+      <w:lvlText w:val=""/>
+      <w:lvlJc w:val="left"/>
+      <w:pPr>
+        <w:ind w:left="5040" w:hanging="360"/>
+      </w:pPr>
+      <w:rPr>
+        <w:rFonts w:hint="default" w:ascii="Symbol" w:hAnsi="Symbol"/>
+      </w:rPr>
+    </w:lvl>
+    <w:lvl xmlns:w="http://schemas.openxmlformats.org/wordprocessingml/2006/main" w:ilvl="7">
+      <w:start w:val="1"/>
+      <w:numFmt w:val="bullet"/>
+      <w:lvlText w:val="o"/>
+      <w:lvlJc w:val="left"/>
+      <w:pPr>
+        <w:ind w:left="5760" w:hanging="360"/>
+      </w:pPr>
+      <w:rPr>
+        <w:rFonts w:hint="default" w:ascii="Courier New" w:hAnsi="Courier New"/>
+      </w:rPr>
+    </w:lvl>
+    <w:lvl xmlns:w="http://schemas.openxmlformats.org/wordprocessingml/2006/main" w:ilvl="8">
+      <w:start w:val="1"/>
+      <w:numFmt w:val="bullet"/>
+      <w:lvlText w:val=""/>
+      <w:lvlJc w:val="left"/>
+      <w:pPr>
+        <w:ind w:left="6480" w:hanging="360"/>
+      </w:pPr>
+      <w:rPr>
+        <w:rFonts w:hint="default" w:ascii="Wingdings" w:hAnsi="Wingdings"/>
+      </w:rPr>
+    </w:lvl>
+  </w:abstractNum>
+  <w:abstractNum xmlns:w="http://schemas.openxmlformats.org/wordprocessingml/2006/main" w:abstractNumId="4">
+    <w:nsid w:val="3b4878a"/>
+    <w:multiLevelType xmlns:w="http://schemas.openxmlformats.org/wordprocessingml/2006/main" w:val="hybridMultilevel"/>
+    <w:lvl xmlns:w="http://schemas.openxmlformats.org/wordprocessingml/2006/main" w:ilvl="0">
+      <w:start w:val="1"/>
+      <w:numFmt w:val="bullet"/>
+      <w:lvlText w:val=""/>
+      <w:lvlJc w:val="left"/>
+      <w:pPr>
+        <w:ind w:left="720" w:hanging="360"/>
+      </w:pPr>
+      <w:rPr>
+        <w:rFonts w:hint="default" w:ascii="Symbol" w:hAnsi="Symbol"/>
+      </w:rPr>
+    </w:lvl>
+    <w:lvl xmlns:w="http://schemas.openxmlformats.org/wordprocessingml/2006/main" w:ilvl="1">
+      <w:start w:val="1"/>
+      <w:numFmt w:val="bullet"/>
+      <w:lvlText w:val="o"/>
+      <w:lvlJc w:val="left"/>
+      <w:pPr>
+        <w:ind w:left="1440" w:hanging="360"/>
+      </w:pPr>
+      <w:rPr>
+        <w:rFonts w:hint="default" w:ascii="Courier New" w:hAnsi="Courier New"/>
+      </w:rPr>
+    </w:lvl>
+    <w:lvl xmlns:w="http://schemas.openxmlformats.org/wordprocessingml/2006/main" w:ilvl="2">
+      <w:start w:val="1"/>
+      <w:numFmt w:val="bullet"/>
+      <w:lvlText w:val=""/>
+      <w:lvlJc w:val="left"/>
+      <w:pPr>
+        <w:ind w:left="2160" w:hanging="360"/>
+      </w:pPr>
+      <w:rPr>
+        <w:rFonts w:hint="default" w:ascii="Wingdings" w:hAnsi="Wingdings"/>
+      </w:rPr>
+    </w:lvl>
+    <w:lvl xmlns:w="http://schemas.openxmlformats.org/wordprocessingml/2006/main" w:ilvl="3">
+      <w:start w:val="1"/>
+      <w:numFmt w:val="bullet"/>
+      <w:lvlText w:val=""/>
+      <w:lvlJc w:val="left"/>
+      <w:pPr>
+        <w:ind w:left="2880" w:hanging="360"/>
+      </w:pPr>
+      <w:rPr>
+        <w:rFonts w:hint="default" w:ascii="Symbol" w:hAnsi="Symbol"/>
+      </w:rPr>
+    </w:lvl>
+    <w:lvl xmlns:w="http://schemas.openxmlformats.org/wordprocessingml/2006/main" w:ilvl="4">
+      <w:start w:val="1"/>
+      <w:numFmt w:val="bullet"/>
+      <w:lvlText w:val="o"/>
+      <w:lvlJc w:val="left"/>
+      <w:pPr>
+        <w:ind w:left="3600" w:hanging="360"/>
+      </w:pPr>
+      <w:rPr>
+        <w:rFonts w:hint="default" w:ascii="Courier New" w:hAnsi="Courier New"/>
+      </w:rPr>
+    </w:lvl>
+    <w:lvl xmlns:w="http://schemas.openxmlformats.org/wordprocessingml/2006/main" w:ilvl="5">
+      <w:start w:val="1"/>
+      <w:numFmt w:val="bullet"/>
+      <w:lvlText w:val=""/>
+      <w:lvlJc w:val="left"/>
+      <w:pPr>
+        <w:ind w:left="4320" w:hanging="360"/>
+      </w:pPr>
+      <w:rPr>
+        <w:rFonts w:hint="default" w:ascii="Wingdings" w:hAnsi="Wingdings"/>
+      </w:rPr>
+    </w:lvl>
+    <w:lvl xmlns:w="http://schemas.openxmlformats.org/wordprocessingml/2006/main" w:ilvl="6">
+      <w:start w:val="1"/>
+      <w:numFmt w:val="bullet"/>
+      <w:lvlText w:val=""/>
+      <w:lvlJc w:val="left"/>
+      <w:pPr>
+        <w:ind w:left="5040" w:hanging="360"/>
+      </w:pPr>
+      <w:rPr>
+        <w:rFonts w:hint="default" w:ascii="Symbol" w:hAnsi="Symbol"/>
+      </w:rPr>
+    </w:lvl>
+    <w:lvl xmlns:w="http://schemas.openxmlformats.org/wordprocessingml/2006/main" w:ilvl="7">
+      <w:start w:val="1"/>
+      <w:numFmt w:val="bullet"/>
+      <w:lvlText w:val="o"/>
+      <w:lvlJc w:val="left"/>
+      <w:pPr>
+        <w:ind w:left="5760" w:hanging="360"/>
+      </w:pPr>
+      <w:rPr>
+        <w:rFonts w:hint="default" w:ascii="Courier New" w:hAnsi="Courier New"/>
+      </w:rPr>
+    </w:lvl>
+    <w:lvl xmlns:w="http://schemas.openxmlformats.org/wordprocessingml/2006/main" w:ilvl="8">
+      <w:start w:val="1"/>
+      <w:numFmt w:val="bullet"/>
+      <w:lvlText w:val=""/>
+      <w:lvlJc w:val="left"/>
+      <w:pPr>
+        <w:ind w:left="6480" w:hanging="360"/>
+      </w:pPr>
+      <w:rPr>
+        <w:rFonts w:hint="default" w:ascii="Wingdings" w:hAnsi="Wingdings"/>
+      </w:rPr>
+    </w:lvl>
+  </w:abstractNum>
   <w:abstractNum xmlns:w="http://schemas.openxmlformats.org/wordprocessingml/2006/main" w:abstractNumId="3">
     <w:nsid w:val="6a808d59"/>
     <w:multiLevelType xmlns:w="http://schemas.openxmlformats.org/wordprocessingml/2006/main" w:val="hybridMultilevel"/>
@@ -1513,6 +3958,24 @@
       </w:rPr>
     </w:lvl>
   </w:abstractNum>
+  <w:num w:numId="9">
+    <w:abstractNumId w:val="9"/>
+  </w:num>
+  <w:num w:numId="8">
+    <w:abstractNumId w:val="8"/>
+  </w:num>
+  <w:num w:numId="7">
+    <w:abstractNumId w:val="7"/>
+  </w:num>
+  <w:num w:numId="6">
+    <w:abstractNumId w:val="6"/>
+  </w:num>
+  <w:num w:numId="5">
+    <w:abstractNumId w:val="5"/>
+  </w:num>
+  <w:num w:numId="4">
+    <w:abstractNumId w:val="4"/>
+  </w:num>
   <w:num w:numId="3">
     <w:abstractNumId w:val="3"/>
   </w:num>
@@ -1951,7 +4414,7 @@
     <w:name w:val="List Paragraph"/>
     <w:basedOn w:val="Normal"/>
     <w:qFormat/>
-    <w:rsid w:val="1764A74A"/>
+    <w:rsid w:val="768BF6EB"/>
     <w:pPr>
       <w:spacing/>
       <w:ind w:left="720"/>
@@ -1965,7 +4428,7 @@
     <w:next w:val="Normal"/>
     <w:unhideWhenUsed/>
     <w:qFormat/>
-    <w:rsid w:val="1764A74A"/>
+    <w:rsid w:val="768BF6EB"/>
     <w:rPr>
       <w:rFonts w:ascii="Aptos Display" w:hAnsi="Aptos Display" w:eastAsia="" w:cs="" w:asciiTheme="majorAscii" w:hAnsiTheme="majorAscii" w:eastAsiaTheme="majorEastAsia" w:cstheme="majorBidi"/>
       <w:color w:val="0F4761" w:themeColor="accent1" w:themeTint="FF" w:themeShade="BF"/>
@@ -1986,7 +4449,7 @@
     <w:next w:val="Normal"/>
     <w:unhideWhenUsed/>
     <w:qFormat/>
-    <w:rsid w:val="1764A74A"/>
+    <w:rsid w:val="768BF6EB"/>
     <w:rPr>
       <w:rFonts w:eastAsia="" w:cs="" w:eastAsiaTheme="majorEastAsia" w:cstheme="majorBidi"/>
       <w:color w:val="0F4761" w:themeColor="accent1" w:themeTint="FF" w:themeShade="BF"/>
@@ -2005,7 +4468,7 @@
     <w:name w:val="Hyperlink"/>
     <w:basedOn w:val="DefaultParagraphFont"/>
     <w:unhideWhenUsed/>
-    <w:rsid w:val="1764A74A"/>
+    <w:rsid w:val="768BF6EB"/>
     <w:rPr>
       <w:color w:val="467886"/>
       <w:u w:val="single"/>

</xml_diff>

<commit_message>
Implement web routing patterns covering direct closures and controller actions
</commit_message>
<xml_diff>
--- a/Laravel notes.docx
+++ b/Laravel notes.docx
@@ -923,7 +923,7 @@
           <w:color w:val="FF0000"/>
         </w:rPr>
       </w:pPr>
-      <w:hyperlink r:id="Rcc5b0481114248d8">
+      <w:hyperlink r:id="R64ce6a52523f4dd8">
         <w:r>
           <w:rPr>
             <w:rStyle w:val="Hyperlink"/>
@@ -1678,7 +1678,7 @@
         <w:shd w:val="clear" w:color="auto" w:fill="FFFFFF" w:themeFill="background1"/>
         <w:spacing w:before="600" w:beforeAutospacing="off" w:after="225" w:afterAutospacing="off"/>
       </w:pPr>
-      <w:hyperlink r:id="R98471b1df7e64c2e">
+      <w:hyperlink r:id="Raa2f46b223054e4e">
         <w:r>
           <w:rPr>
             <w:rStyle w:val="Hyperlink"/>
@@ -2793,6 +2793,8 @@
         <w:pStyle w:val="Normal"/>
         <w:spacing w:before="240" w:beforeAutospacing="off" w:after="240" w:afterAutospacing="off"/>
         <w:ind w:left="0"/>
+      </w:pPr>
+      <w:r>
         <w:rPr>
           <w:rFonts w:ascii="Calibri" w:hAnsi="Calibri" w:eastAsia="Calibri" w:cs="Calibri"/>
           <w:b w:val="1"/>
@@ -2803,7 +2805,8 @@
           <w:szCs w:val="24"/>
           <w:lang w:val="en-GB"/>
         </w:rPr>
-      </w:pPr>
+        <w:t xml:space="preserve">// </w:t>
+      </w:r>
       <w:r>
         <w:rPr>
           <w:rFonts w:ascii="Calibri" w:hAnsi="Calibri" w:eastAsia="Calibri" w:cs="Calibri"/>
@@ -2815,7 +2818,7 @@
           <w:szCs w:val="24"/>
           <w:lang w:val="en-GB"/>
         </w:rPr>
-        <w:t xml:space="preserve">// </w:t>
+        <w:t xml:space="preserve">in </w:t>
       </w:r>
       <w:r>
         <w:rPr>
@@ -2828,7 +2831,7 @@
           <w:szCs w:val="24"/>
           <w:lang w:val="en-GB"/>
         </w:rPr>
-        <w:t xml:space="preserve">in </w:t>
+        <w:t>laravel</w:t>
       </w:r>
       <w:r>
         <w:rPr>
@@ -2841,7 +2844,7 @@
           <w:szCs w:val="24"/>
           <w:lang w:val="en-GB"/>
         </w:rPr>
-        <w:t>laravel</w:t>
+        <w:t xml:space="preserve"> </w:t>
       </w:r>
       <w:r>
         <w:rPr>
@@ -2854,9 +2857,540 @@
           <w:szCs w:val="24"/>
           <w:lang w:val="en-GB"/>
         </w:rPr>
+        <w:t xml:space="preserve">u can find queue in </w:t>
+      </w:r>
+      <w:r>
+        <w:rPr>
+          <w:rFonts w:ascii="Calibri" w:hAnsi="Calibri" w:eastAsia="Calibri" w:cs="Calibri"/>
+          <w:b w:val="1"/>
+          <w:bCs w:val="1"/>
+          <w:noProof w:val="0"/>
+          <w:color w:val="808080" w:themeColor="background1" w:themeTint="FF" w:themeShade="80"/>
+          <w:sz w:val="24"/>
+          <w:szCs w:val="24"/>
+          <w:lang w:val="en-GB"/>
+        </w:rPr>
+        <w:t>confi</w:t>
+      </w:r>
+      <w:r>
+        <w:rPr>
+          <w:rFonts w:ascii="Calibri" w:hAnsi="Calibri" w:eastAsia="Calibri" w:cs="Calibri"/>
+          <w:b w:val="1"/>
+          <w:bCs w:val="1"/>
+          <w:noProof w:val="0"/>
+          <w:color w:val="808080" w:themeColor="background1" w:themeTint="FF" w:themeShade="80"/>
+          <w:sz w:val="24"/>
+          <w:szCs w:val="24"/>
+          <w:lang w:val="en-GB"/>
+        </w:rPr>
+        <w:t>g</w:t>
+      </w:r>
+      <w:r>
+        <w:rPr>
+          <w:rFonts w:ascii="Calibri" w:hAnsi="Calibri" w:eastAsia="Calibri" w:cs="Calibri"/>
+          <w:b w:val="1"/>
+          <w:bCs w:val="1"/>
+          <w:noProof w:val="0"/>
+          <w:color w:val="808080" w:themeColor="background1" w:themeTint="FF" w:themeShade="80"/>
+          <w:sz w:val="24"/>
+          <w:szCs w:val="24"/>
+          <w:lang w:val="en-GB"/>
+        </w:rPr>
+        <w:t>\</w:t>
+      </w:r>
+      <w:r>
+        <w:rPr>
+          <w:rFonts w:ascii="Calibri" w:hAnsi="Calibri" w:eastAsia="Calibri" w:cs="Calibri"/>
+          <w:b w:val="1"/>
+          <w:bCs w:val="1"/>
+          <w:noProof w:val="0"/>
+          <w:color w:val="808080" w:themeColor="background1" w:themeTint="FF" w:themeShade="80"/>
+          <w:sz w:val="24"/>
+          <w:szCs w:val="24"/>
+          <w:lang w:val="en-GB"/>
+        </w:rPr>
+        <w:t>queue.php</w:t>
+      </w:r>
+    </w:p>
+    <w:p>
+      <w:pPr>
+        <w:pStyle w:val="Normal"/>
+        <w:spacing w:before="240" w:beforeAutospacing="off" w:after="240" w:afterAutospacing="off"/>
+        <w:ind w:left="0"/>
+        <w:rPr>
+          <w:rFonts w:ascii="Calibri" w:hAnsi="Calibri" w:eastAsia="Calibri" w:cs="Calibri"/>
+          <w:b w:val="1"/>
+          <w:bCs w:val="1"/>
+          <w:noProof w:val="0"/>
+          <w:color w:val="808080" w:themeColor="background1" w:themeTint="FF" w:themeShade="80"/>
+          <w:sz w:val="24"/>
+          <w:szCs w:val="24"/>
+          <w:lang w:val="en-GB"/>
+        </w:rPr>
+      </w:pPr>
+    </w:p>
+    <w:p>
+      <w:pPr>
+        <w:pStyle w:val="Normal"/>
+        <w:spacing w:before="240" w:beforeAutospacing="off" w:after="240" w:afterAutospacing="off"/>
+        <w:ind w:left="0"/>
+        <w:rPr>
+          <w:rFonts w:ascii="Calibri" w:hAnsi="Calibri" w:eastAsia="Calibri" w:cs="Calibri"/>
+          <w:b w:val="1"/>
+          <w:bCs w:val="1"/>
+          <w:noProof w:val="0"/>
+          <w:color w:val="808080" w:themeColor="background1" w:themeTint="FF" w:themeShade="80"/>
+          <w:sz w:val="32"/>
+          <w:szCs w:val="32"/>
+          <w:lang w:val="en-GB"/>
+        </w:rPr>
+      </w:pPr>
+      <w:r>
+        <w:rPr>
+          <w:rFonts w:ascii="Calibri" w:hAnsi="Calibri" w:eastAsia="Calibri" w:cs="Calibri"/>
+          <w:b w:val="1"/>
+          <w:bCs w:val="1"/>
+          <w:i w:val="1"/>
+          <w:iCs w:val="1"/>
+          <w:noProof w:val="0"/>
+          <w:color w:val="FF0000"/>
+          <w:sz w:val="32"/>
+          <w:szCs w:val="32"/>
+          <w:u w:val="single"/>
+          <w:lang w:val="en-GB"/>
+        </w:rPr>
+        <w:t>Pol</w:t>
+      </w:r>
+      <w:r>
+        <w:rPr>
+          <w:rFonts w:ascii="Calibri" w:hAnsi="Calibri" w:eastAsia="Calibri" w:cs="Calibri"/>
+          <w:b w:val="1"/>
+          <w:bCs w:val="1"/>
+          <w:i w:val="1"/>
+          <w:iCs w:val="1"/>
+          <w:noProof w:val="0"/>
+          <w:color w:val="FF0000"/>
+          <w:sz w:val="32"/>
+          <w:szCs w:val="32"/>
+          <w:u w:val="single"/>
+          <w:lang w:val="en-GB"/>
+        </w:rPr>
+        <w:t>iciy</w:t>
+      </w:r>
+      <w:r>
+        <w:rPr>
+          <w:rFonts w:ascii="Calibri" w:hAnsi="Calibri" w:eastAsia="Calibri" w:cs="Calibri"/>
+          <w:b w:val="1"/>
+          <w:bCs w:val="1"/>
+          <w:i w:val="1"/>
+          <w:iCs w:val="1"/>
+          <w:noProof w:val="0"/>
+          <w:color w:val="FF0000"/>
+          <w:sz w:val="32"/>
+          <w:szCs w:val="32"/>
+          <w:u w:val="single"/>
+          <w:lang w:val="en-GB"/>
+        </w:rPr>
+        <w:t xml:space="preserve"> vs Rules directory:</w:t>
+      </w:r>
+      <w:r>
+        <w:rPr>
+          <w:rFonts w:ascii="Calibri" w:hAnsi="Calibri" w:eastAsia="Calibri" w:cs="Calibri"/>
+          <w:b w:val="1"/>
+          <w:bCs w:val="1"/>
+          <w:noProof w:val="0"/>
+          <w:color w:val="808080" w:themeColor="background1" w:themeTint="FF" w:themeShade="80"/>
+          <w:sz w:val="32"/>
+          <w:szCs w:val="32"/>
+          <w:lang w:val="en-GB"/>
+        </w:rPr>
         <w:t xml:space="preserve"> </w:t>
       </w:r>
-      <w:r>
+    </w:p>
+    <w:p>
+      <w:pPr>
+        <w:pStyle w:val="ListParagraph"/>
+        <w:numPr>
+          <w:ilvl w:val="0"/>
+          <w:numId w:val="1"/>
+        </w:numPr>
+        <w:spacing w:before="240" w:beforeAutospacing="off" w:after="240" w:afterAutospacing="off"/>
+        <w:rPr>
+          <w:rFonts w:ascii="Calibri" w:hAnsi="Calibri" w:eastAsia="Calibri" w:cs="Calibri"/>
+          <w:noProof w:val="0"/>
+          <w:sz w:val="24"/>
+          <w:szCs w:val="24"/>
+          <w:lang w:val="en-GB"/>
+        </w:rPr>
+      </w:pPr>
+      <w:r>
+        <w:rPr>
+          <w:rFonts w:ascii="Consolas" w:hAnsi="Consolas" w:eastAsia="Consolas" w:cs="Consolas"/>
+          <w:b w:val="1"/>
+          <w:bCs w:val="1"/>
+          <w:noProof w:val="0"/>
+          <w:sz w:val="24"/>
+          <w:szCs w:val="24"/>
+          <w:lang w:val="en-GB"/>
+        </w:rPr>
+        <w:t>Policies</w:t>
+      </w:r>
+      <w:r>
+        <w:rPr>
+          <w:rFonts w:ascii="Calibri" w:hAnsi="Calibri" w:eastAsia="Calibri" w:cs="Calibri"/>
+          <w:b w:val="1"/>
+          <w:bCs w:val="1"/>
+          <w:noProof w:val="0"/>
+          <w:sz w:val="24"/>
+          <w:szCs w:val="24"/>
+          <w:lang w:val="en-GB"/>
+        </w:rPr>
+        <w:t xml:space="preserve"> directory</w:t>
+      </w:r>
+      <w:r>
+        <w:rPr>
+          <w:rFonts w:ascii="Calibri" w:hAnsi="Calibri" w:eastAsia="Calibri" w:cs="Calibri"/>
+          <w:noProof w:val="0"/>
+          <w:sz w:val="24"/>
+          <w:szCs w:val="24"/>
+          <w:lang w:val="en-GB"/>
+        </w:rPr>
+        <w:t xml:space="preserve"> → </w:t>
+      </w:r>
+      <w:r>
+        <w:rPr>
+          <w:rFonts w:ascii="Calibri" w:hAnsi="Calibri" w:eastAsia="Calibri" w:cs="Calibri"/>
+          <w:b w:val="1"/>
+          <w:bCs w:val="1"/>
+          <w:noProof w:val="0"/>
+          <w:sz w:val="24"/>
+          <w:szCs w:val="24"/>
+          <w:lang w:val="en-GB"/>
+        </w:rPr>
+        <w:t>authorization</w:t>
+      </w:r>
+      <w:r>
+        <w:rPr>
+          <w:rFonts w:ascii="Calibri" w:hAnsi="Calibri" w:eastAsia="Calibri" w:cs="Calibri"/>
+          <w:noProof w:val="0"/>
+          <w:sz w:val="24"/>
+          <w:szCs w:val="24"/>
+          <w:lang w:val="en-GB"/>
+        </w:rPr>
+        <w:t xml:space="preserve"> (who is allowed to do what).</w:t>
+      </w:r>
+    </w:p>
+    <w:p>
+      <w:pPr>
+        <w:pStyle w:val="ListParagraph"/>
+        <w:numPr>
+          <w:ilvl w:val="0"/>
+          <w:numId w:val="1"/>
+        </w:numPr>
+        <w:spacing w:before="240" w:beforeAutospacing="off" w:after="240" w:afterAutospacing="off"/>
+        <w:rPr>
+          <w:rFonts w:ascii="Calibri" w:hAnsi="Calibri" w:eastAsia="Calibri" w:cs="Calibri"/>
+          <w:noProof w:val="0"/>
+          <w:sz w:val="24"/>
+          <w:szCs w:val="24"/>
+          <w:lang w:val="en-GB"/>
+        </w:rPr>
+      </w:pPr>
+      <w:r>
+        <w:rPr>
+          <w:rFonts w:ascii="Consolas" w:hAnsi="Consolas" w:eastAsia="Consolas" w:cs="Consolas"/>
+          <w:b w:val="1"/>
+          <w:bCs w:val="1"/>
+          <w:noProof w:val="0"/>
+          <w:sz w:val="24"/>
+          <w:szCs w:val="24"/>
+          <w:lang w:val="en-GB"/>
+        </w:rPr>
+        <w:t>Rules</w:t>
+      </w:r>
+      <w:r>
+        <w:rPr>
+          <w:rFonts w:ascii="Calibri" w:hAnsi="Calibri" w:eastAsia="Calibri" w:cs="Calibri"/>
+          <w:b w:val="1"/>
+          <w:bCs w:val="1"/>
+          <w:noProof w:val="0"/>
+          <w:sz w:val="24"/>
+          <w:szCs w:val="24"/>
+          <w:lang w:val="en-GB"/>
+        </w:rPr>
+        <w:t xml:space="preserve"> directory</w:t>
+      </w:r>
+      <w:r>
+        <w:rPr>
+          <w:rFonts w:ascii="Calibri" w:hAnsi="Calibri" w:eastAsia="Calibri" w:cs="Calibri"/>
+          <w:noProof w:val="0"/>
+          <w:sz w:val="24"/>
+          <w:szCs w:val="24"/>
+          <w:lang w:val="en-GB"/>
+        </w:rPr>
+        <w:t xml:space="preserve"> → </w:t>
+      </w:r>
+      <w:r>
+        <w:rPr>
+          <w:rFonts w:ascii="Calibri" w:hAnsi="Calibri" w:eastAsia="Calibri" w:cs="Calibri"/>
+          <w:b w:val="1"/>
+          <w:bCs w:val="1"/>
+          <w:noProof w:val="0"/>
+          <w:sz w:val="24"/>
+          <w:szCs w:val="24"/>
+          <w:lang w:val="en-GB"/>
+        </w:rPr>
+        <w:t>validation</w:t>
+      </w:r>
+      <w:r>
+        <w:rPr>
+          <w:rFonts w:ascii="Calibri" w:hAnsi="Calibri" w:eastAsia="Calibri" w:cs="Calibri"/>
+          <w:noProof w:val="0"/>
+          <w:sz w:val="24"/>
+          <w:szCs w:val="24"/>
+          <w:lang w:val="en-GB"/>
+        </w:rPr>
+        <w:t xml:space="preserve"> (whether input data is valid).</w:t>
+      </w:r>
+    </w:p>
+    <w:p>
+      <w:pPr>
+        <w:pStyle w:val="Normal"/>
+        <w:spacing w:before="240" w:beforeAutospacing="off" w:after="240" w:afterAutospacing="off"/>
+        <w:ind w:left="0"/>
+        <w:rPr>
+          <w:rFonts w:ascii="Calibri" w:hAnsi="Calibri" w:eastAsia="Calibri" w:cs="Calibri"/>
+          <w:b w:val="1"/>
+          <w:bCs w:val="1"/>
+          <w:i w:val="1"/>
+          <w:iCs w:val="1"/>
+          <w:noProof w:val="0"/>
+          <w:color w:val="FF0000"/>
+          <w:sz w:val="32"/>
+          <w:szCs w:val="32"/>
+          <w:u w:val="single"/>
+          <w:lang w:val="en-GB"/>
+        </w:rPr>
+      </w:pPr>
+      <w:r>
+        <w:rPr>
+          <w:rFonts w:ascii="Calibri" w:hAnsi="Calibri" w:eastAsia="Calibri" w:cs="Calibri"/>
+          <w:b w:val="1"/>
+          <w:bCs w:val="1"/>
+          <w:i w:val="1"/>
+          <w:iCs w:val="1"/>
+          <w:noProof w:val="0"/>
+          <w:color w:val="FF0000"/>
+          <w:sz w:val="32"/>
+          <w:szCs w:val="32"/>
+          <w:u w:val="single"/>
+          <w:lang w:val="en-GB"/>
+        </w:rPr>
+        <w:t>Starter Kit:</w:t>
+      </w:r>
+    </w:p>
+    <w:p>
+      <w:pPr>
+        <w:pStyle w:val="ListParagraph"/>
+        <w:numPr>
+          <w:ilvl w:val="0"/>
+          <w:numId w:val="1"/>
+        </w:numPr>
+        <w:spacing w:before="0" w:beforeAutospacing="off" w:after="0" w:afterAutospacing="off" w:line="300" w:lineRule="auto"/>
+        <w:rPr>
+          <w:rFonts w:ascii="Segoe UI" w:hAnsi="Segoe UI" w:eastAsia="Segoe UI" w:cs="Segoe UI"/>
+          <w:b w:val="0"/>
+          <w:bCs w:val="0"/>
+          <w:i w:val="0"/>
+          <w:iCs w:val="0"/>
+          <w:noProof w:val="0"/>
+          <w:sz w:val="21"/>
+          <w:szCs w:val="21"/>
+          <w:lang w:val="en-GB"/>
+        </w:rPr>
+      </w:pPr>
+      <w:r>
+        <w:rPr>
+          <w:rFonts w:ascii="Segoe UI" w:hAnsi="Segoe UI" w:eastAsia="Segoe UI" w:cs="Segoe UI"/>
+          <w:b w:val="1"/>
+          <w:bCs w:val="1"/>
+          <w:i w:val="0"/>
+          <w:iCs w:val="0"/>
+          <w:noProof w:val="0"/>
+          <w:sz w:val="21"/>
+          <w:szCs w:val="21"/>
+          <w:lang w:val="en-GB"/>
+        </w:rPr>
+        <w:t>Starter Kit</w:t>
+      </w:r>
+      <w:r>
+        <w:rPr>
+          <w:rFonts w:ascii="Segoe UI" w:hAnsi="Segoe UI" w:eastAsia="Segoe UI" w:cs="Segoe UI"/>
+          <w:b w:val="0"/>
+          <w:bCs w:val="0"/>
+          <w:i w:val="0"/>
+          <w:iCs w:val="0"/>
+          <w:noProof w:val="0"/>
+          <w:sz w:val="21"/>
+          <w:szCs w:val="21"/>
+          <w:lang w:val="en-GB"/>
+        </w:rPr>
+        <w:t xml:space="preserve"> = A category of pre-built project templates.</w:t>
+      </w:r>
+    </w:p>
+    <w:p>
+      <w:pPr>
+        <w:pStyle w:val="ListParagraph"/>
+        <w:numPr>
+          <w:ilvl w:val="0"/>
+          <w:numId w:val="1"/>
+        </w:numPr>
+        <w:spacing w:before="0" w:beforeAutospacing="off" w:after="0" w:afterAutospacing="off" w:line="300" w:lineRule="auto"/>
+        <w:rPr>
+          <w:rFonts w:ascii="Segoe UI" w:hAnsi="Segoe UI" w:eastAsia="Segoe UI" w:cs="Segoe UI"/>
+          <w:b w:val="0"/>
+          <w:bCs w:val="0"/>
+          <w:i w:val="0"/>
+          <w:iCs w:val="0"/>
+          <w:noProof w:val="0"/>
+          <w:sz w:val="21"/>
+          <w:szCs w:val="21"/>
+          <w:lang w:val="en-GB"/>
+        </w:rPr>
+      </w:pPr>
+      <w:r>
+        <w:rPr>
+          <w:rFonts w:ascii="Segoe UI" w:hAnsi="Segoe UI" w:eastAsia="Segoe UI" w:cs="Segoe UI"/>
+          <w:b w:val="1"/>
+          <w:bCs w:val="1"/>
+          <w:i w:val="0"/>
+          <w:iCs w:val="0"/>
+          <w:noProof w:val="0"/>
+          <w:sz w:val="21"/>
+          <w:szCs w:val="21"/>
+          <w:lang w:val="en-GB"/>
+        </w:rPr>
+        <w:t>Laravel Breeze</w:t>
+      </w:r>
+      <w:r>
+        <w:rPr>
+          <w:rFonts w:ascii="Segoe UI" w:hAnsi="Segoe UI" w:eastAsia="Segoe UI" w:cs="Segoe UI"/>
+          <w:b w:val="0"/>
+          <w:bCs w:val="0"/>
+          <w:i w:val="0"/>
+          <w:iCs w:val="0"/>
+          <w:noProof w:val="0"/>
+          <w:sz w:val="21"/>
+          <w:szCs w:val="21"/>
+          <w:lang w:val="en-GB"/>
+        </w:rPr>
+        <w:t xml:space="preserve"> = One specific starter kit (simple and lightweight).</w:t>
+      </w:r>
+    </w:p>
+    <w:p>
+      <w:pPr>
+        <w:pStyle w:val="ListParagraph"/>
+        <w:numPr>
+          <w:ilvl w:val="0"/>
+          <w:numId w:val="1"/>
+        </w:numPr>
+        <w:spacing w:before="0" w:beforeAutospacing="off" w:after="0" w:afterAutospacing="off" w:line="300" w:lineRule="auto"/>
+        <w:rPr>
+          <w:rFonts w:ascii="Segoe UI" w:hAnsi="Segoe UI" w:eastAsia="Segoe UI" w:cs="Segoe UI"/>
+          <w:b w:val="0"/>
+          <w:bCs w:val="0"/>
+          <w:i w:val="0"/>
+          <w:iCs w:val="0"/>
+          <w:noProof w:val="0"/>
+          <w:sz w:val="21"/>
+          <w:szCs w:val="21"/>
+          <w:lang w:val="en-GB"/>
+        </w:rPr>
+      </w:pPr>
+      <w:r>
+        <w:rPr>
+          <w:rFonts w:ascii="Segoe UI" w:hAnsi="Segoe UI" w:eastAsia="Segoe UI" w:cs="Segoe UI"/>
+          <w:b w:val="1"/>
+          <w:bCs w:val="1"/>
+          <w:i w:val="0"/>
+          <w:iCs w:val="0"/>
+          <w:noProof w:val="0"/>
+          <w:sz w:val="21"/>
+          <w:szCs w:val="21"/>
+          <w:lang w:val="en-GB"/>
+        </w:rPr>
+        <w:t>Laravel Jetstream</w:t>
+      </w:r>
+      <w:r>
+        <w:rPr>
+          <w:rFonts w:ascii="Segoe UI" w:hAnsi="Segoe UI" w:eastAsia="Segoe UI" w:cs="Segoe UI"/>
+          <w:b w:val="0"/>
+          <w:bCs w:val="0"/>
+          <w:i w:val="0"/>
+          <w:iCs w:val="0"/>
+          <w:noProof w:val="0"/>
+          <w:sz w:val="21"/>
+          <w:szCs w:val="21"/>
+          <w:lang w:val="en-GB"/>
+        </w:rPr>
+        <w:t xml:space="preserve"> = Another starter kit (more advanced, with teams, API tokens, etc.).</w:t>
+      </w:r>
+    </w:p>
+    <w:p>
+      <w:pPr>
+        <w:pStyle w:val="Normal"/>
+        <w:spacing w:before="0" w:beforeAutospacing="off" w:after="0" w:afterAutospacing="off" w:line="300" w:lineRule="auto"/>
+        <w:ind w:left="0"/>
+        <w:rPr>
+          <w:rFonts w:ascii="Segoe UI" w:hAnsi="Segoe UI" w:eastAsia="Segoe UI" w:cs="Segoe UI"/>
+          <w:b w:val="0"/>
+          <w:bCs w:val="0"/>
+          <w:i w:val="0"/>
+          <w:iCs w:val="0"/>
+          <w:noProof w:val="0"/>
+          <w:sz w:val="21"/>
+          <w:szCs w:val="21"/>
+          <w:lang w:val="en-GB"/>
+        </w:rPr>
+      </w:pPr>
+    </w:p>
+    <w:p>
+      <w:pPr>
+        <w:pStyle w:val="Normal"/>
+        <w:spacing w:before="0" w:beforeAutospacing="off" w:after="0" w:afterAutospacing="off" w:line="300" w:lineRule="auto"/>
+        <w:ind w:left="0"/>
+        <w:rPr>
+          <w:rFonts w:ascii="Segoe UI" w:hAnsi="Segoe UI" w:eastAsia="Segoe UI" w:cs="Segoe UI"/>
+          <w:b w:val="0"/>
+          <w:bCs w:val="0"/>
+          <w:i w:val="0"/>
+          <w:iCs w:val="0"/>
+          <w:noProof w:val="0"/>
+          <w:sz w:val="21"/>
+          <w:szCs w:val="21"/>
+          <w:lang w:val="en-GB"/>
+        </w:rPr>
+      </w:pPr>
+    </w:p>
+    <w:p>
+      <w:pPr>
+        <w:pStyle w:val="Normal"/>
+        <w:spacing w:before="240" w:beforeAutospacing="off" w:after="240" w:afterAutospacing="off"/>
+        <w:ind w:left="0"/>
+        <w:rPr>
+          <w:rFonts w:ascii="Calibri" w:hAnsi="Calibri" w:eastAsia="Calibri" w:cs="Calibri"/>
+          <w:noProof w:val="0"/>
+          <w:sz w:val="24"/>
+          <w:szCs w:val="24"/>
+          <w:lang w:val="en-GB"/>
+        </w:rPr>
+      </w:pPr>
+    </w:p>
+    <w:p>
+      <w:pPr>
+        <w:pStyle w:val="Normal"/>
+        <w:spacing w:before="240" w:beforeAutospacing="off" w:after="240" w:afterAutospacing="off"/>
+        <w:ind w:left="0"/>
         <w:rPr>
           <w:rFonts w:ascii="Calibri" w:hAnsi="Calibri" w:eastAsia="Calibri" w:cs="Calibri"/>
           <w:b w:val="1"/>
@@ -2867,60 +3401,7 @@
           <w:szCs w:val="24"/>
           <w:lang w:val="en-GB"/>
         </w:rPr>
-        <w:t xml:space="preserve">u can find queue in </w:t>
-      </w:r>
-      <w:r>
-        <w:rPr>
-          <w:rFonts w:ascii="Calibri" w:hAnsi="Calibri" w:eastAsia="Calibri" w:cs="Calibri"/>
-          <w:b w:val="1"/>
-          <w:bCs w:val="1"/>
-          <w:noProof w:val="0"/>
-          <w:color w:val="808080" w:themeColor="background1" w:themeTint="FF" w:themeShade="80"/>
-          <w:sz w:val="24"/>
-          <w:szCs w:val="24"/>
-          <w:lang w:val="en-GB"/>
-        </w:rPr>
-        <w:t>confi</w:t>
-      </w:r>
-      <w:r>
-        <w:rPr>
-          <w:rFonts w:ascii="Calibri" w:hAnsi="Calibri" w:eastAsia="Calibri" w:cs="Calibri"/>
-          <w:b w:val="1"/>
-          <w:bCs w:val="1"/>
-          <w:noProof w:val="0"/>
-          <w:color w:val="808080" w:themeColor="background1" w:themeTint="FF" w:themeShade="80"/>
-          <w:sz w:val="24"/>
-          <w:szCs w:val="24"/>
-          <w:lang w:val="en-GB"/>
-        </w:rPr>
-        <w:t>g</w:t>
-      </w:r>
-      <w:r>
-        <w:rPr>
-          <w:rFonts w:ascii="Calibri" w:hAnsi="Calibri" w:eastAsia="Calibri" w:cs="Calibri"/>
-          <w:b w:val="1"/>
-          <w:bCs w:val="1"/>
-          <w:noProof w:val="0"/>
-          <w:color w:val="808080" w:themeColor="background1" w:themeTint="FF" w:themeShade="80"/>
-          <w:sz w:val="24"/>
-          <w:szCs w:val="24"/>
-          <w:lang w:val="en-GB"/>
-        </w:rPr>
-        <w:t>\</w:t>
-      </w:r>
-      <w:r>
-        <w:rPr>
-          <w:rFonts w:ascii="Calibri" w:hAnsi="Calibri" w:eastAsia="Calibri" w:cs="Calibri"/>
-          <w:b w:val="1"/>
-          <w:bCs w:val="1"/>
-          <w:noProof w:val="0"/>
-          <w:color w:val="808080" w:themeColor="background1" w:themeTint="FF" w:themeShade="80"/>
-          <w:sz w:val="24"/>
-          <w:szCs w:val="24"/>
-          <w:lang w:val="en-GB"/>
-        </w:rPr>
-        <w:t>queue.php</w:t>
-      </w:r>
+      </w:pPr>
     </w:p>
     <w:p>
       <w:pPr>
@@ -4414,7 +4895,7 @@
     <w:name w:val="List Paragraph"/>
     <w:basedOn w:val="Normal"/>
     <w:qFormat/>
-    <w:rsid w:val="768BF6EB"/>
+    <w:rsid w:val="1E07949D"/>
     <w:pPr>
       <w:spacing/>
       <w:ind w:left="720"/>
@@ -4428,7 +4909,7 @@
     <w:next w:val="Normal"/>
     <w:unhideWhenUsed/>
     <w:qFormat/>
-    <w:rsid w:val="768BF6EB"/>
+    <w:rsid w:val="1E07949D"/>
     <w:rPr>
       <w:rFonts w:ascii="Aptos Display" w:hAnsi="Aptos Display" w:eastAsia="" w:cs="" w:asciiTheme="majorAscii" w:hAnsiTheme="majorAscii" w:eastAsiaTheme="majorEastAsia" w:cstheme="majorBidi"/>
       <w:color w:val="0F4761" w:themeColor="accent1" w:themeTint="FF" w:themeShade="BF"/>
@@ -4449,7 +4930,7 @@
     <w:next w:val="Normal"/>
     <w:unhideWhenUsed/>
     <w:qFormat/>
-    <w:rsid w:val="768BF6EB"/>
+    <w:rsid w:val="1E07949D"/>
     <w:rPr>
       <w:rFonts w:eastAsia="" w:cs="" w:eastAsiaTheme="majorEastAsia" w:cstheme="majorBidi"/>
       <w:color w:val="0F4761" w:themeColor="accent1" w:themeTint="FF" w:themeShade="BF"/>
@@ -4468,7 +4949,7 @@
     <w:name w:val="Hyperlink"/>
     <w:basedOn w:val="DefaultParagraphFont"/>
     <w:unhideWhenUsed/>
-    <w:rsid w:val="768BF6EB"/>
+    <w:rsid w:val="1E07949D"/>
     <w:rPr>
       <w:color w:val="467886"/>
       <w:u w:val="single"/>

</xml_diff>

<commit_message>
Implement middleware and Update Laravel notes
</commit_message>
<xml_diff>
--- a/Laravel notes.docx
+++ b/Laravel notes.docx
@@ -3340,7 +3340,6 @@
       <w:pPr>
         <w:pStyle w:val="Normal"/>
         <w:spacing w:before="0" w:beforeAutospacing="off" w:after="0" w:afterAutospacing="off" w:line="300" w:lineRule="auto"/>
-        <w:ind w:left="0"/>
         <w:rPr>
           <w:rFonts w:ascii="Segoe UI" w:hAnsi="Segoe UI" w:eastAsia="Segoe UI" w:cs="Segoe UI"/>
           <w:b w:val="0"/>
@@ -3358,9 +3357,2943 @@
       <w:pPr>
         <w:pStyle w:val="Normal"/>
         <w:spacing w:before="0" w:beforeAutospacing="off" w:after="0" w:afterAutospacing="off" w:line="300" w:lineRule="auto"/>
+      </w:pPr>
+      <w:r>
+        <w:rPr>
+          <w:rFonts w:ascii="Segoe UI" w:hAnsi="Segoe UI" w:eastAsia="Segoe UI" w:cs="Segoe UI"/>
+          <w:b w:val="1"/>
+          <w:bCs w:val="1"/>
+          <w:i w:val="1"/>
+          <w:iCs w:val="1"/>
+          <w:noProof w:val="0"/>
+          <w:color w:val="FF0000"/>
+          <w:sz w:val="32"/>
+          <w:szCs w:val="32"/>
+          <w:u w:val="single"/>
+          <w:lang w:val="en-GB"/>
+        </w:rPr>
+        <w:t>Routing in Laravel:</w:t>
+      </w:r>
+    </w:p>
+    <w:p>
+      <w:pPr>
+        <w:pStyle w:val="Normal"/>
+        <w:spacing w:before="0" w:beforeAutospacing="off" w:after="0" w:afterAutospacing="off" w:line="300" w:lineRule="auto"/>
+        <w:rPr>
+          <w:rFonts w:ascii="Segoe UI" w:hAnsi="Segoe UI" w:eastAsia="Segoe UI" w:cs="Segoe UI"/>
+          <w:b w:val="1"/>
+          <w:bCs w:val="1"/>
+          <w:i w:val="1"/>
+          <w:iCs w:val="1"/>
+          <w:noProof w:val="0"/>
+          <w:color w:val="FF0000"/>
+          <w:sz w:val="32"/>
+          <w:szCs w:val="32"/>
+          <w:u w:val="single"/>
+          <w:lang w:val="en-GB"/>
+        </w:rPr>
+      </w:pPr>
+    </w:p>
+    <w:p>
+      <w:pPr>
+        <w:pStyle w:val="Normal"/>
+        <w:spacing w:before="0" w:beforeAutospacing="off" w:after="0" w:afterAutospacing="off" w:line="300" w:lineRule="auto"/>
+        <w:rPr>
+          <w:rFonts w:ascii="Segoe UI" w:hAnsi="Segoe UI" w:eastAsia="Segoe UI" w:cs="Segoe UI"/>
+          <w:b w:val="1"/>
+          <w:bCs w:val="1"/>
+          <w:i w:val="1"/>
+          <w:iCs w:val="1"/>
+          <w:noProof w:val="0"/>
+          <w:color w:val="FF0000"/>
+          <w:sz w:val="28"/>
+          <w:szCs w:val="28"/>
+          <w:u w:val="single"/>
+          <w:lang w:val="en-GB"/>
+        </w:rPr>
+      </w:pPr>
+      <w:r>
+        <w:rPr>
+          <w:rFonts w:ascii="Segoe UI" w:hAnsi="Segoe UI" w:eastAsia="Segoe UI" w:cs="Segoe UI"/>
+          <w:b w:val="1"/>
+          <w:bCs w:val="1"/>
+          <w:i w:val="1"/>
+          <w:iCs w:val="1"/>
+          <w:noProof w:val="0"/>
+          <w:color w:val="FF0000"/>
+          <w:sz w:val="28"/>
+          <w:szCs w:val="28"/>
+          <w:u w:val="single"/>
+          <w:lang w:val="en-GB"/>
+        </w:rPr>
+        <w:t>Group in route</w:t>
+      </w:r>
+    </w:p>
+    <w:p>
+      <w:pPr>
+        <w:pStyle w:val="Normal"/>
+        <w:spacing w:before="0" w:beforeAutospacing="off" w:after="0" w:afterAutospacing="off" w:line="300" w:lineRule="auto"/>
+        <w:rPr>
+          <w:rFonts w:ascii="Segoe UI" w:hAnsi="Segoe UI" w:eastAsia="Segoe UI" w:cs="Segoe UI"/>
+          <w:b w:val="1"/>
+          <w:bCs w:val="1"/>
+          <w:i w:val="1"/>
+          <w:iCs w:val="1"/>
+          <w:noProof w:val="0"/>
+          <w:color w:val="FF0000"/>
+          <w:sz w:val="32"/>
+          <w:szCs w:val="32"/>
+          <w:u w:val="single"/>
+          <w:lang w:val="en-GB"/>
+        </w:rPr>
+      </w:pPr>
+    </w:p>
+    <w:p>
+      <w:pPr>
+        <w:pStyle w:val="Heading2"/>
+        <w:spacing w:before="299" w:beforeAutospacing="off" w:after="299" w:afterAutospacing="off"/>
+      </w:pPr>
+      <w:r>
+        <w:rPr>
+          <w:rFonts w:ascii="Segoe UI" w:hAnsi="Segoe UI" w:eastAsia="Segoe UI" w:cs="Segoe UI"/>
+          <w:b w:val="1"/>
+          <w:bCs w:val="1"/>
+          <w:noProof w:val="0"/>
+          <w:sz w:val="36"/>
+          <w:szCs w:val="36"/>
+          <w:lang w:val="en-GB"/>
+        </w:rPr>
+        <w:t>Group by prefix</w:t>
+      </w:r>
+    </w:p>
+    <w:p>
+      <w:pPr>
+        <w:spacing w:before="240" w:beforeAutospacing="off" w:after="240" w:afterAutospacing="off"/>
+      </w:pPr>
+      <w:r>
+        <w:rPr>
+          <w:rFonts w:ascii="Segoe UI" w:hAnsi="Segoe UI" w:eastAsia="Segoe UI" w:cs="Segoe UI"/>
+          <w:noProof w:val="0"/>
+          <w:sz w:val="32"/>
+          <w:szCs w:val="32"/>
+          <w:lang w:val="en-GB"/>
+        </w:rPr>
+        <w:t xml:space="preserve">Instead of repeating </w:t>
+      </w:r>
+      <w:r>
+        <w:rPr>
+          <w:rFonts w:ascii="Consolas" w:hAnsi="Consolas" w:eastAsia="Consolas" w:cs="Consolas"/>
+          <w:noProof w:val="0"/>
+          <w:sz w:val="32"/>
+          <w:szCs w:val="32"/>
+          <w:lang w:val="en-GB"/>
+        </w:rPr>
+        <w:t>/admin</w:t>
+      </w:r>
+      <w:r>
+        <w:rPr>
+          <w:rFonts w:ascii="Segoe UI" w:hAnsi="Segoe UI" w:eastAsia="Segoe UI" w:cs="Segoe UI"/>
+          <w:noProof w:val="0"/>
+          <w:sz w:val="32"/>
+          <w:szCs w:val="32"/>
+          <w:lang w:val="en-GB"/>
+        </w:rPr>
+        <w:t xml:space="preserve"> in every route:</w:t>
+      </w:r>
+    </w:p>
+    <w:p>
+      <w:pPr>
+        <w:spacing w:before="0" w:beforeAutospacing="off" w:after="0" w:afterAutospacing="off"/>
+        <w:rPr>
+          <w:rFonts w:ascii="Consolas" w:hAnsi="Consolas" w:eastAsia="Consolas" w:cs="Consolas"/>
+          <w:noProof w:val="0"/>
+          <w:color w:val="4C94D8" w:themeColor="text2" w:themeTint="80" w:themeShade="FF"/>
+          <w:sz w:val="32"/>
+          <w:szCs w:val="32"/>
+          <w:lang w:val="en-GB"/>
+        </w:rPr>
+      </w:pPr>
+      <w:r>
+        <w:rPr>
+          <w:rFonts w:ascii="Consolas" w:hAnsi="Consolas" w:eastAsia="Consolas" w:cs="Consolas"/>
+          <w:noProof w:val="0"/>
+          <w:color w:val="4C94D8" w:themeColor="text2" w:themeTint="80" w:themeShade="FF"/>
+          <w:sz w:val="32"/>
+          <w:szCs w:val="32"/>
+          <w:lang w:val="en-GB"/>
+        </w:rPr>
+        <w:t>php</w:t>
+      </w:r>
+    </w:p>
+    <w:p>
+      <w:pPr>
+        <w:spacing w:before="0" w:beforeAutospacing="off" w:after="0" w:afterAutospacing="off"/>
+        <w:jc w:val="right"/>
+        <w:rPr>
+          <w:rFonts w:ascii="Consolas" w:hAnsi="Consolas" w:eastAsia="Consolas" w:cs="Consolas"/>
+          <w:noProof w:val="0"/>
+          <w:color w:val="4C94D8" w:themeColor="text2" w:themeTint="80" w:themeShade="FF"/>
+          <w:sz w:val="32"/>
+          <w:szCs w:val="32"/>
+          <w:lang w:val="en-GB"/>
+        </w:rPr>
+      </w:pPr>
+      <w:r>
+        <w:rPr>
+          <w:rFonts w:ascii="Consolas" w:hAnsi="Consolas" w:eastAsia="Consolas" w:cs="Consolas"/>
+          <w:noProof w:val="0"/>
+          <w:color w:val="4C94D8" w:themeColor="text2" w:themeTint="80" w:themeShade="FF"/>
+          <w:sz w:val="32"/>
+          <w:szCs w:val="32"/>
+          <w:lang w:val="en-GB"/>
+        </w:rPr>
+        <w:t>Route::get('/admin/dashboard', function () {</w:t>
+      </w:r>
+      <w:r>
+        <w:br/>
+      </w:r>
+      <w:r>
+        <w:rPr>
+          <w:rFonts w:ascii="Consolas" w:hAnsi="Consolas" w:eastAsia="Consolas" w:cs="Consolas"/>
+          <w:noProof w:val="0"/>
+          <w:color w:val="4C94D8" w:themeColor="text2" w:themeTint="80" w:themeShade="FF"/>
+          <w:sz w:val="32"/>
+          <w:szCs w:val="32"/>
+          <w:lang w:val="en-GB"/>
+        </w:rPr>
+        <w:t xml:space="preserve">    return 'Admin Dashboard';</w:t>
+      </w:r>
+      <w:r>
+        <w:br/>
+      </w:r>
+      <w:r>
+        <w:rPr>
+          <w:rFonts w:ascii="Consolas" w:hAnsi="Consolas" w:eastAsia="Consolas" w:cs="Consolas"/>
+          <w:noProof w:val="0"/>
+          <w:color w:val="4C94D8" w:themeColor="text2" w:themeTint="80" w:themeShade="FF"/>
+          <w:sz w:val="32"/>
+          <w:szCs w:val="32"/>
+          <w:lang w:val="en-GB"/>
+        </w:rPr>
+        <w:t>});</w:t>
+      </w:r>
+      <w:r>
+        <w:br/>
+      </w:r>
+      <w:r>
+        <w:br/>
+      </w:r>
+      <w:r>
+        <w:rPr>
+          <w:rFonts w:ascii="Consolas" w:hAnsi="Consolas" w:eastAsia="Consolas" w:cs="Consolas"/>
+          <w:noProof w:val="0"/>
+          <w:color w:val="4C94D8" w:themeColor="text2" w:themeTint="80" w:themeShade="FF"/>
+          <w:sz w:val="32"/>
+          <w:szCs w:val="32"/>
+          <w:lang w:val="en-GB"/>
+        </w:rPr>
+        <w:t>Route::get('/admin/users', function () {</w:t>
+      </w:r>
+      <w:r>
+        <w:br/>
+      </w:r>
+      <w:r>
+        <w:rPr>
+          <w:rFonts w:ascii="Consolas" w:hAnsi="Consolas" w:eastAsia="Consolas" w:cs="Consolas"/>
+          <w:noProof w:val="0"/>
+          <w:color w:val="4C94D8" w:themeColor="text2" w:themeTint="80" w:themeShade="FF"/>
+          <w:sz w:val="32"/>
+          <w:szCs w:val="32"/>
+          <w:lang w:val="en-GB"/>
+        </w:rPr>
+        <w:t xml:space="preserve">    return 'Admin Users';</w:t>
+      </w:r>
+      <w:r>
+        <w:br/>
+      </w:r>
+      <w:r>
+        <w:rPr>
+          <w:rFonts w:ascii="Consolas" w:hAnsi="Consolas" w:eastAsia="Consolas" w:cs="Consolas"/>
+          <w:noProof w:val="0"/>
+          <w:color w:val="4C94D8" w:themeColor="text2" w:themeTint="80" w:themeShade="FF"/>
+          <w:sz w:val="32"/>
+          <w:szCs w:val="32"/>
+          <w:lang w:val="en-GB"/>
+        </w:rPr>
+        <w:t>});</w:t>
+      </w:r>
+    </w:p>
+    <w:p>
+      <w:pPr>
+        <w:spacing w:before="240" w:beforeAutospacing="off" w:after="240" w:afterAutospacing="off"/>
+      </w:pPr>
+      <w:r>
+        <w:rPr>
+          <w:rFonts w:ascii="Segoe UI" w:hAnsi="Segoe UI" w:eastAsia="Segoe UI" w:cs="Segoe UI"/>
+          <w:noProof w:val="0"/>
+          <w:sz w:val="32"/>
+          <w:szCs w:val="32"/>
+          <w:lang w:val="en-GB"/>
+        </w:rPr>
+        <w:t>You can group them:</w:t>
+      </w:r>
+    </w:p>
+    <w:p>
+      <w:pPr>
+        <w:spacing w:before="240" w:beforeAutospacing="off" w:after="240" w:afterAutospacing="off"/>
+        <w:rPr>
+          <w:rFonts w:ascii="Segoe UI" w:hAnsi="Segoe UI" w:eastAsia="Segoe UI" w:cs="Segoe UI"/>
+          <w:noProof w:val="0"/>
+          <w:color w:val="4C94D8" w:themeColor="text2" w:themeTint="80" w:themeShade="FF"/>
+          <w:sz w:val="32"/>
+          <w:szCs w:val="32"/>
+          <w:lang w:val="en-GB"/>
+        </w:rPr>
+      </w:pPr>
+      <w:r>
+        <w:rPr>
+          <w:rFonts w:ascii="Segoe UI" w:hAnsi="Segoe UI" w:eastAsia="Segoe UI" w:cs="Segoe UI"/>
+          <w:noProof w:val="0"/>
+          <w:color w:val="4C94D8" w:themeColor="text2" w:themeTint="80" w:themeShade="FF"/>
+          <w:sz w:val="32"/>
+          <w:szCs w:val="32"/>
+          <w:lang w:val="en-GB"/>
+        </w:rPr>
+        <w:t>use Illuminate\Support\Facades\Route;</w:t>
+      </w:r>
+    </w:p>
+    <w:p>
+      <w:pPr>
+        <w:pStyle w:val="Normal"/>
+        <w:spacing w:before="240" w:beforeAutospacing="off" w:after="240" w:afterAutospacing="off"/>
+        <w:rPr>
+          <w:rFonts w:ascii="Segoe UI" w:hAnsi="Segoe UI" w:eastAsia="Segoe UI" w:cs="Segoe UI"/>
+          <w:noProof w:val="0"/>
+          <w:color w:val="4C94D8" w:themeColor="text2" w:themeTint="80" w:themeShade="FF"/>
+          <w:sz w:val="32"/>
+          <w:szCs w:val="32"/>
+          <w:lang w:val="en-GB"/>
+        </w:rPr>
+      </w:pPr>
+      <w:r>
+        <w:rPr>
+          <w:rFonts w:ascii="Segoe UI" w:hAnsi="Segoe UI" w:eastAsia="Segoe UI" w:cs="Segoe UI"/>
+          <w:noProof w:val="0"/>
+          <w:color w:val="4C94D8" w:themeColor="text2" w:themeTint="80" w:themeShade="FF"/>
+          <w:sz w:val="32"/>
+          <w:szCs w:val="32"/>
+          <w:lang w:val="en-GB"/>
+        </w:rPr>
+        <w:t xml:space="preserve"> </w:t>
+      </w:r>
+    </w:p>
+    <w:p>
+      <w:pPr>
+        <w:pStyle w:val="Normal"/>
+        <w:spacing w:before="240" w:beforeAutospacing="off" w:after="240" w:afterAutospacing="off"/>
+        <w:rPr>
+          <w:rFonts w:ascii="Segoe UI" w:hAnsi="Segoe UI" w:eastAsia="Segoe UI" w:cs="Segoe UI"/>
+          <w:noProof w:val="0"/>
+          <w:color w:val="4C94D8" w:themeColor="text2" w:themeTint="80" w:themeShade="FF"/>
+          <w:sz w:val="32"/>
+          <w:szCs w:val="32"/>
+          <w:lang w:val="en-GB"/>
+        </w:rPr>
+      </w:pPr>
+      <w:r>
+        <w:rPr>
+          <w:rFonts w:ascii="Segoe UI" w:hAnsi="Segoe UI" w:eastAsia="Segoe UI" w:cs="Segoe UI"/>
+          <w:noProof w:val="0"/>
+          <w:color w:val="4C94D8" w:themeColor="text2" w:themeTint="80" w:themeShade="FF"/>
+          <w:sz w:val="32"/>
+          <w:szCs w:val="32"/>
+          <w:lang w:val="en-GB"/>
+        </w:rPr>
+        <w:t>Route::prefix('admin')-&gt;group(function () {</w:t>
+      </w:r>
+    </w:p>
+    <w:p>
+      <w:pPr>
+        <w:pStyle w:val="Normal"/>
+        <w:spacing w:before="240" w:beforeAutospacing="off" w:after="240" w:afterAutospacing="off"/>
+        <w:rPr>
+          <w:rFonts w:ascii="Segoe UI" w:hAnsi="Segoe UI" w:eastAsia="Segoe UI" w:cs="Segoe UI"/>
+          <w:noProof w:val="0"/>
+          <w:color w:val="4C94D8" w:themeColor="text2" w:themeTint="80" w:themeShade="FF"/>
+          <w:sz w:val="32"/>
+          <w:szCs w:val="32"/>
+          <w:lang w:val="en-GB"/>
+        </w:rPr>
+      </w:pPr>
+      <w:r>
+        <w:rPr>
+          <w:rFonts w:ascii="Segoe UI" w:hAnsi="Segoe UI" w:eastAsia="Segoe UI" w:cs="Segoe UI"/>
+          <w:noProof w:val="0"/>
+          <w:color w:val="4C94D8" w:themeColor="text2" w:themeTint="80" w:themeShade="FF"/>
+          <w:sz w:val="32"/>
+          <w:szCs w:val="32"/>
+          <w:lang w:val="en-GB"/>
+        </w:rPr>
+        <w:t xml:space="preserve">    Route::get('/dashboard', function () {</w:t>
+      </w:r>
+    </w:p>
+    <w:p>
+      <w:pPr>
+        <w:pStyle w:val="Normal"/>
+        <w:spacing w:before="240" w:beforeAutospacing="off" w:after="240" w:afterAutospacing="off"/>
+        <w:rPr>
+          <w:rFonts w:ascii="Segoe UI" w:hAnsi="Segoe UI" w:eastAsia="Segoe UI" w:cs="Segoe UI"/>
+          <w:noProof w:val="0"/>
+          <w:color w:val="4C94D8" w:themeColor="text2" w:themeTint="80" w:themeShade="FF"/>
+          <w:sz w:val="32"/>
+          <w:szCs w:val="32"/>
+          <w:lang w:val="en-GB"/>
+        </w:rPr>
+      </w:pPr>
+      <w:r>
+        <w:rPr>
+          <w:rFonts w:ascii="Segoe UI" w:hAnsi="Segoe UI" w:eastAsia="Segoe UI" w:cs="Segoe UI"/>
+          <w:noProof w:val="0"/>
+          <w:color w:val="4C94D8" w:themeColor="text2" w:themeTint="80" w:themeShade="FF"/>
+          <w:sz w:val="32"/>
+          <w:szCs w:val="32"/>
+          <w:lang w:val="en-GB"/>
+        </w:rPr>
+        <w:t xml:space="preserve">        return 'Admin Dashboard';</w:t>
+      </w:r>
+    </w:p>
+    <w:p>
+      <w:pPr>
+        <w:pStyle w:val="Normal"/>
+        <w:spacing w:before="240" w:beforeAutospacing="off" w:after="240" w:afterAutospacing="off"/>
+        <w:rPr>
+          <w:rFonts w:ascii="Segoe UI" w:hAnsi="Segoe UI" w:eastAsia="Segoe UI" w:cs="Segoe UI"/>
+          <w:noProof w:val="0"/>
+          <w:color w:val="4C94D8" w:themeColor="text2" w:themeTint="80" w:themeShade="FF"/>
+          <w:sz w:val="32"/>
+          <w:szCs w:val="32"/>
+          <w:lang w:val="en-GB"/>
+        </w:rPr>
+      </w:pPr>
+      <w:r>
+        <w:rPr>
+          <w:rFonts w:ascii="Segoe UI" w:hAnsi="Segoe UI" w:eastAsia="Segoe UI" w:cs="Segoe UI"/>
+          <w:noProof w:val="0"/>
+          <w:color w:val="4C94D8" w:themeColor="text2" w:themeTint="80" w:themeShade="FF"/>
+          <w:sz w:val="32"/>
+          <w:szCs w:val="32"/>
+          <w:lang w:val="en-GB"/>
+        </w:rPr>
+        <w:t xml:space="preserve">    });</w:t>
+      </w:r>
+    </w:p>
+    <w:p>
+      <w:pPr>
+        <w:pStyle w:val="Normal"/>
+        <w:spacing w:before="240" w:beforeAutospacing="off" w:after="240" w:afterAutospacing="off"/>
+      </w:pPr>
+      <w:r>
+        <w:rPr>
+          <w:rFonts w:ascii="Segoe UI" w:hAnsi="Segoe UI" w:eastAsia="Segoe UI" w:cs="Segoe UI"/>
+          <w:noProof w:val="0"/>
+          <w:color w:val="4C94D8" w:themeColor="text2" w:themeTint="80" w:themeShade="FF"/>
+          <w:sz w:val="32"/>
+          <w:szCs w:val="32"/>
+          <w:lang w:val="en-GB"/>
+        </w:rPr>
+        <w:t xml:space="preserve"> </w:t>
+      </w:r>
+    </w:p>
+    <w:p>
+      <w:pPr>
+        <w:pStyle w:val="Normal"/>
+        <w:spacing w:before="240" w:beforeAutospacing="off" w:after="240" w:afterAutospacing="off"/>
+        <w:rPr>
+          <w:rFonts w:ascii="Segoe UI" w:hAnsi="Segoe UI" w:eastAsia="Segoe UI" w:cs="Segoe UI"/>
+          <w:noProof w:val="0"/>
+          <w:color w:val="4C94D8" w:themeColor="text2" w:themeTint="80" w:themeShade="FF"/>
+          <w:sz w:val="32"/>
+          <w:szCs w:val="32"/>
+          <w:lang w:val="en-GB"/>
+        </w:rPr>
+      </w:pPr>
+      <w:r>
+        <w:rPr>
+          <w:rFonts w:ascii="Segoe UI" w:hAnsi="Segoe UI" w:eastAsia="Segoe UI" w:cs="Segoe UI"/>
+          <w:noProof w:val="0"/>
+          <w:color w:val="4C94D8" w:themeColor="text2" w:themeTint="80" w:themeShade="FF"/>
+          <w:sz w:val="32"/>
+          <w:szCs w:val="32"/>
+          <w:lang w:val="en-GB"/>
+        </w:rPr>
+        <w:t xml:space="preserve">    Route::get('/users', function () {</w:t>
+      </w:r>
+    </w:p>
+    <w:p>
+      <w:pPr>
+        <w:pStyle w:val="Normal"/>
+        <w:spacing w:before="240" w:beforeAutospacing="off" w:after="240" w:afterAutospacing="off"/>
+        <w:rPr>
+          <w:rFonts w:ascii="Segoe UI" w:hAnsi="Segoe UI" w:eastAsia="Segoe UI" w:cs="Segoe UI"/>
+          <w:noProof w:val="0"/>
+          <w:color w:val="4C94D8" w:themeColor="text2" w:themeTint="80" w:themeShade="FF"/>
+          <w:sz w:val="32"/>
+          <w:szCs w:val="32"/>
+          <w:lang w:val="en-GB"/>
+        </w:rPr>
+      </w:pPr>
+      <w:r>
+        <w:rPr>
+          <w:rFonts w:ascii="Segoe UI" w:hAnsi="Segoe UI" w:eastAsia="Segoe UI" w:cs="Segoe UI"/>
+          <w:noProof w:val="0"/>
+          <w:color w:val="4C94D8" w:themeColor="text2" w:themeTint="80" w:themeShade="FF"/>
+          <w:sz w:val="32"/>
+          <w:szCs w:val="32"/>
+          <w:lang w:val="en-GB"/>
+        </w:rPr>
+        <w:t xml:space="preserve">        return 'Admin Users';</w:t>
+      </w:r>
+    </w:p>
+    <w:p>
+      <w:pPr>
+        <w:pStyle w:val="Normal"/>
+        <w:spacing w:before="240" w:beforeAutospacing="off" w:after="240" w:afterAutospacing="off"/>
+        <w:rPr>
+          <w:rFonts w:ascii="Segoe UI" w:hAnsi="Segoe UI" w:eastAsia="Segoe UI" w:cs="Segoe UI"/>
+          <w:noProof w:val="0"/>
+          <w:color w:val="4C94D8" w:themeColor="text2" w:themeTint="80" w:themeShade="FF"/>
+          <w:sz w:val="32"/>
+          <w:szCs w:val="32"/>
+          <w:lang w:val="en-GB"/>
+        </w:rPr>
+      </w:pPr>
+      <w:r>
+        <w:rPr>
+          <w:rFonts w:ascii="Segoe UI" w:hAnsi="Segoe UI" w:eastAsia="Segoe UI" w:cs="Segoe UI"/>
+          <w:noProof w:val="0"/>
+          <w:color w:val="4C94D8" w:themeColor="text2" w:themeTint="80" w:themeShade="FF"/>
+          <w:sz w:val="32"/>
+          <w:szCs w:val="32"/>
+          <w:lang w:val="en-GB"/>
+        </w:rPr>
+        <w:t xml:space="preserve">    });</w:t>
+      </w:r>
+    </w:p>
+    <w:p>
+      <w:pPr>
+        <w:pStyle w:val="Normal"/>
+        <w:spacing w:before="240" w:beforeAutospacing="off" w:after="240" w:afterAutospacing="off"/>
+      </w:pPr>
+      <w:r>
+        <w:rPr>
+          <w:rFonts w:ascii="Segoe UI" w:hAnsi="Segoe UI" w:eastAsia="Segoe UI" w:cs="Segoe UI"/>
+          <w:noProof w:val="0"/>
+          <w:color w:val="4C94D8" w:themeColor="text2" w:themeTint="80" w:themeShade="FF"/>
+          <w:sz w:val="32"/>
+          <w:szCs w:val="32"/>
+          <w:lang w:val="en-GB"/>
+        </w:rPr>
+        <w:t>});</w:t>
+      </w:r>
+    </w:p>
+    <w:p>
+      <w:pPr>
+        <w:pStyle w:val="Normal"/>
+        <w:spacing w:before="240" w:beforeAutospacing="off" w:after="240" w:afterAutospacing="off"/>
+        <w:rPr>
+          <w:rFonts w:ascii="Segoe UI" w:hAnsi="Segoe UI" w:eastAsia="Segoe UI" w:cs="Segoe UI"/>
+          <w:noProof w:val="0"/>
+          <w:color w:val="4C94D8" w:themeColor="text2" w:themeTint="80" w:themeShade="FF"/>
+          <w:sz w:val="32"/>
+          <w:szCs w:val="32"/>
+          <w:lang w:val="en-GB"/>
+        </w:rPr>
+      </w:pPr>
+    </w:p>
+    <w:p>
+      <w:pPr>
+        <w:pStyle w:val="Normal"/>
+        <w:spacing w:before="240" w:beforeAutospacing="off" w:after="240" w:afterAutospacing="off"/>
+        <w:rPr>
+          <w:rFonts w:ascii="Segoe UI" w:hAnsi="Segoe UI" w:eastAsia="Segoe UI" w:cs="Segoe UI"/>
+          <w:b w:val="1"/>
+          <w:bCs w:val="1"/>
+          <w:i w:val="1"/>
+          <w:iCs w:val="1"/>
+          <w:noProof w:val="0"/>
+          <w:color w:val="FF0000"/>
+          <w:sz w:val="32"/>
+          <w:szCs w:val="32"/>
+          <w:u w:val="single"/>
+          <w:lang w:val="en-GB"/>
+        </w:rPr>
+      </w:pPr>
+      <w:r>
+        <w:rPr>
+          <w:rFonts w:ascii="Segoe UI" w:hAnsi="Segoe UI" w:eastAsia="Segoe UI" w:cs="Segoe UI"/>
+          <w:b w:val="1"/>
+          <w:bCs w:val="1"/>
+          <w:i w:val="1"/>
+          <w:iCs w:val="1"/>
+          <w:noProof w:val="0"/>
+          <w:color w:val="FF0000"/>
+          <w:sz w:val="32"/>
+          <w:szCs w:val="32"/>
+          <w:u w:val="single"/>
+          <w:lang w:val="en-GB"/>
+        </w:rPr>
+        <w:t>Resource &amp; API Resource Routes:</w:t>
+      </w:r>
+    </w:p>
+    <w:p>
+      <w:pPr>
+        <w:pStyle w:val="Normal"/>
+        <w:spacing w:before="240" w:beforeAutospacing="off" w:after="240" w:afterAutospacing="off"/>
+      </w:pPr>
+      <w:r>
+        <w:rPr>
+          <w:rFonts w:ascii="Segoe UI" w:hAnsi="Segoe UI" w:eastAsia="Segoe UI" w:cs="Segoe UI"/>
+          <w:noProof w:val="0"/>
+          <w:sz w:val="32"/>
+          <w:szCs w:val="32"/>
+          <w:lang w:val="en-GB"/>
+        </w:rPr>
+        <w:t>Replace many manual CRUD routes with one line</w:t>
+      </w:r>
+    </w:p>
+    <w:p>
+      <w:pPr>
+        <w:pStyle w:val="Normal"/>
+        <w:spacing w:before="240" w:beforeAutospacing="off" w:after="240" w:afterAutospacing="off"/>
+      </w:pPr>
+      <w:r>
+        <w:rPr>
+          <w:rFonts w:ascii="Segoe UI" w:hAnsi="Segoe UI" w:eastAsia="Segoe UI" w:cs="Segoe UI"/>
+          <w:noProof w:val="0"/>
+          <w:sz w:val="22"/>
+          <w:szCs w:val="22"/>
+          <w:lang w:val="en-GB"/>
+        </w:rPr>
+        <w:t>Without resource routes, a typical CRUD setup might look like:</w:t>
+      </w:r>
+    </w:p>
+    <w:p>
+      <w:pPr>
+        <w:pStyle w:val="Normal"/>
+        <w:spacing w:before="240" w:beforeAutospacing="off" w:after="240" w:afterAutospacing="off"/>
+      </w:pPr>
+      <w:r>
+        <w:rPr>
+          <w:rFonts w:ascii="Segoe UI" w:hAnsi="Segoe UI" w:eastAsia="Segoe UI" w:cs="Segoe UI"/>
+          <w:noProof w:val="0"/>
+          <w:sz w:val="22"/>
+          <w:szCs w:val="22"/>
+          <w:lang w:val="en-GB"/>
+        </w:rPr>
+        <w:t>Route::get('/posts', [PostController::class, 'index']);        // list</w:t>
+      </w:r>
+    </w:p>
+    <w:p>
+      <w:pPr>
+        <w:pStyle w:val="Normal"/>
+        <w:spacing w:before="240" w:beforeAutospacing="off" w:after="240" w:afterAutospacing="off"/>
+      </w:pPr>
+      <w:r>
+        <w:rPr>
+          <w:rFonts w:ascii="Segoe UI" w:hAnsi="Segoe UI" w:eastAsia="Segoe UI" w:cs="Segoe UI"/>
+          <w:noProof w:val="0"/>
+          <w:sz w:val="22"/>
+          <w:szCs w:val="22"/>
+          <w:lang w:val="en-GB"/>
+        </w:rPr>
+        <w:t>Route::get('/posts/create', [PostController::class, 'create']); // form to create</w:t>
+      </w:r>
+    </w:p>
+    <w:p>
+      <w:pPr>
+        <w:pStyle w:val="Normal"/>
+        <w:spacing w:before="240" w:beforeAutospacing="off" w:after="240" w:afterAutospacing="off"/>
+      </w:pPr>
+      <w:r>
+        <w:rPr>
+          <w:rFonts w:ascii="Segoe UI" w:hAnsi="Segoe UI" w:eastAsia="Segoe UI" w:cs="Segoe UI"/>
+          <w:noProof w:val="0"/>
+          <w:sz w:val="22"/>
+          <w:szCs w:val="22"/>
+          <w:lang w:val="en-GB"/>
+        </w:rPr>
+        <w:t>Route::post('/posts', [PostController::class, 'store']);        // save new</w:t>
+      </w:r>
+    </w:p>
+    <w:p>
+      <w:pPr>
+        <w:pStyle w:val="Normal"/>
+        <w:spacing w:before="240" w:beforeAutospacing="off" w:after="240" w:afterAutospacing="off"/>
+      </w:pPr>
+      <w:r>
+        <w:rPr>
+          <w:rFonts w:ascii="Segoe UI" w:hAnsi="Segoe UI" w:eastAsia="Segoe UI" w:cs="Segoe UI"/>
+          <w:noProof w:val="0"/>
+          <w:sz w:val="22"/>
+          <w:szCs w:val="22"/>
+          <w:lang w:val="en-GB"/>
+        </w:rPr>
+        <w:t>Route::get('/posts/{post}', [PostController::class, 'show']);   // show one</w:t>
+      </w:r>
+    </w:p>
+    <w:p>
+      <w:pPr>
+        <w:pStyle w:val="Normal"/>
+        <w:spacing w:before="240" w:beforeAutospacing="off" w:after="240" w:afterAutospacing="off"/>
+      </w:pPr>
+      <w:r>
+        <w:rPr>
+          <w:rFonts w:ascii="Segoe UI" w:hAnsi="Segoe UI" w:eastAsia="Segoe UI" w:cs="Segoe UI"/>
+          <w:noProof w:val="0"/>
+          <w:sz w:val="22"/>
+          <w:szCs w:val="22"/>
+          <w:lang w:val="en-GB"/>
+        </w:rPr>
+        <w:t>Route::get('/posts/{post}/edit', [PostController::class, 'edit']); // form to edit</w:t>
+      </w:r>
+    </w:p>
+    <w:p>
+      <w:pPr>
+        <w:pStyle w:val="Normal"/>
+        <w:spacing w:before="240" w:beforeAutospacing="off" w:after="240" w:afterAutospacing="off"/>
+      </w:pPr>
+      <w:r>
+        <w:rPr>
+          <w:rFonts w:ascii="Segoe UI" w:hAnsi="Segoe UI" w:eastAsia="Segoe UI" w:cs="Segoe UI"/>
+          <w:noProof w:val="0"/>
+          <w:sz w:val="22"/>
+          <w:szCs w:val="22"/>
+          <w:lang w:val="en-GB"/>
+        </w:rPr>
+        <w:t>Route::put('/posts/{post}', [PostController::class, 'update']); // update</w:t>
+      </w:r>
+    </w:p>
+    <w:p>
+      <w:pPr>
+        <w:pStyle w:val="Normal"/>
+        <w:spacing w:before="240" w:beforeAutospacing="off" w:after="240" w:afterAutospacing="off"/>
+      </w:pPr>
+      <w:r>
+        <w:rPr>
+          <w:rFonts w:ascii="Segoe UI" w:hAnsi="Segoe UI" w:eastAsia="Segoe UI" w:cs="Segoe UI"/>
+          <w:noProof w:val="0"/>
+          <w:sz w:val="22"/>
+          <w:szCs w:val="22"/>
+          <w:lang w:val="en-GB"/>
+        </w:rPr>
+        <w:t>Route::delete('/posts/{post}', [PostController::class, 'destroy']); // delete</w:t>
+      </w:r>
+    </w:p>
+    <w:p>
+      <w:pPr>
+        <w:pStyle w:val="Normal"/>
+        <w:spacing w:before="240" w:beforeAutospacing="off" w:after="240" w:afterAutospacing="off"/>
+        <w:rPr>
+          <w:rFonts w:ascii="Segoe UI" w:hAnsi="Segoe UI" w:eastAsia="Segoe UI" w:cs="Segoe UI"/>
+          <w:noProof w:val="0"/>
+          <w:sz w:val="22"/>
+          <w:szCs w:val="22"/>
+          <w:lang w:val="en-GB"/>
+        </w:rPr>
+      </w:pPr>
+    </w:p>
+    <w:p>
+      <w:pPr>
+        <w:pStyle w:val="Heading2"/>
+        <w:spacing w:before="299" w:beforeAutospacing="off" w:after="299" w:afterAutospacing="off"/>
+      </w:pPr>
+      <w:r>
+        <w:rPr>
+          <w:rFonts w:ascii="Segoe UI" w:hAnsi="Segoe UI" w:eastAsia="Segoe UI" w:cs="Segoe UI"/>
+          <w:b w:val="1"/>
+          <w:bCs w:val="1"/>
+          <w:noProof w:val="0"/>
+          <w:sz w:val="36"/>
+          <w:szCs w:val="36"/>
+          <w:lang w:val="en-GB"/>
+        </w:rPr>
+        <w:t xml:space="preserve">2. Basic </w:t>
+      </w:r>
+      <w:r>
+        <w:rPr>
+          <w:rFonts w:ascii="Consolas" w:hAnsi="Consolas" w:eastAsia="Consolas" w:cs="Consolas"/>
+          <w:b w:val="1"/>
+          <w:bCs w:val="1"/>
+          <w:noProof w:val="0"/>
+          <w:sz w:val="36"/>
+          <w:szCs w:val="36"/>
+          <w:lang w:val="en-GB"/>
+        </w:rPr>
+        <w:t>resource</w:t>
+      </w:r>
+      <w:r>
+        <w:rPr>
+          <w:rFonts w:ascii="Segoe UI" w:hAnsi="Segoe UI" w:eastAsia="Segoe UI" w:cs="Segoe UI"/>
+          <w:b w:val="1"/>
+          <w:bCs w:val="1"/>
+          <w:noProof w:val="0"/>
+          <w:sz w:val="36"/>
+          <w:szCs w:val="36"/>
+          <w:lang w:val="en-GB"/>
+        </w:rPr>
+        <w:t xml:space="preserve"> route</w:t>
+      </w:r>
+    </w:p>
+    <w:p>
+      <w:pPr>
+        <w:spacing w:before="240" w:beforeAutospacing="off" w:after="240" w:afterAutospacing="off"/>
+        <w:rPr>
+          <w:rFonts w:ascii="Segoe UI" w:hAnsi="Segoe UI" w:eastAsia="Segoe UI" w:cs="Segoe UI"/>
+          <w:noProof w:val="0"/>
+          <w:sz w:val="22"/>
+          <w:szCs w:val="22"/>
+          <w:lang w:val="en-GB"/>
+        </w:rPr>
+      </w:pPr>
+    </w:p>
+    <w:p>
+      <w:pPr>
+        <w:spacing w:before="240" w:beforeAutospacing="off" w:after="240" w:afterAutospacing="off"/>
+        <w:rPr>
+          <w:rFonts w:ascii="Segoe UI" w:hAnsi="Segoe UI" w:eastAsia="Segoe UI" w:cs="Segoe UI"/>
+          <w:noProof w:val="0"/>
+          <w:sz w:val="22"/>
+          <w:szCs w:val="22"/>
+          <w:lang w:val="en-GB"/>
+        </w:rPr>
+      </w:pPr>
+    </w:p>
+    <w:p>
+      <w:pPr>
+        <w:spacing w:before="240" w:beforeAutospacing="off" w:after="240" w:afterAutospacing="off"/>
+      </w:pPr>
+      <w:r>
+        <w:rPr>
+          <w:rFonts w:ascii="Segoe UI" w:hAnsi="Segoe UI" w:eastAsia="Segoe UI" w:cs="Segoe UI"/>
+          <w:noProof w:val="0"/>
+          <w:sz w:val="22"/>
+          <w:szCs w:val="22"/>
+          <w:lang w:val="en-GB"/>
+        </w:rPr>
+        <w:t xml:space="preserve">In </w:t>
+      </w:r>
+      <w:r>
+        <w:rPr>
+          <w:rFonts w:ascii="Consolas" w:hAnsi="Consolas" w:eastAsia="Consolas" w:cs="Consolas"/>
+          <w:noProof w:val="0"/>
+          <w:sz w:val="22"/>
+          <w:szCs w:val="22"/>
+          <w:lang w:val="en-GB"/>
+        </w:rPr>
+        <w:t>routes/web.php</w:t>
+      </w:r>
+      <w:r>
+        <w:rPr>
+          <w:rFonts w:ascii="Segoe UI" w:hAnsi="Segoe UI" w:eastAsia="Segoe UI" w:cs="Segoe UI"/>
+          <w:noProof w:val="0"/>
+          <w:sz w:val="22"/>
+          <w:szCs w:val="22"/>
+          <w:lang w:val="en-GB"/>
+        </w:rPr>
+        <w:t>:</w:t>
+      </w:r>
+    </w:p>
+    <w:p>
+      <w:pPr>
+        <w:spacing w:before="0" w:beforeAutospacing="off" w:after="0" w:afterAutospacing="off"/>
+      </w:pPr>
+      <w:r>
+        <w:rPr>
+          <w:rFonts w:ascii="Consolas" w:hAnsi="Consolas" w:eastAsia="Consolas" w:cs="Consolas"/>
+          <w:noProof w:val="0"/>
+          <w:sz w:val="22"/>
+          <w:szCs w:val="22"/>
+          <w:lang w:val="en-GB"/>
+        </w:rPr>
+        <w:t>php</w:t>
+      </w:r>
+    </w:p>
+    <w:p>
+      <w:pPr>
+        <w:spacing w:before="0" w:beforeAutospacing="off" w:after="0" w:afterAutospacing="off"/>
+        <w:jc w:val="right"/>
+        <w:rPr>
+          <w:rFonts w:ascii="Consolas" w:hAnsi="Consolas" w:eastAsia="Consolas" w:cs="Consolas"/>
+          <w:noProof w:val="0"/>
+          <w:color w:val="4C94D8" w:themeColor="text2" w:themeTint="80" w:themeShade="FF"/>
+          <w:sz w:val="22"/>
+          <w:szCs w:val="22"/>
+          <w:lang w:val="en-GB"/>
+        </w:rPr>
+      </w:pPr>
+      <w:r>
+        <w:rPr>
+          <w:rFonts w:ascii="Consolas" w:hAnsi="Consolas" w:eastAsia="Consolas" w:cs="Consolas"/>
+          <w:noProof w:val="0"/>
+          <w:color w:val="4C94D8" w:themeColor="text2" w:themeTint="80" w:themeShade="FF"/>
+          <w:sz w:val="22"/>
+          <w:szCs w:val="22"/>
+          <w:lang w:val="en-GB"/>
+        </w:rPr>
+        <w:t>use App\Http\Controllers\</w:t>
+      </w:r>
+      <w:r>
+        <w:rPr>
+          <w:rFonts w:ascii="Consolas" w:hAnsi="Consolas" w:eastAsia="Consolas" w:cs="Consolas"/>
+          <w:noProof w:val="0"/>
+          <w:color w:val="4C94D8" w:themeColor="text2" w:themeTint="80" w:themeShade="FF"/>
+          <w:sz w:val="22"/>
+          <w:szCs w:val="22"/>
+          <w:lang w:val="en-GB"/>
+        </w:rPr>
+        <w:t>PostController</w:t>
+      </w:r>
+      <w:r>
+        <w:rPr>
+          <w:rFonts w:ascii="Consolas" w:hAnsi="Consolas" w:eastAsia="Consolas" w:cs="Consolas"/>
+          <w:noProof w:val="0"/>
+          <w:color w:val="4C94D8" w:themeColor="text2" w:themeTint="80" w:themeShade="FF"/>
+          <w:sz w:val="22"/>
+          <w:szCs w:val="22"/>
+          <w:lang w:val="en-GB"/>
+        </w:rPr>
+        <w:t>;</w:t>
+      </w:r>
+      <w:r>
+        <w:br/>
+      </w:r>
+      <w:r>
+        <w:rPr>
+          <w:rFonts w:ascii="Consolas" w:hAnsi="Consolas" w:eastAsia="Consolas" w:cs="Consolas"/>
+          <w:noProof w:val="0"/>
+          <w:color w:val="4C94D8" w:themeColor="text2" w:themeTint="80" w:themeShade="FF"/>
+          <w:sz w:val="22"/>
+          <w:szCs w:val="22"/>
+          <w:lang w:val="en-GB"/>
+        </w:rPr>
+        <w:t>use Illuminate\Support\Facades\Route;</w:t>
+      </w:r>
+      <w:r>
+        <w:br/>
+      </w:r>
+      <w:r>
+        <w:br/>
+      </w:r>
+    </w:p>
+    <w:p>
+      <w:pPr>
+        <w:spacing w:before="0" w:beforeAutospacing="off" w:after="0" w:afterAutospacing="off"/>
+        <w:jc w:val="right"/>
+        <w:rPr>
+          <w:rFonts w:ascii="Consolas" w:hAnsi="Consolas" w:eastAsia="Consolas" w:cs="Consolas"/>
+          <w:b w:val="1"/>
+          <w:bCs w:val="1"/>
+          <w:noProof w:val="0"/>
+          <w:color w:val="4C94D8" w:themeColor="text2" w:themeTint="80" w:themeShade="FF"/>
+          <w:sz w:val="24"/>
+          <w:szCs w:val="24"/>
+          <w:lang w:val="en-GB"/>
+        </w:rPr>
+      </w:pPr>
+    </w:p>
+    <w:p>
+      <w:pPr>
+        <w:spacing w:before="0" w:beforeAutospacing="off" w:after="0" w:afterAutospacing="off"/>
+        <w:jc w:val="right"/>
+      </w:pPr>
+      <w:r>
+        <w:rPr>
+          <w:rFonts w:ascii="Consolas" w:hAnsi="Consolas" w:eastAsia="Consolas" w:cs="Consolas"/>
+          <w:b w:val="1"/>
+          <w:bCs w:val="1"/>
+          <w:noProof w:val="0"/>
+          <w:color w:val="4C94D8" w:themeColor="text2" w:themeTint="80" w:themeShade="FF"/>
+          <w:sz w:val="24"/>
+          <w:szCs w:val="24"/>
+          <w:lang w:val="en-GB"/>
+        </w:rPr>
+        <w:t>Route::</w:t>
+      </w:r>
+      <w:r>
+        <w:rPr>
+          <w:rFonts w:ascii="Consolas" w:hAnsi="Consolas" w:eastAsia="Consolas" w:cs="Consolas"/>
+          <w:b w:val="1"/>
+          <w:bCs w:val="1"/>
+          <w:noProof w:val="0"/>
+          <w:color w:val="4C94D8" w:themeColor="text2" w:themeTint="80" w:themeShade="FF"/>
+          <w:sz w:val="24"/>
+          <w:szCs w:val="24"/>
+          <w:lang w:val="en-GB"/>
+        </w:rPr>
+        <w:t>resource(</w:t>
+      </w:r>
+      <w:r>
+        <w:rPr>
+          <w:rFonts w:ascii="Consolas" w:hAnsi="Consolas" w:eastAsia="Consolas" w:cs="Consolas"/>
+          <w:b w:val="1"/>
+          <w:bCs w:val="1"/>
+          <w:noProof w:val="0"/>
+          <w:color w:val="4C94D8" w:themeColor="text2" w:themeTint="80" w:themeShade="FF"/>
+          <w:sz w:val="24"/>
+          <w:szCs w:val="24"/>
+          <w:lang w:val="en-GB"/>
+        </w:rPr>
+        <w:t xml:space="preserve">'posts', </w:t>
+      </w:r>
+      <w:r>
+        <w:rPr>
+          <w:rFonts w:ascii="Consolas" w:hAnsi="Consolas" w:eastAsia="Consolas" w:cs="Consolas"/>
+          <w:b w:val="1"/>
+          <w:bCs w:val="1"/>
+          <w:noProof w:val="0"/>
+          <w:color w:val="4C94D8" w:themeColor="text2" w:themeTint="80" w:themeShade="FF"/>
+          <w:sz w:val="24"/>
+          <w:szCs w:val="24"/>
+          <w:lang w:val="en-GB"/>
+        </w:rPr>
+        <w:t>PostController</w:t>
+      </w:r>
+      <w:r>
+        <w:rPr>
+          <w:rFonts w:ascii="Consolas" w:hAnsi="Consolas" w:eastAsia="Consolas" w:cs="Consolas"/>
+          <w:b w:val="1"/>
+          <w:bCs w:val="1"/>
+          <w:noProof w:val="0"/>
+          <w:color w:val="4C94D8" w:themeColor="text2" w:themeTint="80" w:themeShade="FF"/>
+          <w:sz w:val="24"/>
+          <w:szCs w:val="24"/>
+          <w:lang w:val="en-GB"/>
+        </w:rPr>
+        <w:t>::class);</w:t>
+      </w:r>
+    </w:p>
+    <w:p>
+      <w:pPr>
+        <w:pStyle w:val="Normal"/>
+        <w:spacing w:before="0" w:beforeAutospacing="off" w:after="0" w:afterAutospacing="off"/>
+        <w:jc w:val="right"/>
+        <w:rPr>
+          <w:rFonts w:ascii="Consolas" w:hAnsi="Consolas" w:eastAsia="Consolas" w:cs="Consolas"/>
+          <w:noProof w:val="0"/>
+          <w:sz w:val="24"/>
+          <w:szCs w:val="24"/>
+          <w:lang w:val="en-GB"/>
+        </w:rPr>
+      </w:pPr>
+    </w:p>
+    <w:p>
+      <w:pPr>
+        <w:pStyle w:val="Normal"/>
+        <w:spacing w:before="0" w:beforeAutospacing="off" w:after="0" w:afterAutospacing="off"/>
+        <w:jc w:val="right"/>
+      </w:pPr>
+      <w:r>
+        <w:rPr>
+          <w:rFonts w:ascii="Consolas" w:hAnsi="Consolas" w:eastAsia="Consolas" w:cs="Consolas"/>
+          <w:noProof w:val="0"/>
+          <w:sz w:val="24"/>
+          <w:szCs w:val="24"/>
+          <w:lang w:val="en-GB"/>
+        </w:rPr>
+        <w:t>This single line creates these routes:</w:t>
+      </w:r>
+    </w:p>
+    <w:p>
+      <w:pPr>
+        <w:pStyle w:val="Normal"/>
+        <w:spacing w:before="240" w:beforeAutospacing="off" w:after="240" w:afterAutospacing="off"/>
+        <w:rPr>
+          <w:rFonts w:ascii="Segoe UI" w:hAnsi="Segoe UI" w:eastAsia="Segoe UI" w:cs="Segoe UI"/>
+          <w:noProof w:val="0"/>
+          <w:sz w:val="22"/>
+          <w:szCs w:val="22"/>
+          <w:lang w:val="en-GB"/>
+        </w:rPr>
+      </w:pPr>
+    </w:p>
+    <w:tbl>
+      <w:tblPr>
+        <w:tblStyle w:val="TableNormal"/>
+        <w:bidiVisual w:val="0"/>
+        <w:tblW w:w="0" w:type="auto"/>
+        <w:tblLook w:val="06A0" w:firstRow="1" w:lastRow="0" w:firstColumn="1" w:lastColumn="0" w:noHBand="1" w:noVBand="1"/>
+      </w:tblPr>
+      <w:tblGrid>
+        <w:gridCol w:w="1943"/>
+        <w:gridCol w:w="3418"/>
+        <w:gridCol w:w="1611"/>
+        <w:gridCol w:w="2043"/>
+      </w:tblGrid>
+      <w:tr>
+        <w:trPr>
+          <w:trHeight w:val="300"/>
+        </w:trPr>
+        <w:tc>
+          <w:tcPr>
+            <w:tcW w:w="1943" w:type="dxa"/>
+            <w:tcBorders>
+              <w:top w:val="single" w:color="DDDDDD" w:sz="6"/>
+              <w:left w:val="single" w:color="DDDDDD" w:sz="6"/>
+              <w:bottom w:val="single" w:color="DDDDDD" w:sz="6"/>
+              <w:right w:val="single" w:color="DDDDDD" w:sz="6"/>
+            </w:tcBorders>
+            <w:shd w:val="clear" w:color="auto" w:fill="F2F2F2" w:themeFill="background1" w:themeFillShade="F2"/>
+            <w:tcMar>
+              <w:top w:w="120" w:type="dxa"/>
+              <w:left w:w="120" w:type="dxa"/>
+              <w:bottom w:w="120" w:type="dxa"/>
+              <w:right w:w="120" w:type="dxa"/>
+            </w:tcMar>
+            <w:vAlign w:val="center"/>
+          </w:tcPr>
+          <w:p>
+            <w:pPr>
+              <w:spacing w:before="0" w:beforeAutospacing="off" w:after="0" w:afterAutospacing="off"/>
+              <w:jc w:val="left"/>
+            </w:pPr>
+            <w:r>
+              <w:rPr>
+                <w:rFonts w:ascii="Arial" w:hAnsi="Arial" w:eastAsia="Arial" w:cs="Arial"/>
+                <w:b w:val="1"/>
+                <w:bCs w:val="1"/>
+              </w:rPr>
+              <w:t>Method</w:t>
+            </w:r>
+          </w:p>
+        </w:tc>
+        <w:tc>
+          <w:tcPr>
+            <w:tcW w:w="3418" w:type="dxa"/>
+            <w:tcBorders>
+              <w:top w:val="single" w:color="DDDDDD" w:sz="6"/>
+              <w:left w:val="single" w:color="DDDDDD" w:sz="6"/>
+              <w:bottom w:val="single" w:color="DDDDDD" w:sz="6"/>
+              <w:right w:val="single" w:color="DDDDDD" w:sz="6"/>
+            </w:tcBorders>
+            <w:shd w:val="clear" w:color="auto" w:fill="F2F2F2" w:themeFill="background1" w:themeFillShade="F2"/>
+            <w:tcMar>
+              <w:top w:w="120" w:type="dxa"/>
+              <w:left w:w="120" w:type="dxa"/>
+              <w:bottom w:w="120" w:type="dxa"/>
+              <w:right w:w="120" w:type="dxa"/>
+            </w:tcMar>
+            <w:vAlign w:val="center"/>
+          </w:tcPr>
+          <w:p>
+            <w:pPr>
+              <w:spacing w:before="0" w:beforeAutospacing="off" w:after="0" w:afterAutospacing="off"/>
+              <w:jc w:val="left"/>
+            </w:pPr>
+            <w:r>
+              <w:rPr>
+                <w:rFonts w:ascii="Arial" w:hAnsi="Arial" w:eastAsia="Arial" w:cs="Arial"/>
+                <w:b w:val="1"/>
+                <w:bCs w:val="1"/>
+              </w:rPr>
+              <w:t>URI</w:t>
+            </w:r>
+          </w:p>
+        </w:tc>
+        <w:tc>
+          <w:tcPr>
+            <w:tcW w:w="1611" w:type="dxa"/>
+            <w:tcBorders>
+              <w:top w:val="single" w:color="DDDDDD" w:sz="6"/>
+              <w:left w:val="single" w:color="DDDDDD" w:sz="6"/>
+              <w:bottom w:val="single" w:color="DDDDDD" w:sz="6"/>
+              <w:right w:val="single" w:color="DDDDDD" w:sz="6"/>
+            </w:tcBorders>
+            <w:shd w:val="clear" w:color="auto" w:fill="F2F2F2" w:themeFill="background1" w:themeFillShade="F2"/>
+            <w:tcMar>
+              <w:top w:w="120" w:type="dxa"/>
+              <w:left w:w="120" w:type="dxa"/>
+              <w:bottom w:w="120" w:type="dxa"/>
+              <w:right w:w="120" w:type="dxa"/>
+            </w:tcMar>
+            <w:vAlign w:val="center"/>
+          </w:tcPr>
+          <w:p>
+            <w:pPr>
+              <w:spacing w:before="0" w:beforeAutospacing="off" w:after="0" w:afterAutospacing="off"/>
+              <w:jc w:val="left"/>
+            </w:pPr>
+            <w:r>
+              <w:rPr>
+                <w:rFonts w:ascii="Arial" w:hAnsi="Arial" w:eastAsia="Arial" w:cs="Arial"/>
+                <w:b w:val="1"/>
+                <w:bCs w:val="1"/>
+              </w:rPr>
+              <w:t>Action</w:t>
+            </w:r>
+          </w:p>
+        </w:tc>
+        <w:tc>
+          <w:tcPr>
+            <w:tcW w:w="2043" w:type="dxa"/>
+            <w:tcBorders>
+              <w:top w:val="single" w:color="DDDDDD" w:sz="6"/>
+              <w:left w:val="single" w:color="DDDDDD" w:sz="6"/>
+              <w:bottom w:val="single" w:color="DDDDDD" w:sz="6"/>
+              <w:right w:val="single" w:color="DDDDDD" w:sz="6"/>
+            </w:tcBorders>
+            <w:shd w:val="clear" w:color="auto" w:fill="F2F2F2" w:themeFill="background1" w:themeFillShade="F2"/>
+            <w:tcMar>
+              <w:top w:w="120" w:type="dxa"/>
+              <w:left w:w="120" w:type="dxa"/>
+              <w:bottom w:w="120" w:type="dxa"/>
+              <w:right w:w="120" w:type="dxa"/>
+            </w:tcMar>
+            <w:vAlign w:val="center"/>
+          </w:tcPr>
+          <w:p>
+            <w:pPr>
+              <w:spacing w:before="0" w:beforeAutospacing="off" w:after="0" w:afterAutospacing="off"/>
+              <w:jc w:val="left"/>
+            </w:pPr>
+            <w:r>
+              <w:rPr>
+                <w:rFonts w:ascii="Arial" w:hAnsi="Arial" w:eastAsia="Arial" w:cs="Arial"/>
+                <w:b w:val="1"/>
+                <w:bCs w:val="1"/>
+              </w:rPr>
+              <w:t>Route Name</w:t>
+            </w:r>
+          </w:p>
+        </w:tc>
+      </w:tr>
+      <w:tr>
+        <w:trPr>
+          <w:trHeight w:val="300"/>
+        </w:trPr>
+        <w:tc>
+          <w:tcPr>
+            <w:tcW w:w="1943" w:type="dxa"/>
+            <w:tcBorders>
+              <w:top w:val="single" w:color="DDDDDD" w:sz="6"/>
+              <w:left w:val="single" w:color="DDDDDD" w:sz="6"/>
+              <w:bottom w:val="single" w:color="DDDDDD" w:sz="6"/>
+              <w:right w:val="single" w:color="DDDDDD" w:sz="6"/>
+            </w:tcBorders>
+            <w:tcMar>
+              <w:top w:w="120" w:type="dxa"/>
+              <w:left w:w="120" w:type="dxa"/>
+              <w:bottom w:w="120" w:type="dxa"/>
+              <w:right w:w="120" w:type="dxa"/>
+            </w:tcMar>
+            <w:vAlign w:val="center"/>
+          </w:tcPr>
+          <w:p>
+            <w:pPr>
+              <w:spacing w:before="0" w:beforeAutospacing="off" w:after="0" w:afterAutospacing="off"/>
+              <w:jc w:val="left"/>
+            </w:pPr>
+            <w:r>
+              <w:rPr>
+                <w:rFonts w:ascii="Arial" w:hAnsi="Arial" w:eastAsia="Arial" w:cs="Arial"/>
+              </w:rPr>
+              <w:t>GET</w:t>
+            </w:r>
+          </w:p>
+        </w:tc>
+        <w:tc>
+          <w:tcPr>
+            <w:tcW w:w="3418" w:type="dxa"/>
+            <w:tcBorders>
+              <w:top w:val="single" w:color="DDDDDD" w:sz="6"/>
+              <w:left w:val="single" w:color="DDDDDD" w:sz="6"/>
+              <w:bottom w:val="single" w:color="DDDDDD" w:sz="6"/>
+              <w:right w:val="single" w:color="DDDDDD" w:sz="6"/>
+            </w:tcBorders>
+            <w:tcMar>
+              <w:top w:w="120" w:type="dxa"/>
+              <w:left w:w="120" w:type="dxa"/>
+              <w:bottom w:w="120" w:type="dxa"/>
+              <w:right w:w="120" w:type="dxa"/>
+            </w:tcMar>
+            <w:vAlign w:val="center"/>
+          </w:tcPr>
+          <w:p>
+            <w:pPr>
+              <w:spacing w:before="0" w:beforeAutospacing="off" w:after="0" w:afterAutospacing="off"/>
+              <w:jc w:val="left"/>
+            </w:pPr>
+            <w:r>
+              <w:rPr>
+                <w:rFonts w:ascii="Consolas" w:hAnsi="Consolas" w:eastAsia="Consolas" w:cs="Consolas"/>
+              </w:rPr>
+              <w:t>/posts</w:t>
+            </w:r>
+          </w:p>
+        </w:tc>
+        <w:tc>
+          <w:tcPr>
+            <w:tcW w:w="1611" w:type="dxa"/>
+            <w:tcBorders>
+              <w:top w:val="single" w:color="DDDDDD" w:sz="6"/>
+              <w:left w:val="single" w:color="DDDDDD" w:sz="6"/>
+              <w:bottom w:val="single" w:color="DDDDDD" w:sz="6"/>
+              <w:right w:val="single" w:color="DDDDDD" w:sz="6"/>
+            </w:tcBorders>
+            <w:tcMar>
+              <w:top w:w="120" w:type="dxa"/>
+              <w:left w:w="120" w:type="dxa"/>
+              <w:bottom w:w="120" w:type="dxa"/>
+              <w:right w:w="120" w:type="dxa"/>
+            </w:tcMar>
+            <w:vAlign w:val="center"/>
+          </w:tcPr>
+          <w:p>
+            <w:pPr>
+              <w:spacing w:before="0" w:beforeAutospacing="off" w:after="0" w:afterAutospacing="off"/>
+              <w:jc w:val="left"/>
+            </w:pPr>
+            <w:r>
+              <w:rPr>
+                <w:rFonts w:ascii="Arial" w:hAnsi="Arial" w:eastAsia="Arial" w:cs="Arial"/>
+              </w:rPr>
+              <w:t>index</w:t>
+            </w:r>
+          </w:p>
+        </w:tc>
+        <w:tc>
+          <w:tcPr>
+            <w:tcW w:w="2043" w:type="dxa"/>
+            <w:tcBorders>
+              <w:top w:val="single" w:color="DDDDDD" w:sz="6"/>
+              <w:left w:val="single" w:color="DDDDDD" w:sz="6"/>
+              <w:bottom w:val="single" w:color="DDDDDD" w:sz="6"/>
+              <w:right w:val="single" w:color="DDDDDD" w:sz="6"/>
+            </w:tcBorders>
+            <w:tcMar>
+              <w:top w:w="120" w:type="dxa"/>
+              <w:left w:w="120" w:type="dxa"/>
+              <w:bottom w:w="120" w:type="dxa"/>
+              <w:right w:w="120" w:type="dxa"/>
+            </w:tcMar>
+            <w:vAlign w:val="center"/>
+          </w:tcPr>
+          <w:p>
+            <w:pPr>
+              <w:spacing w:before="0" w:beforeAutospacing="off" w:after="0" w:afterAutospacing="off"/>
+              <w:jc w:val="left"/>
+            </w:pPr>
+            <w:r>
+              <w:rPr>
+                <w:rFonts w:ascii="Consolas" w:hAnsi="Consolas" w:eastAsia="Consolas" w:cs="Consolas"/>
+              </w:rPr>
+              <w:t>posts.index</w:t>
+            </w:r>
+          </w:p>
+        </w:tc>
+      </w:tr>
+      <w:tr>
+        <w:trPr>
+          <w:trHeight w:val="300"/>
+        </w:trPr>
+        <w:tc>
+          <w:tcPr>
+            <w:tcW w:w="1943" w:type="dxa"/>
+            <w:tcBorders>
+              <w:top w:val="single" w:color="DDDDDD" w:sz="6"/>
+              <w:left w:val="single" w:color="DDDDDD" w:sz="6"/>
+              <w:bottom w:val="single" w:color="DDDDDD" w:sz="6"/>
+              <w:right w:val="single" w:color="DDDDDD" w:sz="6"/>
+            </w:tcBorders>
+            <w:tcMar>
+              <w:top w:w="120" w:type="dxa"/>
+              <w:left w:w="120" w:type="dxa"/>
+              <w:bottom w:w="120" w:type="dxa"/>
+              <w:right w:w="120" w:type="dxa"/>
+            </w:tcMar>
+            <w:vAlign w:val="center"/>
+          </w:tcPr>
+          <w:p>
+            <w:pPr>
+              <w:spacing w:before="0" w:beforeAutospacing="off" w:after="0" w:afterAutospacing="off"/>
+              <w:jc w:val="left"/>
+            </w:pPr>
+            <w:r>
+              <w:rPr>
+                <w:rFonts w:ascii="Arial" w:hAnsi="Arial" w:eastAsia="Arial" w:cs="Arial"/>
+              </w:rPr>
+              <w:t>GET</w:t>
+            </w:r>
+          </w:p>
+        </w:tc>
+        <w:tc>
+          <w:tcPr>
+            <w:tcW w:w="3418" w:type="dxa"/>
+            <w:tcBorders>
+              <w:top w:val="single" w:color="DDDDDD" w:sz="6"/>
+              <w:left w:val="single" w:color="DDDDDD" w:sz="6"/>
+              <w:bottom w:val="single" w:color="DDDDDD" w:sz="6"/>
+              <w:right w:val="single" w:color="DDDDDD" w:sz="6"/>
+            </w:tcBorders>
+            <w:tcMar>
+              <w:top w:w="120" w:type="dxa"/>
+              <w:left w:w="120" w:type="dxa"/>
+              <w:bottom w:w="120" w:type="dxa"/>
+              <w:right w:w="120" w:type="dxa"/>
+            </w:tcMar>
+            <w:vAlign w:val="center"/>
+          </w:tcPr>
+          <w:p>
+            <w:pPr>
+              <w:spacing w:before="0" w:beforeAutospacing="off" w:after="0" w:afterAutospacing="off"/>
+              <w:jc w:val="left"/>
+            </w:pPr>
+            <w:r>
+              <w:rPr>
+                <w:rFonts w:ascii="Consolas" w:hAnsi="Consolas" w:eastAsia="Consolas" w:cs="Consolas"/>
+              </w:rPr>
+              <w:t>/posts/create</w:t>
+            </w:r>
+          </w:p>
+        </w:tc>
+        <w:tc>
+          <w:tcPr>
+            <w:tcW w:w="1611" w:type="dxa"/>
+            <w:tcBorders>
+              <w:top w:val="single" w:color="DDDDDD" w:sz="6"/>
+              <w:left w:val="single" w:color="DDDDDD" w:sz="6"/>
+              <w:bottom w:val="single" w:color="DDDDDD" w:sz="6"/>
+              <w:right w:val="single" w:color="DDDDDD" w:sz="6"/>
+            </w:tcBorders>
+            <w:tcMar>
+              <w:top w:w="120" w:type="dxa"/>
+              <w:left w:w="120" w:type="dxa"/>
+              <w:bottom w:w="120" w:type="dxa"/>
+              <w:right w:w="120" w:type="dxa"/>
+            </w:tcMar>
+            <w:vAlign w:val="center"/>
+          </w:tcPr>
+          <w:p>
+            <w:pPr>
+              <w:spacing w:before="0" w:beforeAutospacing="off" w:after="0" w:afterAutospacing="off"/>
+              <w:jc w:val="left"/>
+            </w:pPr>
+            <w:r>
+              <w:rPr>
+                <w:rFonts w:ascii="Arial" w:hAnsi="Arial" w:eastAsia="Arial" w:cs="Arial"/>
+              </w:rPr>
+              <w:t>create</w:t>
+            </w:r>
+          </w:p>
+        </w:tc>
+        <w:tc>
+          <w:tcPr>
+            <w:tcW w:w="2043" w:type="dxa"/>
+            <w:tcBorders>
+              <w:top w:val="single" w:color="DDDDDD" w:sz="6"/>
+              <w:left w:val="single" w:color="DDDDDD" w:sz="6"/>
+              <w:bottom w:val="single" w:color="DDDDDD" w:sz="6"/>
+              <w:right w:val="single" w:color="DDDDDD" w:sz="6"/>
+            </w:tcBorders>
+            <w:tcMar>
+              <w:top w:w="120" w:type="dxa"/>
+              <w:left w:w="120" w:type="dxa"/>
+              <w:bottom w:w="120" w:type="dxa"/>
+              <w:right w:w="120" w:type="dxa"/>
+            </w:tcMar>
+            <w:vAlign w:val="center"/>
+          </w:tcPr>
+          <w:p>
+            <w:pPr>
+              <w:spacing w:before="0" w:beforeAutospacing="off" w:after="0" w:afterAutospacing="off"/>
+              <w:jc w:val="left"/>
+            </w:pPr>
+            <w:r>
+              <w:rPr>
+                <w:rFonts w:ascii="Consolas" w:hAnsi="Consolas" w:eastAsia="Consolas" w:cs="Consolas"/>
+              </w:rPr>
+              <w:t>posts.create</w:t>
+            </w:r>
+          </w:p>
+        </w:tc>
+      </w:tr>
+      <w:tr>
+        <w:trPr>
+          <w:trHeight w:val="300"/>
+        </w:trPr>
+        <w:tc>
+          <w:tcPr>
+            <w:tcW w:w="1943" w:type="dxa"/>
+            <w:tcBorders>
+              <w:top w:val="single" w:color="DDDDDD" w:sz="6"/>
+              <w:left w:val="single" w:color="DDDDDD" w:sz="6"/>
+              <w:bottom w:val="single" w:color="DDDDDD" w:sz="6"/>
+              <w:right w:val="single" w:color="DDDDDD" w:sz="6"/>
+            </w:tcBorders>
+            <w:tcMar>
+              <w:top w:w="120" w:type="dxa"/>
+              <w:left w:w="120" w:type="dxa"/>
+              <w:bottom w:w="120" w:type="dxa"/>
+              <w:right w:w="120" w:type="dxa"/>
+            </w:tcMar>
+            <w:vAlign w:val="center"/>
+          </w:tcPr>
+          <w:p>
+            <w:pPr>
+              <w:spacing w:before="0" w:beforeAutospacing="off" w:after="0" w:afterAutospacing="off"/>
+              <w:jc w:val="left"/>
+            </w:pPr>
+            <w:r>
+              <w:rPr>
+                <w:rFonts w:ascii="Arial" w:hAnsi="Arial" w:eastAsia="Arial" w:cs="Arial"/>
+              </w:rPr>
+              <w:t>POST</w:t>
+            </w:r>
+          </w:p>
+        </w:tc>
+        <w:tc>
+          <w:tcPr>
+            <w:tcW w:w="3418" w:type="dxa"/>
+            <w:tcBorders>
+              <w:top w:val="single" w:color="DDDDDD" w:sz="6"/>
+              <w:left w:val="single" w:color="DDDDDD" w:sz="6"/>
+              <w:bottom w:val="single" w:color="DDDDDD" w:sz="6"/>
+              <w:right w:val="single" w:color="DDDDDD" w:sz="6"/>
+            </w:tcBorders>
+            <w:tcMar>
+              <w:top w:w="120" w:type="dxa"/>
+              <w:left w:w="120" w:type="dxa"/>
+              <w:bottom w:w="120" w:type="dxa"/>
+              <w:right w:w="120" w:type="dxa"/>
+            </w:tcMar>
+            <w:vAlign w:val="center"/>
+          </w:tcPr>
+          <w:p>
+            <w:pPr>
+              <w:spacing w:before="0" w:beforeAutospacing="off" w:after="0" w:afterAutospacing="off"/>
+              <w:jc w:val="left"/>
+            </w:pPr>
+            <w:r>
+              <w:rPr>
+                <w:rFonts w:ascii="Consolas" w:hAnsi="Consolas" w:eastAsia="Consolas" w:cs="Consolas"/>
+              </w:rPr>
+              <w:t>/posts</w:t>
+            </w:r>
+          </w:p>
+        </w:tc>
+        <w:tc>
+          <w:tcPr>
+            <w:tcW w:w="1611" w:type="dxa"/>
+            <w:tcBorders>
+              <w:top w:val="single" w:color="DDDDDD" w:sz="6"/>
+              <w:left w:val="single" w:color="DDDDDD" w:sz="6"/>
+              <w:bottom w:val="single" w:color="DDDDDD" w:sz="6"/>
+              <w:right w:val="single" w:color="DDDDDD" w:sz="6"/>
+            </w:tcBorders>
+            <w:tcMar>
+              <w:top w:w="120" w:type="dxa"/>
+              <w:left w:w="120" w:type="dxa"/>
+              <w:bottom w:w="120" w:type="dxa"/>
+              <w:right w:w="120" w:type="dxa"/>
+            </w:tcMar>
+            <w:vAlign w:val="center"/>
+          </w:tcPr>
+          <w:p>
+            <w:pPr>
+              <w:spacing w:before="0" w:beforeAutospacing="off" w:after="0" w:afterAutospacing="off"/>
+              <w:jc w:val="left"/>
+            </w:pPr>
+            <w:r>
+              <w:rPr>
+                <w:rFonts w:ascii="Arial" w:hAnsi="Arial" w:eastAsia="Arial" w:cs="Arial"/>
+              </w:rPr>
+              <w:t>store</w:t>
+            </w:r>
+          </w:p>
+        </w:tc>
+        <w:tc>
+          <w:tcPr>
+            <w:tcW w:w="2043" w:type="dxa"/>
+            <w:tcBorders>
+              <w:top w:val="single" w:color="DDDDDD" w:sz="6"/>
+              <w:left w:val="single" w:color="DDDDDD" w:sz="6"/>
+              <w:bottom w:val="single" w:color="DDDDDD" w:sz="6"/>
+              <w:right w:val="single" w:color="DDDDDD" w:sz="6"/>
+            </w:tcBorders>
+            <w:tcMar>
+              <w:top w:w="120" w:type="dxa"/>
+              <w:left w:w="120" w:type="dxa"/>
+              <w:bottom w:w="120" w:type="dxa"/>
+              <w:right w:w="120" w:type="dxa"/>
+            </w:tcMar>
+            <w:vAlign w:val="center"/>
+          </w:tcPr>
+          <w:p>
+            <w:pPr>
+              <w:spacing w:before="0" w:beforeAutospacing="off" w:after="0" w:afterAutospacing="off"/>
+              <w:jc w:val="left"/>
+            </w:pPr>
+            <w:r>
+              <w:rPr>
+                <w:rFonts w:ascii="Consolas" w:hAnsi="Consolas" w:eastAsia="Consolas" w:cs="Consolas"/>
+              </w:rPr>
+              <w:t>posts.store</w:t>
+            </w:r>
+          </w:p>
+        </w:tc>
+      </w:tr>
+      <w:tr>
+        <w:trPr>
+          <w:trHeight w:val="300"/>
+        </w:trPr>
+        <w:tc>
+          <w:tcPr>
+            <w:tcW w:w="1943" w:type="dxa"/>
+            <w:tcBorders>
+              <w:top w:val="single" w:color="DDDDDD" w:sz="6"/>
+              <w:left w:val="single" w:color="DDDDDD" w:sz="6"/>
+              <w:bottom w:val="single" w:color="DDDDDD" w:sz="6"/>
+              <w:right w:val="single" w:color="DDDDDD" w:sz="6"/>
+            </w:tcBorders>
+            <w:tcMar>
+              <w:top w:w="120" w:type="dxa"/>
+              <w:left w:w="120" w:type="dxa"/>
+              <w:bottom w:w="120" w:type="dxa"/>
+              <w:right w:w="120" w:type="dxa"/>
+            </w:tcMar>
+            <w:vAlign w:val="center"/>
+          </w:tcPr>
+          <w:p>
+            <w:pPr>
+              <w:spacing w:before="0" w:beforeAutospacing="off" w:after="0" w:afterAutospacing="off"/>
+              <w:jc w:val="left"/>
+            </w:pPr>
+            <w:r>
+              <w:rPr>
+                <w:rFonts w:ascii="Arial" w:hAnsi="Arial" w:eastAsia="Arial" w:cs="Arial"/>
+              </w:rPr>
+              <w:t>GET</w:t>
+            </w:r>
+          </w:p>
+        </w:tc>
+        <w:tc>
+          <w:tcPr>
+            <w:tcW w:w="3418" w:type="dxa"/>
+            <w:tcBorders>
+              <w:top w:val="single" w:color="DDDDDD" w:sz="6"/>
+              <w:left w:val="single" w:color="DDDDDD" w:sz="6"/>
+              <w:bottom w:val="single" w:color="DDDDDD" w:sz="6"/>
+              <w:right w:val="single" w:color="DDDDDD" w:sz="6"/>
+            </w:tcBorders>
+            <w:tcMar>
+              <w:top w:w="120" w:type="dxa"/>
+              <w:left w:w="120" w:type="dxa"/>
+              <w:bottom w:w="120" w:type="dxa"/>
+              <w:right w:w="120" w:type="dxa"/>
+            </w:tcMar>
+            <w:vAlign w:val="center"/>
+          </w:tcPr>
+          <w:p>
+            <w:pPr>
+              <w:spacing w:before="0" w:beforeAutospacing="off" w:after="0" w:afterAutospacing="off"/>
+              <w:jc w:val="left"/>
+            </w:pPr>
+            <w:r>
+              <w:rPr>
+                <w:rFonts w:ascii="Consolas" w:hAnsi="Consolas" w:eastAsia="Consolas" w:cs="Consolas"/>
+              </w:rPr>
+              <w:t>/posts/{post}</w:t>
+            </w:r>
+          </w:p>
+        </w:tc>
+        <w:tc>
+          <w:tcPr>
+            <w:tcW w:w="1611" w:type="dxa"/>
+            <w:tcBorders>
+              <w:top w:val="single" w:color="DDDDDD" w:sz="6"/>
+              <w:left w:val="single" w:color="DDDDDD" w:sz="6"/>
+              <w:bottom w:val="single" w:color="DDDDDD" w:sz="6"/>
+              <w:right w:val="single" w:color="DDDDDD" w:sz="6"/>
+            </w:tcBorders>
+            <w:tcMar>
+              <w:top w:w="120" w:type="dxa"/>
+              <w:left w:w="120" w:type="dxa"/>
+              <w:bottom w:w="120" w:type="dxa"/>
+              <w:right w:w="120" w:type="dxa"/>
+            </w:tcMar>
+            <w:vAlign w:val="center"/>
+          </w:tcPr>
+          <w:p>
+            <w:pPr>
+              <w:spacing w:before="0" w:beforeAutospacing="off" w:after="0" w:afterAutospacing="off"/>
+              <w:jc w:val="left"/>
+            </w:pPr>
+            <w:r>
+              <w:rPr>
+                <w:rFonts w:ascii="Arial" w:hAnsi="Arial" w:eastAsia="Arial" w:cs="Arial"/>
+              </w:rPr>
+              <w:t>show</w:t>
+            </w:r>
+          </w:p>
+        </w:tc>
+        <w:tc>
+          <w:tcPr>
+            <w:tcW w:w="2043" w:type="dxa"/>
+            <w:tcBorders>
+              <w:top w:val="single" w:color="DDDDDD" w:sz="6"/>
+              <w:left w:val="single" w:color="DDDDDD" w:sz="6"/>
+              <w:bottom w:val="single" w:color="DDDDDD" w:sz="6"/>
+              <w:right w:val="single" w:color="DDDDDD" w:sz="6"/>
+            </w:tcBorders>
+            <w:tcMar>
+              <w:top w:w="120" w:type="dxa"/>
+              <w:left w:w="120" w:type="dxa"/>
+              <w:bottom w:w="120" w:type="dxa"/>
+              <w:right w:w="120" w:type="dxa"/>
+            </w:tcMar>
+            <w:vAlign w:val="center"/>
+          </w:tcPr>
+          <w:p>
+            <w:pPr>
+              <w:spacing w:before="0" w:beforeAutospacing="off" w:after="0" w:afterAutospacing="off"/>
+              <w:jc w:val="left"/>
+            </w:pPr>
+            <w:r>
+              <w:rPr>
+                <w:rFonts w:ascii="Consolas" w:hAnsi="Consolas" w:eastAsia="Consolas" w:cs="Consolas"/>
+              </w:rPr>
+              <w:t>posts.show</w:t>
+            </w:r>
+          </w:p>
+        </w:tc>
+      </w:tr>
+      <w:tr>
+        <w:trPr>
+          <w:trHeight w:val="300"/>
+        </w:trPr>
+        <w:tc>
+          <w:tcPr>
+            <w:tcW w:w="1943" w:type="dxa"/>
+            <w:tcBorders>
+              <w:top w:val="single" w:color="DDDDDD" w:sz="6"/>
+              <w:left w:val="single" w:color="DDDDDD" w:sz="6"/>
+              <w:bottom w:val="single" w:color="DDDDDD" w:sz="6"/>
+              <w:right w:val="single" w:color="DDDDDD" w:sz="6"/>
+            </w:tcBorders>
+            <w:tcMar>
+              <w:top w:w="120" w:type="dxa"/>
+              <w:left w:w="120" w:type="dxa"/>
+              <w:bottom w:w="120" w:type="dxa"/>
+              <w:right w:w="120" w:type="dxa"/>
+            </w:tcMar>
+            <w:vAlign w:val="center"/>
+          </w:tcPr>
+          <w:p>
+            <w:pPr>
+              <w:spacing w:before="0" w:beforeAutospacing="off" w:after="0" w:afterAutospacing="off"/>
+              <w:jc w:val="left"/>
+            </w:pPr>
+            <w:r>
+              <w:rPr>
+                <w:rFonts w:ascii="Arial" w:hAnsi="Arial" w:eastAsia="Arial" w:cs="Arial"/>
+              </w:rPr>
+              <w:t>GET</w:t>
+            </w:r>
+          </w:p>
+        </w:tc>
+        <w:tc>
+          <w:tcPr>
+            <w:tcW w:w="3418" w:type="dxa"/>
+            <w:tcBorders>
+              <w:top w:val="single" w:color="DDDDDD" w:sz="6"/>
+              <w:left w:val="single" w:color="DDDDDD" w:sz="6"/>
+              <w:bottom w:val="single" w:color="DDDDDD" w:sz="6"/>
+              <w:right w:val="single" w:color="DDDDDD" w:sz="6"/>
+            </w:tcBorders>
+            <w:tcMar>
+              <w:top w:w="120" w:type="dxa"/>
+              <w:left w:w="120" w:type="dxa"/>
+              <w:bottom w:w="120" w:type="dxa"/>
+              <w:right w:w="120" w:type="dxa"/>
+            </w:tcMar>
+            <w:vAlign w:val="center"/>
+          </w:tcPr>
+          <w:p>
+            <w:pPr>
+              <w:spacing w:before="0" w:beforeAutospacing="off" w:after="0" w:afterAutospacing="off"/>
+              <w:jc w:val="left"/>
+            </w:pPr>
+            <w:r>
+              <w:rPr>
+                <w:rFonts w:ascii="Consolas" w:hAnsi="Consolas" w:eastAsia="Consolas" w:cs="Consolas"/>
+              </w:rPr>
+              <w:t>/posts/{post}/edit</w:t>
+            </w:r>
+            <w:r>
+              <w:rPr>
+                <w:rFonts w:ascii="Arial" w:hAnsi="Arial" w:eastAsia="Arial" w:cs="Arial"/>
+              </w:rPr>
+              <w:t>| edit</w:t>
+            </w:r>
+          </w:p>
+        </w:tc>
+        <w:tc>
+          <w:tcPr>
+            <w:tcW w:w="1611" w:type="dxa"/>
+            <w:tcBorders>
+              <w:top w:val="single" w:color="DDDDDD" w:sz="6"/>
+              <w:left w:val="single" w:color="DDDDDD" w:sz="6"/>
+              <w:bottom w:val="single" w:color="DDDDDD" w:sz="6"/>
+              <w:right w:val="single" w:color="DDDDDD" w:sz="6"/>
+            </w:tcBorders>
+            <w:tcMar>
+              <w:top w:w="120" w:type="dxa"/>
+              <w:left w:w="120" w:type="dxa"/>
+              <w:bottom w:w="120" w:type="dxa"/>
+              <w:right w:w="120" w:type="dxa"/>
+            </w:tcMar>
+            <w:vAlign w:val="center"/>
+          </w:tcPr>
+          <w:p>
+            <w:pPr>
+              <w:spacing w:before="0" w:beforeAutospacing="off" w:after="0" w:afterAutospacing="off"/>
+              <w:jc w:val="left"/>
+            </w:pPr>
+            <w:r>
+              <w:rPr>
+                <w:rFonts w:ascii="Consolas" w:hAnsi="Consolas" w:eastAsia="Consolas" w:cs="Consolas"/>
+              </w:rPr>
+              <w:t>posts.edit</w:t>
+            </w:r>
+          </w:p>
+        </w:tc>
+        <w:tc>
+          <w:tcPr>
+            <w:tcW w:w="2043" w:type="dxa"/>
+            <w:tcBorders>
+              <w:top w:val="single" w:color="DDDDDD" w:sz="6"/>
+              <w:left w:val="single" w:color="DDDDDD" w:sz="6"/>
+              <w:bottom w:val="single" w:color="DDDDDD" w:sz="6"/>
+              <w:right w:val="single" w:color="DDDDDD" w:sz="6"/>
+            </w:tcBorders>
+            <w:tcMar>
+              <w:top w:w="120" w:type="dxa"/>
+              <w:left w:w="120" w:type="dxa"/>
+              <w:bottom w:w="120" w:type="dxa"/>
+              <w:right w:w="120" w:type="dxa"/>
+            </w:tcMar>
+            <w:vAlign w:val="center"/>
+          </w:tcPr>
+          <w:p/>
+        </w:tc>
+      </w:tr>
+      <w:tr>
+        <w:trPr>
+          <w:trHeight w:val="300"/>
+        </w:trPr>
+        <w:tc>
+          <w:tcPr>
+            <w:tcW w:w="1943" w:type="dxa"/>
+            <w:tcBorders>
+              <w:top w:val="single" w:color="DDDDDD" w:sz="6"/>
+              <w:left w:val="single" w:color="DDDDDD" w:sz="6"/>
+              <w:bottom w:val="single" w:color="DDDDDD" w:sz="6"/>
+              <w:right w:val="single" w:color="DDDDDD" w:sz="6"/>
+            </w:tcBorders>
+            <w:tcMar>
+              <w:top w:w="120" w:type="dxa"/>
+              <w:left w:w="120" w:type="dxa"/>
+              <w:bottom w:w="120" w:type="dxa"/>
+              <w:right w:w="120" w:type="dxa"/>
+            </w:tcMar>
+            <w:vAlign w:val="center"/>
+          </w:tcPr>
+          <w:p>
+            <w:pPr>
+              <w:spacing w:before="0" w:beforeAutospacing="off" w:after="0" w:afterAutospacing="off"/>
+              <w:jc w:val="left"/>
+            </w:pPr>
+            <w:r>
+              <w:rPr>
+                <w:rFonts w:ascii="Arial" w:hAnsi="Arial" w:eastAsia="Arial" w:cs="Arial"/>
+              </w:rPr>
+              <w:t>PUT/PATCH</w:t>
+            </w:r>
+          </w:p>
+        </w:tc>
+        <w:tc>
+          <w:tcPr>
+            <w:tcW w:w="3418" w:type="dxa"/>
+            <w:tcBorders>
+              <w:top w:val="single" w:color="DDDDDD" w:sz="6"/>
+              <w:left w:val="single" w:color="DDDDDD" w:sz="6"/>
+              <w:bottom w:val="single" w:color="DDDDDD" w:sz="6"/>
+              <w:right w:val="single" w:color="DDDDDD" w:sz="6"/>
+            </w:tcBorders>
+            <w:tcMar>
+              <w:top w:w="120" w:type="dxa"/>
+              <w:left w:w="120" w:type="dxa"/>
+              <w:bottom w:w="120" w:type="dxa"/>
+              <w:right w:w="120" w:type="dxa"/>
+            </w:tcMar>
+            <w:vAlign w:val="center"/>
+          </w:tcPr>
+          <w:p>
+            <w:pPr>
+              <w:spacing w:before="0" w:beforeAutospacing="off" w:after="0" w:afterAutospacing="off"/>
+              <w:jc w:val="left"/>
+            </w:pPr>
+            <w:r>
+              <w:rPr>
+                <w:rFonts w:ascii="Consolas" w:hAnsi="Consolas" w:eastAsia="Consolas" w:cs="Consolas"/>
+              </w:rPr>
+              <w:t>/posts/{post}</w:t>
+            </w:r>
+          </w:p>
+        </w:tc>
+        <w:tc>
+          <w:tcPr>
+            <w:tcW w:w="1611" w:type="dxa"/>
+            <w:tcBorders>
+              <w:top w:val="single" w:color="DDDDDD" w:sz="6"/>
+              <w:left w:val="single" w:color="DDDDDD" w:sz="6"/>
+              <w:bottom w:val="single" w:color="DDDDDD" w:sz="6"/>
+              <w:right w:val="single" w:color="DDDDDD" w:sz="6"/>
+            </w:tcBorders>
+            <w:tcMar>
+              <w:top w:w="120" w:type="dxa"/>
+              <w:left w:w="120" w:type="dxa"/>
+              <w:bottom w:w="120" w:type="dxa"/>
+              <w:right w:w="120" w:type="dxa"/>
+            </w:tcMar>
+            <w:vAlign w:val="center"/>
+          </w:tcPr>
+          <w:p>
+            <w:pPr>
+              <w:spacing w:before="0" w:beforeAutospacing="off" w:after="0" w:afterAutospacing="off"/>
+              <w:jc w:val="left"/>
+            </w:pPr>
+            <w:r>
+              <w:rPr>
+                <w:rFonts w:ascii="Arial" w:hAnsi="Arial" w:eastAsia="Arial" w:cs="Arial"/>
+              </w:rPr>
+              <w:t>update</w:t>
+            </w:r>
+          </w:p>
+        </w:tc>
+        <w:tc>
+          <w:tcPr>
+            <w:tcW w:w="2043" w:type="dxa"/>
+            <w:tcBorders>
+              <w:top w:val="single" w:color="DDDDDD" w:sz="6"/>
+              <w:left w:val="single" w:color="DDDDDD" w:sz="6"/>
+              <w:bottom w:val="single" w:color="DDDDDD" w:sz="6"/>
+              <w:right w:val="single" w:color="DDDDDD" w:sz="6"/>
+            </w:tcBorders>
+            <w:tcMar>
+              <w:top w:w="120" w:type="dxa"/>
+              <w:left w:w="120" w:type="dxa"/>
+              <w:bottom w:w="120" w:type="dxa"/>
+              <w:right w:w="120" w:type="dxa"/>
+            </w:tcMar>
+            <w:vAlign w:val="center"/>
+          </w:tcPr>
+          <w:p>
+            <w:pPr>
+              <w:spacing w:before="0" w:beforeAutospacing="off" w:after="0" w:afterAutospacing="off"/>
+              <w:jc w:val="left"/>
+            </w:pPr>
+            <w:r>
+              <w:rPr>
+                <w:rFonts w:ascii="Consolas" w:hAnsi="Consolas" w:eastAsia="Consolas" w:cs="Consolas"/>
+              </w:rPr>
+              <w:t>posts.update</w:t>
+            </w:r>
+          </w:p>
+        </w:tc>
+      </w:tr>
+      <w:tr>
+        <w:trPr>
+          <w:trHeight w:val="300"/>
+        </w:trPr>
+        <w:tc>
+          <w:tcPr>
+            <w:tcW w:w="1943" w:type="dxa"/>
+            <w:tcBorders>
+              <w:top w:val="single" w:color="DDDDDD" w:sz="6"/>
+              <w:left w:val="single" w:color="DDDDDD" w:sz="6"/>
+              <w:bottom w:val="single" w:color="DDDDDD" w:sz="6"/>
+              <w:right w:val="single" w:color="DDDDDD" w:sz="6"/>
+            </w:tcBorders>
+            <w:tcMar>
+              <w:top w:w="120" w:type="dxa"/>
+              <w:left w:w="120" w:type="dxa"/>
+              <w:bottom w:w="120" w:type="dxa"/>
+              <w:right w:w="120" w:type="dxa"/>
+            </w:tcMar>
+            <w:vAlign w:val="center"/>
+          </w:tcPr>
+          <w:p>
+            <w:pPr>
+              <w:spacing w:before="0" w:beforeAutospacing="off" w:after="0" w:afterAutospacing="off"/>
+              <w:jc w:val="left"/>
+            </w:pPr>
+            <w:r>
+              <w:rPr>
+                <w:rFonts w:ascii="Arial" w:hAnsi="Arial" w:eastAsia="Arial" w:cs="Arial"/>
+              </w:rPr>
+              <w:t>DELETE</w:t>
+            </w:r>
+          </w:p>
+        </w:tc>
+        <w:tc>
+          <w:tcPr>
+            <w:tcW w:w="3418" w:type="dxa"/>
+            <w:tcBorders>
+              <w:top w:val="single" w:color="DDDDDD" w:sz="6"/>
+              <w:left w:val="single" w:color="DDDDDD" w:sz="6"/>
+              <w:bottom w:val="single" w:color="DDDDDD" w:sz="6"/>
+              <w:right w:val="single" w:color="DDDDDD" w:sz="6"/>
+            </w:tcBorders>
+            <w:tcMar>
+              <w:top w:w="120" w:type="dxa"/>
+              <w:left w:w="120" w:type="dxa"/>
+              <w:bottom w:w="120" w:type="dxa"/>
+              <w:right w:w="120" w:type="dxa"/>
+            </w:tcMar>
+            <w:vAlign w:val="center"/>
+          </w:tcPr>
+          <w:p>
+            <w:pPr>
+              <w:spacing w:before="0" w:beforeAutospacing="off" w:after="0" w:afterAutospacing="off"/>
+              <w:jc w:val="left"/>
+            </w:pPr>
+            <w:r>
+              <w:rPr>
+                <w:rFonts w:ascii="Consolas" w:hAnsi="Consolas" w:eastAsia="Consolas" w:cs="Consolas"/>
+              </w:rPr>
+              <w:t>/posts/{post}</w:t>
+            </w:r>
+          </w:p>
+        </w:tc>
+        <w:tc>
+          <w:tcPr>
+            <w:tcW w:w="1611" w:type="dxa"/>
+            <w:tcBorders>
+              <w:top w:val="single" w:color="DDDDDD" w:sz="6"/>
+              <w:left w:val="single" w:color="DDDDDD" w:sz="6"/>
+              <w:bottom w:val="single" w:color="DDDDDD" w:sz="6"/>
+              <w:right w:val="single" w:color="DDDDDD" w:sz="6"/>
+            </w:tcBorders>
+            <w:tcMar>
+              <w:top w:w="120" w:type="dxa"/>
+              <w:left w:w="120" w:type="dxa"/>
+              <w:bottom w:w="120" w:type="dxa"/>
+              <w:right w:w="120" w:type="dxa"/>
+            </w:tcMar>
+            <w:vAlign w:val="center"/>
+          </w:tcPr>
+          <w:p>
+            <w:pPr>
+              <w:spacing w:before="0" w:beforeAutospacing="off" w:after="0" w:afterAutospacing="off"/>
+              <w:jc w:val="left"/>
+            </w:pPr>
+            <w:r>
+              <w:rPr>
+                <w:rFonts w:ascii="Arial" w:hAnsi="Arial" w:eastAsia="Arial" w:cs="Arial"/>
+              </w:rPr>
+              <w:t>destroy</w:t>
+            </w:r>
+          </w:p>
+        </w:tc>
+        <w:tc>
+          <w:tcPr>
+            <w:tcW w:w="2043" w:type="dxa"/>
+            <w:tcBorders>
+              <w:top w:val="single" w:color="DDDDDD" w:sz="6"/>
+              <w:left w:val="single" w:color="DDDDDD" w:sz="6"/>
+              <w:bottom w:val="single" w:color="DDDDDD" w:sz="6"/>
+              <w:right w:val="single" w:color="DDDDDD" w:sz="6"/>
+            </w:tcBorders>
+            <w:tcMar>
+              <w:top w:w="120" w:type="dxa"/>
+              <w:left w:w="120" w:type="dxa"/>
+              <w:bottom w:w="120" w:type="dxa"/>
+              <w:right w:w="120" w:type="dxa"/>
+            </w:tcMar>
+            <w:vAlign w:val="center"/>
+          </w:tcPr>
+          <w:p>
+            <w:pPr>
+              <w:spacing w:before="0" w:beforeAutospacing="off" w:after="0" w:afterAutospacing="off"/>
+              <w:jc w:val="left"/>
+            </w:pPr>
+            <w:r>
+              <w:rPr>
+                <w:rFonts w:ascii="Consolas" w:hAnsi="Consolas" w:eastAsia="Consolas" w:cs="Consolas"/>
+              </w:rPr>
+              <w:t>posts.destroy</w:t>
+            </w:r>
+          </w:p>
+        </w:tc>
+      </w:tr>
+    </w:tbl>
+    <w:p>
+      <w:pPr>
+        <w:pStyle w:val="Normal"/>
+        <w:spacing w:before="240" w:beforeAutospacing="off" w:after="240" w:afterAutospacing="off"/>
+        <w:rPr>
+          <w:rFonts w:ascii="Segoe UI" w:hAnsi="Segoe UI" w:eastAsia="Segoe UI" w:cs="Segoe UI"/>
+          <w:noProof w:val="0"/>
+          <w:sz w:val="22"/>
+          <w:szCs w:val="22"/>
+          <w:lang w:val="en-GB"/>
+        </w:rPr>
+      </w:pPr>
+    </w:p>
+    <w:p>
+      <w:pPr>
+        <w:pStyle w:val="Normal"/>
+        <w:spacing w:before="240" w:beforeAutospacing="off" w:after="240" w:afterAutospacing="off"/>
+        <w:rPr>
+          <w:rFonts w:ascii="Segoe UI" w:hAnsi="Segoe UI" w:eastAsia="Segoe UI" w:cs="Segoe UI"/>
+          <w:b w:val="1"/>
+          <w:bCs w:val="1"/>
+          <w:i w:val="1"/>
+          <w:iCs w:val="1"/>
+          <w:noProof w:val="0"/>
+          <w:color w:val="FF0000"/>
+          <w:sz w:val="36"/>
+          <w:szCs w:val="36"/>
+          <w:u w:val="single"/>
+          <w:lang w:val="en-GB"/>
+        </w:rPr>
+      </w:pPr>
+      <w:r>
+        <w:rPr>
+          <w:rFonts w:ascii="Segoe UI" w:hAnsi="Segoe UI" w:eastAsia="Segoe UI" w:cs="Segoe UI"/>
+          <w:b w:val="1"/>
+          <w:bCs w:val="1"/>
+          <w:i w:val="1"/>
+          <w:iCs w:val="1"/>
+          <w:noProof w:val="0"/>
+          <w:color w:val="FF0000"/>
+          <w:sz w:val="36"/>
+          <w:szCs w:val="36"/>
+          <w:u w:val="single"/>
+          <w:lang w:val="en-GB"/>
+        </w:rPr>
+        <w:t>Controller:</w:t>
+      </w:r>
+    </w:p>
+    <w:p>
+      <w:pPr>
+        <w:pStyle w:val="Normal"/>
+        <w:spacing w:before="240" w:beforeAutospacing="off" w:after="240" w:afterAutospacing="off"/>
+        <w:rPr>
+          <w:rFonts w:ascii="Segoe UI" w:hAnsi="Segoe UI" w:eastAsia="Segoe UI" w:cs="Segoe UI"/>
+          <w:b w:val="1"/>
+          <w:bCs w:val="1"/>
+          <w:i w:val="1"/>
+          <w:iCs w:val="1"/>
+          <w:noProof w:val="0"/>
+          <w:color w:val="FF0000"/>
+          <w:sz w:val="28"/>
+          <w:szCs w:val="28"/>
+          <w:u w:val="single"/>
+          <w:lang w:val="en-GB"/>
+        </w:rPr>
+      </w:pPr>
+      <w:r>
+        <w:rPr>
+          <w:rFonts w:ascii="Segoe UI" w:hAnsi="Segoe UI" w:eastAsia="Segoe UI" w:cs="Segoe UI"/>
+          <w:b w:val="1"/>
+          <w:bCs w:val="1"/>
+          <w:i w:val="1"/>
+          <w:iCs w:val="1"/>
+          <w:noProof w:val="0"/>
+          <w:color w:val="FF0000"/>
+          <w:sz w:val="28"/>
+          <w:szCs w:val="28"/>
+          <w:u w:val="single"/>
+          <w:lang w:val="en-GB"/>
+        </w:rPr>
+        <w:t>__</w:t>
+      </w:r>
+      <w:r>
+        <w:rPr>
+          <w:rFonts w:ascii="Segoe UI" w:hAnsi="Segoe UI" w:eastAsia="Segoe UI" w:cs="Segoe UI"/>
+          <w:b w:val="1"/>
+          <w:bCs w:val="1"/>
+          <w:i w:val="1"/>
+          <w:iCs w:val="1"/>
+          <w:noProof w:val="0"/>
+          <w:color w:val="FF0000"/>
+          <w:sz w:val="28"/>
+          <w:szCs w:val="28"/>
+          <w:u w:val="single"/>
+          <w:lang w:val="en-GB"/>
+        </w:rPr>
+        <w:t>invoke(</w:t>
+      </w:r>
+      <w:r>
+        <w:rPr>
+          <w:rFonts w:ascii="Segoe UI" w:hAnsi="Segoe UI" w:eastAsia="Segoe UI" w:cs="Segoe UI"/>
+          <w:b w:val="1"/>
+          <w:bCs w:val="1"/>
+          <w:i w:val="1"/>
+          <w:iCs w:val="1"/>
+          <w:noProof w:val="0"/>
+          <w:color w:val="FF0000"/>
+          <w:sz w:val="28"/>
+          <w:szCs w:val="28"/>
+          <w:u w:val="single"/>
+          <w:lang w:val="en-GB"/>
+        </w:rPr>
+        <w:t>):</w:t>
+      </w:r>
+    </w:p>
+    <w:p>
+      <w:pPr>
+        <w:spacing w:before="360" w:beforeAutospacing="off" w:after="180" w:afterAutospacing="off"/>
+        <w:rPr>
+          <w:rFonts w:ascii="Calibri" w:hAnsi="Calibri" w:eastAsia="Calibri" w:cs="Calibri" w:asciiTheme="minorAscii" w:hAnsiTheme="minorAscii" w:eastAsiaTheme="minorAscii" w:cstheme="minorAscii"/>
+          <w:b w:val="1"/>
+          <w:bCs w:val="1"/>
+          <w:strike w:val="0"/>
+          <w:dstrike w:val="0"/>
+          <w:noProof w:val="0"/>
+          <w:sz w:val="21"/>
+          <w:szCs w:val="21"/>
+          <w:u w:val="none"/>
+          <w:lang w:val="en-GB"/>
+        </w:rPr>
+      </w:pPr>
+      <w:r>
+        <w:rPr>
+          <w:rFonts w:ascii="Calibri" w:hAnsi="Calibri" w:eastAsia="Calibri" w:cs="Calibri" w:asciiTheme="minorAscii" w:hAnsiTheme="minorAscii" w:eastAsiaTheme="minorAscii" w:cstheme="minorAscii"/>
+          <w:b w:val="1"/>
+          <w:bCs w:val="1"/>
+          <w:strike w:val="0"/>
+          <w:dstrike w:val="0"/>
+          <w:noProof w:val="0"/>
+          <w:sz w:val="30"/>
+          <w:szCs w:val="30"/>
+          <w:u w:val="none"/>
+          <w:lang w:val="en-GB"/>
+        </w:rPr>
+        <w:t xml:space="preserve">When to Use </w:t>
+      </w:r>
+      <w:r>
+        <w:rPr>
+          <w:rFonts w:ascii="Calibri" w:hAnsi="Calibri" w:eastAsia="Calibri" w:cs="Calibri" w:asciiTheme="minorAscii" w:hAnsiTheme="minorAscii" w:eastAsiaTheme="minorAscii" w:cstheme="minorAscii"/>
+          <w:b w:val="1"/>
+          <w:bCs w:val="1"/>
+          <w:strike w:val="0"/>
+          <w:dstrike w:val="0"/>
+          <w:noProof w:val="0"/>
+          <w:sz w:val="21"/>
+          <w:szCs w:val="21"/>
+          <w:u w:val="none"/>
+          <w:lang w:val="en-GB"/>
+        </w:rPr>
+        <w:t>__invoke()</w:t>
+      </w:r>
+    </w:p>
+    <w:p>
+      <w:pPr>
+        <w:pStyle w:val="ListParagraph"/>
+        <w:numPr>
+          <w:ilvl w:val="0"/>
+          <w:numId w:val="10"/>
+        </w:numPr>
+        <w:spacing w:before="0" w:beforeAutospacing="off" w:after="180" w:afterAutospacing="off"/>
+        <w:rPr>
+          <w:rFonts w:ascii="Calibri" w:hAnsi="Calibri" w:eastAsia="Calibri" w:cs="Calibri" w:asciiTheme="minorAscii" w:hAnsiTheme="minorAscii" w:eastAsiaTheme="minorAscii" w:cstheme="minorAscii"/>
+          <w:b w:val="0"/>
+          <w:bCs w:val="0"/>
+          <w:strike w:val="0"/>
+          <w:dstrike w:val="0"/>
+          <w:noProof w:val="0"/>
+          <w:sz w:val="24"/>
+          <w:szCs w:val="24"/>
+          <w:u w:val="none"/>
+          <w:lang w:val="en-GB"/>
+        </w:rPr>
+      </w:pPr>
+      <w:r>
+        <w:rPr>
+          <w:rFonts w:ascii="Calibri" w:hAnsi="Calibri" w:eastAsia="Calibri" w:cs="Calibri" w:asciiTheme="minorAscii" w:hAnsiTheme="minorAscii" w:eastAsiaTheme="minorAscii" w:cstheme="minorAscii"/>
+          <w:b w:val="1"/>
+          <w:bCs w:val="1"/>
+          <w:strike w:val="0"/>
+          <w:dstrike w:val="0"/>
+          <w:noProof w:val="0"/>
+          <w:sz w:val="24"/>
+          <w:szCs w:val="24"/>
+          <w:u w:val="none"/>
+          <w:lang w:val="en-GB"/>
+        </w:rPr>
+        <w:t>Dedicated Business Logic:</w:t>
+      </w:r>
+      <w:r>
+        <w:rPr>
+          <w:rFonts w:ascii="Calibri" w:hAnsi="Calibri" w:eastAsia="Calibri" w:cs="Calibri" w:asciiTheme="minorAscii" w:hAnsiTheme="minorAscii" w:eastAsiaTheme="minorAscii" w:cstheme="minorAscii"/>
+          <w:b w:val="0"/>
+          <w:bCs w:val="0"/>
+          <w:strike w:val="0"/>
+          <w:dstrike w:val="0"/>
+          <w:noProof w:val="0"/>
+          <w:sz w:val="24"/>
+          <w:szCs w:val="24"/>
+          <w:u w:val="none"/>
+          <w:lang w:val="en-GB"/>
+        </w:rPr>
+        <w:t xml:space="preserve"> Use for complex, single-purpose actions like processing a checkout (</w:t>
+      </w:r>
+      <w:r>
+        <w:rPr>
+          <w:rFonts w:ascii="Calibri" w:hAnsi="Calibri" w:eastAsia="Calibri" w:cs="Calibri" w:asciiTheme="minorAscii" w:hAnsiTheme="minorAscii" w:eastAsiaTheme="minorAscii" w:cstheme="minorAscii"/>
+          <w:b w:val="0"/>
+          <w:bCs w:val="0"/>
+          <w:strike w:val="0"/>
+          <w:dstrike w:val="0"/>
+          <w:noProof w:val="0"/>
+          <w:sz w:val="21"/>
+          <w:szCs w:val="21"/>
+          <w:u w:val="none"/>
+          <w:lang w:val="en-GB"/>
+        </w:rPr>
+        <w:t>CheckoutController</w:t>
+      </w:r>
+      <w:r>
+        <w:rPr>
+          <w:rFonts w:ascii="Calibri" w:hAnsi="Calibri" w:eastAsia="Calibri" w:cs="Calibri" w:asciiTheme="minorAscii" w:hAnsiTheme="minorAscii" w:eastAsiaTheme="minorAscii" w:cstheme="minorAscii"/>
+          <w:b w:val="0"/>
+          <w:bCs w:val="0"/>
+          <w:strike w:val="0"/>
+          <w:dstrike w:val="0"/>
+          <w:noProof w:val="0"/>
+          <w:sz w:val="24"/>
+          <w:szCs w:val="24"/>
+          <w:u w:val="none"/>
+          <w:lang w:val="en-GB"/>
+        </w:rPr>
+        <w:t>) or generating a PDF report (</w:t>
+      </w:r>
+      <w:r>
+        <w:rPr>
+          <w:rFonts w:ascii="Calibri" w:hAnsi="Calibri" w:eastAsia="Calibri" w:cs="Calibri" w:asciiTheme="minorAscii" w:hAnsiTheme="minorAscii" w:eastAsiaTheme="minorAscii" w:cstheme="minorAscii"/>
+          <w:b w:val="0"/>
+          <w:bCs w:val="0"/>
+          <w:strike w:val="0"/>
+          <w:dstrike w:val="0"/>
+          <w:noProof w:val="0"/>
+          <w:sz w:val="21"/>
+          <w:szCs w:val="21"/>
+          <w:u w:val="none"/>
+          <w:lang w:val="en-GB"/>
+        </w:rPr>
+        <w:t>ExportReportController</w:t>
+      </w:r>
+      <w:r>
+        <w:rPr>
+          <w:rFonts w:ascii="Calibri" w:hAnsi="Calibri" w:eastAsia="Calibri" w:cs="Calibri" w:asciiTheme="minorAscii" w:hAnsiTheme="minorAscii" w:eastAsiaTheme="minorAscii" w:cstheme="minorAscii"/>
+          <w:b w:val="0"/>
+          <w:bCs w:val="0"/>
+          <w:strike w:val="0"/>
+          <w:dstrike w:val="0"/>
+          <w:noProof w:val="0"/>
+          <w:sz w:val="24"/>
+          <w:szCs w:val="24"/>
+          <w:u w:val="none"/>
+          <w:lang w:val="en-GB"/>
+        </w:rPr>
+        <w:t>).</w:t>
+      </w:r>
+    </w:p>
+    <w:p>
+      <w:pPr>
+        <w:pStyle w:val="ListParagraph"/>
+        <w:numPr>
+          <w:ilvl w:val="0"/>
+          <w:numId w:val="10"/>
+        </w:numPr>
+        <w:spacing w:before="0" w:beforeAutospacing="off" w:after="180" w:afterAutospacing="off"/>
+        <w:rPr>
+          <w:rFonts w:ascii="Calibri" w:hAnsi="Calibri" w:eastAsia="Calibri" w:cs="Calibri" w:asciiTheme="minorAscii" w:hAnsiTheme="minorAscii" w:eastAsiaTheme="minorAscii" w:cstheme="minorAscii"/>
+          <w:b w:val="0"/>
+          <w:bCs w:val="0"/>
+          <w:strike w:val="0"/>
+          <w:dstrike w:val="0"/>
+          <w:noProof w:val="0"/>
+          <w:sz w:val="24"/>
+          <w:szCs w:val="24"/>
+          <w:u w:val="none"/>
+          <w:lang w:val="en-GB"/>
+        </w:rPr>
+      </w:pPr>
+      <w:r>
+        <w:rPr>
+          <w:rFonts w:ascii="Calibri" w:hAnsi="Calibri" w:eastAsia="Calibri" w:cs="Calibri" w:asciiTheme="minorAscii" w:hAnsiTheme="minorAscii" w:eastAsiaTheme="minorAscii" w:cstheme="minorAscii"/>
+          <w:b w:val="1"/>
+          <w:bCs w:val="1"/>
+          <w:strike w:val="0"/>
+          <w:dstrike w:val="0"/>
+          <w:noProof w:val="0"/>
+          <w:sz w:val="24"/>
+          <w:szCs w:val="24"/>
+          <w:u w:val="none"/>
+          <w:lang w:val="en-GB"/>
+        </w:rPr>
+        <w:t>Webhooks and API Callbacks:</w:t>
+      </w:r>
+      <w:r>
+        <w:rPr>
+          <w:rFonts w:ascii="Calibri" w:hAnsi="Calibri" w:eastAsia="Calibri" w:cs="Calibri" w:asciiTheme="minorAscii" w:hAnsiTheme="minorAscii" w:eastAsiaTheme="minorAscii" w:cstheme="minorAscii"/>
+          <w:b w:val="0"/>
+          <w:bCs w:val="0"/>
+          <w:strike w:val="0"/>
+          <w:dstrike w:val="0"/>
+          <w:noProof w:val="0"/>
+          <w:sz w:val="24"/>
+          <w:szCs w:val="24"/>
+          <w:u w:val="none"/>
+          <w:lang w:val="en-GB"/>
+        </w:rPr>
+        <w:t xml:space="preserve"> Use for receiving external data from third-party services, such as Stripe payment events (</w:t>
+      </w:r>
+      <w:r>
+        <w:rPr>
+          <w:rFonts w:ascii="Calibri" w:hAnsi="Calibri" w:eastAsia="Calibri" w:cs="Calibri" w:asciiTheme="minorAscii" w:hAnsiTheme="minorAscii" w:eastAsiaTheme="minorAscii" w:cstheme="minorAscii"/>
+          <w:b w:val="0"/>
+          <w:bCs w:val="0"/>
+          <w:strike w:val="0"/>
+          <w:dstrike w:val="0"/>
+          <w:noProof w:val="0"/>
+          <w:sz w:val="21"/>
+          <w:szCs w:val="21"/>
+          <w:u w:val="none"/>
+          <w:lang w:val="en-GB"/>
+        </w:rPr>
+        <w:t>StripeWebhookController</w:t>
+      </w:r>
+      <w:r>
+        <w:rPr>
+          <w:rFonts w:ascii="Calibri" w:hAnsi="Calibri" w:eastAsia="Calibri" w:cs="Calibri" w:asciiTheme="minorAscii" w:hAnsiTheme="minorAscii" w:eastAsiaTheme="minorAscii" w:cstheme="minorAscii"/>
+          <w:b w:val="0"/>
+          <w:bCs w:val="0"/>
+          <w:strike w:val="0"/>
+          <w:dstrike w:val="0"/>
+          <w:noProof w:val="0"/>
+          <w:sz w:val="24"/>
+          <w:szCs w:val="24"/>
+          <w:u w:val="none"/>
+          <w:lang w:val="en-GB"/>
+        </w:rPr>
+        <w:t>).</w:t>
+      </w:r>
+    </w:p>
+    <w:p>
+      <w:pPr>
+        <w:pStyle w:val="ListParagraph"/>
+        <w:numPr>
+          <w:ilvl w:val="0"/>
+          <w:numId w:val="10"/>
+        </w:numPr>
+        <w:spacing w:before="0" w:beforeAutospacing="off" w:after="180" w:afterAutospacing="off"/>
+        <w:rPr>
+          <w:rFonts w:ascii="Calibri" w:hAnsi="Calibri" w:eastAsia="Calibri" w:cs="Calibri" w:asciiTheme="minorAscii" w:hAnsiTheme="minorAscii" w:eastAsiaTheme="minorAscii" w:cstheme="minorAscii"/>
+          <w:b w:val="0"/>
+          <w:bCs w:val="0"/>
+          <w:strike w:val="0"/>
+          <w:dstrike w:val="0"/>
+          <w:noProof w:val="0"/>
+          <w:sz w:val="24"/>
+          <w:szCs w:val="24"/>
+          <w:u w:val="none"/>
+          <w:lang w:val="en-GB"/>
+        </w:rPr>
+      </w:pPr>
+      <w:r>
+        <w:rPr>
+          <w:rFonts w:ascii="Calibri" w:hAnsi="Calibri" w:eastAsia="Calibri" w:cs="Calibri" w:asciiTheme="minorAscii" w:hAnsiTheme="minorAscii" w:eastAsiaTheme="minorAscii" w:cstheme="minorAscii"/>
+          <w:b w:val="1"/>
+          <w:bCs w:val="1"/>
+          <w:strike w:val="0"/>
+          <w:dstrike w:val="0"/>
+          <w:noProof w:val="0"/>
+          <w:sz w:val="24"/>
+          <w:szCs w:val="24"/>
+          <w:u w:val="none"/>
+          <w:lang w:val="en-GB"/>
+        </w:rPr>
+        <w:t>Dashboard Landing Pages:</w:t>
+      </w:r>
+      <w:r>
+        <w:rPr>
+          <w:rFonts w:ascii="Calibri" w:hAnsi="Calibri" w:eastAsia="Calibri" w:cs="Calibri" w:asciiTheme="minorAscii" w:hAnsiTheme="minorAscii" w:eastAsiaTheme="minorAscii" w:cstheme="minorAscii"/>
+          <w:b w:val="0"/>
+          <w:bCs w:val="0"/>
+          <w:strike w:val="0"/>
+          <w:dstrike w:val="0"/>
+          <w:noProof w:val="0"/>
+          <w:sz w:val="24"/>
+          <w:szCs w:val="24"/>
+          <w:u w:val="none"/>
+          <w:lang w:val="en-GB"/>
+        </w:rPr>
+        <w:t xml:space="preserve"> Use for rendering a main dashboard or home page that simply aggregates data rather than managing a resource (</w:t>
+      </w:r>
+      <w:r>
+        <w:rPr>
+          <w:rFonts w:ascii="Calibri" w:hAnsi="Calibri" w:eastAsia="Calibri" w:cs="Calibri" w:asciiTheme="minorAscii" w:hAnsiTheme="minorAscii" w:eastAsiaTheme="minorAscii" w:cstheme="minorAscii"/>
+          <w:b w:val="0"/>
+          <w:bCs w:val="0"/>
+          <w:strike w:val="0"/>
+          <w:dstrike w:val="0"/>
+          <w:noProof w:val="0"/>
+          <w:sz w:val="21"/>
+          <w:szCs w:val="21"/>
+          <w:u w:val="none"/>
+          <w:lang w:val="en-GB"/>
+        </w:rPr>
+        <w:t>ShowDashboardController</w:t>
+      </w:r>
+      <w:r>
+        <w:rPr>
+          <w:rFonts w:ascii="Calibri" w:hAnsi="Calibri" w:eastAsia="Calibri" w:cs="Calibri" w:asciiTheme="minorAscii" w:hAnsiTheme="minorAscii" w:eastAsiaTheme="minorAscii" w:cstheme="minorAscii"/>
+          <w:b w:val="0"/>
+          <w:bCs w:val="0"/>
+          <w:strike w:val="0"/>
+          <w:dstrike w:val="0"/>
+          <w:noProof w:val="0"/>
+          <w:sz w:val="24"/>
+          <w:szCs w:val="24"/>
+          <w:u w:val="none"/>
+          <w:lang w:val="en-GB"/>
+        </w:rPr>
+        <w:t>).</w:t>
+      </w:r>
+    </w:p>
+    <w:p>
+      <w:pPr>
+        <w:pStyle w:val="ListParagraph"/>
+        <w:numPr>
+          <w:ilvl w:val="0"/>
+          <w:numId w:val="10"/>
+        </w:numPr>
+        <w:spacing w:before="0" w:beforeAutospacing="off" w:after="180" w:afterAutospacing="off"/>
+        <w:rPr>
+          <w:rFonts w:ascii="Calibri" w:hAnsi="Calibri" w:eastAsia="Calibri" w:cs="Calibri" w:asciiTheme="minorAscii" w:hAnsiTheme="minorAscii" w:eastAsiaTheme="minorAscii" w:cstheme="minorAscii"/>
+          <w:b w:val="0"/>
+          <w:bCs w:val="0"/>
+          <w:strike w:val="0"/>
+          <w:dstrike w:val="0"/>
+          <w:noProof w:val="0"/>
+          <w:sz w:val="24"/>
+          <w:szCs w:val="24"/>
+          <w:u w:val="none"/>
+          <w:lang w:val="en-GB"/>
+        </w:rPr>
+      </w:pPr>
+      <w:r>
+        <w:rPr>
+          <w:rFonts w:ascii="Calibri" w:hAnsi="Calibri" w:eastAsia="Calibri" w:cs="Calibri" w:asciiTheme="minorAscii" w:hAnsiTheme="minorAscii" w:eastAsiaTheme="minorAscii" w:cstheme="minorAscii"/>
+          <w:b w:val="1"/>
+          <w:bCs w:val="1"/>
+          <w:strike w:val="0"/>
+          <w:dstrike w:val="0"/>
+          <w:noProof w:val="0"/>
+          <w:sz w:val="24"/>
+          <w:szCs w:val="24"/>
+          <w:u w:val="none"/>
+          <w:lang w:val="en-GB"/>
+        </w:rPr>
+        <w:t>Isolating Bloated Code:</w:t>
+      </w:r>
+      <w:r>
+        <w:rPr>
+          <w:rFonts w:ascii="Calibri" w:hAnsi="Calibri" w:eastAsia="Calibri" w:cs="Calibri" w:asciiTheme="minorAscii" w:hAnsiTheme="minorAscii" w:eastAsiaTheme="minorAscii" w:cstheme="minorAscii"/>
+          <w:b w:val="0"/>
+          <w:bCs w:val="0"/>
+          <w:strike w:val="0"/>
+          <w:dstrike w:val="0"/>
+          <w:noProof w:val="0"/>
+          <w:sz w:val="24"/>
+          <w:szCs w:val="24"/>
+          <w:u w:val="none"/>
+          <w:lang w:val="en-GB"/>
+        </w:rPr>
+        <w:t xml:space="preserve"> Use when a single method inside a traditional controller becomes too massive and requires its own dependencies and isolated testing.</w:t>
+      </w:r>
+    </w:p>
+    <w:p>
+      <w:pPr>
+        <w:spacing w:before="360" w:beforeAutospacing="off" w:after="180" w:afterAutospacing="off"/>
+        <w:rPr>
+          <w:rFonts w:ascii="Calibri" w:hAnsi="Calibri" w:eastAsia="Calibri" w:cs="Calibri" w:asciiTheme="minorAscii" w:hAnsiTheme="minorAscii" w:eastAsiaTheme="minorAscii" w:cstheme="minorAscii"/>
+          <w:b w:val="1"/>
+          <w:bCs w:val="1"/>
+          <w:strike w:val="0"/>
+          <w:dstrike w:val="0"/>
+          <w:noProof w:val="0"/>
+          <w:sz w:val="21"/>
+          <w:szCs w:val="21"/>
+          <w:u w:val="none"/>
+          <w:lang w:val="en-GB"/>
+        </w:rPr>
+      </w:pPr>
+      <w:r>
+        <w:rPr>
+          <w:rFonts w:ascii="Calibri" w:hAnsi="Calibri" w:eastAsia="Calibri" w:cs="Calibri" w:asciiTheme="minorAscii" w:hAnsiTheme="minorAscii" w:eastAsiaTheme="minorAscii" w:cstheme="minorAscii"/>
+          <w:b w:val="1"/>
+          <w:bCs w:val="1"/>
+          <w:strike w:val="0"/>
+          <w:dstrike w:val="0"/>
+          <w:noProof w:val="0"/>
+          <w:sz w:val="30"/>
+          <w:szCs w:val="30"/>
+          <w:u w:val="none"/>
+          <w:lang w:val="en-GB"/>
+        </w:rPr>
+        <w:t xml:space="preserve">When NOT to Use </w:t>
+      </w:r>
+      <w:r>
+        <w:rPr>
+          <w:rFonts w:ascii="Calibri" w:hAnsi="Calibri" w:eastAsia="Calibri" w:cs="Calibri" w:asciiTheme="minorAscii" w:hAnsiTheme="minorAscii" w:eastAsiaTheme="minorAscii" w:cstheme="minorAscii"/>
+          <w:b w:val="1"/>
+          <w:bCs w:val="1"/>
+          <w:strike w:val="0"/>
+          <w:dstrike w:val="0"/>
+          <w:noProof w:val="0"/>
+          <w:sz w:val="21"/>
+          <w:szCs w:val="21"/>
+          <w:u w:val="none"/>
+          <w:lang w:val="en-GB"/>
+        </w:rPr>
+        <w:t>__</w:t>
+      </w:r>
+      <w:r>
+        <w:rPr>
+          <w:rFonts w:ascii="Calibri" w:hAnsi="Calibri" w:eastAsia="Calibri" w:cs="Calibri" w:asciiTheme="minorAscii" w:hAnsiTheme="minorAscii" w:eastAsiaTheme="minorAscii" w:cstheme="minorAscii"/>
+          <w:b w:val="1"/>
+          <w:bCs w:val="1"/>
+          <w:strike w:val="0"/>
+          <w:dstrike w:val="0"/>
+          <w:noProof w:val="0"/>
+          <w:sz w:val="21"/>
+          <w:szCs w:val="21"/>
+          <w:u w:val="none"/>
+          <w:lang w:val="en-GB"/>
+        </w:rPr>
+        <w:t>invoke(</w:t>
+      </w:r>
+      <w:r>
+        <w:rPr>
+          <w:rFonts w:ascii="Calibri" w:hAnsi="Calibri" w:eastAsia="Calibri" w:cs="Calibri" w:asciiTheme="minorAscii" w:hAnsiTheme="minorAscii" w:eastAsiaTheme="minorAscii" w:cstheme="minorAscii"/>
+          <w:b w:val="1"/>
+          <w:bCs w:val="1"/>
+          <w:strike w:val="0"/>
+          <w:dstrike w:val="0"/>
+          <w:noProof w:val="0"/>
+          <w:sz w:val="21"/>
+          <w:szCs w:val="21"/>
+          <w:u w:val="none"/>
+          <w:lang w:val="en-GB"/>
+        </w:rPr>
+        <w:t>)</w:t>
+      </w:r>
+    </w:p>
+    <w:p>
+      <w:pPr>
+        <w:pStyle w:val="ListParagraph"/>
+        <w:numPr>
+          <w:ilvl w:val="0"/>
+          <w:numId w:val="11"/>
+        </w:numPr>
+        <w:spacing w:before="0" w:beforeAutospacing="off" w:after="180" w:afterAutospacing="off"/>
+        <w:rPr>
+          <w:rFonts w:ascii="Calibri" w:hAnsi="Calibri" w:eastAsia="Calibri" w:cs="Calibri" w:asciiTheme="minorAscii" w:hAnsiTheme="minorAscii" w:eastAsiaTheme="minorAscii" w:cstheme="minorAscii"/>
+          <w:b w:val="0"/>
+          <w:bCs w:val="0"/>
+          <w:strike w:val="0"/>
+          <w:dstrike w:val="0"/>
+          <w:noProof w:val="0"/>
+          <w:sz w:val="24"/>
+          <w:szCs w:val="24"/>
+          <w:u w:val="none"/>
+          <w:lang w:val="en-GB"/>
+        </w:rPr>
+      </w:pPr>
+      <w:r>
+        <w:rPr>
+          <w:rFonts w:ascii="Calibri" w:hAnsi="Calibri" w:eastAsia="Calibri" w:cs="Calibri" w:asciiTheme="minorAscii" w:hAnsiTheme="minorAscii" w:eastAsiaTheme="minorAscii" w:cstheme="minorAscii"/>
+          <w:b w:val="1"/>
+          <w:bCs w:val="1"/>
+          <w:strike w:val="0"/>
+          <w:dstrike w:val="0"/>
+          <w:noProof w:val="0"/>
+          <w:sz w:val="24"/>
+          <w:szCs w:val="24"/>
+          <w:u w:val="none"/>
+          <w:lang w:val="en-GB"/>
+        </w:rPr>
+        <w:t>Standard REST/CRUD Resources:</w:t>
+      </w:r>
+      <w:r>
+        <w:rPr>
+          <w:rFonts w:ascii="Calibri" w:hAnsi="Calibri" w:eastAsia="Calibri" w:cs="Calibri" w:asciiTheme="minorAscii" w:hAnsiTheme="minorAscii" w:eastAsiaTheme="minorAscii" w:cstheme="minorAscii"/>
+          <w:b w:val="0"/>
+          <w:bCs w:val="0"/>
+          <w:strike w:val="0"/>
+          <w:dstrike w:val="0"/>
+          <w:noProof w:val="0"/>
+          <w:sz w:val="24"/>
+          <w:szCs w:val="24"/>
+          <w:u w:val="none"/>
+          <w:lang w:val="en-GB"/>
+        </w:rPr>
+        <w:t xml:space="preserve"> Do not use if you need to create, read, update, and delete a resource (e.g., managing products, users, or articles). Use standard resource controllers instead.</w:t>
+      </w:r>
+    </w:p>
+    <w:p>
+      <w:pPr>
+        <w:pStyle w:val="ListParagraph"/>
+        <w:numPr>
+          <w:ilvl w:val="0"/>
+          <w:numId w:val="11"/>
+        </w:numPr>
+        <w:spacing w:before="0" w:beforeAutospacing="off" w:after="180" w:afterAutospacing="off"/>
+        <w:rPr>
+          <w:rFonts w:ascii="Calibri" w:hAnsi="Calibri" w:eastAsia="Calibri" w:cs="Calibri" w:asciiTheme="minorAscii" w:hAnsiTheme="minorAscii" w:eastAsiaTheme="minorAscii" w:cstheme="minorAscii"/>
+          <w:b w:val="0"/>
+          <w:bCs w:val="0"/>
+          <w:strike w:val="0"/>
+          <w:dstrike w:val="0"/>
+          <w:noProof w:val="0"/>
+          <w:sz w:val="24"/>
+          <w:szCs w:val="24"/>
+          <w:u w:val="none"/>
+          <w:lang w:val="en-GB"/>
+        </w:rPr>
+      </w:pPr>
+      <w:r>
+        <w:rPr>
+          <w:rFonts w:ascii="Calibri" w:hAnsi="Calibri" w:eastAsia="Calibri" w:cs="Calibri" w:asciiTheme="minorAscii" w:hAnsiTheme="minorAscii" w:eastAsiaTheme="minorAscii" w:cstheme="minorAscii"/>
+          <w:b w:val="1"/>
+          <w:bCs w:val="1"/>
+          <w:strike w:val="0"/>
+          <w:dstrike w:val="0"/>
+          <w:noProof w:val="0"/>
+          <w:sz w:val="24"/>
+          <w:szCs w:val="24"/>
+          <w:u w:val="none"/>
+          <w:lang w:val="en-GB"/>
+        </w:rPr>
+        <w:t>Highly Related Actions:</w:t>
+      </w:r>
+      <w:r>
+        <w:rPr>
+          <w:rFonts w:ascii="Calibri" w:hAnsi="Calibri" w:eastAsia="Calibri" w:cs="Calibri" w:asciiTheme="minorAscii" w:hAnsiTheme="minorAscii" w:eastAsiaTheme="minorAscii" w:cstheme="minorAscii"/>
+          <w:b w:val="0"/>
+          <w:bCs w:val="0"/>
+          <w:strike w:val="0"/>
+          <w:dstrike w:val="0"/>
+          <w:noProof w:val="0"/>
+          <w:sz w:val="24"/>
+          <w:szCs w:val="24"/>
+          <w:u w:val="none"/>
+          <w:lang w:val="en-GB"/>
+        </w:rPr>
+        <w:t xml:space="preserve"> Do not use if a set of actions share tight logical grouping, such as </w:t>
+      </w:r>
+      <w:r>
+        <w:rPr>
+          <w:rFonts w:ascii="Calibri" w:hAnsi="Calibri" w:eastAsia="Calibri" w:cs="Calibri" w:asciiTheme="minorAscii" w:hAnsiTheme="minorAscii" w:eastAsiaTheme="minorAscii" w:cstheme="minorAscii"/>
+          <w:b w:val="0"/>
+          <w:bCs w:val="0"/>
+          <w:strike w:val="0"/>
+          <w:dstrike w:val="0"/>
+          <w:noProof w:val="0"/>
+          <w:sz w:val="21"/>
+          <w:szCs w:val="21"/>
+          <w:u w:val="none"/>
+          <w:lang w:val="en-GB"/>
+        </w:rPr>
+        <w:t>login()</w:t>
+      </w:r>
+      <w:r>
+        <w:rPr>
+          <w:rFonts w:ascii="Calibri" w:hAnsi="Calibri" w:eastAsia="Calibri" w:cs="Calibri" w:asciiTheme="minorAscii" w:hAnsiTheme="minorAscii" w:eastAsiaTheme="minorAscii" w:cstheme="minorAscii"/>
+          <w:b w:val="0"/>
+          <w:bCs w:val="0"/>
+          <w:strike w:val="0"/>
+          <w:dstrike w:val="0"/>
+          <w:noProof w:val="0"/>
+          <w:sz w:val="24"/>
+          <w:szCs w:val="24"/>
+          <w:u w:val="none"/>
+          <w:lang w:val="en-GB"/>
+        </w:rPr>
+        <w:t xml:space="preserve">, </w:t>
+      </w:r>
+      <w:r>
+        <w:rPr>
+          <w:rFonts w:ascii="Calibri" w:hAnsi="Calibri" w:eastAsia="Calibri" w:cs="Calibri" w:asciiTheme="minorAscii" w:hAnsiTheme="minorAscii" w:eastAsiaTheme="minorAscii" w:cstheme="minorAscii"/>
+          <w:b w:val="0"/>
+          <w:bCs w:val="0"/>
+          <w:strike w:val="0"/>
+          <w:dstrike w:val="0"/>
+          <w:noProof w:val="0"/>
+          <w:sz w:val="21"/>
+          <w:szCs w:val="21"/>
+          <w:u w:val="none"/>
+          <w:lang w:val="en-GB"/>
+        </w:rPr>
+        <w:t>logout()</w:t>
+      </w:r>
+      <w:r>
+        <w:rPr>
+          <w:rFonts w:ascii="Calibri" w:hAnsi="Calibri" w:eastAsia="Calibri" w:cs="Calibri" w:asciiTheme="minorAscii" w:hAnsiTheme="minorAscii" w:eastAsiaTheme="minorAscii" w:cstheme="minorAscii"/>
+          <w:b w:val="0"/>
+          <w:bCs w:val="0"/>
+          <w:strike w:val="0"/>
+          <w:dstrike w:val="0"/>
+          <w:noProof w:val="0"/>
+          <w:sz w:val="24"/>
+          <w:szCs w:val="24"/>
+          <w:u w:val="none"/>
+          <w:lang w:val="en-GB"/>
+        </w:rPr>
+        <w:t xml:space="preserve">, and </w:t>
+      </w:r>
+      <w:r>
+        <w:rPr>
+          <w:rFonts w:ascii="Calibri" w:hAnsi="Calibri" w:eastAsia="Calibri" w:cs="Calibri" w:asciiTheme="minorAscii" w:hAnsiTheme="minorAscii" w:eastAsiaTheme="minorAscii" w:cstheme="minorAscii"/>
+          <w:b w:val="0"/>
+          <w:bCs w:val="0"/>
+          <w:strike w:val="0"/>
+          <w:dstrike w:val="0"/>
+          <w:noProof w:val="0"/>
+          <w:sz w:val="21"/>
+          <w:szCs w:val="21"/>
+          <w:u w:val="none"/>
+          <w:lang w:val="en-GB"/>
+        </w:rPr>
+        <w:t>register()</w:t>
+      </w:r>
+      <w:r>
+        <w:rPr>
+          <w:rFonts w:ascii="Calibri" w:hAnsi="Calibri" w:eastAsia="Calibri" w:cs="Calibri" w:asciiTheme="minorAscii" w:hAnsiTheme="minorAscii" w:eastAsiaTheme="minorAscii" w:cstheme="minorAscii"/>
+          <w:b w:val="0"/>
+          <w:bCs w:val="0"/>
+          <w:strike w:val="0"/>
+          <w:dstrike w:val="0"/>
+          <w:noProof w:val="0"/>
+          <w:sz w:val="24"/>
+          <w:szCs w:val="24"/>
+          <w:u w:val="none"/>
+          <w:lang w:val="en-GB"/>
+        </w:rPr>
+        <w:t>. Splitting these into three individual invokable controllers often creates unnecessary file clutter.</w:t>
+      </w:r>
+    </w:p>
+    <w:p>
+      <w:pPr>
+        <w:pStyle w:val="ListParagraph"/>
+        <w:numPr>
+          <w:ilvl w:val="0"/>
+          <w:numId w:val="11"/>
+        </w:numPr>
+        <w:spacing w:before="0" w:beforeAutospacing="off" w:after="180" w:afterAutospacing="off"/>
+        <w:rPr>
+          <w:rFonts w:ascii="Calibri" w:hAnsi="Calibri" w:eastAsia="Calibri" w:cs="Calibri" w:asciiTheme="minorAscii" w:hAnsiTheme="minorAscii" w:eastAsiaTheme="minorAscii" w:cstheme="minorAscii"/>
+          <w:b w:val="0"/>
+          <w:bCs w:val="0"/>
+          <w:strike w:val="0"/>
+          <w:dstrike w:val="0"/>
+          <w:noProof w:val="0"/>
+          <w:sz w:val="24"/>
+          <w:szCs w:val="24"/>
+          <w:u w:val="none"/>
+          <w:lang w:val="en-GB"/>
+        </w:rPr>
+      </w:pPr>
+      <w:r>
+        <w:rPr>
+          <w:rFonts w:ascii="Calibri" w:hAnsi="Calibri" w:eastAsia="Calibri" w:cs="Calibri" w:asciiTheme="minorAscii" w:hAnsiTheme="minorAscii" w:eastAsiaTheme="minorAscii" w:cstheme="minorAscii"/>
+          <w:b w:val="1"/>
+          <w:bCs w:val="1"/>
+          <w:strike w:val="0"/>
+          <w:dstrike w:val="0"/>
+          <w:noProof w:val="0"/>
+          <w:sz w:val="24"/>
+          <w:szCs w:val="24"/>
+          <w:u w:val="none"/>
+          <w:lang w:val="en-GB"/>
+        </w:rPr>
+        <w:t>Simple Data Fetching:</w:t>
+      </w:r>
+      <w:r>
+        <w:rPr>
+          <w:rFonts w:ascii="Calibri" w:hAnsi="Calibri" w:eastAsia="Calibri" w:cs="Calibri" w:asciiTheme="minorAscii" w:hAnsiTheme="minorAscii" w:eastAsiaTheme="minorAscii" w:cstheme="minorAscii"/>
+          <w:b w:val="0"/>
+          <w:bCs w:val="0"/>
+          <w:strike w:val="0"/>
+          <w:dstrike w:val="0"/>
+          <w:noProof w:val="0"/>
+          <w:sz w:val="24"/>
+          <w:szCs w:val="24"/>
+          <w:u w:val="none"/>
+          <w:lang w:val="en-GB"/>
+        </w:rPr>
+        <w:t xml:space="preserve"> Do not use for basic database queries that can easily live inside a shared controller.</w:t>
+      </w:r>
+    </w:p>
+    <w:p>
+      <w:pPr>
+        <w:pStyle w:val="Normal"/>
+        <w:spacing w:before="0" w:beforeAutospacing="off" w:after="0" w:afterAutospacing="off" w:line="300" w:lineRule="auto"/>
+        <w:rPr>
+          <w:rFonts w:ascii="Calibri" w:hAnsi="Calibri" w:eastAsia="Calibri" w:cs="Calibri" w:asciiTheme="minorAscii" w:hAnsiTheme="minorAscii" w:eastAsiaTheme="minorAscii" w:cstheme="minorAscii"/>
+          <w:b w:val="1"/>
+          <w:bCs w:val="1"/>
+          <w:i w:val="1"/>
+          <w:iCs w:val="1"/>
+          <w:noProof w:val="0"/>
+          <w:color w:val="FF0000"/>
+          <w:sz w:val="32"/>
+          <w:szCs w:val="32"/>
+          <w:u w:val="single"/>
+          <w:lang w:val="en-GB"/>
+        </w:rPr>
+      </w:pPr>
+    </w:p>
+    <w:p>
+      <w:pPr>
+        <w:pStyle w:val="Normal"/>
+        <w:spacing w:before="0" w:beforeAutospacing="off" w:after="0" w:afterAutospacing="off" w:line="300" w:lineRule="auto"/>
         <w:ind w:left="0"/>
         <w:rPr>
-          <w:rFonts w:ascii="Segoe UI" w:hAnsi="Segoe UI" w:eastAsia="Segoe UI" w:cs="Segoe UI"/>
+          <w:rFonts w:ascii="Calibri" w:hAnsi="Calibri" w:eastAsia="Calibri" w:cs="Calibri" w:asciiTheme="minorAscii" w:hAnsiTheme="minorAscii" w:eastAsiaTheme="minorAscii" w:cstheme="minorAscii"/>
+          <w:b w:val="0"/>
+          <w:bCs w:val="0"/>
+          <w:i w:val="0"/>
+          <w:iCs w:val="0"/>
+          <w:noProof w:val="0"/>
+          <w:sz w:val="21"/>
+          <w:szCs w:val="21"/>
+          <w:lang w:val="en-GB"/>
+        </w:rPr>
+      </w:pPr>
+    </w:p>
+    <w:p>
+      <w:pPr>
+        <w:pStyle w:val="Normal"/>
+        <w:spacing w:before="0" w:beforeAutospacing="off" w:after="0" w:afterAutospacing="off" w:line="300" w:lineRule="auto"/>
+        <w:ind w:left="0"/>
+        <w:rPr>
+          <w:rFonts w:ascii="Calibri" w:hAnsi="Calibri" w:eastAsia="Calibri" w:cs="Calibri" w:asciiTheme="minorAscii" w:hAnsiTheme="minorAscii" w:eastAsiaTheme="minorAscii" w:cstheme="minorAscii"/>
           <w:b w:val="0"/>
           <w:bCs w:val="0"/>
           <w:i w:val="0"/>
@@ -3458,6 +6391,230 @@
 
 <file path=word/numbering.xml><?xml version="1.0" encoding="utf-8"?>
 <w:numbering xmlns:w="http://schemas.openxmlformats.org/wordprocessingml/2006/main">
+  <w:abstractNum xmlns:w="http://schemas.openxmlformats.org/wordprocessingml/2006/main" w:abstractNumId="11">
+    <w:nsid w:val="2316683a"/>
+    <w:multiLevelType xmlns:w="http://schemas.openxmlformats.org/wordprocessingml/2006/main" w:val="hybridMultilevel"/>
+    <w:lvl xmlns:w="http://schemas.openxmlformats.org/wordprocessingml/2006/main" w:ilvl="0">
+      <w:start w:val="1"/>
+      <w:numFmt w:val="bullet"/>
+      <w:lvlText w:val=""/>
+      <w:lvlJc w:val="left"/>
+      <w:pPr>
+        <w:ind w:left="720" w:hanging="360"/>
+      </w:pPr>
+      <w:rPr>
+        <w:rFonts w:hint="default" w:ascii="Symbol" w:hAnsi="Symbol"/>
+      </w:rPr>
+    </w:lvl>
+    <w:lvl xmlns:w="http://schemas.openxmlformats.org/wordprocessingml/2006/main" w:ilvl="1">
+      <w:start w:val="1"/>
+      <w:numFmt w:val="bullet"/>
+      <w:lvlText w:val="o"/>
+      <w:lvlJc w:val="left"/>
+      <w:pPr>
+        <w:ind w:left="1440" w:hanging="360"/>
+      </w:pPr>
+      <w:rPr>
+        <w:rFonts w:hint="default" w:ascii="Courier New" w:hAnsi="Courier New"/>
+      </w:rPr>
+    </w:lvl>
+    <w:lvl xmlns:w="http://schemas.openxmlformats.org/wordprocessingml/2006/main" w:ilvl="2">
+      <w:start w:val="1"/>
+      <w:numFmt w:val="bullet"/>
+      <w:lvlText w:val=""/>
+      <w:lvlJc w:val="left"/>
+      <w:pPr>
+        <w:ind w:left="2160" w:hanging="360"/>
+      </w:pPr>
+      <w:rPr>
+        <w:rFonts w:hint="default" w:ascii="Wingdings" w:hAnsi="Wingdings"/>
+      </w:rPr>
+    </w:lvl>
+    <w:lvl xmlns:w="http://schemas.openxmlformats.org/wordprocessingml/2006/main" w:ilvl="3">
+      <w:start w:val="1"/>
+      <w:numFmt w:val="bullet"/>
+      <w:lvlText w:val=""/>
+      <w:lvlJc w:val="left"/>
+      <w:pPr>
+        <w:ind w:left="2880" w:hanging="360"/>
+      </w:pPr>
+      <w:rPr>
+        <w:rFonts w:hint="default" w:ascii="Symbol" w:hAnsi="Symbol"/>
+      </w:rPr>
+    </w:lvl>
+    <w:lvl xmlns:w="http://schemas.openxmlformats.org/wordprocessingml/2006/main" w:ilvl="4">
+      <w:start w:val="1"/>
+      <w:numFmt w:val="bullet"/>
+      <w:lvlText w:val="o"/>
+      <w:lvlJc w:val="left"/>
+      <w:pPr>
+        <w:ind w:left="3600" w:hanging="360"/>
+      </w:pPr>
+      <w:rPr>
+        <w:rFonts w:hint="default" w:ascii="Courier New" w:hAnsi="Courier New"/>
+      </w:rPr>
+    </w:lvl>
+    <w:lvl xmlns:w="http://schemas.openxmlformats.org/wordprocessingml/2006/main" w:ilvl="5">
+      <w:start w:val="1"/>
+      <w:numFmt w:val="bullet"/>
+      <w:lvlText w:val=""/>
+      <w:lvlJc w:val="left"/>
+      <w:pPr>
+        <w:ind w:left="4320" w:hanging="360"/>
+      </w:pPr>
+      <w:rPr>
+        <w:rFonts w:hint="default" w:ascii="Wingdings" w:hAnsi="Wingdings"/>
+      </w:rPr>
+    </w:lvl>
+    <w:lvl xmlns:w="http://schemas.openxmlformats.org/wordprocessingml/2006/main" w:ilvl="6">
+      <w:start w:val="1"/>
+      <w:numFmt w:val="bullet"/>
+      <w:lvlText w:val=""/>
+      <w:lvlJc w:val="left"/>
+      <w:pPr>
+        <w:ind w:left="5040" w:hanging="360"/>
+      </w:pPr>
+      <w:rPr>
+        <w:rFonts w:hint="default" w:ascii="Symbol" w:hAnsi="Symbol"/>
+      </w:rPr>
+    </w:lvl>
+    <w:lvl xmlns:w="http://schemas.openxmlformats.org/wordprocessingml/2006/main" w:ilvl="7">
+      <w:start w:val="1"/>
+      <w:numFmt w:val="bullet"/>
+      <w:lvlText w:val="o"/>
+      <w:lvlJc w:val="left"/>
+      <w:pPr>
+        <w:ind w:left="5760" w:hanging="360"/>
+      </w:pPr>
+      <w:rPr>
+        <w:rFonts w:hint="default" w:ascii="Courier New" w:hAnsi="Courier New"/>
+      </w:rPr>
+    </w:lvl>
+    <w:lvl xmlns:w="http://schemas.openxmlformats.org/wordprocessingml/2006/main" w:ilvl="8">
+      <w:start w:val="1"/>
+      <w:numFmt w:val="bullet"/>
+      <w:lvlText w:val=""/>
+      <w:lvlJc w:val="left"/>
+      <w:pPr>
+        <w:ind w:left="6480" w:hanging="360"/>
+      </w:pPr>
+      <w:rPr>
+        <w:rFonts w:hint="default" w:ascii="Wingdings" w:hAnsi="Wingdings"/>
+      </w:rPr>
+    </w:lvl>
+  </w:abstractNum>
+  <w:abstractNum xmlns:w="http://schemas.openxmlformats.org/wordprocessingml/2006/main" w:abstractNumId="10">
+    <w:nsid w:val="160c7524"/>
+    <w:multiLevelType xmlns:w="http://schemas.openxmlformats.org/wordprocessingml/2006/main" w:val="hybridMultilevel"/>
+    <w:lvl xmlns:w="http://schemas.openxmlformats.org/wordprocessingml/2006/main" w:ilvl="0">
+      <w:start w:val="1"/>
+      <w:numFmt w:val="bullet"/>
+      <w:lvlText w:val=""/>
+      <w:lvlJc w:val="left"/>
+      <w:pPr>
+        <w:ind w:left="720" w:hanging="360"/>
+      </w:pPr>
+      <w:rPr>
+        <w:rFonts w:hint="default" w:ascii="Symbol" w:hAnsi="Symbol"/>
+      </w:rPr>
+    </w:lvl>
+    <w:lvl xmlns:w="http://schemas.openxmlformats.org/wordprocessingml/2006/main" w:ilvl="1">
+      <w:start w:val="1"/>
+      <w:numFmt w:val="bullet"/>
+      <w:lvlText w:val="o"/>
+      <w:lvlJc w:val="left"/>
+      <w:pPr>
+        <w:ind w:left="1440" w:hanging="360"/>
+      </w:pPr>
+      <w:rPr>
+        <w:rFonts w:hint="default" w:ascii="Courier New" w:hAnsi="Courier New"/>
+      </w:rPr>
+    </w:lvl>
+    <w:lvl xmlns:w="http://schemas.openxmlformats.org/wordprocessingml/2006/main" w:ilvl="2">
+      <w:start w:val="1"/>
+      <w:numFmt w:val="bullet"/>
+      <w:lvlText w:val=""/>
+      <w:lvlJc w:val="left"/>
+      <w:pPr>
+        <w:ind w:left="2160" w:hanging="360"/>
+      </w:pPr>
+      <w:rPr>
+        <w:rFonts w:hint="default" w:ascii="Wingdings" w:hAnsi="Wingdings"/>
+      </w:rPr>
+    </w:lvl>
+    <w:lvl xmlns:w="http://schemas.openxmlformats.org/wordprocessingml/2006/main" w:ilvl="3">
+      <w:start w:val="1"/>
+      <w:numFmt w:val="bullet"/>
+      <w:lvlText w:val=""/>
+      <w:lvlJc w:val="left"/>
+      <w:pPr>
+        <w:ind w:left="2880" w:hanging="360"/>
+      </w:pPr>
+      <w:rPr>
+        <w:rFonts w:hint="default" w:ascii="Symbol" w:hAnsi="Symbol"/>
+      </w:rPr>
+    </w:lvl>
+    <w:lvl xmlns:w="http://schemas.openxmlformats.org/wordprocessingml/2006/main" w:ilvl="4">
+      <w:start w:val="1"/>
+      <w:numFmt w:val="bullet"/>
+      <w:lvlText w:val="o"/>
+      <w:lvlJc w:val="left"/>
+      <w:pPr>
+        <w:ind w:left="3600" w:hanging="360"/>
+      </w:pPr>
+      <w:rPr>
+        <w:rFonts w:hint="default" w:ascii="Courier New" w:hAnsi="Courier New"/>
+      </w:rPr>
+    </w:lvl>
+    <w:lvl xmlns:w="http://schemas.openxmlformats.org/wordprocessingml/2006/main" w:ilvl="5">
+      <w:start w:val="1"/>
+      <w:numFmt w:val="bullet"/>
+      <w:lvlText w:val=""/>
+      <w:lvlJc w:val="left"/>
+      <w:pPr>
+        <w:ind w:left="4320" w:hanging="360"/>
+      </w:pPr>
+      <w:rPr>
+        <w:rFonts w:hint="default" w:ascii="Wingdings" w:hAnsi="Wingdings"/>
+      </w:rPr>
+    </w:lvl>
+    <w:lvl xmlns:w="http://schemas.openxmlformats.org/wordprocessingml/2006/main" w:ilvl="6">
+      <w:start w:val="1"/>
+      <w:numFmt w:val="bullet"/>
+      <w:lvlText w:val=""/>
+      <w:lvlJc w:val="left"/>
+      <w:pPr>
+        <w:ind w:left="5040" w:hanging="360"/>
+      </w:pPr>
+      <w:rPr>
+        <w:rFonts w:hint="default" w:ascii="Symbol" w:hAnsi="Symbol"/>
+      </w:rPr>
+    </w:lvl>
+    <w:lvl xmlns:w="http://schemas.openxmlformats.org/wordprocessingml/2006/main" w:ilvl="7">
+      <w:start w:val="1"/>
+      <w:numFmt w:val="bullet"/>
+      <w:lvlText w:val="o"/>
+      <w:lvlJc w:val="left"/>
+      <w:pPr>
+        <w:ind w:left="5760" w:hanging="360"/>
+      </w:pPr>
+      <w:rPr>
+        <w:rFonts w:hint="default" w:ascii="Courier New" w:hAnsi="Courier New"/>
+      </w:rPr>
+    </w:lvl>
+    <w:lvl xmlns:w="http://schemas.openxmlformats.org/wordprocessingml/2006/main" w:ilvl="8">
+      <w:start w:val="1"/>
+      <w:numFmt w:val="bullet"/>
+      <w:lvlText w:val=""/>
+      <w:lvlJc w:val="left"/>
+      <w:pPr>
+        <w:ind w:left="6480" w:hanging="360"/>
+      </w:pPr>
+      <w:rPr>
+        <w:rFonts w:hint="default" w:ascii="Wingdings" w:hAnsi="Wingdings"/>
+      </w:rPr>
+    </w:lvl>
+  </w:abstractNum>
   <w:abstractNum xmlns:w="http://schemas.openxmlformats.org/wordprocessingml/2006/main" w:abstractNumId="9">
     <w:nsid w:val="2d80a573"/>
     <w:multiLevelType xmlns:w="http://schemas.openxmlformats.org/wordprocessingml/2006/main" w:val="hybridMultilevel"/>
@@ -4439,6 +7596,12 @@
       </w:rPr>
     </w:lvl>
   </w:abstractNum>
+  <w:num w:numId="11">
+    <w:abstractNumId w:val="11"/>
+  </w:num>
+  <w:num w:numId="10">
+    <w:abstractNumId w:val="10"/>
+  </w:num>
   <w:num w:numId="9">
     <w:abstractNumId w:val="9"/>
   </w:num>
@@ -4955,6 +8118,32 @@
       <w:u w:val="single"/>
     </w:rPr>
   </w:style>
+  <w:style xmlns:w="http://schemas.openxmlformats.org/wordprocessingml/2006/main" w:type="table" w:styleId="TableGrid">
+    <w:name xmlns:w="http://schemas.openxmlformats.org/wordprocessingml/2006/main" w:val="Table Grid"/>
+    <w:basedOn xmlns:w="http://schemas.openxmlformats.org/wordprocessingml/2006/main" w:val="TableNormal"/>
+    <w:uiPriority xmlns:w="http://schemas.openxmlformats.org/wordprocessingml/2006/main" w:val="59"/>
+    <w:rsid xmlns:w="http://schemas.openxmlformats.org/wordprocessingml/2006/main" w:val="00FB4123"/>
+    <w:pPr xmlns:w="http://schemas.openxmlformats.org/wordprocessingml/2006/main">
+      <w:spacing w:after="0" w:line="240" w:lineRule="auto"/>
+    </w:pPr>
+    <w:tblPr xmlns:w="http://schemas.openxmlformats.org/wordprocessingml/2006/main">
+      <w:tblInd w:w="0" w:type="dxa"/>
+      <w:tblBorders>
+        <w:top w:val="single" w:color="000000" w:themeColor="text1" w:sz="4" w:space="0"/>
+        <w:left w:val="single" w:color="000000" w:themeColor="text1" w:sz="4" w:space="0"/>
+        <w:bottom w:val="single" w:color="000000" w:themeColor="text1" w:sz="4" w:space="0"/>
+        <w:right w:val="single" w:color="000000" w:themeColor="text1" w:sz="4" w:space="0"/>
+        <w:insideH w:val="single" w:color="000000" w:themeColor="text1" w:sz="4" w:space="0"/>
+        <w:insideV w:val="single" w:color="000000" w:themeColor="text1" w:sz="4" w:space="0"/>
+      </w:tblBorders>
+      <w:tblCellMar>
+        <w:top w:w="0" w:type="dxa"/>
+        <w:left w:w="108" w:type="dxa"/>
+        <w:bottom w:w="0" w:type="dxa"/>
+        <w:right w:w="108" w:type="dxa"/>
+      </w:tblCellMar>
+    </w:tblPr>
+  </w:style>
 </w:styles>
 </file>
 

</xml_diff>

<commit_message>
Update Laravel notes: Controller-Middleware
</commit_message>
<xml_diff>
--- a/Laravel notes.docx
+++ b/Laravel notes.docx
@@ -5929,6 +5929,42 @@
     </w:p>
     <w:p>
       <w:pPr>
+        <w:pStyle w:val="Normal"/>
+        <w:spacing w:before="0" w:beforeAutospacing="off" w:after="180" w:afterAutospacing="off"/>
+        <w:rPr>
+          <w:rFonts w:ascii="Calibri" w:hAnsi="Calibri" w:eastAsia="Calibri" w:cs="Calibri" w:asciiTheme="minorAscii" w:hAnsiTheme="minorAscii" w:eastAsiaTheme="minorAscii" w:cstheme="minorAscii"/>
+          <w:b w:val="0"/>
+          <w:bCs w:val="0"/>
+          <w:strike w:val="0"/>
+          <w:dstrike w:val="0"/>
+          <w:noProof w:val="0"/>
+          <w:sz w:val="24"/>
+          <w:szCs w:val="24"/>
+          <w:u w:val="none"/>
+          <w:lang w:val="en-GB"/>
+        </w:rPr>
+      </w:pPr>
+    </w:p>
+    <w:p>
+      <w:pPr>
+        <w:pStyle w:val="Normal"/>
+        <w:spacing w:before="0" w:beforeAutospacing="off" w:after="180" w:afterAutospacing="off"/>
+        <w:rPr>
+          <w:rFonts w:ascii="Calibri" w:hAnsi="Calibri" w:eastAsia="Calibri" w:cs="Calibri" w:asciiTheme="minorAscii" w:hAnsiTheme="minorAscii" w:eastAsiaTheme="minorAscii" w:cstheme="minorAscii"/>
+          <w:b w:val="0"/>
+          <w:bCs w:val="0"/>
+          <w:strike w:val="0"/>
+          <w:dstrike w:val="0"/>
+          <w:noProof w:val="0"/>
+          <w:sz w:val="24"/>
+          <w:szCs w:val="24"/>
+          <w:u w:val="none"/>
+          <w:lang w:val="en-GB"/>
+        </w:rPr>
+      </w:pPr>
+    </w:p>
+    <w:p>
+      <w:pPr>
         <w:spacing w:before="360" w:beforeAutospacing="off" w:after="180" w:afterAutospacing="off"/>
         <w:rPr>
           <w:rFonts w:ascii="Calibri" w:hAnsi="Calibri" w:eastAsia="Calibri" w:cs="Calibri" w:asciiTheme="minorAscii" w:hAnsiTheme="minorAscii" w:eastAsiaTheme="minorAscii" w:cstheme="minorAscii"/>
@@ -6249,6 +6285,397 @@
         </w:rPr>
         <w:t xml:space="preserve"> Do not use for basic database queries that can easily live inside a shared controller.</w:t>
       </w:r>
+    </w:p>
+    <w:p>
+      <w:pPr>
+        <w:pStyle w:val="Normal"/>
+        <w:spacing w:before="0" w:beforeAutospacing="off" w:after="180" w:afterAutospacing="off"/>
+        <w:rPr>
+          <w:rFonts w:ascii="Calibri" w:hAnsi="Calibri" w:eastAsia="Calibri" w:cs="Calibri" w:asciiTheme="minorAscii" w:hAnsiTheme="minorAscii" w:eastAsiaTheme="minorAscii" w:cstheme="minorAscii"/>
+          <w:b w:val="0"/>
+          <w:bCs w:val="0"/>
+          <w:strike w:val="0"/>
+          <w:dstrike w:val="0"/>
+          <w:noProof w:val="0"/>
+          <w:sz w:val="24"/>
+          <w:szCs w:val="24"/>
+          <w:u w:val="none"/>
+          <w:lang w:val="en-GB"/>
+        </w:rPr>
+      </w:pPr>
+    </w:p>
+    <w:p>
+      <w:pPr>
+        <w:pStyle w:val="Heading2"/>
+        <w:shd w:val="clear" w:color="auto" w:fill="FFFFFF" w:themeFill="background1"/>
+        <w:spacing w:before="840" w:beforeAutospacing="off" w:after="315" w:afterAutospacing="off"/>
+      </w:pPr>
+      <w:hyperlink r:id="Ra0f2f595c8594d48">
+        <w:r>
+          <w:rPr>
+            <w:rStyle w:val="Hyperlink"/>
+            <w:b w:val="1"/>
+            <w:bCs w:val="1"/>
+            <w:i w:val="1"/>
+            <w:iCs w:val="1"/>
+            <w:caps w:val="0"/>
+            <w:smallCaps w:val="0"/>
+            <w:strike w:val="0"/>
+            <w:dstrike w:val="0"/>
+            <w:noProof w:val="0"/>
+            <w:color w:val="FF0000"/>
+            <w:u w:val="single"/>
+            <w:lang w:val="en-GB"/>
+          </w:rPr>
+          <w:t>Controller Middleware:</w:t>
+        </w:r>
+      </w:hyperlink>
+    </w:p>
+    <w:p>
+      <w:pPr>
+        <w:pStyle w:val="Normal"/>
+      </w:pPr>
+      <w:hyperlink r:id="Rd6e44d85d661457f">
+        <w:r>
+          <w:rPr>
+            <w:rStyle w:val="Hyperlink"/>
+            <w:rFonts w:ascii="Calibri" w:hAnsi="Calibri" w:eastAsia="Calibri" w:cs="Calibri" w:asciiTheme="minorAscii" w:hAnsiTheme="minorAscii" w:eastAsiaTheme="minorAscii" w:cstheme="minorAscii"/>
+            <w:b w:val="0"/>
+            <w:bCs w:val="0"/>
+            <w:i w:val="0"/>
+            <w:iCs w:val="0"/>
+            <w:caps w:val="0"/>
+            <w:smallCaps w:val="0"/>
+            <w:strike w:val="0"/>
+            <w:dstrike w:val="0"/>
+            <w:noProof w:val="0"/>
+            <w:u w:val="single"/>
+            <w:lang w:val="en-GB"/>
+          </w:rPr>
+          <w:t>Middleware</w:t>
+        </w:r>
+      </w:hyperlink>
+      <w:r>
+        <w:rPr>
+          <w:rFonts w:ascii="Calibri" w:hAnsi="Calibri" w:eastAsia="Calibri" w:cs="Calibri" w:asciiTheme="minorAscii" w:hAnsiTheme="minorAscii" w:eastAsiaTheme="minorAscii" w:cstheme="minorAscii"/>
+          <w:b w:val="0"/>
+          <w:bCs w:val="0"/>
+          <w:i w:val="0"/>
+          <w:iCs w:val="0"/>
+          <w:caps w:val="0"/>
+          <w:smallCaps w:val="0"/>
+          <w:noProof w:val="0"/>
+          <w:color w:val="364153"/>
+          <w:sz w:val="24"/>
+          <w:szCs w:val="24"/>
+          <w:lang w:val="en-GB"/>
+        </w:rPr>
+        <w:t xml:space="preserve"> </w:t>
+      </w:r>
+      <w:r>
+        <w:rPr>
+          <w:rFonts w:ascii="Calibri" w:hAnsi="Calibri" w:eastAsia="Calibri" w:cs="Calibri" w:asciiTheme="minorAscii" w:hAnsiTheme="minorAscii" w:eastAsiaTheme="minorAscii" w:cstheme="minorAscii"/>
+          <w:b w:val="0"/>
+          <w:bCs w:val="0"/>
+          <w:i w:val="0"/>
+          <w:iCs w:val="0"/>
+          <w:caps w:val="0"/>
+          <w:smallCaps w:val="0"/>
+          <w:noProof w:val="0"/>
+          <w:color w:val="364153"/>
+          <w:sz w:val="24"/>
+          <w:szCs w:val="24"/>
+          <w:lang w:val="en-GB"/>
+        </w:rPr>
+        <w:t>may be assigned to the controller's routes in your route files:</w:t>
+      </w:r>
+    </w:p>
+    <w:p>
+      <w:pPr>
+        <w:pStyle w:val="Normal"/>
+        <w:rPr>
+          <w:rFonts w:ascii="Calibri" w:hAnsi="Calibri" w:eastAsia="Calibri" w:cs="Calibri" w:asciiTheme="minorAscii" w:hAnsiTheme="minorAscii" w:eastAsiaTheme="minorAscii" w:cstheme="minorAscii"/>
+          <w:b w:val="1"/>
+          <w:bCs w:val="1"/>
+          <w:i w:val="0"/>
+          <w:iCs w:val="0"/>
+          <w:caps w:val="0"/>
+          <w:smallCaps w:val="0"/>
+          <w:noProof w:val="0"/>
+          <w:color w:val="4C94D8" w:themeColor="text2" w:themeTint="80" w:themeShade="FF"/>
+          <w:sz w:val="24"/>
+          <w:szCs w:val="24"/>
+          <w:lang w:val="en-GB"/>
+        </w:rPr>
+      </w:pPr>
+      <w:r>
+        <w:rPr>
+          <w:rFonts w:ascii="Calibri" w:hAnsi="Calibri" w:eastAsia="Calibri" w:cs="Calibri" w:asciiTheme="minorAscii" w:hAnsiTheme="minorAscii" w:eastAsiaTheme="minorAscii" w:cstheme="minorAscii"/>
+          <w:b w:val="1"/>
+          <w:bCs w:val="1"/>
+          <w:i w:val="0"/>
+          <w:iCs w:val="0"/>
+          <w:caps w:val="0"/>
+          <w:smallCaps w:val="0"/>
+          <w:noProof w:val="0"/>
+          <w:color w:val="4C94D8" w:themeColor="text2" w:themeTint="80" w:themeShade="FF"/>
+          <w:sz w:val="24"/>
+          <w:szCs w:val="24"/>
+          <w:lang w:val="en-GB"/>
+        </w:rPr>
+        <w:t>Route::</w:t>
+      </w:r>
+      <w:r>
+        <w:rPr>
+          <w:rFonts w:ascii="Calibri" w:hAnsi="Calibri" w:eastAsia="Calibri" w:cs="Calibri" w:asciiTheme="minorAscii" w:hAnsiTheme="minorAscii" w:eastAsiaTheme="minorAscii" w:cstheme="minorAscii"/>
+          <w:b w:val="1"/>
+          <w:bCs w:val="1"/>
+          <w:i w:val="0"/>
+          <w:iCs w:val="0"/>
+          <w:caps w:val="0"/>
+          <w:smallCaps w:val="0"/>
+          <w:noProof w:val="0"/>
+          <w:color w:val="4C94D8" w:themeColor="text2" w:themeTint="80" w:themeShade="FF"/>
+          <w:sz w:val="24"/>
+          <w:szCs w:val="24"/>
+          <w:lang w:val="en-GB"/>
+        </w:rPr>
+        <w:t>get(</w:t>
+      </w:r>
+      <w:r>
+        <w:rPr>
+          <w:rFonts w:ascii="Calibri" w:hAnsi="Calibri" w:eastAsia="Calibri" w:cs="Calibri" w:asciiTheme="minorAscii" w:hAnsiTheme="minorAscii" w:eastAsiaTheme="minorAscii" w:cstheme="minorAscii"/>
+          <w:b w:val="1"/>
+          <w:bCs w:val="1"/>
+          <w:i w:val="0"/>
+          <w:iCs w:val="0"/>
+          <w:caps w:val="0"/>
+          <w:smallCaps w:val="0"/>
+          <w:noProof w:val="0"/>
+          <w:color w:val="4C94D8" w:themeColor="text2" w:themeTint="80" w:themeShade="FF"/>
+          <w:sz w:val="24"/>
+          <w:szCs w:val="24"/>
+          <w:lang w:val="en-GB"/>
+        </w:rPr>
+        <w:t xml:space="preserve">'/profile', </w:t>
+      </w:r>
+      <w:r>
+        <w:rPr>
+          <w:rFonts w:ascii="Calibri" w:hAnsi="Calibri" w:eastAsia="Calibri" w:cs="Calibri" w:asciiTheme="minorAscii" w:hAnsiTheme="minorAscii" w:eastAsiaTheme="minorAscii" w:cstheme="minorAscii"/>
+          <w:b w:val="1"/>
+          <w:bCs w:val="1"/>
+          <w:i w:val="0"/>
+          <w:iCs w:val="0"/>
+          <w:caps w:val="0"/>
+          <w:smallCaps w:val="0"/>
+          <w:noProof w:val="0"/>
+          <w:color w:val="4C94D8" w:themeColor="text2" w:themeTint="80" w:themeShade="FF"/>
+          <w:sz w:val="24"/>
+          <w:szCs w:val="24"/>
+          <w:lang w:val="en-GB"/>
+        </w:rPr>
+        <w:t xml:space="preserve"> </w:t>
+      </w:r>
+      <w:r>
+        <w:rPr>
+          <w:rFonts w:ascii="Calibri" w:hAnsi="Calibri" w:eastAsia="Calibri" w:cs="Calibri" w:asciiTheme="minorAscii" w:hAnsiTheme="minorAscii" w:eastAsiaTheme="minorAscii" w:cstheme="minorAscii"/>
+          <w:b w:val="1"/>
+          <w:bCs w:val="1"/>
+          <w:i w:val="0"/>
+          <w:iCs w:val="0"/>
+          <w:caps w:val="0"/>
+          <w:smallCaps w:val="0"/>
+          <w:noProof w:val="0"/>
+          <w:color w:val="4C94D8" w:themeColor="text2" w:themeTint="80" w:themeShade="FF"/>
+          <w:sz w:val="24"/>
+          <w:szCs w:val="24"/>
+          <w:lang w:val="en-GB"/>
+        </w:rPr>
+        <w:t>[</w:t>
+      </w:r>
+      <w:r>
+        <w:rPr>
+          <w:rFonts w:ascii="Calibri" w:hAnsi="Calibri" w:eastAsia="Calibri" w:cs="Calibri" w:asciiTheme="minorAscii" w:hAnsiTheme="minorAscii" w:eastAsiaTheme="minorAscii" w:cstheme="minorAscii"/>
+          <w:b w:val="1"/>
+          <w:bCs w:val="1"/>
+          <w:i w:val="0"/>
+          <w:iCs w:val="0"/>
+          <w:caps w:val="0"/>
+          <w:smallCaps w:val="0"/>
+          <w:noProof w:val="0"/>
+          <w:color w:val="4C94D8" w:themeColor="text2" w:themeTint="80" w:themeShade="FF"/>
+          <w:sz w:val="24"/>
+          <w:szCs w:val="24"/>
+          <w:lang w:val="en-GB"/>
+        </w:rPr>
+        <w:t>UserController</w:t>
+      </w:r>
+      <w:r>
+        <w:rPr>
+          <w:rFonts w:ascii="Calibri" w:hAnsi="Calibri" w:eastAsia="Calibri" w:cs="Calibri" w:asciiTheme="minorAscii" w:hAnsiTheme="minorAscii" w:eastAsiaTheme="minorAscii" w:cstheme="minorAscii"/>
+          <w:b w:val="1"/>
+          <w:bCs w:val="1"/>
+          <w:i w:val="0"/>
+          <w:iCs w:val="0"/>
+          <w:caps w:val="0"/>
+          <w:smallCaps w:val="0"/>
+          <w:noProof w:val="0"/>
+          <w:color w:val="4C94D8" w:themeColor="text2" w:themeTint="80" w:themeShade="FF"/>
+          <w:sz w:val="24"/>
+          <w:szCs w:val="24"/>
+          <w:lang w:val="en-GB"/>
+        </w:rPr>
+        <w:t>::</w:t>
+      </w:r>
+      <w:r>
+        <w:rPr>
+          <w:rFonts w:ascii="Calibri" w:hAnsi="Calibri" w:eastAsia="Calibri" w:cs="Calibri" w:asciiTheme="minorAscii" w:hAnsiTheme="minorAscii" w:eastAsiaTheme="minorAscii" w:cstheme="minorAscii"/>
+          <w:b w:val="1"/>
+          <w:bCs w:val="1"/>
+          <w:i w:val="0"/>
+          <w:iCs w:val="0"/>
+          <w:caps w:val="0"/>
+          <w:smallCaps w:val="0"/>
+          <w:noProof w:val="0"/>
+          <w:color w:val="4C94D8" w:themeColor="text2" w:themeTint="80" w:themeShade="FF"/>
+          <w:sz w:val="24"/>
+          <w:szCs w:val="24"/>
+          <w:lang w:val="en-GB"/>
+        </w:rPr>
+        <w:t>class ,</w:t>
+      </w:r>
+      <w:r>
+        <w:rPr>
+          <w:rFonts w:ascii="Calibri" w:hAnsi="Calibri" w:eastAsia="Calibri" w:cs="Calibri" w:asciiTheme="minorAscii" w:hAnsiTheme="minorAscii" w:eastAsiaTheme="minorAscii" w:cstheme="minorAscii"/>
+          <w:b w:val="1"/>
+          <w:bCs w:val="1"/>
+          <w:i w:val="0"/>
+          <w:iCs w:val="0"/>
+          <w:caps w:val="0"/>
+          <w:smallCaps w:val="0"/>
+          <w:noProof w:val="0"/>
+          <w:color w:val="4C94D8" w:themeColor="text2" w:themeTint="80" w:themeShade="FF"/>
+          <w:sz w:val="24"/>
+          <w:szCs w:val="24"/>
+          <w:lang w:val="en-GB"/>
+        </w:rPr>
+        <w:t xml:space="preserve"> 'show')-&gt;middleware('auth);</w:t>
+      </w:r>
+    </w:p>
+    <w:p>
+      <w:pPr>
+        <w:pStyle w:val="Normal"/>
+        <w:rPr>
+          <w:rFonts w:ascii="Calibri" w:hAnsi="Calibri" w:eastAsia="Calibri" w:cs="Calibri" w:asciiTheme="minorAscii" w:hAnsiTheme="minorAscii" w:eastAsiaTheme="minorAscii" w:cstheme="minorAscii"/>
+          <w:noProof w:val="0"/>
+          <w:sz w:val="24"/>
+          <w:szCs w:val="24"/>
+          <w:lang w:val="en-GB"/>
+        </w:rPr>
+      </w:pPr>
+      <w:r>
+        <w:rPr>
+          <w:rFonts w:ascii="Calibri" w:hAnsi="Calibri" w:eastAsia="Calibri" w:cs="Calibri" w:asciiTheme="minorAscii" w:hAnsiTheme="minorAscii" w:eastAsiaTheme="minorAscii" w:cstheme="minorAscii"/>
+          <w:b w:val="0"/>
+          <w:bCs w:val="0"/>
+          <w:i w:val="0"/>
+          <w:iCs w:val="0"/>
+          <w:caps w:val="0"/>
+          <w:smallCaps w:val="0"/>
+          <w:noProof w:val="0"/>
+          <w:color w:val="364153"/>
+          <w:sz w:val="24"/>
+          <w:szCs w:val="24"/>
+          <w:lang w:val="en-GB"/>
+        </w:rPr>
+        <w:t xml:space="preserve">Or, you may find it convenient to specify middleware within your controller class. To do so, your controller should implement the </w:t>
+      </w:r>
+      <w:r>
+        <w:rPr>
+          <w:rFonts w:ascii="Calibri" w:hAnsi="Calibri" w:eastAsia="Calibri" w:cs="Calibri" w:asciiTheme="minorAscii" w:hAnsiTheme="minorAscii" w:eastAsiaTheme="minorAscii" w:cstheme="minorAscii"/>
+          <w:b w:val="0"/>
+          <w:bCs w:val="0"/>
+          <w:i w:val="0"/>
+          <w:iCs w:val="0"/>
+          <w:caps w:val="0"/>
+          <w:smallCaps w:val="0"/>
+          <w:noProof w:val="0"/>
+          <w:color w:val="101828"/>
+          <w:sz w:val="24"/>
+          <w:szCs w:val="24"/>
+          <w:lang w:val="en-GB"/>
+        </w:rPr>
+        <w:t>HasMiddleware</w:t>
+      </w:r>
+      <w:r>
+        <w:rPr>
+          <w:rFonts w:ascii="Calibri" w:hAnsi="Calibri" w:eastAsia="Calibri" w:cs="Calibri" w:asciiTheme="minorAscii" w:hAnsiTheme="minorAscii" w:eastAsiaTheme="minorAscii" w:cstheme="minorAscii"/>
+          <w:b w:val="0"/>
+          <w:bCs w:val="0"/>
+          <w:i w:val="0"/>
+          <w:iCs w:val="0"/>
+          <w:caps w:val="0"/>
+          <w:smallCaps w:val="0"/>
+          <w:noProof w:val="0"/>
+          <w:color w:val="364153"/>
+          <w:sz w:val="24"/>
+          <w:szCs w:val="24"/>
+          <w:lang w:val="en-GB"/>
+        </w:rPr>
+        <w:t xml:space="preserve"> interface, which dictates that the controller should have a static </w:t>
+      </w:r>
+      <w:r>
+        <w:rPr>
+          <w:rFonts w:ascii="Calibri" w:hAnsi="Calibri" w:eastAsia="Calibri" w:cs="Calibri" w:asciiTheme="minorAscii" w:hAnsiTheme="minorAscii" w:eastAsiaTheme="minorAscii" w:cstheme="minorAscii"/>
+          <w:b w:val="0"/>
+          <w:bCs w:val="0"/>
+          <w:i w:val="0"/>
+          <w:iCs w:val="0"/>
+          <w:caps w:val="0"/>
+          <w:smallCaps w:val="0"/>
+          <w:noProof w:val="0"/>
+          <w:color w:val="101828"/>
+          <w:sz w:val="24"/>
+          <w:szCs w:val="24"/>
+          <w:lang w:val="en-GB"/>
+        </w:rPr>
+        <w:t>middleware</w:t>
+      </w:r>
+      <w:r>
+        <w:rPr>
+          <w:rFonts w:ascii="Calibri" w:hAnsi="Calibri" w:eastAsia="Calibri" w:cs="Calibri" w:asciiTheme="minorAscii" w:hAnsiTheme="minorAscii" w:eastAsiaTheme="minorAscii" w:cstheme="minorAscii"/>
+          <w:b w:val="0"/>
+          <w:bCs w:val="0"/>
+          <w:i w:val="0"/>
+          <w:iCs w:val="0"/>
+          <w:caps w:val="0"/>
+          <w:smallCaps w:val="0"/>
+          <w:noProof w:val="0"/>
+          <w:color w:val="364153"/>
+          <w:sz w:val="24"/>
+          <w:szCs w:val="24"/>
+          <w:lang w:val="en-GB"/>
+        </w:rPr>
+        <w:t xml:space="preserve"> method. From this method, you may return an array of middleware that should be applied to the controller's actions:</w:t>
+      </w:r>
+    </w:p>
+    <w:p>
+      <w:pPr>
+        <w:pStyle w:val="Normal"/>
+        <w:spacing w:before="0" w:beforeAutospacing="off" w:after="180" w:afterAutospacing="off"/>
+        <w:rPr>
+          <w:rFonts w:ascii="Calibri" w:hAnsi="Calibri" w:eastAsia="Calibri" w:cs="Calibri" w:asciiTheme="minorAscii" w:hAnsiTheme="minorAscii" w:eastAsiaTheme="minorAscii" w:cstheme="minorAscii"/>
+          <w:b w:val="0"/>
+          <w:bCs w:val="0"/>
+          <w:strike w:val="0"/>
+          <w:dstrike w:val="0"/>
+          <w:noProof w:val="0"/>
+          <w:sz w:val="24"/>
+          <w:szCs w:val="24"/>
+          <w:u w:val="none"/>
+          <w:lang w:val="en-GB"/>
+        </w:rPr>
+      </w:pPr>
     </w:p>
     <w:p>
       <w:pPr>

</xml_diff>

<commit_message>
Add notes on Laravel database migrations and Eloquent basics
</commit_message>
<xml_diff>
--- a/Laravel notes.docx
+++ b/Laravel notes.docx
@@ -6310,7 +6310,7 @@
         <w:shd w:val="clear" w:color="auto" w:fill="FFFFFF" w:themeFill="background1"/>
         <w:spacing w:before="840" w:beforeAutospacing="off" w:after="315" w:afterAutospacing="off"/>
       </w:pPr>
-      <w:hyperlink r:id="Ra0f2f595c8594d48">
+      <w:hyperlink r:id="Rb6c8263210114f09">
         <w:r>
           <w:rPr>
             <w:rStyle w:val="Hyperlink"/>
@@ -6335,7 +6335,7 @@
       <w:pPr>
         <w:pStyle w:val="Normal"/>
       </w:pPr>
-      <w:hyperlink r:id="Rd6e44d85d661457f">
+      <w:hyperlink r:id="R1d577a3bfc8d46d3">
         <w:r>
           <w:rPr>
             <w:rStyle w:val="Hyperlink"/>
@@ -6565,13 +6565,6 @@
     <w:p>
       <w:pPr>
         <w:pStyle w:val="Normal"/>
-        <w:rPr>
-          <w:rFonts w:ascii="Calibri" w:hAnsi="Calibri" w:eastAsia="Calibri" w:cs="Calibri" w:asciiTheme="minorAscii" w:hAnsiTheme="minorAscii" w:eastAsiaTheme="minorAscii" w:cstheme="minorAscii"/>
-          <w:noProof w:val="0"/>
-          <w:sz w:val="24"/>
-          <w:szCs w:val="24"/>
-          <w:lang w:val="en-GB"/>
-        </w:rPr>
       </w:pPr>
       <w:r>
         <w:rPr>
@@ -6658,6 +6651,2280 @@
         </w:rPr>
         <w:t xml:space="preserve"> method. From this method, you may return an array of middleware that should be applied to the controller's actions:</w:t>
       </w:r>
+    </w:p>
+    <w:p>
+      <w:pPr>
+        <w:pStyle w:val="Normal"/>
+        <w:rPr>
+          <w:rFonts w:ascii="Calibri" w:hAnsi="Calibri" w:eastAsia="Calibri" w:cs="Calibri" w:asciiTheme="minorAscii" w:hAnsiTheme="minorAscii" w:eastAsiaTheme="minorAscii" w:cstheme="minorAscii"/>
+          <w:b w:val="0"/>
+          <w:bCs w:val="0"/>
+          <w:i w:val="0"/>
+          <w:iCs w:val="0"/>
+          <w:caps w:val="0"/>
+          <w:smallCaps w:val="0"/>
+          <w:noProof w:val="0"/>
+          <w:color w:val="364153"/>
+          <w:sz w:val="24"/>
+          <w:szCs w:val="24"/>
+          <w:lang w:val="en-GB"/>
+        </w:rPr>
+      </w:pPr>
+    </w:p>
+    <w:p>
+      <w:pPr>
+        <w:pStyle w:val="Normal"/>
+        <w:rPr>
+          <w:rFonts w:ascii="Calibri" w:hAnsi="Calibri" w:eastAsia="Calibri" w:cs="Calibri" w:asciiTheme="minorAscii" w:hAnsiTheme="minorAscii" w:eastAsiaTheme="minorAscii" w:cstheme="minorAscii"/>
+          <w:b w:val="0"/>
+          <w:bCs w:val="0"/>
+          <w:i w:val="0"/>
+          <w:iCs w:val="0"/>
+          <w:caps w:val="0"/>
+          <w:smallCaps w:val="0"/>
+          <w:noProof w:val="0"/>
+          <w:color w:val="364153"/>
+          <w:sz w:val="24"/>
+          <w:szCs w:val="24"/>
+          <w:lang w:val="en-GB"/>
+        </w:rPr>
+      </w:pPr>
+    </w:p>
+    <w:p>
+      <w:pPr>
+        <w:pStyle w:val="Normal"/>
+        <w:rPr>
+          <w:rFonts w:ascii="Calibri" w:hAnsi="Calibri" w:eastAsia="Calibri" w:cs="Calibri" w:asciiTheme="minorAscii" w:hAnsiTheme="minorAscii" w:eastAsiaTheme="minorAscii" w:cstheme="minorAscii"/>
+          <w:b w:val="1"/>
+          <w:bCs w:val="1"/>
+          <w:i w:val="1"/>
+          <w:iCs w:val="1"/>
+          <w:caps w:val="0"/>
+          <w:smallCaps w:val="0"/>
+          <w:noProof w:val="0"/>
+          <w:color w:val="FF0000"/>
+          <w:sz w:val="36"/>
+          <w:szCs w:val="36"/>
+          <w:u w:val="single"/>
+          <w:lang w:val="en-GB"/>
+        </w:rPr>
+      </w:pPr>
+      <w:r>
+        <w:rPr>
+          <w:rFonts w:ascii="Calibri" w:hAnsi="Calibri" w:eastAsia="Calibri" w:cs="Calibri" w:asciiTheme="minorAscii" w:hAnsiTheme="minorAscii" w:eastAsiaTheme="minorAscii" w:cstheme="minorAscii"/>
+          <w:b w:val="1"/>
+          <w:bCs w:val="1"/>
+          <w:i w:val="1"/>
+          <w:iCs w:val="1"/>
+          <w:caps w:val="0"/>
+          <w:smallCaps w:val="0"/>
+          <w:noProof w:val="0"/>
+          <w:color w:val="FF0000"/>
+          <w:sz w:val="36"/>
+          <w:szCs w:val="36"/>
+          <w:u w:val="single"/>
+          <w:lang w:val="en-GB"/>
+        </w:rPr>
+        <w:t>Datab</w:t>
+      </w:r>
+      <w:r>
+        <w:rPr>
+          <w:rFonts w:ascii="Calibri" w:hAnsi="Calibri" w:eastAsia="Calibri" w:cs="Calibri" w:asciiTheme="minorAscii" w:hAnsiTheme="minorAscii" w:eastAsiaTheme="minorAscii" w:cstheme="minorAscii"/>
+          <w:b w:val="1"/>
+          <w:bCs w:val="1"/>
+          <w:i w:val="1"/>
+          <w:iCs w:val="1"/>
+          <w:caps w:val="0"/>
+          <w:smallCaps w:val="0"/>
+          <w:noProof w:val="0"/>
+          <w:color w:val="FF0000"/>
+          <w:sz w:val="36"/>
+          <w:szCs w:val="36"/>
+          <w:u w:val="single"/>
+          <w:lang w:val="en-GB"/>
+        </w:rPr>
+        <w:t>ase:</w:t>
+      </w:r>
+    </w:p>
+    <w:p>
+      <w:pPr>
+        <w:pStyle w:val="Heading2"/>
+        <w:shd w:val="clear" w:color="auto" w:fill="FFFFFF" w:themeFill="background1"/>
+        <w:spacing w:before="840" w:beforeAutospacing="off" w:after="315" w:afterAutospacing="off"/>
+        <w:rPr>
+          <w:rFonts w:ascii="Calibri" w:hAnsi="Calibri" w:eastAsia="Calibri" w:cs="Calibri" w:asciiTheme="minorAscii" w:hAnsiTheme="minorAscii" w:eastAsiaTheme="minorAscii" w:cstheme="minorAscii"/>
+        </w:rPr>
+      </w:pPr>
+      <w:hyperlink r:id="R055a4d545f4742e4">
+        <w:r>
+          <w:rPr>
+            <w:rStyle w:val="Hyperlink"/>
+            <w:rFonts w:ascii="Calibri" w:hAnsi="Calibri" w:eastAsia="Calibri" w:cs="Calibri" w:asciiTheme="minorAscii" w:hAnsiTheme="minorAscii" w:eastAsiaTheme="minorAscii" w:cstheme="minorAscii"/>
+            <w:b w:val="0"/>
+            <w:bCs w:val="0"/>
+            <w:i w:val="0"/>
+            <w:iCs w:val="0"/>
+            <w:caps w:val="0"/>
+            <w:smallCaps w:val="0"/>
+            <w:strike w:val="0"/>
+            <w:dstrike w:val="0"/>
+            <w:noProof w:val="0"/>
+            <w:color w:val="222221"/>
+            <w:u w:val="none"/>
+            <w:lang w:val="en-GB"/>
+          </w:rPr>
+          <w:t>Running Migrations</w:t>
+        </w:r>
+      </w:hyperlink>
+    </w:p>
+    <w:p>
+      <w:pPr>
+        <w:pStyle w:val="Normal"/>
+      </w:pPr>
+      <w:r>
+        <w:rPr>
+          <w:rFonts w:ascii="Calibri" w:hAnsi="Calibri" w:eastAsia="Calibri" w:cs="Calibri" w:asciiTheme="minorAscii" w:hAnsiTheme="minorAscii" w:eastAsiaTheme="minorAscii" w:cstheme="minorAscii"/>
+          <w:b w:val="1"/>
+          <w:bCs w:val="1"/>
+          <w:i w:val="0"/>
+          <w:iCs w:val="0"/>
+          <w:caps w:val="0"/>
+          <w:smallCaps w:val="0"/>
+          <w:noProof w:val="0"/>
+          <w:color w:val="4C94D8" w:themeColor="text2" w:themeTint="80" w:themeShade="FF"/>
+          <w:sz w:val="28"/>
+          <w:szCs w:val="28"/>
+          <w:u w:val="none"/>
+          <w:lang w:val="en-GB"/>
+        </w:rPr>
+        <w:t>Php artisan migrate</w:t>
+      </w:r>
+    </w:p>
+    <w:p>
+      <w:pPr>
+        <w:pStyle w:val="Normal"/>
+        <w:rPr>
+          <w:rFonts w:ascii="Calibri" w:hAnsi="Calibri" w:eastAsia="Calibri" w:cs="Calibri" w:asciiTheme="minorAscii" w:hAnsiTheme="minorAscii" w:eastAsiaTheme="minorAscii" w:cstheme="minorAscii"/>
+          <w:b w:val="1"/>
+          <w:bCs w:val="1"/>
+          <w:i w:val="0"/>
+          <w:iCs w:val="0"/>
+          <w:caps w:val="0"/>
+          <w:smallCaps w:val="0"/>
+          <w:noProof w:val="0"/>
+          <w:color w:val="4C94D8" w:themeColor="text2" w:themeTint="80" w:themeShade="FF"/>
+          <w:sz w:val="28"/>
+          <w:szCs w:val="28"/>
+          <w:u w:val="none"/>
+          <w:lang w:val="en-GB"/>
+        </w:rPr>
+      </w:pPr>
+    </w:p>
+    <w:p>
+      <w:pPr>
+        <w:pStyle w:val="Normal"/>
+        <w:rPr>
+          <w:rFonts w:ascii="Calibri" w:hAnsi="Calibri" w:eastAsia="Calibri" w:cs="Calibri" w:asciiTheme="minorAscii" w:hAnsiTheme="minorAscii" w:eastAsiaTheme="minorAscii" w:cstheme="minorAscii"/>
+          <w:b w:val="1"/>
+          <w:bCs w:val="1"/>
+          <w:i w:val="0"/>
+          <w:iCs w:val="0"/>
+          <w:caps w:val="0"/>
+          <w:smallCaps w:val="0"/>
+          <w:noProof w:val="0"/>
+          <w:color w:val="4C94D8" w:themeColor="text2" w:themeTint="80" w:themeShade="FF"/>
+          <w:sz w:val="24"/>
+          <w:szCs w:val="24"/>
+          <w:lang w:val="en-GB"/>
+        </w:rPr>
+      </w:pPr>
+    </w:p>
+    <w:p>
+      <w:pPr>
+        <w:pStyle w:val="Normal"/>
+        <w:rPr>
+          <w:rFonts w:ascii="Calibri" w:hAnsi="Calibri" w:eastAsia="Calibri" w:cs="Calibri" w:asciiTheme="minorAscii" w:hAnsiTheme="minorAscii" w:eastAsiaTheme="minorAscii" w:cstheme="minorAscii"/>
+          <w:b w:val="1"/>
+          <w:bCs w:val="1"/>
+          <w:i w:val="0"/>
+          <w:iCs w:val="0"/>
+          <w:caps w:val="0"/>
+          <w:smallCaps w:val="0"/>
+          <w:noProof w:val="0"/>
+          <w:color w:val="4C94D8" w:themeColor="text2" w:themeTint="80" w:themeShade="FF"/>
+          <w:sz w:val="24"/>
+          <w:szCs w:val="24"/>
+          <w:lang w:val="en-GB"/>
+        </w:rPr>
+      </w:pPr>
+    </w:p>
+    <w:p>
+      <w:pPr>
+        <w:pStyle w:val="Normal"/>
+        <w:rPr>
+          <w:rFonts w:ascii="Calibri" w:hAnsi="Calibri" w:eastAsia="Calibri" w:cs="Calibri" w:asciiTheme="minorAscii" w:hAnsiTheme="minorAscii" w:eastAsiaTheme="minorAscii" w:cstheme="minorAscii"/>
+          <w:b w:val="1"/>
+          <w:bCs w:val="1"/>
+          <w:i w:val="0"/>
+          <w:iCs w:val="0"/>
+          <w:caps w:val="0"/>
+          <w:smallCaps w:val="0"/>
+          <w:noProof w:val="0"/>
+          <w:color w:val="4C94D8" w:themeColor="text2" w:themeTint="80" w:themeShade="FF"/>
+          <w:sz w:val="24"/>
+          <w:szCs w:val="24"/>
+          <w:lang w:val="en-GB"/>
+        </w:rPr>
+      </w:pPr>
+      <w:r>
+        <w:rPr>
+          <w:rFonts w:ascii="Calibri" w:hAnsi="Calibri" w:eastAsia="Calibri" w:cs="Calibri" w:asciiTheme="minorAscii" w:hAnsiTheme="minorAscii" w:eastAsiaTheme="minorAscii" w:cstheme="minorAscii"/>
+          <w:b w:val="1"/>
+          <w:bCs w:val="1"/>
+          <w:i w:val="0"/>
+          <w:iCs w:val="0"/>
+          <w:caps w:val="0"/>
+          <w:smallCaps w:val="0"/>
+          <w:noProof w:val="0"/>
+          <w:color w:val="4C94D8" w:themeColor="text2" w:themeTint="80" w:themeShade="FF"/>
+          <w:sz w:val="24"/>
+          <w:szCs w:val="24"/>
+          <w:lang w:val="en-GB"/>
+        </w:rPr>
+        <w:t>php</w:t>
+      </w:r>
+      <w:r>
+        <w:rPr>
+          <w:rFonts w:ascii="Calibri" w:hAnsi="Calibri" w:eastAsia="Calibri" w:cs="Calibri" w:asciiTheme="minorAscii" w:hAnsiTheme="minorAscii" w:eastAsiaTheme="minorAscii" w:cstheme="minorAscii"/>
+          <w:b w:val="1"/>
+          <w:bCs w:val="1"/>
+          <w:i w:val="0"/>
+          <w:iCs w:val="0"/>
+          <w:caps w:val="0"/>
+          <w:smallCaps w:val="0"/>
+          <w:noProof w:val="0"/>
+          <w:color w:val="4C94D8" w:themeColor="text2" w:themeTint="80" w:themeShade="FF"/>
+          <w:sz w:val="24"/>
+          <w:szCs w:val="24"/>
+          <w:lang w:val="en-GB"/>
+        </w:rPr>
+        <w:t xml:space="preserve"> artisan </w:t>
+      </w:r>
+      <w:r>
+        <w:rPr>
+          <w:rFonts w:ascii="Calibri" w:hAnsi="Calibri" w:eastAsia="Calibri" w:cs="Calibri" w:asciiTheme="minorAscii" w:hAnsiTheme="minorAscii" w:eastAsiaTheme="minorAscii" w:cstheme="minorAscii"/>
+          <w:b w:val="1"/>
+          <w:bCs w:val="1"/>
+          <w:i w:val="0"/>
+          <w:iCs w:val="0"/>
+          <w:caps w:val="0"/>
+          <w:smallCaps w:val="0"/>
+          <w:noProof w:val="0"/>
+          <w:color w:val="4C94D8" w:themeColor="text2" w:themeTint="80" w:themeShade="FF"/>
+          <w:sz w:val="24"/>
+          <w:szCs w:val="24"/>
+          <w:lang w:val="en-GB"/>
+        </w:rPr>
+        <w:t>migrate:status</w:t>
+      </w:r>
+    </w:p>
+    <w:p>
+      <w:pPr>
+        <w:pStyle w:val="Normal"/>
+      </w:pPr>
+      <w:r>
+        <w:rPr>
+          <w:rFonts w:ascii="Calibri" w:hAnsi="Calibri" w:eastAsia="Calibri" w:cs="Calibri" w:asciiTheme="minorAscii" w:hAnsiTheme="minorAscii" w:eastAsiaTheme="minorAscii" w:cstheme="minorAscii"/>
+          <w:b w:val="0"/>
+          <w:bCs w:val="0"/>
+          <w:i w:val="0"/>
+          <w:iCs w:val="0"/>
+          <w:caps w:val="0"/>
+          <w:smallCaps w:val="0"/>
+          <w:noProof w:val="0"/>
+          <w:color w:val="364153"/>
+          <w:sz w:val="24"/>
+          <w:szCs w:val="24"/>
+          <w:lang w:val="en-GB"/>
+        </w:rPr>
+        <w:t xml:space="preserve">If you would like to see which migrations have already run and which are still pending, you may use the </w:t>
+      </w:r>
+      <w:r>
+        <w:rPr>
+          <w:rFonts w:ascii="Calibri" w:hAnsi="Calibri" w:eastAsia="Calibri" w:cs="Calibri" w:asciiTheme="minorAscii" w:hAnsiTheme="minorAscii" w:eastAsiaTheme="minorAscii" w:cstheme="minorAscii"/>
+          <w:b w:val="0"/>
+          <w:bCs w:val="0"/>
+          <w:i w:val="0"/>
+          <w:iCs w:val="0"/>
+          <w:caps w:val="0"/>
+          <w:smallCaps w:val="0"/>
+          <w:noProof w:val="0"/>
+          <w:color w:val="101828"/>
+          <w:sz w:val="28"/>
+          <w:szCs w:val="28"/>
+          <w:lang w:val="en-GB"/>
+        </w:rPr>
+        <w:t>migrate:status</w:t>
+      </w:r>
+      <w:r>
+        <w:rPr>
+          <w:rFonts w:ascii="Calibri" w:hAnsi="Calibri" w:eastAsia="Calibri" w:cs="Calibri" w:asciiTheme="minorAscii" w:hAnsiTheme="minorAscii" w:eastAsiaTheme="minorAscii" w:cstheme="minorAscii"/>
+          <w:b w:val="0"/>
+          <w:bCs w:val="0"/>
+          <w:i w:val="0"/>
+          <w:iCs w:val="0"/>
+          <w:caps w:val="0"/>
+          <w:smallCaps w:val="0"/>
+          <w:noProof w:val="0"/>
+          <w:color w:val="364153"/>
+          <w:sz w:val="24"/>
+          <w:szCs w:val="24"/>
+          <w:lang w:val="en-GB"/>
+        </w:rPr>
+        <w:t xml:space="preserve"> Artisan command</w:t>
+      </w:r>
+    </w:p>
+    <w:p>
+      <w:pPr>
+        <w:pStyle w:val="Normal"/>
+        <w:rPr>
+          <w:rFonts w:ascii="Calibri" w:hAnsi="Calibri" w:eastAsia="Calibri" w:cs="Calibri" w:asciiTheme="minorAscii" w:hAnsiTheme="minorAscii" w:eastAsiaTheme="minorAscii" w:cstheme="minorAscii"/>
+          <w:b w:val="0"/>
+          <w:bCs w:val="0"/>
+          <w:i w:val="0"/>
+          <w:iCs w:val="0"/>
+          <w:caps w:val="0"/>
+          <w:smallCaps w:val="0"/>
+          <w:noProof w:val="0"/>
+          <w:color w:val="364153"/>
+          <w:sz w:val="24"/>
+          <w:szCs w:val="24"/>
+          <w:lang w:val="en-GB"/>
+        </w:rPr>
+      </w:pPr>
+    </w:p>
+    <w:p>
+      <w:pPr>
+        <w:pStyle w:val="Normal"/>
+        <w:rPr>
+          <w:rFonts w:ascii="Calibri" w:hAnsi="Calibri" w:eastAsia="Calibri" w:cs="Calibri" w:asciiTheme="minorAscii" w:hAnsiTheme="minorAscii" w:eastAsiaTheme="minorAscii" w:cstheme="minorAscii"/>
+          <w:b w:val="1"/>
+          <w:bCs w:val="1"/>
+          <w:i w:val="0"/>
+          <w:iCs w:val="0"/>
+          <w:caps w:val="0"/>
+          <w:smallCaps w:val="0"/>
+          <w:noProof w:val="0"/>
+          <w:color w:val="4C94D8" w:themeColor="text2" w:themeTint="80" w:themeShade="FF"/>
+          <w:sz w:val="24"/>
+          <w:szCs w:val="24"/>
+          <w:u w:val="none"/>
+          <w:lang w:val="en-GB"/>
+        </w:rPr>
+      </w:pPr>
+      <w:r>
+        <w:rPr>
+          <w:rFonts w:ascii="Calibri" w:hAnsi="Calibri" w:eastAsia="Calibri" w:cs="Calibri" w:asciiTheme="minorAscii" w:hAnsiTheme="minorAscii" w:eastAsiaTheme="minorAscii" w:cstheme="minorAscii"/>
+          <w:b w:val="1"/>
+          <w:bCs w:val="1"/>
+          <w:i w:val="0"/>
+          <w:iCs w:val="0"/>
+          <w:caps w:val="0"/>
+          <w:smallCaps w:val="0"/>
+          <w:noProof w:val="0"/>
+          <w:color w:val="4C94D8" w:themeColor="text2" w:themeTint="80" w:themeShade="FF"/>
+          <w:sz w:val="24"/>
+          <w:szCs w:val="24"/>
+          <w:u w:val="none"/>
+          <w:lang w:val="en-GB"/>
+        </w:rPr>
+        <w:t>Php</w:t>
+      </w:r>
+      <w:r>
+        <w:rPr>
+          <w:rFonts w:ascii="Calibri" w:hAnsi="Calibri" w:eastAsia="Calibri" w:cs="Calibri" w:asciiTheme="minorAscii" w:hAnsiTheme="minorAscii" w:eastAsiaTheme="minorAscii" w:cstheme="minorAscii"/>
+          <w:b w:val="1"/>
+          <w:bCs w:val="1"/>
+          <w:i w:val="0"/>
+          <w:iCs w:val="0"/>
+          <w:caps w:val="0"/>
+          <w:smallCaps w:val="0"/>
+          <w:noProof w:val="0"/>
+          <w:color w:val="4C94D8" w:themeColor="text2" w:themeTint="80" w:themeShade="FF"/>
+          <w:sz w:val="24"/>
+          <w:szCs w:val="24"/>
+          <w:u w:val="none"/>
+          <w:lang w:val="en-GB"/>
+        </w:rPr>
+        <w:t xml:space="preserve"> artisan migrate –step</w:t>
+      </w:r>
+    </w:p>
+    <w:p>
+      <w:pPr>
+        <w:pStyle w:val="Normal"/>
+        <w:rPr>
+          <w:rFonts w:ascii="Calibri" w:hAnsi="Calibri" w:eastAsia="Calibri" w:cs="Calibri" w:asciiTheme="minorAscii" w:hAnsiTheme="minorAscii" w:eastAsiaTheme="minorAscii" w:cstheme="minorAscii"/>
+          <w:b w:val="0"/>
+          <w:bCs w:val="0"/>
+          <w:i w:val="0"/>
+          <w:iCs w:val="0"/>
+          <w:caps w:val="0"/>
+          <w:smallCaps w:val="0"/>
+          <w:noProof w:val="0"/>
+          <w:color w:val="364153"/>
+          <w:sz w:val="24"/>
+          <w:szCs w:val="24"/>
+          <w:lang w:val="en-GB"/>
+        </w:rPr>
+      </w:pPr>
+      <w:r>
+        <w:rPr>
+          <w:rFonts w:ascii="Calibri" w:hAnsi="Calibri" w:eastAsia="Calibri" w:cs="Calibri" w:asciiTheme="minorAscii" w:hAnsiTheme="minorAscii" w:eastAsiaTheme="minorAscii" w:cstheme="minorAscii"/>
+          <w:b w:val="0"/>
+          <w:bCs w:val="0"/>
+          <w:i w:val="0"/>
+          <w:iCs w:val="0"/>
+          <w:caps w:val="0"/>
+          <w:smallCaps w:val="0"/>
+          <w:noProof w:val="0"/>
+          <w:color w:val="364153"/>
+          <w:sz w:val="24"/>
+          <w:szCs w:val="24"/>
+          <w:lang w:val="en-GB"/>
+        </w:rPr>
+        <w:t xml:space="preserve">If you provide the </w:t>
+      </w:r>
+      <w:r>
+        <w:rPr>
+          <w:rFonts w:ascii="Calibri" w:hAnsi="Calibri" w:eastAsia="Calibri" w:cs="Calibri" w:asciiTheme="minorAscii" w:hAnsiTheme="minorAscii" w:eastAsiaTheme="minorAscii" w:cstheme="minorAscii"/>
+          <w:b w:val="0"/>
+          <w:bCs w:val="0"/>
+          <w:i w:val="0"/>
+          <w:iCs w:val="0"/>
+          <w:caps w:val="0"/>
+          <w:smallCaps w:val="0"/>
+          <w:noProof w:val="0"/>
+          <w:color w:val="101828"/>
+          <w:sz w:val="24"/>
+          <w:szCs w:val="24"/>
+          <w:lang w:val="en-GB"/>
+        </w:rPr>
+        <w:t>--step</w:t>
+      </w:r>
+      <w:r>
+        <w:rPr>
+          <w:rFonts w:ascii="Calibri" w:hAnsi="Calibri" w:eastAsia="Calibri" w:cs="Calibri" w:asciiTheme="minorAscii" w:hAnsiTheme="minorAscii" w:eastAsiaTheme="minorAscii" w:cstheme="minorAscii"/>
+          <w:b w:val="0"/>
+          <w:bCs w:val="0"/>
+          <w:i w:val="0"/>
+          <w:iCs w:val="0"/>
+          <w:caps w:val="0"/>
+          <w:smallCaps w:val="0"/>
+          <w:noProof w:val="0"/>
+          <w:color w:val="364153"/>
+          <w:sz w:val="24"/>
+          <w:szCs w:val="24"/>
+          <w:lang w:val="en-GB"/>
+        </w:rPr>
+        <w:t xml:space="preserve"> option to the </w:t>
+      </w:r>
+      <w:r>
+        <w:rPr>
+          <w:rFonts w:ascii="Calibri" w:hAnsi="Calibri" w:eastAsia="Calibri" w:cs="Calibri" w:asciiTheme="minorAscii" w:hAnsiTheme="minorAscii" w:eastAsiaTheme="minorAscii" w:cstheme="minorAscii"/>
+          <w:b w:val="0"/>
+          <w:bCs w:val="0"/>
+          <w:i w:val="0"/>
+          <w:iCs w:val="0"/>
+          <w:caps w:val="0"/>
+          <w:smallCaps w:val="0"/>
+          <w:noProof w:val="0"/>
+          <w:color w:val="101828"/>
+          <w:sz w:val="24"/>
+          <w:szCs w:val="24"/>
+          <w:lang w:val="en-GB"/>
+        </w:rPr>
+        <w:t>migrate</w:t>
+      </w:r>
+      <w:r>
+        <w:rPr>
+          <w:rFonts w:ascii="Calibri" w:hAnsi="Calibri" w:eastAsia="Calibri" w:cs="Calibri" w:asciiTheme="minorAscii" w:hAnsiTheme="minorAscii" w:eastAsiaTheme="minorAscii" w:cstheme="minorAscii"/>
+          <w:b w:val="0"/>
+          <w:bCs w:val="0"/>
+          <w:i w:val="0"/>
+          <w:iCs w:val="0"/>
+          <w:caps w:val="0"/>
+          <w:smallCaps w:val="0"/>
+          <w:noProof w:val="0"/>
+          <w:color w:val="364153"/>
+          <w:sz w:val="24"/>
+          <w:szCs w:val="24"/>
+          <w:lang w:val="en-GB"/>
+        </w:rPr>
+        <w:t xml:space="preserve"> command, the command will run each migration as its own batch, allowing you to roll back individual migrations later using the </w:t>
+      </w:r>
+      <w:r>
+        <w:rPr>
+          <w:rFonts w:ascii="Calibri" w:hAnsi="Calibri" w:eastAsia="Calibri" w:cs="Calibri" w:asciiTheme="minorAscii" w:hAnsiTheme="minorAscii" w:eastAsiaTheme="minorAscii" w:cstheme="minorAscii"/>
+          <w:b w:val="0"/>
+          <w:bCs w:val="0"/>
+          <w:i w:val="0"/>
+          <w:iCs w:val="0"/>
+          <w:caps w:val="0"/>
+          <w:smallCaps w:val="0"/>
+          <w:noProof w:val="0"/>
+          <w:color w:val="101828"/>
+          <w:sz w:val="24"/>
+          <w:szCs w:val="24"/>
+          <w:lang w:val="en-GB"/>
+        </w:rPr>
+        <w:t>migrate:rollback</w:t>
+      </w:r>
+      <w:r>
+        <w:rPr>
+          <w:rFonts w:ascii="Calibri" w:hAnsi="Calibri" w:eastAsia="Calibri" w:cs="Calibri" w:asciiTheme="minorAscii" w:hAnsiTheme="minorAscii" w:eastAsiaTheme="minorAscii" w:cstheme="minorAscii"/>
+          <w:b w:val="0"/>
+          <w:bCs w:val="0"/>
+          <w:i w:val="0"/>
+          <w:iCs w:val="0"/>
+          <w:caps w:val="0"/>
+          <w:smallCaps w:val="0"/>
+          <w:noProof w:val="0"/>
+          <w:color w:val="364153"/>
+          <w:sz w:val="24"/>
+          <w:szCs w:val="24"/>
+          <w:lang w:val="en-GB"/>
+        </w:rPr>
+        <w:t xml:space="preserve"> command:</w:t>
+      </w:r>
+    </w:p>
+    <w:p>
+      <w:pPr>
+        <w:pStyle w:val="Normal"/>
+        <w:rPr>
+          <w:rFonts w:ascii="Calibri" w:hAnsi="Calibri" w:eastAsia="Calibri" w:cs="Calibri" w:asciiTheme="minorAscii" w:hAnsiTheme="minorAscii" w:eastAsiaTheme="minorAscii" w:cstheme="minorAscii"/>
+          <w:b w:val="0"/>
+          <w:bCs w:val="0"/>
+          <w:i w:val="0"/>
+          <w:iCs w:val="0"/>
+          <w:caps w:val="0"/>
+          <w:smallCaps w:val="0"/>
+          <w:noProof w:val="0"/>
+          <w:color w:val="364153"/>
+          <w:sz w:val="24"/>
+          <w:szCs w:val="24"/>
+          <w:lang w:val="en-GB"/>
+        </w:rPr>
+      </w:pPr>
+    </w:p>
+    <w:p>
+      <w:pPr>
+        <w:pStyle w:val="Normal"/>
+        <w:rPr>
+          <w:rFonts w:ascii="Calibri" w:hAnsi="Calibri" w:eastAsia="Calibri" w:cs="Calibri" w:asciiTheme="minorAscii" w:hAnsiTheme="minorAscii" w:eastAsiaTheme="minorAscii" w:cstheme="minorAscii"/>
+          <w:b w:val="1"/>
+          <w:bCs w:val="1"/>
+          <w:i w:val="0"/>
+          <w:iCs w:val="0"/>
+          <w:caps w:val="0"/>
+          <w:smallCaps w:val="0"/>
+          <w:noProof w:val="0"/>
+          <w:color w:val="4C94D8" w:themeColor="text2" w:themeTint="80" w:themeShade="FF"/>
+          <w:sz w:val="24"/>
+          <w:szCs w:val="24"/>
+          <w:lang w:val="en-GB"/>
+        </w:rPr>
+      </w:pPr>
+      <w:r>
+        <w:rPr>
+          <w:rFonts w:ascii="Calibri" w:hAnsi="Calibri" w:eastAsia="Calibri" w:cs="Calibri" w:asciiTheme="minorAscii" w:hAnsiTheme="minorAscii" w:eastAsiaTheme="minorAscii" w:cstheme="minorAscii"/>
+          <w:b w:val="1"/>
+          <w:bCs w:val="1"/>
+          <w:i w:val="0"/>
+          <w:iCs w:val="0"/>
+          <w:caps w:val="0"/>
+          <w:smallCaps w:val="0"/>
+          <w:noProof w:val="0"/>
+          <w:color w:val="4C94D8" w:themeColor="text2" w:themeTint="80" w:themeShade="FF"/>
+          <w:sz w:val="24"/>
+          <w:szCs w:val="24"/>
+          <w:lang w:val="en-GB"/>
+        </w:rPr>
+        <w:t>Php</w:t>
+      </w:r>
+      <w:r>
+        <w:rPr>
+          <w:rFonts w:ascii="Calibri" w:hAnsi="Calibri" w:eastAsia="Calibri" w:cs="Calibri" w:asciiTheme="minorAscii" w:hAnsiTheme="minorAscii" w:eastAsiaTheme="minorAscii" w:cstheme="minorAscii"/>
+          <w:b w:val="1"/>
+          <w:bCs w:val="1"/>
+          <w:i w:val="0"/>
+          <w:iCs w:val="0"/>
+          <w:caps w:val="0"/>
+          <w:smallCaps w:val="0"/>
+          <w:noProof w:val="0"/>
+          <w:color w:val="4C94D8" w:themeColor="text2" w:themeTint="80" w:themeShade="FF"/>
+          <w:sz w:val="24"/>
+          <w:szCs w:val="24"/>
+          <w:lang w:val="en-GB"/>
+        </w:rPr>
+        <w:t xml:space="preserve"> artisan migrate --pretend</w:t>
+      </w:r>
+    </w:p>
+    <w:p>
+      <w:pPr>
+        <w:pStyle w:val="Normal"/>
+        <w:rPr>
+          <w:rFonts w:ascii="Calibri" w:hAnsi="Calibri" w:eastAsia="Calibri" w:cs="Calibri" w:asciiTheme="minorAscii" w:hAnsiTheme="minorAscii" w:eastAsiaTheme="minorAscii" w:cstheme="minorAscii"/>
+          <w:b w:val="0"/>
+          <w:bCs w:val="0"/>
+          <w:i w:val="0"/>
+          <w:iCs w:val="0"/>
+          <w:caps w:val="0"/>
+          <w:smallCaps w:val="0"/>
+          <w:noProof w:val="0"/>
+          <w:color w:val="364153"/>
+          <w:sz w:val="24"/>
+          <w:szCs w:val="24"/>
+          <w:lang w:val="en-GB"/>
+        </w:rPr>
+      </w:pPr>
+      <w:r>
+        <w:rPr>
+          <w:rFonts w:ascii="Calibri" w:hAnsi="Calibri" w:eastAsia="Calibri" w:cs="Calibri" w:asciiTheme="minorAscii" w:hAnsiTheme="minorAscii" w:eastAsiaTheme="minorAscii" w:cstheme="minorAscii"/>
+          <w:b w:val="0"/>
+          <w:bCs w:val="0"/>
+          <w:i w:val="0"/>
+          <w:iCs w:val="0"/>
+          <w:caps w:val="0"/>
+          <w:smallCaps w:val="0"/>
+          <w:noProof w:val="0"/>
+          <w:color w:val="364153"/>
+          <w:sz w:val="24"/>
+          <w:szCs w:val="24"/>
+          <w:lang w:val="en-GB"/>
+        </w:rPr>
+        <w:t xml:space="preserve">If you would like to see the SQL statements that will be executed by the migrations without actually running them, you may provide the </w:t>
+      </w:r>
+      <w:r>
+        <w:rPr>
+          <w:rFonts w:ascii="Calibri" w:hAnsi="Calibri" w:eastAsia="Calibri" w:cs="Calibri" w:asciiTheme="minorAscii" w:hAnsiTheme="minorAscii" w:eastAsiaTheme="minorAscii" w:cstheme="minorAscii"/>
+          <w:b w:val="0"/>
+          <w:bCs w:val="0"/>
+          <w:i w:val="0"/>
+          <w:iCs w:val="0"/>
+          <w:caps w:val="0"/>
+          <w:smallCaps w:val="0"/>
+          <w:noProof w:val="0"/>
+          <w:color w:val="101828"/>
+          <w:sz w:val="24"/>
+          <w:szCs w:val="24"/>
+          <w:lang w:val="en-GB"/>
+        </w:rPr>
+        <w:t>--pretend</w:t>
+      </w:r>
+      <w:r>
+        <w:rPr>
+          <w:rFonts w:ascii="Calibri" w:hAnsi="Calibri" w:eastAsia="Calibri" w:cs="Calibri" w:asciiTheme="minorAscii" w:hAnsiTheme="minorAscii" w:eastAsiaTheme="minorAscii" w:cstheme="minorAscii"/>
+          <w:b w:val="0"/>
+          <w:bCs w:val="0"/>
+          <w:i w:val="0"/>
+          <w:iCs w:val="0"/>
+          <w:caps w:val="0"/>
+          <w:smallCaps w:val="0"/>
+          <w:noProof w:val="0"/>
+          <w:color w:val="364153"/>
+          <w:sz w:val="24"/>
+          <w:szCs w:val="24"/>
+          <w:lang w:val="en-GB"/>
+        </w:rPr>
+        <w:t xml:space="preserve"> flag to the </w:t>
+      </w:r>
+      <w:r>
+        <w:rPr>
+          <w:rFonts w:ascii="Calibri" w:hAnsi="Calibri" w:eastAsia="Calibri" w:cs="Calibri" w:asciiTheme="minorAscii" w:hAnsiTheme="minorAscii" w:eastAsiaTheme="minorAscii" w:cstheme="minorAscii"/>
+          <w:b w:val="0"/>
+          <w:bCs w:val="0"/>
+          <w:i w:val="0"/>
+          <w:iCs w:val="0"/>
+          <w:caps w:val="0"/>
+          <w:smallCaps w:val="0"/>
+          <w:noProof w:val="0"/>
+          <w:color w:val="101828"/>
+          <w:sz w:val="24"/>
+          <w:szCs w:val="24"/>
+          <w:lang w:val="en-GB"/>
+        </w:rPr>
+        <w:t>migrate</w:t>
+      </w:r>
+      <w:r>
+        <w:rPr>
+          <w:rFonts w:ascii="Calibri" w:hAnsi="Calibri" w:eastAsia="Calibri" w:cs="Calibri" w:asciiTheme="minorAscii" w:hAnsiTheme="minorAscii" w:eastAsiaTheme="minorAscii" w:cstheme="minorAscii"/>
+          <w:b w:val="0"/>
+          <w:bCs w:val="0"/>
+          <w:i w:val="0"/>
+          <w:iCs w:val="0"/>
+          <w:caps w:val="0"/>
+          <w:smallCaps w:val="0"/>
+          <w:noProof w:val="0"/>
+          <w:color w:val="364153"/>
+          <w:sz w:val="24"/>
+          <w:szCs w:val="24"/>
+          <w:lang w:val="en-GB"/>
+        </w:rPr>
+        <w:t xml:space="preserve"> command:</w:t>
+      </w:r>
+    </w:p>
+    <w:p>
+      <w:pPr>
+        <w:pStyle w:val="Normal"/>
+        <w:rPr>
+          <w:rFonts w:ascii="Calibri" w:hAnsi="Calibri" w:eastAsia="Calibri" w:cs="Calibri" w:asciiTheme="minorAscii" w:hAnsiTheme="minorAscii" w:eastAsiaTheme="minorAscii" w:cstheme="minorAscii"/>
+          <w:b w:val="1"/>
+          <w:bCs w:val="1"/>
+          <w:i w:val="0"/>
+          <w:iCs w:val="0"/>
+          <w:caps w:val="0"/>
+          <w:smallCaps w:val="0"/>
+          <w:noProof w:val="0"/>
+          <w:color w:val="4C94D8" w:themeColor="text2" w:themeTint="80" w:themeShade="FF"/>
+          <w:sz w:val="24"/>
+          <w:szCs w:val="24"/>
+          <w:lang w:val="en-GB"/>
+        </w:rPr>
+      </w:pPr>
+    </w:p>
+    <w:p>
+      <w:pPr>
+        <w:pStyle w:val="Normal"/>
+        <w:rPr>
+          <w:rFonts w:ascii="Calibri" w:hAnsi="Calibri" w:eastAsia="Calibri" w:cs="Calibri" w:asciiTheme="minorAscii" w:hAnsiTheme="minorAscii" w:eastAsiaTheme="minorAscii" w:cstheme="minorAscii"/>
+          <w:b w:val="1"/>
+          <w:bCs w:val="1"/>
+          <w:i w:val="0"/>
+          <w:iCs w:val="0"/>
+          <w:caps w:val="0"/>
+          <w:smallCaps w:val="0"/>
+          <w:noProof w:val="0"/>
+          <w:color w:val="4C94D8" w:themeColor="text2" w:themeTint="80" w:themeShade="FF"/>
+          <w:sz w:val="24"/>
+          <w:szCs w:val="24"/>
+          <w:lang w:val="en-GB"/>
+        </w:rPr>
+      </w:pPr>
+      <w:r>
+        <w:rPr>
+          <w:rFonts w:ascii="Calibri" w:hAnsi="Calibri" w:eastAsia="Calibri" w:cs="Calibri" w:asciiTheme="minorAscii" w:hAnsiTheme="minorAscii" w:eastAsiaTheme="minorAscii" w:cstheme="minorAscii"/>
+          <w:b w:val="1"/>
+          <w:bCs w:val="1"/>
+          <w:i w:val="0"/>
+          <w:iCs w:val="0"/>
+          <w:caps w:val="0"/>
+          <w:smallCaps w:val="0"/>
+          <w:noProof w:val="0"/>
+          <w:color w:val="4C94D8" w:themeColor="text2" w:themeTint="80" w:themeShade="FF"/>
+          <w:sz w:val="24"/>
+          <w:szCs w:val="24"/>
+          <w:lang w:val="en-GB"/>
+        </w:rPr>
+        <w:t>Php</w:t>
+      </w:r>
+      <w:r>
+        <w:rPr>
+          <w:rFonts w:ascii="Calibri" w:hAnsi="Calibri" w:eastAsia="Calibri" w:cs="Calibri" w:asciiTheme="minorAscii" w:hAnsiTheme="minorAscii" w:eastAsiaTheme="minorAscii" w:cstheme="minorAscii"/>
+          <w:b w:val="1"/>
+          <w:bCs w:val="1"/>
+          <w:i w:val="0"/>
+          <w:iCs w:val="0"/>
+          <w:caps w:val="0"/>
+          <w:smallCaps w:val="0"/>
+          <w:noProof w:val="0"/>
+          <w:color w:val="4C94D8" w:themeColor="text2" w:themeTint="80" w:themeShade="FF"/>
+          <w:sz w:val="24"/>
+          <w:szCs w:val="24"/>
+          <w:lang w:val="en-GB"/>
+        </w:rPr>
+        <w:t xml:space="preserve"> artisan migrate --isolated</w:t>
+      </w:r>
+    </w:p>
+    <w:p>
+      <w:pPr>
+        <w:rPr>
+          <w:rFonts w:ascii="Calibri" w:hAnsi="Calibri" w:eastAsia="Calibri" w:cs="Calibri" w:asciiTheme="minorAscii" w:hAnsiTheme="minorAscii" w:eastAsiaTheme="minorAscii" w:cstheme="minorAscii"/>
+        </w:rPr>
+      </w:pPr>
+      <w:r>
+        <w:rPr>
+          <w:rFonts w:ascii="Calibri" w:hAnsi="Calibri" w:eastAsia="Calibri" w:cs="Calibri" w:asciiTheme="minorAscii" w:hAnsiTheme="minorAscii" w:eastAsiaTheme="minorAscii" w:cstheme="minorAscii"/>
+          <w:noProof w:val="0"/>
+          <w:sz w:val="24"/>
+          <w:szCs w:val="24"/>
+          <w:lang w:val="en-GB"/>
+        </w:rPr>
+        <w:t xml:space="preserve">The </w:t>
+      </w:r>
+      <w:r>
+        <w:rPr>
+          <w:rFonts w:ascii="Calibri" w:hAnsi="Calibri" w:eastAsia="Calibri" w:cs="Calibri" w:asciiTheme="minorAscii" w:hAnsiTheme="minorAscii" w:eastAsiaTheme="minorAscii" w:cstheme="minorAscii"/>
+          <w:noProof w:val="0"/>
+          <w:sz w:val="24"/>
+          <w:szCs w:val="24"/>
+          <w:lang w:val="en-GB"/>
+        </w:rPr>
+        <w:t>--isolated</w:t>
+      </w:r>
+      <w:r>
+        <w:rPr>
+          <w:rFonts w:ascii="Calibri" w:hAnsi="Calibri" w:eastAsia="Calibri" w:cs="Calibri" w:asciiTheme="minorAscii" w:hAnsiTheme="minorAscii" w:eastAsiaTheme="minorAscii" w:cstheme="minorAscii"/>
+          <w:noProof w:val="0"/>
+          <w:sz w:val="24"/>
+          <w:szCs w:val="24"/>
+          <w:lang w:val="en-GB"/>
+        </w:rPr>
+        <w:t xml:space="preserve"> option ensures only one server runs migrations at a time by using a temporary “lock” stored in your cache (like Redis or a database table).</w:t>
+      </w:r>
+      <w:hyperlink r:id="R38815daed7ec4ebb">
+        <w:r>
+          <w:rPr>
+            <w:rStyle w:val="Hyperlink"/>
+            <w:rFonts w:ascii="Calibri" w:hAnsi="Calibri" w:eastAsia="Calibri" w:cs="Calibri" w:asciiTheme="minorAscii" w:hAnsiTheme="minorAscii" w:eastAsiaTheme="minorAscii" w:cstheme="minorAscii"/>
+            <w:noProof w:val="0"/>
+            <w:lang w:val="en-GB"/>
+          </w:rPr>
+          <w:t>laravel</w:t>
+        </w:r>
+      </w:hyperlink>
+    </w:p>
+    <w:p>
+      <w:pPr>
+        <w:rPr>
+          <w:rFonts w:ascii="Calibri" w:hAnsi="Calibri" w:eastAsia="Calibri" w:cs="Calibri" w:asciiTheme="minorAscii" w:hAnsiTheme="minorAscii" w:eastAsiaTheme="minorAscii" w:cstheme="minorAscii"/>
+        </w:rPr>
+      </w:pPr>
+      <w:r>
+        <w:rPr>
+          <w:rFonts w:ascii="Calibri" w:hAnsi="Calibri" w:eastAsia="Calibri" w:cs="Calibri" w:asciiTheme="minorAscii" w:hAnsiTheme="minorAscii" w:eastAsiaTheme="minorAscii" w:cstheme="minorAscii"/>
+          <w:noProof w:val="0"/>
+          <w:sz w:val="24"/>
+          <w:szCs w:val="24"/>
+          <w:lang w:val="en-GB"/>
+        </w:rPr>
+        <w:t xml:space="preserve">The first server to run </w:t>
+      </w:r>
+      <w:r>
+        <w:rPr>
+          <w:rFonts w:ascii="Calibri" w:hAnsi="Calibri" w:eastAsia="Calibri" w:cs="Calibri" w:asciiTheme="minorAscii" w:hAnsiTheme="minorAscii" w:eastAsiaTheme="minorAscii" w:cstheme="minorAscii"/>
+          <w:b w:val="1"/>
+          <w:bCs w:val="1"/>
+          <w:i w:val="0"/>
+          <w:iCs w:val="0"/>
+          <w:caps w:val="0"/>
+          <w:smallCaps w:val="0"/>
+          <w:noProof w:val="0"/>
+          <w:color w:val="4C94D8" w:themeColor="text2" w:themeTint="80" w:themeShade="FF"/>
+          <w:sz w:val="24"/>
+          <w:szCs w:val="24"/>
+          <w:lang w:val="en-GB"/>
+        </w:rPr>
+        <w:t>Php</w:t>
+      </w:r>
+      <w:r>
+        <w:rPr>
+          <w:rFonts w:ascii="Calibri" w:hAnsi="Calibri" w:eastAsia="Calibri" w:cs="Calibri" w:asciiTheme="minorAscii" w:hAnsiTheme="minorAscii" w:eastAsiaTheme="minorAscii" w:cstheme="minorAscii"/>
+          <w:b w:val="1"/>
+          <w:bCs w:val="1"/>
+          <w:i w:val="0"/>
+          <w:iCs w:val="0"/>
+          <w:caps w:val="0"/>
+          <w:smallCaps w:val="0"/>
+          <w:noProof w:val="0"/>
+          <w:color w:val="4C94D8" w:themeColor="text2" w:themeTint="80" w:themeShade="FF"/>
+          <w:sz w:val="24"/>
+          <w:szCs w:val="24"/>
+          <w:lang w:val="en-GB"/>
+        </w:rPr>
+        <w:t xml:space="preserve"> artisan migrate --isolated</w:t>
+      </w:r>
+      <w:r>
+        <w:rPr>
+          <w:rFonts w:ascii="Calibri" w:hAnsi="Calibri" w:eastAsia="Calibri" w:cs="Calibri" w:asciiTheme="minorAscii" w:hAnsiTheme="minorAscii" w:eastAsiaTheme="minorAscii" w:cstheme="minorAscii"/>
+          <w:noProof w:val="0"/>
+          <w:sz w:val="24"/>
+          <w:szCs w:val="24"/>
+          <w:lang w:val="en-GB"/>
+        </w:rPr>
+        <w:t xml:space="preserve"> </w:t>
+      </w:r>
+      <w:r>
+        <w:rPr>
+          <w:rFonts w:ascii="Calibri" w:hAnsi="Calibri" w:eastAsia="Calibri" w:cs="Calibri" w:asciiTheme="minorAscii" w:hAnsiTheme="minorAscii" w:eastAsiaTheme="minorAscii" w:cstheme="minorAscii"/>
+          <w:noProof w:val="0"/>
+          <w:sz w:val="24"/>
+          <w:szCs w:val="24"/>
+          <w:lang w:val="en-GB"/>
+        </w:rPr>
+        <w:t xml:space="preserve">sets this lock; other servers see it and skip </w:t>
+      </w:r>
+      <w:r>
+        <w:rPr>
+          <w:rFonts w:ascii="Calibri" w:hAnsi="Calibri" w:eastAsia="Calibri" w:cs="Calibri" w:asciiTheme="minorAscii" w:hAnsiTheme="minorAscii" w:eastAsiaTheme="minorAscii" w:cstheme="minorAscii"/>
+          <w:noProof w:val="0"/>
+          <w:sz w:val="24"/>
+          <w:szCs w:val="24"/>
+          <w:lang w:val="en-GB"/>
+        </w:rPr>
+        <w:t>migrations, but</w:t>
+      </w:r>
+      <w:r>
+        <w:rPr>
+          <w:rFonts w:ascii="Calibri" w:hAnsi="Calibri" w:eastAsia="Calibri" w:cs="Calibri" w:asciiTheme="minorAscii" w:hAnsiTheme="minorAscii" w:eastAsiaTheme="minorAscii" w:cstheme="minorAscii"/>
+          <w:noProof w:val="0"/>
+          <w:sz w:val="24"/>
+          <w:szCs w:val="24"/>
+          <w:lang w:val="en-GB"/>
+        </w:rPr>
+        <w:t xml:space="preserve"> still exit successfully so deployments </w:t>
+      </w:r>
+      <w:r>
+        <w:rPr>
+          <w:rFonts w:ascii="Calibri" w:hAnsi="Calibri" w:eastAsia="Calibri" w:cs="Calibri" w:asciiTheme="minorAscii" w:hAnsiTheme="minorAscii" w:eastAsiaTheme="minorAscii" w:cstheme="minorAscii"/>
+          <w:noProof w:val="0"/>
+          <w:sz w:val="24"/>
+          <w:szCs w:val="24"/>
+          <w:lang w:val="en-GB"/>
+        </w:rPr>
+        <w:t>don’t</w:t>
+      </w:r>
+      <w:r>
+        <w:rPr>
+          <w:rFonts w:ascii="Calibri" w:hAnsi="Calibri" w:eastAsia="Calibri" w:cs="Calibri" w:asciiTheme="minorAscii" w:hAnsiTheme="minorAscii" w:eastAsiaTheme="minorAscii" w:cstheme="minorAscii"/>
+          <w:noProof w:val="0"/>
+          <w:sz w:val="24"/>
+          <w:szCs w:val="24"/>
+          <w:lang w:val="en-GB"/>
+        </w:rPr>
+        <w:t xml:space="preserve"> fail.</w:t>
+      </w:r>
+      <w:hyperlink r:id="Rea17321b1e0d424d">
+        <w:r>
+          <w:rPr>
+            <w:rStyle w:val="Hyperlink"/>
+            <w:rFonts w:ascii="Calibri" w:hAnsi="Calibri" w:eastAsia="Calibri" w:cs="Calibri" w:asciiTheme="minorAscii" w:hAnsiTheme="minorAscii" w:eastAsiaTheme="minorAscii" w:cstheme="minorAscii"/>
+            <w:noProof w:val="0"/>
+            <w:lang w:val="en-GB"/>
+          </w:rPr>
+          <w:t>laravel</w:t>
+        </w:r>
+      </w:hyperlink>
+    </w:p>
+    <w:p>
+      <w:pPr>
+        <w:pStyle w:val="Normal"/>
+      </w:pPr>
+      <w:r>
+        <w:rPr>
+          <w:rFonts w:ascii="Calibri" w:hAnsi="Calibri" w:eastAsia="Calibri" w:cs="Calibri" w:asciiTheme="minorAscii" w:hAnsiTheme="minorAscii" w:eastAsiaTheme="minorAscii" w:cstheme="minorAscii"/>
+          <w:noProof w:val="0"/>
+          <w:sz w:val="24"/>
+          <w:szCs w:val="24"/>
+          <w:lang w:val="en-GB"/>
+        </w:rPr>
+        <w:t>When the first server finishes, it removes the lock, preventing simultaneous schema changes and conflicts.</w:t>
+      </w:r>
+    </w:p>
+    <w:p>
+      <w:pPr>
+        <w:pStyle w:val="Normal"/>
+      </w:pPr>
+      <w:r>
+        <w:rPr>
+          <w:rFonts w:ascii="Calibri" w:hAnsi="Calibri" w:eastAsia="Calibri" w:cs="Calibri" w:asciiTheme="minorAscii" w:hAnsiTheme="minorAscii" w:eastAsiaTheme="minorAscii" w:cstheme="minorAscii"/>
+          <w:b w:val="1"/>
+          <w:bCs w:val="1"/>
+          <w:i w:val="1"/>
+          <w:iCs w:val="1"/>
+          <w:noProof w:val="0"/>
+          <w:sz w:val="24"/>
+          <w:szCs w:val="24"/>
+          <w:lang w:val="en-GB"/>
+        </w:rPr>
+        <w:t>Note:</w:t>
+      </w:r>
+      <w:r>
+        <w:rPr>
+          <w:rFonts w:ascii="Calibri" w:hAnsi="Calibri" w:eastAsia="Calibri" w:cs="Calibri" w:asciiTheme="minorAscii" w:hAnsiTheme="minorAscii" w:eastAsiaTheme="minorAscii" w:cstheme="minorAscii"/>
+          <w:b w:val="0"/>
+          <w:bCs w:val="0"/>
+          <w:i w:val="1"/>
+          <w:iCs w:val="1"/>
+          <w:noProof w:val="0"/>
+          <w:sz w:val="24"/>
+          <w:szCs w:val="24"/>
+          <w:lang w:val="en-GB"/>
+        </w:rPr>
+        <w:t xml:space="preserve"> </w:t>
+      </w:r>
+      <w:r>
+        <w:rPr>
+          <w:rFonts w:ascii="system-ui" w:hAnsi="system-ui" w:eastAsia="system-ui" w:cs="system-ui"/>
+          <w:b w:val="0"/>
+          <w:bCs w:val="0"/>
+          <w:i w:val="1"/>
+          <w:iCs w:val="1"/>
+          <w:caps w:val="0"/>
+          <w:smallCaps w:val="0"/>
+          <w:noProof w:val="0"/>
+          <w:color w:val="364153"/>
+          <w:sz w:val="24"/>
+          <w:szCs w:val="24"/>
+          <w:lang w:val="en-GB"/>
+        </w:rPr>
+        <w:t xml:space="preserve">To </w:t>
+      </w:r>
+      <w:r>
+        <w:rPr>
+          <w:rFonts w:ascii="system-ui" w:hAnsi="system-ui" w:eastAsia="system-ui" w:cs="system-ui"/>
+          <w:b w:val="0"/>
+          <w:bCs w:val="0"/>
+          <w:i w:val="1"/>
+          <w:iCs w:val="1"/>
+          <w:caps w:val="0"/>
+          <w:smallCaps w:val="0"/>
+          <w:noProof w:val="0"/>
+          <w:color w:val="364153"/>
+          <w:sz w:val="24"/>
+          <w:szCs w:val="24"/>
+          <w:lang w:val="en-GB"/>
+        </w:rPr>
+        <w:t>utilize</w:t>
+      </w:r>
+      <w:r>
+        <w:rPr>
+          <w:rFonts w:ascii="system-ui" w:hAnsi="system-ui" w:eastAsia="system-ui" w:cs="system-ui"/>
+          <w:b w:val="0"/>
+          <w:bCs w:val="0"/>
+          <w:i w:val="1"/>
+          <w:iCs w:val="1"/>
+          <w:caps w:val="0"/>
+          <w:smallCaps w:val="0"/>
+          <w:noProof w:val="0"/>
+          <w:color w:val="364153"/>
+          <w:sz w:val="24"/>
+          <w:szCs w:val="24"/>
+          <w:lang w:val="en-GB"/>
+        </w:rPr>
+        <w:t xml:space="preserve"> this feature, your application must be using the </w:t>
+      </w:r>
+      <w:r>
+        <w:rPr>
+          <w:rFonts w:ascii="Consolas" w:hAnsi="Consolas" w:eastAsia="Consolas" w:cs="Consolas"/>
+          <w:b w:val="0"/>
+          <w:bCs w:val="0"/>
+          <w:i w:val="1"/>
+          <w:iCs w:val="1"/>
+          <w:caps w:val="0"/>
+          <w:smallCaps w:val="0"/>
+          <w:noProof w:val="0"/>
+          <w:color w:val="101828"/>
+          <w:sz w:val="24"/>
+          <w:szCs w:val="24"/>
+          <w:lang w:val="en-GB"/>
+        </w:rPr>
+        <w:t>memcached</w:t>
+      </w:r>
+      <w:r>
+        <w:rPr>
+          <w:rFonts w:ascii="system-ui" w:hAnsi="system-ui" w:eastAsia="system-ui" w:cs="system-ui"/>
+          <w:b w:val="0"/>
+          <w:bCs w:val="0"/>
+          <w:i w:val="1"/>
+          <w:iCs w:val="1"/>
+          <w:caps w:val="0"/>
+          <w:smallCaps w:val="0"/>
+          <w:noProof w:val="0"/>
+          <w:color w:val="364153"/>
+          <w:sz w:val="24"/>
+          <w:szCs w:val="24"/>
+          <w:lang w:val="en-GB"/>
+        </w:rPr>
+        <w:t xml:space="preserve">, </w:t>
+      </w:r>
+      <w:r>
+        <w:rPr>
+          <w:rFonts w:ascii="Consolas" w:hAnsi="Consolas" w:eastAsia="Consolas" w:cs="Consolas"/>
+          <w:b w:val="0"/>
+          <w:bCs w:val="0"/>
+          <w:i w:val="1"/>
+          <w:iCs w:val="1"/>
+          <w:caps w:val="0"/>
+          <w:smallCaps w:val="0"/>
+          <w:noProof w:val="0"/>
+          <w:color w:val="101828"/>
+          <w:sz w:val="24"/>
+          <w:szCs w:val="24"/>
+          <w:lang w:val="en-GB"/>
+        </w:rPr>
+        <w:t>redis</w:t>
+      </w:r>
+      <w:r>
+        <w:rPr>
+          <w:rFonts w:ascii="system-ui" w:hAnsi="system-ui" w:eastAsia="system-ui" w:cs="system-ui"/>
+          <w:b w:val="0"/>
+          <w:bCs w:val="0"/>
+          <w:i w:val="1"/>
+          <w:iCs w:val="1"/>
+          <w:caps w:val="0"/>
+          <w:smallCaps w:val="0"/>
+          <w:noProof w:val="0"/>
+          <w:color w:val="364153"/>
+          <w:sz w:val="24"/>
+          <w:szCs w:val="24"/>
+          <w:lang w:val="en-GB"/>
+        </w:rPr>
+        <w:t xml:space="preserve">, </w:t>
+      </w:r>
+      <w:r>
+        <w:rPr>
+          <w:rFonts w:ascii="Consolas" w:hAnsi="Consolas" w:eastAsia="Consolas" w:cs="Consolas"/>
+          <w:b w:val="0"/>
+          <w:bCs w:val="0"/>
+          <w:i w:val="1"/>
+          <w:iCs w:val="1"/>
+          <w:caps w:val="0"/>
+          <w:smallCaps w:val="0"/>
+          <w:noProof w:val="0"/>
+          <w:color w:val="101828"/>
+          <w:sz w:val="24"/>
+          <w:szCs w:val="24"/>
+          <w:lang w:val="en-GB"/>
+        </w:rPr>
+        <w:t>dynamodb</w:t>
+      </w:r>
+      <w:r>
+        <w:rPr>
+          <w:rFonts w:ascii="system-ui" w:hAnsi="system-ui" w:eastAsia="system-ui" w:cs="system-ui"/>
+          <w:b w:val="0"/>
+          <w:bCs w:val="0"/>
+          <w:i w:val="1"/>
+          <w:iCs w:val="1"/>
+          <w:caps w:val="0"/>
+          <w:smallCaps w:val="0"/>
+          <w:noProof w:val="0"/>
+          <w:color w:val="364153"/>
+          <w:sz w:val="24"/>
+          <w:szCs w:val="24"/>
+          <w:lang w:val="en-GB"/>
+        </w:rPr>
+        <w:t xml:space="preserve">, </w:t>
+      </w:r>
+      <w:r>
+        <w:rPr>
+          <w:rFonts w:ascii="Consolas" w:hAnsi="Consolas" w:eastAsia="Consolas" w:cs="Consolas"/>
+          <w:b w:val="0"/>
+          <w:bCs w:val="0"/>
+          <w:i w:val="1"/>
+          <w:iCs w:val="1"/>
+          <w:caps w:val="0"/>
+          <w:smallCaps w:val="0"/>
+          <w:noProof w:val="0"/>
+          <w:color w:val="101828"/>
+          <w:sz w:val="24"/>
+          <w:szCs w:val="24"/>
+          <w:lang w:val="en-GB"/>
+        </w:rPr>
+        <w:t>database</w:t>
+      </w:r>
+      <w:r>
+        <w:rPr>
+          <w:rFonts w:ascii="system-ui" w:hAnsi="system-ui" w:eastAsia="system-ui" w:cs="system-ui"/>
+          <w:b w:val="0"/>
+          <w:bCs w:val="0"/>
+          <w:i w:val="1"/>
+          <w:iCs w:val="1"/>
+          <w:caps w:val="0"/>
+          <w:smallCaps w:val="0"/>
+          <w:noProof w:val="0"/>
+          <w:color w:val="364153"/>
+          <w:sz w:val="24"/>
+          <w:szCs w:val="24"/>
+          <w:lang w:val="en-GB"/>
+        </w:rPr>
+        <w:t xml:space="preserve">, </w:t>
+      </w:r>
+      <w:r>
+        <w:rPr>
+          <w:rFonts w:ascii="Consolas" w:hAnsi="Consolas" w:eastAsia="Consolas" w:cs="Consolas"/>
+          <w:b w:val="0"/>
+          <w:bCs w:val="0"/>
+          <w:i w:val="1"/>
+          <w:iCs w:val="1"/>
+          <w:caps w:val="0"/>
+          <w:smallCaps w:val="0"/>
+          <w:noProof w:val="0"/>
+          <w:color w:val="101828"/>
+          <w:sz w:val="24"/>
+          <w:szCs w:val="24"/>
+          <w:lang w:val="en-GB"/>
+        </w:rPr>
+        <w:t>file</w:t>
+      </w:r>
+      <w:r>
+        <w:rPr>
+          <w:rFonts w:ascii="system-ui" w:hAnsi="system-ui" w:eastAsia="system-ui" w:cs="system-ui"/>
+          <w:b w:val="0"/>
+          <w:bCs w:val="0"/>
+          <w:i w:val="1"/>
+          <w:iCs w:val="1"/>
+          <w:caps w:val="0"/>
+          <w:smallCaps w:val="0"/>
+          <w:noProof w:val="0"/>
+          <w:color w:val="364153"/>
+          <w:sz w:val="24"/>
+          <w:szCs w:val="24"/>
+          <w:lang w:val="en-GB"/>
+        </w:rPr>
+        <w:t xml:space="preserve">, or  </w:t>
+      </w:r>
+      <w:r>
+        <w:rPr>
+          <w:rFonts w:ascii="Consolas" w:hAnsi="Consolas" w:eastAsia="Consolas" w:cs="Consolas"/>
+          <w:b w:val="0"/>
+          <w:bCs w:val="0"/>
+          <w:i w:val="1"/>
+          <w:iCs w:val="1"/>
+          <w:caps w:val="0"/>
+          <w:smallCaps w:val="0"/>
+          <w:noProof w:val="0"/>
+          <w:color w:val="101828"/>
+          <w:sz w:val="24"/>
+          <w:szCs w:val="24"/>
+          <w:lang w:val="en-GB"/>
+        </w:rPr>
+        <w:t>array</w:t>
+      </w:r>
+      <w:r>
+        <w:rPr>
+          <w:rFonts w:ascii="system-ui" w:hAnsi="system-ui" w:eastAsia="system-ui" w:cs="system-ui"/>
+          <w:b w:val="0"/>
+          <w:bCs w:val="0"/>
+          <w:i w:val="1"/>
+          <w:iCs w:val="1"/>
+          <w:caps w:val="0"/>
+          <w:smallCaps w:val="0"/>
+          <w:noProof w:val="0"/>
+          <w:color w:val="364153"/>
+          <w:sz w:val="24"/>
+          <w:szCs w:val="24"/>
+          <w:lang w:val="en-GB"/>
+        </w:rPr>
+        <w:t xml:space="preserve"> cache driver as your application's default cache driver. In addition, all servers must be communicating with the same central cache server.</w:t>
+      </w:r>
+    </w:p>
+    <w:p>
+      <w:pPr>
+        <w:pStyle w:val="Normal"/>
+        <w:rPr>
+          <w:rFonts w:ascii="system-ui" w:hAnsi="system-ui" w:eastAsia="system-ui" w:cs="system-ui"/>
+          <w:b w:val="0"/>
+          <w:bCs w:val="0"/>
+          <w:i w:val="1"/>
+          <w:iCs w:val="1"/>
+          <w:caps w:val="0"/>
+          <w:smallCaps w:val="0"/>
+          <w:noProof w:val="0"/>
+          <w:color w:val="364153"/>
+          <w:sz w:val="24"/>
+          <w:szCs w:val="24"/>
+          <w:lang w:val="en-GB"/>
+        </w:rPr>
+      </w:pPr>
+    </w:p>
+    <w:p>
+      <w:pPr>
+        <w:pStyle w:val="Normal"/>
+        <w:spacing w:before="240" w:beforeAutospacing="off" w:after="240" w:afterAutospacing="off"/>
+        <w:ind w:left="0"/>
+        <w:rPr>
+          <w:rFonts w:ascii="system-ui" w:hAnsi="system-ui" w:eastAsia="system-ui" w:cs="system-ui"/>
+          <w:noProof w:val="0"/>
+          <w:sz w:val="24"/>
+          <w:szCs w:val="24"/>
+          <w:u w:val="none"/>
+          <w:lang w:val="en-GB"/>
+        </w:rPr>
+      </w:pPr>
+      <w:r>
+        <w:rPr>
+          <w:rFonts w:ascii="Consolas" w:hAnsi="Consolas" w:eastAsia="Consolas" w:cs="Consolas"/>
+          <w:b w:val="1"/>
+          <w:bCs w:val="1"/>
+          <w:noProof w:val="0"/>
+          <w:color w:val="4C94D8" w:themeColor="text2" w:themeTint="80" w:themeShade="FF"/>
+          <w:sz w:val="24"/>
+          <w:szCs w:val="24"/>
+          <w:u w:val="none"/>
+          <w:lang w:val="en-GB"/>
+        </w:rPr>
+        <w:t xml:space="preserve">php artisan </w:t>
+      </w:r>
+      <w:r>
+        <w:rPr>
+          <w:rFonts w:ascii="Consolas" w:hAnsi="Consolas" w:eastAsia="Consolas" w:cs="Consolas"/>
+          <w:b w:val="1"/>
+          <w:bCs w:val="1"/>
+          <w:noProof w:val="0"/>
+          <w:color w:val="4C94D8" w:themeColor="text2" w:themeTint="80" w:themeShade="FF"/>
+          <w:sz w:val="24"/>
+          <w:szCs w:val="24"/>
+          <w:u w:val="none"/>
+          <w:lang w:val="en-GB"/>
+        </w:rPr>
+        <w:t>migrate:rollback</w:t>
+      </w:r>
+    </w:p>
+    <w:p>
+      <w:pPr>
+        <w:pStyle w:val="Normal"/>
+        <w:spacing w:before="240" w:beforeAutospacing="off" w:after="240" w:afterAutospacing="off"/>
+        <w:ind w:left="0"/>
+      </w:pPr>
+      <w:r>
+        <w:rPr>
+          <w:rFonts w:ascii="system-ui" w:hAnsi="system-ui" w:eastAsia="system-ui" w:cs="system-ui"/>
+          <w:noProof w:val="0"/>
+          <w:sz w:val="24"/>
+          <w:szCs w:val="24"/>
+          <w:lang w:val="en-GB"/>
+        </w:rPr>
+        <w:t xml:space="preserve"> Runs the </w:t>
+      </w:r>
+      <w:r>
+        <w:rPr>
+          <w:rFonts w:ascii="Consolas" w:hAnsi="Consolas" w:eastAsia="Consolas" w:cs="Consolas"/>
+          <w:noProof w:val="0"/>
+          <w:sz w:val="24"/>
+          <w:szCs w:val="24"/>
+          <w:lang w:val="en-GB"/>
+        </w:rPr>
+        <w:t>down(</w:t>
+      </w:r>
+      <w:r>
+        <w:rPr>
+          <w:rFonts w:ascii="Consolas" w:hAnsi="Consolas" w:eastAsia="Consolas" w:cs="Consolas"/>
+          <w:noProof w:val="0"/>
+          <w:sz w:val="24"/>
+          <w:szCs w:val="24"/>
+          <w:lang w:val="en-GB"/>
+        </w:rPr>
+        <w:t>)</w:t>
+      </w:r>
+      <w:r>
+        <w:rPr>
+          <w:rFonts w:ascii="system-ui" w:hAnsi="system-ui" w:eastAsia="system-ui" w:cs="system-ui"/>
+          <w:noProof w:val="0"/>
+          <w:sz w:val="24"/>
+          <w:szCs w:val="24"/>
+          <w:lang w:val="en-GB"/>
+        </w:rPr>
+        <w:t xml:space="preserve"> method of the last batch.</w:t>
+      </w:r>
+    </w:p>
+    <w:p>
+      <w:pPr>
+        <w:pStyle w:val="Normal"/>
+        <w:spacing w:before="240" w:beforeAutospacing="off" w:after="240" w:afterAutospacing="off"/>
+        <w:ind w:left="0"/>
+      </w:pPr>
+      <w:r>
+        <w:rPr>
+          <w:rFonts w:ascii="Consolas" w:hAnsi="Consolas" w:eastAsia="Consolas" w:cs="Consolas"/>
+          <w:b w:val="1"/>
+          <w:bCs w:val="1"/>
+          <w:noProof w:val="0"/>
+          <w:color w:val="4C94D8" w:themeColor="text2" w:themeTint="80" w:themeShade="FF"/>
+          <w:sz w:val="24"/>
+          <w:szCs w:val="24"/>
+          <w:u w:val="none"/>
+          <w:lang w:val="en-GB"/>
+        </w:rPr>
+        <w:t>php</w:t>
+      </w:r>
+      <w:r>
+        <w:rPr>
+          <w:rFonts w:ascii="Consolas" w:hAnsi="Consolas" w:eastAsia="Consolas" w:cs="Consolas"/>
+          <w:b w:val="1"/>
+          <w:bCs w:val="1"/>
+          <w:noProof w:val="0"/>
+          <w:color w:val="4C94D8" w:themeColor="text2" w:themeTint="80" w:themeShade="FF"/>
+          <w:sz w:val="24"/>
+          <w:szCs w:val="24"/>
+          <w:u w:val="none"/>
+          <w:lang w:val="en-GB"/>
+        </w:rPr>
+        <w:t xml:space="preserve"> artisan </w:t>
+      </w:r>
+      <w:r>
+        <w:rPr>
+          <w:rFonts w:ascii="Consolas" w:hAnsi="Consolas" w:eastAsia="Consolas" w:cs="Consolas"/>
+          <w:b w:val="1"/>
+          <w:bCs w:val="1"/>
+          <w:noProof w:val="0"/>
+          <w:color w:val="4C94D8" w:themeColor="text2" w:themeTint="80" w:themeShade="FF"/>
+          <w:sz w:val="24"/>
+          <w:szCs w:val="24"/>
+          <w:u w:val="none"/>
+          <w:lang w:val="en-GB"/>
+        </w:rPr>
+        <w:t>migrate:fresh</w:t>
+      </w:r>
+    </w:p>
+    <w:p>
+      <w:pPr>
+        <w:pStyle w:val="Normal"/>
+        <w:spacing w:before="240" w:beforeAutospacing="off" w:after="240" w:afterAutospacing="off"/>
+        <w:ind w:left="0"/>
+      </w:pPr>
+      <w:r>
+        <w:rPr>
+          <w:rFonts w:ascii="system-ui" w:hAnsi="system-ui" w:eastAsia="system-ui" w:cs="system-ui"/>
+          <w:noProof w:val="0"/>
+          <w:sz w:val="24"/>
+          <w:szCs w:val="24"/>
+          <w:lang w:val="en-GB"/>
+        </w:rPr>
+        <w:t xml:space="preserve">Drops all tables and re-runs all migrations from scratch. (Only use in local development; pair with </w:t>
+      </w:r>
+      <w:r>
+        <w:rPr>
+          <w:rFonts w:ascii="Consolas" w:hAnsi="Consolas" w:eastAsia="Consolas" w:cs="Consolas"/>
+          <w:noProof w:val="0"/>
+          <w:sz w:val="24"/>
+          <w:szCs w:val="24"/>
+          <w:lang w:val="en-GB"/>
+        </w:rPr>
+        <w:t>--seed</w:t>
+      </w:r>
+      <w:r>
+        <w:rPr>
+          <w:rFonts w:ascii="system-ui" w:hAnsi="system-ui" w:eastAsia="system-ui" w:cs="system-ui"/>
+          <w:noProof w:val="0"/>
+          <w:sz w:val="24"/>
+          <w:szCs w:val="24"/>
+          <w:lang w:val="en-GB"/>
+        </w:rPr>
+        <w:t xml:space="preserve"> to re-populate fake data).</w:t>
+      </w:r>
+    </w:p>
+    <w:p>
+      <w:pPr>
+        <w:pStyle w:val="Normal"/>
+        <w:spacing w:before="240" w:beforeAutospacing="off" w:after="240" w:afterAutospacing="off"/>
+        <w:ind w:left="0"/>
+        <w:rPr>
+          <w:rFonts w:ascii="system-ui" w:hAnsi="system-ui" w:eastAsia="system-ui" w:cs="system-ui"/>
+          <w:noProof w:val="0"/>
+          <w:sz w:val="24"/>
+          <w:szCs w:val="24"/>
+          <w:lang w:val="en-GB"/>
+        </w:rPr>
+      </w:pPr>
+    </w:p>
+    <w:p>
+      <w:pPr>
+        <w:pStyle w:val="Normal"/>
+        <w:spacing w:before="240" w:beforeAutospacing="off" w:after="240" w:afterAutospacing="off"/>
+        <w:ind w:left="0"/>
+      </w:pPr>
+      <w:r>
+        <w:rPr>
+          <w:rFonts w:ascii="system-ui" w:hAnsi="system-ui" w:eastAsia="system-ui" w:cs="system-ui"/>
+          <w:b w:val="1"/>
+          <w:bCs w:val="1"/>
+          <w:noProof w:val="0"/>
+          <w:color w:val="4C94D8" w:themeColor="text2" w:themeTint="80" w:themeShade="FF"/>
+          <w:sz w:val="24"/>
+          <w:szCs w:val="24"/>
+          <w:lang w:val="en-GB"/>
+        </w:rPr>
+        <w:t>$table-&gt;foreignId('user_id')-&gt;constrained()-&gt;cascadeO</w:t>
+      </w:r>
+      <w:r>
+        <w:rPr>
+          <w:rFonts w:ascii="system-ui" w:hAnsi="system-ui" w:eastAsia="system-ui" w:cs="system-ui"/>
+          <w:b w:val="1"/>
+          <w:bCs w:val="1"/>
+          <w:noProof w:val="0"/>
+          <w:color w:val="4C94D8" w:themeColor="text2" w:themeTint="80" w:themeShade="FF"/>
+          <w:sz w:val="24"/>
+          <w:szCs w:val="24"/>
+          <w:lang w:val="en-GB"/>
+        </w:rPr>
+        <w:t>nDele</w:t>
+      </w:r>
+      <w:r>
+        <w:rPr>
+          <w:rFonts w:ascii="system-ui" w:hAnsi="system-ui" w:eastAsia="system-ui" w:cs="system-ui"/>
+          <w:b w:val="1"/>
+          <w:bCs w:val="1"/>
+          <w:noProof w:val="0"/>
+          <w:color w:val="4C94D8" w:themeColor="text2" w:themeTint="80" w:themeShade="FF"/>
+          <w:sz w:val="24"/>
+          <w:szCs w:val="24"/>
+          <w:lang w:val="en-GB"/>
+        </w:rPr>
+        <w:t>te();</w:t>
+      </w:r>
+    </w:p>
+    <w:p>
+      <w:pPr>
+        <w:pStyle w:val="Normal"/>
+        <w:spacing w:before="240" w:beforeAutospacing="off" w:after="240" w:afterAutospacing="off"/>
+        <w:ind w:left="0"/>
+      </w:pPr>
+      <w:r>
+        <w:rPr>
+          <w:rFonts w:ascii="Arial" w:hAnsi="Arial" w:eastAsia="Arial" w:cs="Arial"/>
+          <w:b w:val="1"/>
+          <w:bCs w:val="1"/>
+          <w:strike w:val="0"/>
+          <w:dstrike w:val="0"/>
+          <w:noProof w:val="0"/>
+          <w:sz w:val="24"/>
+          <w:szCs w:val="24"/>
+          <w:u w:val="none"/>
+          <w:lang w:val="en-GB"/>
+        </w:rPr>
+        <w:t>Cascade on delete</w:t>
+      </w:r>
+      <w:r>
+        <w:rPr>
+          <w:rFonts w:ascii="system-ui" w:hAnsi="system-ui" w:eastAsia="system-ui" w:cs="system-ui"/>
+          <w:noProof w:val="0"/>
+          <w:sz w:val="24"/>
+          <w:szCs w:val="24"/>
+          <w:lang w:val="en-GB"/>
+        </w:rPr>
+        <w:t xml:space="preserve"> means that </w:t>
+      </w:r>
+      <w:r>
+        <w:rPr>
+          <w:rFonts w:ascii="Arial" w:hAnsi="Arial" w:eastAsia="Arial" w:cs="Arial"/>
+          <w:b w:val="0"/>
+          <w:bCs w:val="0"/>
+          <w:strike w:val="0"/>
+          <w:dstrike w:val="0"/>
+          <w:noProof w:val="0"/>
+          <w:sz w:val="24"/>
+          <w:szCs w:val="24"/>
+          <w:u w:val="none"/>
+          <w:lang w:val="en-GB"/>
+        </w:rPr>
+        <w:t>when a row in a parent table is deleted, all related rows in the child table are automatically deleted by the database</w:t>
+      </w:r>
+      <w:r>
+        <w:rPr>
+          <w:rFonts w:ascii="system-ui" w:hAnsi="system-ui" w:eastAsia="system-ui" w:cs="system-ui"/>
+          <w:noProof w:val="0"/>
+          <w:sz w:val="24"/>
+          <w:szCs w:val="24"/>
+          <w:lang w:val="en-GB"/>
+        </w:rPr>
+        <w:t>.</w:t>
+      </w:r>
+    </w:p>
+    <w:p>
+      <w:pPr>
+        <w:pStyle w:val="Normal"/>
+        <w:spacing w:before="240" w:beforeAutospacing="off" w:after="240" w:afterAutospacing="off"/>
+        <w:ind w:left="0"/>
+        <w:rPr>
+          <w:rFonts w:ascii="Calibri" w:hAnsi="Calibri" w:eastAsia="Calibri" w:cs="Calibri" w:asciiTheme="minorAscii" w:hAnsiTheme="minorAscii" w:eastAsiaTheme="minorAscii" w:cstheme="minorAscii"/>
+          <w:noProof w:val="0"/>
+          <w:sz w:val="24"/>
+          <w:szCs w:val="24"/>
+          <w:lang w:val="en-GB"/>
+        </w:rPr>
+      </w:pPr>
+    </w:p>
+    <w:p>
+      <w:pPr>
+        <w:pStyle w:val="Heading3"/>
+        <w:spacing w:before="281" w:beforeAutospacing="off" w:after="281" w:afterAutospacing="off"/>
+        <w:rPr>
+          <w:rFonts w:ascii="Calibri" w:hAnsi="Calibri" w:eastAsia="Calibri" w:cs="Calibri" w:asciiTheme="minorAscii" w:hAnsiTheme="minorAscii" w:eastAsiaTheme="minorAscii" w:cstheme="minorAscii"/>
+          <w:b w:val="1"/>
+          <w:bCs w:val="1"/>
+          <w:noProof w:val="0"/>
+          <w:sz w:val="28"/>
+          <w:szCs w:val="28"/>
+          <w:lang w:val="en-GB"/>
+        </w:rPr>
+      </w:pPr>
+      <w:r>
+        <w:rPr>
+          <w:rFonts w:ascii="Calibri" w:hAnsi="Calibri" w:eastAsia="Calibri" w:cs="Calibri" w:asciiTheme="minorAscii" w:hAnsiTheme="minorAscii" w:eastAsiaTheme="minorAscii" w:cstheme="minorAscii"/>
+          <w:b w:val="1"/>
+          <w:bCs w:val="1"/>
+          <w:noProof w:val="0"/>
+          <w:sz w:val="28"/>
+          <w:szCs w:val="28"/>
+          <w:lang w:val="en-GB"/>
+        </w:rPr>
+        <w:t xml:space="preserve">Mass Assignment: </w:t>
+      </w:r>
+      <w:r>
+        <w:rPr>
+          <w:rFonts w:ascii="Calibri" w:hAnsi="Calibri" w:eastAsia="Calibri" w:cs="Calibri" w:asciiTheme="minorAscii" w:hAnsiTheme="minorAscii" w:eastAsiaTheme="minorAscii" w:cstheme="minorAscii"/>
+          <w:b w:val="1"/>
+          <w:bCs w:val="1"/>
+          <w:noProof w:val="0"/>
+          <w:sz w:val="28"/>
+          <w:szCs w:val="28"/>
+          <w:lang w:val="en-GB"/>
+        </w:rPr>
+        <w:t>$fillable</w:t>
+      </w:r>
+      <w:r>
+        <w:rPr>
+          <w:rFonts w:ascii="Calibri" w:hAnsi="Calibri" w:eastAsia="Calibri" w:cs="Calibri" w:asciiTheme="minorAscii" w:hAnsiTheme="minorAscii" w:eastAsiaTheme="minorAscii" w:cstheme="minorAscii"/>
+          <w:b w:val="1"/>
+          <w:bCs w:val="1"/>
+          <w:noProof w:val="0"/>
+          <w:sz w:val="28"/>
+          <w:szCs w:val="28"/>
+          <w:lang w:val="en-GB"/>
+        </w:rPr>
+        <w:t xml:space="preserve"> vs </w:t>
+      </w:r>
+      <w:r>
+        <w:rPr>
+          <w:rFonts w:ascii="Calibri" w:hAnsi="Calibri" w:eastAsia="Calibri" w:cs="Calibri" w:asciiTheme="minorAscii" w:hAnsiTheme="minorAscii" w:eastAsiaTheme="minorAscii" w:cstheme="minorAscii"/>
+          <w:b w:val="1"/>
+          <w:bCs w:val="1"/>
+          <w:noProof w:val="0"/>
+          <w:sz w:val="28"/>
+          <w:szCs w:val="28"/>
+          <w:lang w:val="en-GB"/>
+        </w:rPr>
+        <w:t>$guarded</w:t>
+      </w:r>
+    </w:p>
+    <w:p>
+      <w:pPr>
+        <w:spacing w:before="240" w:beforeAutospacing="off" w:after="240" w:afterAutospacing="off"/>
+        <w:rPr>
+          <w:rFonts w:ascii="Calibri" w:hAnsi="Calibri" w:eastAsia="Calibri" w:cs="Calibri" w:asciiTheme="minorAscii" w:hAnsiTheme="minorAscii" w:eastAsiaTheme="minorAscii" w:cstheme="minorAscii"/>
+          <w:noProof w:val="0"/>
+          <w:sz w:val="24"/>
+          <w:szCs w:val="24"/>
+          <w:lang w:val="en-GB"/>
+        </w:rPr>
+      </w:pPr>
+      <w:r>
+        <w:rPr>
+          <w:rFonts w:ascii="Calibri" w:hAnsi="Calibri" w:eastAsia="Calibri" w:cs="Calibri" w:asciiTheme="minorAscii" w:hAnsiTheme="minorAscii" w:eastAsiaTheme="minorAscii" w:cstheme="minorAscii"/>
+          <w:noProof w:val="0"/>
+          <w:sz w:val="24"/>
+          <w:szCs w:val="24"/>
+          <w:lang w:val="en-GB"/>
+        </w:rPr>
+        <w:t>When an AI writes a store or update action, it will typically write:</w:t>
+      </w:r>
+    </w:p>
+    <w:p>
+      <w:pPr>
+        <w:spacing w:before="0" w:beforeAutospacing="off" w:after="0" w:afterAutospacing="off"/>
+        <w:rPr>
+          <w:rFonts w:ascii="Calibri" w:hAnsi="Calibri" w:eastAsia="Calibri" w:cs="Calibri" w:asciiTheme="minorAscii" w:hAnsiTheme="minorAscii" w:eastAsiaTheme="minorAscii" w:cstheme="minorAscii"/>
+          <w:noProof w:val="0"/>
+          <w:sz w:val="24"/>
+          <w:szCs w:val="24"/>
+          <w:lang w:val="en-GB"/>
+        </w:rPr>
+      </w:pPr>
+      <w:r>
+        <w:rPr>
+          <w:rFonts w:ascii="Calibri" w:hAnsi="Calibri" w:eastAsia="Calibri" w:cs="Calibri" w:asciiTheme="minorAscii" w:hAnsiTheme="minorAscii" w:eastAsiaTheme="minorAscii" w:cstheme="minorAscii"/>
+          <w:noProof w:val="0"/>
+          <w:sz w:val="24"/>
+          <w:szCs w:val="24"/>
+          <w:lang w:val="en-GB"/>
+        </w:rPr>
+        <w:t>PHP</w:t>
+      </w:r>
+    </w:p>
+    <w:p>
+      <w:pPr>
+        <w:spacing w:before="0" w:beforeAutospacing="off" w:after="0" w:afterAutospacing="off"/>
+        <w:rPr>
+          <w:rFonts w:ascii="Calibri" w:hAnsi="Calibri" w:eastAsia="Calibri" w:cs="Calibri" w:asciiTheme="minorAscii" w:hAnsiTheme="minorAscii" w:eastAsiaTheme="minorAscii" w:cstheme="minorAscii"/>
+          <w:noProof w:val="0"/>
+          <w:sz w:val="24"/>
+          <w:szCs w:val="24"/>
+          <w:lang w:val="en-GB"/>
+        </w:rPr>
+      </w:pPr>
+      <w:r>
+        <w:rPr>
+          <w:rFonts w:ascii="Calibri" w:hAnsi="Calibri" w:eastAsia="Calibri" w:cs="Calibri" w:asciiTheme="minorAscii" w:hAnsiTheme="minorAscii" w:eastAsiaTheme="minorAscii" w:cstheme="minorAscii"/>
+          <w:noProof w:val="0"/>
+          <w:sz w:val="24"/>
+          <w:szCs w:val="24"/>
+          <w:lang w:val="en-GB"/>
+        </w:rPr>
+        <w:t>Post::create($request-&gt;validated());</w:t>
+      </w:r>
+      <w:r>
+        <w:br/>
+      </w:r>
+    </w:p>
+    <w:p>
+      <w:pPr>
+        <w:spacing w:before="240" w:beforeAutospacing="off" w:after="240" w:afterAutospacing="off"/>
+        <w:rPr>
+          <w:rFonts w:ascii="Calibri" w:hAnsi="Calibri" w:eastAsia="Calibri" w:cs="Calibri" w:asciiTheme="minorAscii" w:hAnsiTheme="minorAscii" w:eastAsiaTheme="minorAscii" w:cstheme="minorAscii"/>
+          <w:noProof w:val="0"/>
+          <w:sz w:val="24"/>
+          <w:szCs w:val="24"/>
+          <w:lang w:val="en-GB"/>
+        </w:rPr>
+      </w:pPr>
+      <w:r>
+        <w:rPr>
+          <w:rFonts w:ascii="Calibri" w:hAnsi="Calibri" w:eastAsia="Calibri" w:cs="Calibri" w:asciiTheme="minorAscii" w:hAnsiTheme="minorAscii" w:eastAsiaTheme="minorAscii" w:cstheme="minorAscii"/>
+          <w:noProof w:val="0"/>
+          <w:sz w:val="24"/>
+          <w:szCs w:val="24"/>
+          <w:lang w:val="en-GB"/>
+        </w:rPr>
+        <w:t xml:space="preserve">If your model is not guarded, Laravel throws a </w:t>
+      </w:r>
+      <w:r>
+        <w:rPr>
+          <w:rFonts w:ascii="Calibri" w:hAnsi="Calibri" w:eastAsia="Calibri" w:cs="Calibri" w:asciiTheme="minorAscii" w:hAnsiTheme="minorAscii" w:eastAsiaTheme="minorAscii" w:cstheme="minorAscii"/>
+          <w:noProof w:val="0"/>
+          <w:sz w:val="24"/>
+          <w:szCs w:val="24"/>
+          <w:lang w:val="en-GB"/>
+        </w:rPr>
+        <w:t>MassAssignmentException</w:t>
+      </w:r>
+      <w:r>
+        <w:rPr>
+          <w:rFonts w:ascii="Calibri" w:hAnsi="Calibri" w:eastAsia="Calibri" w:cs="Calibri" w:asciiTheme="minorAscii" w:hAnsiTheme="minorAscii" w:eastAsiaTheme="minorAscii" w:cstheme="minorAscii"/>
+          <w:noProof w:val="0"/>
+          <w:sz w:val="24"/>
+          <w:szCs w:val="24"/>
+          <w:lang w:val="en-GB"/>
+        </w:rPr>
+        <w:t>. If it's configured incorrectly, you expose a critical security vulnerability.</w:t>
+      </w:r>
+    </w:p>
+    <w:p>
+      <w:pPr>
+        <w:spacing w:before="0" w:beforeAutospacing="off" w:after="0" w:afterAutospacing="off"/>
+        <w:rPr>
+          <w:rFonts w:ascii="Calibri" w:hAnsi="Calibri" w:eastAsia="Calibri" w:cs="Calibri" w:asciiTheme="minorAscii" w:hAnsiTheme="minorAscii" w:eastAsiaTheme="minorAscii" w:cstheme="minorAscii"/>
+          <w:noProof w:val="0"/>
+          <w:sz w:val="24"/>
+          <w:szCs w:val="24"/>
+          <w:lang w:val="en-GB"/>
+        </w:rPr>
+      </w:pPr>
+      <w:r>
+        <w:rPr>
+          <w:rFonts w:ascii="Calibri" w:hAnsi="Calibri" w:eastAsia="Calibri" w:cs="Calibri" w:asciiTheme="minorAscii" w:hAnsiTheme="minorAscii" w:eastAsiaTheme="minorAscii" w:cstheme="minorAscii"/>
+          <w:noProof w:val="0"/>
+          <w:sz w:val="24"/>
+          <w:szCs w:val="24"/>
+          <w:lang w:val="en-GB"/>
+        </w:rPr>
+        <w:t>PHP</w:t>
+      </w:r>
+    </w:p>
+    <w:p>
+      <w:pPr>
+        <w:spacing w:before="0" w:beforeAutospacing="off" w:after="0" w:afterAutospacing="off"/>
+        <w:rPr>
+          <w:rFonts w:ascii="Calibri" w:hAnsi="Calibri" w:eastAsia="Calibri" w:cs="Calibri" w:asciiTheme="minorAscii" w:hAnsiTheme="minorAscii" w:eastAsiaTheme="minorAscii" w:cstheme="minorAscii"/>
+          <w:noProof w:val="0"/>
+          <w:sz w:val="24"/>
+          <w:szCs w:val="24"/>
+          <w:lang w:val="en-GB"/>
+        </w:rPr>
+      </w:pPr>
+      <w:r>
+        <w:rPr>
+          <w:rFonts w:ascii="Calibri" w:hAnsi="Calibri" w:eastAsia="Calibri" w:cs="Calibri" w:asciiTheme="minorAscii" w:hAnsiTheme="minorAscii" w:eastAsiaTheme="minorAscii" w:cstheme="minorAscii"/>
+          <w:noProof w:val="0"/>
+          <w:sz w:val="24"/>
+          <w:szCs w:val="24"/>
+          <w:lang w:val="en-GB"/>
+        </w:rPr>
+        <w:t>// app/Models/Post.php</w:t>
+      </w:r>
+      <w:r>
+        <w:br/>
+      </w:r>
+      <w:r>
+        <w:rPr>
+          <w:rFonts w:ascii="Calibri" w:hAnsi="Calibri" w:eastAsia="Calibri" w:cs="Calibri" w:asciiTheme="minorAscii" w:hAnsiTheme="minorAscii" w:eastAsiaTheme="minorAscii" w:cstheme="minorAscii"/>
+          <w:noProof w:val="0"/>
+          <w:sz w:val="24"/>
+          <w:szCs w:val="24"/>
+          <w:lang w:val="en-GB"/>
+        </w:rPr>
+        <w:t>class Post extends Model</w:t>
+      </w:r>
+      <w:r>
+        <w:br/>
+      </w:r>
+      <w:r>
+        <w:rPr>
+          <w:rFonts w:ascii="Calibri" w:hAnsi="Calibri" w:eastAsia="Calibri" w:cs="Calibri" w:asciiTheme="minorAscii" w:hAnsiTheme="minorAscii" w:eastAsiaTheme="minorAscii" w:cstheme="minorAscii"/>
+          <w:noProof w:val="0"/>
+          <w:sz w:val="24"/>
+          <w:szCs w:val="24"/>
+          <w:lang w:val="en-GB"/>
+        </w:rPr>
+        <w:t>{</w:t>
+      </w:r>
+      <w:r>
+        <w:br/>
+      </w:r>
+      <w:r>
+        <w:rPr>
+          <w:rFonts w:ascii="Calibri" w:hAnsi="Calibri" w:eastAsia="Calibri" w:cs="Calibri" w:asciiTheme="minorAscii" w:hAnsiTheme="minorAscii" w:eastAsiaTheme="minorAscii" w:cstheme="minorAscii"/>
+          <w:noProof w:val="0"/>
+          <w:sz w:val="24"/>
+          <w:szCs w:val="24"/>
+          <w:lang w:val="en-GB"/>
+        </w:rPr>
+        <w:t xml:space="preserve">    </w:t>
+      </w:r>
+      <w:r>
+        <w:rPr>
+          <w:rFonts w:ascii="Calibri" w:hAnsi="Calibri" w:eastAsia="Calibri" w:cs="Calibri" w:asciiTheme="minorAscii" w:hAnsiTheme="minorAscii" w:eastAsiaTheme="minorAscii" w:cstheme="minorAscii"/>
+          <w:b w:val="1"/>
+          <w:bCs w:val="1"/>
+          <w:noProof w:val="0"/>
+          <w:color w:val="4C94D8" w:themeColor="text2" w:themeTint="80" w:themeShade="FF"/>
+          <w:sz w:val="24"/>
+          <w:szCs w:val="24"/>
+          <w:highlight w:val="yellow"/>
+          <w:lang w:val="en-GB"/>
+        </w:rPr>
+        <w:t>// RECOMMENDED: Explicitly allow only what the user can submit</w:t>
+      </w:r>
+      <w:r>
+        <w:br/>
+      </w:r>
+      <w:r>
+        <w:rPr>
+          <w:rFonts w:ascii="Calibri" w:hAnsi="Calibri" w:eastAsia="Calibri" w:cs="Calibri" w:asciiTheme="minorAscii" w:hAnsiTheme="minorAscii" w:eastAsiaTheme="minorAscii" w:cstheme="minorAscii"/>
+          <w:b w:val="1"/>
+          <w:bCs w:val="1"/>
+          <w:noProof w:val="0"/>
+          <w:color w:val="4C94D8" w:themeColor="text2" w:themeTint="80" w:themeShade="FF"/>
+          <w:sz w:val="24"/>
+          <w:szCs w:val="24"/>
+          <w:highlight w:val="yellow"/>
+          <w:lang w:val="en-GB"/>
+        </w:rPr>
+        <w:t xml:space="preserve">    protected $fillable = [</w:t>
+      </w:r>
+      <w:r>
+        <w:br/>
+      </w:r>
+      <w:r>
+        <w:rPr>
+          <w:rFonts w:ascii="Calibri" w:hAnsi="Calibri" w:eastAsia="Calibri" w:cs="Calibri" w:asciiTheme="minorAscii" w:hAnsiTheme="minorAscii" w:eastAsiaTheme="minorAscii" w:cstheme="minorAscii"/>
+          <w:b w:val="1"/>
+          <w:bCs w:val="1"/>
+          <w:noProof w:val="0"/>
+          <w:color w:val="4C94D8" w:themeColor="text2" w:themeTint="80" w:themeShade="FF"/>
+          <w:sz w:val="24"/>
+          <w:szCs w:val="24"/>
+          <w:highlight w:val="yellow"/>
+          <w:lang w:val="en-GB"/>
+        </w:rPr>
+        <w:t xml:space="preserve">        'title',</w:t>
+      </w:r>
+      <w:r>
+        <w:br/>
+      </w:r>
+      <w:r>
+        <w:rPr>
+          <w:rFonts w:ascii="Calibri" w:hAnsi="Calibri" w:eastAsia="Calibri" w:cs="Calibri" w:asciiTheme="minorAscii" w:hAnsiTheme="minorAscii" w:eastAsiaTheme="minorAscii" w:cstheme="minorAscii"/>
+          <w:b w:val="1"/>
+          <w:bCs w:val="1"/>
+          <w:noProof w:val="0"/>
+          <w:color w:val="4C94D8" w:themeColor="text2" w:themeTint="80" w:themeShade="FF"/>
+          <w:sz w:val="24"/>
+          <w:szCs w:val="24"/>
+          <w:highlight w:val="yellow"/>
+          <w:lang w:val="en-GB"/>
+        </w:rPr>
+        <w:t xml:space="preserve">        'slug',</w:t>
+      </w:r>
+      <w:r>
+        <w:br/>
+      </w:r>
+      <w:r>
+        <w:rPr>
+          <w:rFonts w:ascii="Calibri" w:hAnsi="Calibri" w:eastAsia="Calibri" w:cs="Calibri" w:asciiTheme="minorAscii" w:hAnsiTheme="minorAscii" w:eastAsiaTheme="minorAscii" w:cstheme="minorAscii"/>
+          <w:b w:val="1"/>
+          <w:bCs w:val="1"/>
+          <w:noProof w:val="0"/>
+          <w:color w:val="4C94D8" w:themeColor="text2" w:themeTint="80" w:themeShade="FF"/>
+          <w:sz w:val="24"/>
+          <w:szCs w:val="24"/>
+          <w:highlight w:val="yellow"/>
+          <w:lang w:val="en-GB"/>
+        </w:rPr>
+        <w:t xml:space="preserve">        'body',</w:t>
+      </w:r>
+      <w:r>
+        <w:br/>
+      </w:r>
+      <w:r>
+        <w:rPr>
+          <w:rFonts w:ascii="Calibri" w:hAnsi="Calibri" w:eastAsia="Calibri" w:cs="Calibri" w:asciiTheme="minorAscii" w:hAnsiTheme="minorAscii" w:eastAsiaTheme="minorAscii" w:cstheme="minorAscii"/>
+          <w:b w:val="1"/>
+          <w:bCs w:val="1"/>
+          <w:noProof w:val="0"/>
+          <w:color w:val="4C94D8" w:themeColor="text2" w:themeTint="80" w:themeShade="FF"/>
+          <w:sz w:val="24"/>
+          <w:szCs w:val="24"/>
+          <w:highlight w:val="yellow"/>
+          <w:lang w:val="en-GB"/>
+        </w:rPr>
+        <w:t xml:space="preserve">        'is_published',</w:t>
+      </w:r>
+      <w:r>
+        <w:br/>
+      </w:r>
+      <w:r>
+        <w:rPr>
+          <w:rFonts w:ascii="Calibri" w:hAnsi="Calibri" w:eastAsia="Calibri" w:cs="Calibri" w:asciiTheme="minorAscii" w:hAnsiTheme="minorAscii" w:eastAsiaTheme="minorAscii" w:cstheme="minorAscii"/>
+          <w:b w:val="1"/>
+          <w:bCs w:val="1"/>
+          <w:noProof w:val="0"/>
+          <w:color w:val="4C94D8" w:themeColor="text2" w:themeTint="80" w:themeShade="FF"/>
+          <w:sz w:val="24"/>
+          <w:szCs w:val="24"/>
+          <w:highlight w:val="yellow"/>
+          <w:lang w:val="en-GB"/>
+        </w:rPr>
+        <w:t xml:space="preserve">    ];</w:t>
+      </w:r>
+      <w:r>
+        <w:br/>
+      </w:r>
+      <w:r>
+        <w:br/>
+      </w:r>
+      <w:r>
+        <w:rPr>
+          <w:rFonts w:ascii="Calibri" w:hAnsi="Calibri" w:eastAsia="Calibri" w:cs="Calibri" w:asciiTheme="minorAscii" w:hAnsiTheme="minorAscii" w:eastAsiaTheme="minorAscii" w:cstheme="minorAscii"/>
+          <w:noProof w:val="0"/>
+          <w:sz w:val="24"/>
+          <w:szCs w:val="24"/>
+          <w:lang w:val="en-GB"/>
+        </w:rPr>
+        <w:t xml:space="preserve">    // DANGEROUS: If an AI writes this, an attacker can pass `is_admin=true`</w:t>
+      </w:r>
+      <w:r>
+        <w:br/>
+      </w:r>
+      <w:r>
+        <w:rPr>
+          <w:rFonts w:ascii="Calibri" w:hAnsi="Calibri" w:eastAsia="Calibri" w:cs="Calibri" w:asciiTheme="minorAscii" w:hAnsiTheme="minorAscii" w:eastAsiaTheme="minorAscii" w:cstheme="minorAscii"/>
+          <w:noProof w:val="0"/>
+          <w:sz w:val="24"/>
+          <w:szCs w:val="24"/>
+          <w:lang w:val="en-GB"/>
+        </w:rPr>
+        <w:t xml:space="preserve">    // protected $guarded = []; </w:t>
+      </w:r>
+      <w:r>
+        <w:br/>
+      </w:r>
+      <w:r>
+        <w:rPr>
+          <w:rFonts w:ascii="Calibri" w:hAnsi="Calibri" w:eastAsia="Calibri" w:cs="Calibri" w:asciiTheme="minorAscii" w:hAnsiTheme="minorAscii" w:eastAsiaTheme="minorAscii" w:cstheme="minorAscii"/>
+          <w:noProof w:val="0"/>
+          <w:sz w:val="24"/>
+          <w:szCs w:val="24"/>
+          <w:lang w:val="en-GB"/>
+        </w:rPr>
+        <w:t>}</w:t>
+      </w:r>
+    </w:p>
+    <w:p>
+      <w:pPr>
+        <w:pStyle w:val="Normal"/>
+        <w:spacing w:before="240" w:beforeAutospacing="off" w:after="240" w:afterAutospacing="off"/>
+        <w:ind w:left="0"/>
+        <w:rPr>
+          <w:rFonts w:ascii="Calibri" w:hAnsi="Calibri" w:eastAsia="Calibri" w:cs="Calibri" w:asciiTheme="minorAscii" w:hAnsiTheme="minorAscii" w:eastAsiaTheme="minorAscii" w:cstheme="minorAscii"/>
+          <w:noProof w:val="0"/>
+          <w:sz w:val="24"/>
+          <w:szCs w:val="24"/>
+          <w:lang w:val="en-GB"/>
+        </w:rPr>
+      </w:pPr>
+    </w:p>
+    <w:p>
+      <w:pPr>
+        <w:pStyle w:val="Normal"/>
+        <w:spacing w:before="240" w:beforeAutospacing="off" w:after="240" w:afterAutospacing="off"/>
+        <w:ind w:left="0"/>
+        <w:rPr>
+          <w:rFonts w:ascii="Calibri" w:hAnsi="Calibri" w:eastAsia="Calibri" w:cs="Calibri" w:asciiTheme="minorAscii" w:hAnsiTheme="minorAscii" w:eastAsiaTheme="minorAscii" w:cstheme="minorAscii"/>
+          <w:noProof w:val="0"/>
+          <w:sz w:val="24"/>
+          <w:szCs w:val="24"/>
+          <w:lang w:val="en-GB"/>
+        </w:rPr>
+      </w:pPr>
+    </w:p>
+    <w:p>
+      <w:pPr>
+        <w:pStyle w:val="Normal"/>
+        <w:spacing w:before="240" w:beforeAutospacing="off" w:after="240" w:afterAutospacing="off"/>
+        <w:ind w:left="0"/>
+        <w:rPr>
+          <w:rFonts w:ascii="Calibri" w:hAnsi="Calibri" w:eastAsia="Calibri" w:cs="Calibri" w:asciiTheme="minorAscii" w:hAnsiTheme="minorAscii" w:eastAsiaTheme="minorAscii" w:cstheme="minorAscii"/>
+          <w:b w:val="1"/>
+          <w:bCs w:val="1"/>
+          <w:noProof w:val="0"/>
+          <w:color w:val="FF0000"/>
+          <w:sz w:val="28"/>
+          <w:szCs w:val="28"/>
+          <w:highlight w:val="yellow"/>
+          <w:lang w:val="en-GB"/>
+        </w:rPr>
+      </w:pPr>
+      <w:r>
+        <w:rPr>
+          <w:rFonts w:ascii="Calibri" w:hAnsi="Calibri" w:eastAsia="Calibri" w:cs="Calibri" w:asciiTheme="minorAscii" w:hAnsiTheme="minorAscii" w:eastAsiaTheme="minorAscii" w:cstheme="minorAscii"/>
+          <w:b w:val="1"/>
+          <w:bCs w:val="1"/>
+          <w:noProof w:val="0"/>
+          <w:color w:val="000000" w:themeColor="text1" w:themeTint="FF" w:themeShade="FF"/>
+          <w:sz w:val="28"/>
+          <w:szCs w:val="28"/>
+          <w:highlight w:val="yellow"/>
+          <w:lang w:val="en-GB"/>
+        </w:rPr>
+        <w:t>Note:</w:t>
+      </w:r>
+      <w:r>
+        <w:rPr>
+          <w:rFonts w:ascii="Calibri" w:hAnsi="Calibri" w:eastAsia="Calibri" w:cs="Calibri" w:asciiTheme="minorAscii" w:hAnsiTheme="minorAscii" w:eastAsiaTheme="minorAscii" w:cstheme="minorAscii"/>
+          <w:b w:val="1"/>
+          <w:bCs w:val="1"/>
+          <w:noProof w:val="0"/>
+          <w:color w:val="FF0000"/>
+          <w:sz w:val="28"/>
+          <w:szCs w:val="28"/>
+          <w:highlight w:val="yellow"/>
+          <w:lang w:val="en-GB"/>
+        </w:rPr>
+        <w:t xml:space="preserve"> </w:t>
+      </w:r>
+      <w:r>
+        <w:rPr>
+          <w:rFonts w:ascii="Calibri" w:hAnsi="Calibri" w:eastAsia="Calibri" w:cs="Calibri" w:asciiTheme="minorAscii" w:hAnsiTheme="minorAscii" w:eastAsiaTheme="minorAscii" w:cstheme="minorAscii"/>
+          <w:b w:val="1"/>
+          <w:bCs w:val="1"/>
+          <w:noProof w:val="0"/>
+          <w:color w:val="FF0000"/>
+          <w:sz w:val="28"/>
+          <w:szCs w:val="28"/>
+          <w:highlight w:val="yellow"/>
+          <w:lang w:val="en-GB"/>
+        </w:rPr>
+        <w:t xml:space="preserve">If an AI suggests </w:t>
+      </w:r>
+      <w:r>
+        <w:rPr>
+          <w:rFonts w:ascii="Calibri" w:hAnsi="Calibri" w:eastAsia="Calibri" w:cs="Calibri" w:asciiTheme="minorAscii" w:hAnsiTheme="minorAscii" w:eastAsiaTheme="minorAscii" w:cstheme="minorAscii"/>
+          <w:b w:val="1"/>
+          <w:bCs w:val="1"/>
+          <w:noProof w:val="0"/>
+          <w:color w:val="FF0000"/>
+          <w:sz w:val="28"/>
+          <w:szCs w:val="28"/>
+          <w:highlight w:val="yellow"/>
+          <w:lang w:val="en-GB"/>
+        </w:rPr>
+        <w:t>protected $guarded = [];</w:t>
+      </w:r>
+      <w:r>
+        <w:rPr>
+          <w:rFonts w:ascii="Calibri" w:hAnsi="Calibri" w:eastAsia="Calibri" w:cs="Calibri" w:asciiTheme="minorAscii" w:hAnsiTheme="minorAscii" w:eastAsiaTheme="minorAscii" w:cstheme="minorAscii"/>
+          <w:b w:val="1"/>
+          <w:bCs w:val="1"/>
+          <w:noProof w:val="0"/>
+          <w:color w:val="FF0000"/>
+          <w:sz w:val="28"/>
+          <w:szCs w:val="28"/>
+          <w:highlight w:val="yellow"/>
+          <w:lang w:val="en-GB"/>
+        </w:rPr>
+        <w:t xml:space="preserve"> or </w:t>
+      </w:r>
+      <w:r>
+        <w:rPr>
+          <w:rFonts w:ascii="Calibri" w:hAnsi="Calibri" w:eastAsia="Calibri" w:cs="Calibri" w:asciiTheme="minorAscii" w:hAnsiTheme="minorAscii" w:eastAsiaTheme="minorAscii" w:cstheme="minorAscii"/>
+          <w:b w:val="1"/>
+          <w:bCs w:val="1"/>
+          <w:noProof w:val="0"/>
+          <w:color w:val="FF0000"/>
+          <w:sz w:val="28"/>
+          <w:szCs w:val="28"/>
+          <w:highlight w:val="yellow"/>
+          <w:lang w:val="en-GB"/>
+        </w:rPr>
+        <w:t>Model::</w:t>
+      </w:r>
+      <w:r>
+        <w:rPr>
+          <w:rFonts w:ascii="Calibri" w:hAnsi="Calibri" w:eastAsia="Calibri" w:cs="Calibri" w:asciiTheme="minorAscii" w:hAnsiTheme="minorAscii" w:eastAsiaTheme="minorAscii" w:cstheme="minorAscii"/>
+          <w:b w:val="1"/>
+          <w:bCs w:val="1"/>
+          <w:noProof w:val="0"/>
+          <w:color w:val="FF0000"/>
+          <w:sz w:val="28"/>
+          <w:szCs w:val="28"/>
+          <w:highlight w:val="yellow"/>
+          <w:lang w:val="en-GB"/>
+        </w:rPr>
+        <w:t>unguard(</w:t>
+      </w:r>
+      <w:r>
+        <w:rPr>
+          <w:rFonts w:ascii="Calibri" w:hAnsi="Calibri" w:eastAsia="Calibri" w:cs="Calibri" w:asciiTheme="minorAscii" w:hAnsiTheme="minorAscii" w:eastAsiaTheme="minorAscii" w:cstheme="minorAscii"/>
+          <w:b w:val="1"/>
+          <w:bCs w:val="1"/>
+          <w:noProof w:val="0"/>
+          <w:color w:val="FF0000"/>
+          <w:sz w:val="28"/>
+          <w:szCs w:val="28"/>
+          <w:highlight w:val="yellow"/>
+          <w:lang w:val="en-GB"/>
+        </w:rPr>
+        <w:t>)</w:t>
+      </w:r>
+      <w:r>
+        <w:rPr>
+          <w:rFonts w:ascii="Calibri" w:hAnsi="Calibri" w:eastAsia="Calibri" w:cs="Calibri" w:asciiTheme="minorAscii" w:hAnsiTheme="minorAscii" w:eastAsiaTheme="minorAscii" w:cstheme="minorAscii"/>
+          <w:b w:val="1"/>
+          <w:bCs w:val="1"/>
+          <w:noProof w:val="0"/>
+          <w:color w:val="FF0000"/>
+          <w:sz w:val="28"/>
+          <w:szCs w:val="28"/>
+          <w:highlight w:val="yellow"/>
+          <w:lang w:val="en-GB"/>
+        </w:rPr>
+        <w:t xml:space="preserve">, reject it </w:t>
+      </w:r>
+      <w:r>
+        <w:rPr>
+          <w:rFonts w:ascii="Calibri" w:hAnsi="Calibri" w:eastAsia="Calibri" w:cs="Calibri" w:asciiTheme="minorAscii" w:hAnsiTheme="minorAscii" w:eastAsiaTheme="minorAscii" w:cstheme="minorAscii"/>
+          <w:b w:val="1"/>
+          <w:bCs w:val="1"/>
+          <w:noProof w:val="0"/>
+          <w:color w:val="FF0000"/>
+          <w:sz w:val="28"/>
+          <w:szCs w:val="28"/>
+          <w:highlight w:val="yellow"/>
+          <w:lang w:val="en-GB"/>
+        </w:rPr>
+        <w:t>immediately</w:t>
+      </w:r>
+      <w:r>
+        <w:rPr>
+          <w:rFonts w:ascii="Calibri" w:hAnsi="Calibri" w:eastAsia="Calibri" w:cs="Calibri" w:asciiTheme="minorAscii" w:hAnsiTheme="minorAscii" w:eastAsiaTheme="minorAscii" w:cstheme="minorAscii"/>
+          <w:b w:val="1"/>
+          <w:bCs w:val="1"/>
+          <w:noProof w:val="0"/>
+          <w:color w:val="FF0000"/>
+          <w:sz w:val="28"/>
+          <w:szCs w:val="28"/>
+          <w:highlight w:val="yellow"/>
+          <w:lang w:val="en-GB"/>
+        </w:rPr>
+        <w:t xml:space="preserve">. Tell it: </w:t>
+      </w:r>
+      <w:r>
+        <w:rPr>
+          <w:rFonts w:ascii="Calibri" w:hAnsi="Calibri" w:eastAsia="Calibri" w:cs="Calibri" w:asciiTheme="minorAscii" w:hAnsiTheme="minorAscii" w:eastAsiaTheme="minorAscii" w:cstheme="minorAscii"/>
+          <w:b w:val="1"/>
+          <w:bCs w:val="1"/>
+          <w:i w:val="1"/>
+          <w:iCs w:val="1"/>
+          <w:noProof w:val="0"/>
+          <w:color w:val="FF0000"/>
+          <w:sz w:val="28"/>
+          <w:szCs w:val="28"/>
+          <w:highlight w:val="yellow"/>
+          <w:lang w:val="en-GB"/>
+        </w:rPr>
+        <w:t xml:space="preserve">"Use an explicit </w:t>
+      </w:r>
+      <w:r>
+        <w:rPr>
+          <w:rFonts w:ascii="Calibri" w:hAnsi="Calibri" w:eastAsia="Calibri" w:cs="Calibri" w:asciiTheme="minorAscii" w:hAnsiTheme="minorAscii" w:eastAsiaTheme="minorAscii" w:cstheme="minorAscii"/>
+          <w:b w:val="1"/>
+          <w:bCs w:val="1"/>
+          <w:i w:val="1"/>
+          <w:iCs w:val="1"/>
+          <w:noProof w:val="0"/>
+          <w:color w:val="FF0000"/>
+          <w:sz w:val="28"/>
+          <w:szCs w:val="28"/>
+          <w:highlight w:val="yellow"/>
+          <w:lang w:val="en-GB"/>
+        </w:rPr>
+        <w:t>$fillable</w:t>
+      </w:r>
+      <w:r>
+        <w:rPr>
+          <w:rFonts w:ascii="Calibri" w:hAnsi="Calibri" w:eastAsia="Calibri" w:cs="Calibri" w:asciiTheme="minorAscii" w:hAnsiTheme="minorAscii" w:eastAsiaTheme="minorAscii" w:cstheme="minorAscii"/>
+          <w:b w:val="1"/>
+          <w:bCs w:val="1"/>
+          <w:i w:val="1"/>
+          <w:iCs w:val="1"/>
+          <w:noProof w:val="0"/>
+          <w:color w:val="FF0000"/>
+          <w:sz w:val="28"/>
+          <w:szCs w:val="28"/>
+          <w:highlight w:val="yellow"/>
+          <w:lang w:val="en-GB"/>
+        </w:rPr>
+        <w:t xml:space="preserve"> array on the model."</w:t>
+      </w:r>
+    </w:p>
+    <w:p>
+      <w:pPr>
+        <w:pStyle w:val="Normal"/>
+        <w:rPr>
+          <w:rFonts w:ascii="system-ui" w:hAnsi="system-ui" w:eastAsia="system-ui" w:cs="system-ui"/>
+          <w:b w:val="0"/>
+          <w:bCs w:val="0"/>
+          <w:i w:val="1"/>
+          <w:iCs w:val="1"/>
+          <w:caps w:val="0"/>
+          <w:smallCaps w:val="0"/>
+          <w:noProof w:val="0"/>
+          <w:color w:val="364153"/>
+          <w:sz w:val="24"/>
+          <w:szCs w:val="24"/>
+          <w:lang w:val="en-GB"/>
+        </w:rPr>
+      </w:pPr>
     </w:p>
     <w:p>
       <w:pPr>

</xml_diff>

<commit_message>
Add permission:cache-reset command to Laravel notes
</commit_message>
<xml_diff>
--- a/Laravel notes.docx
+++ b/Laravel notes.docx
@@ -11045,16 +11045,6 @@
       <w:pPr>
         <w:pStyle w:val="Normal"/>
         <w:spacing w:before="240" w:beforeAutospacing="off" w:after="240" w:afterAutospacing="off"/>
-        <w:rPr>
-          <w:rFonts w:ascii="Calibri" w:hAnsi="Calibri" w:eastAsia="Calibri" w:cs="Calibri" w:asciiTheme="minorAscii" w:hAnsiTheme="minorAscii" w:eastAsiaTheme="minorAscii" w:cstheme="minorAscii"/>
-          <w:b w:val="1"/>
-          <w:bCs w:val="1"/>
-          <w:noProof w:val="0"/>
-          <w:color w:val="0E2740" w:themeColor="text2" w:themeTint="80" w:themeShade="FF"/>
-          <w:sz w:val="22"/>
-          <w:szCs w:val="22"/>
-          <w:lang w:val="en-GB"/>
-        </w:rPr>
       </w:pPr>
       <w:r>
         <w:rPr>
@@ -11134,6 +11124,255 @@
         </w:rPr>
         <w:t>);</w:t>
       </w:r>
+    </w:p>
+    <w:p>
+      <w:pPr>
+        <w:pStyle w:val="Normal"/>
+        <w:spacing w:before="240" w:beforeAutospacing="off" w:after="240" w:afterAutospacing="off"/>
+        <w:rPr>
+          <w:rFonts w:ascii="Calibri" w:hAnsi="Calibri" w:eastAsia="Calibri" w:cs="Calibri" w:asciiTheme="minorAscii" w:hAnsiTheme="minorAscii" w:eastAsiaTheme="minorAscii" w:cstheme="minorAscii"/>
+          <w:b w:val="1"/>
+          <w:bCs w:val="1"/>
+          <w:noProof w:val="0"/>
+          <w:color w:val="0E2740"/>
+          <w:sz w:val="22"/>
+          <w:szCs w:val="22"/>
+          <w:lang w:val="en-GB"/>
+        </w:rPr>
+      </w:pPr>
+    </w:p>
+    <w:p>
+      <w:pPr>
+        <w:pStyle w:val="Normal"/>
+        <w:spacing w:before="240" w:beforeAutospacing="off" w:after="240" w:afterAutospacing="off"/>
+        <w:rPr>
+          <w:rFonts w:ascii="Calibri" w:hAnsi="Calibri" w:eastAsia="Calibri" w:cs="Calibri" w:asciiTheme="minorAscii" w:hAnsiTheme="minorAscii" w:eastAsiaTheme="minorAscii" w:cstheme="minorAscii"/>
+          <w:b w:val="1"/>
+          <w:bCs w:val="1"/>
+          <w:noProof w:val="0"/>
+          <w:color w:val="0E2740"/>
+          <w:sz w:val="22"/>
+          <w:szCs w:val="22"/>
+          <w:lang w:val="en-GB"/>
+        </w:rPr>
+      </w:pPr>
+    </w:p>
+    <w:p>
+      <w:pPr>
+        <w:pStyle w:val="Normal"/>
+        <w:spacing w:before="240" w:beforeAutospacing="off" w:after="240" w:afterAutospacing="off"/>
+        <w:rPr>
+          <w:rFonts w:ascii="Calibri" w:hAnsi="Calibri" w:eastAsia="Calibri" w:cs="Calibri" w:asciiTheme="minorAscii" w:hAnsiTheme="minorAscii" w:eastAsiaTheme="minorAscii" w:cstheme="minorAscii"/>
+          <w:b w:val="1"/>
+          <w:bCs w:val="1"/>
+          <w:noProof w:val="0"/>
+          <w:color w:val="4C94D8" w:themeColor="text2" w:themeTint="80" w:themeShade="FF"/>
+          <w:sz w:val="32"/>
+          <w:szCs w:val="32"/>
+          <w:lang w:val="en-GB"/>
+        </w:rPr>
+      </w:pPr>
+      <w:r>
+        <w:rPr>
+          <w:rFonts w:ascii="Calibri" w:hAnsi="Calibri" w:eastAsia="Calibri" w:cs="Calibri" w:asciiTheme="minorAscii" w:hAnsiTheme="minorAscii" w:eastAsiaTheme="minorAscii" w:cstheme="minorAscii"/>
+          <w:b w:val="1"/>
+          <w:bCs w:val="1"/>
+          <w:noProof w:val="0"/>
+          <w:color w:val="4C94D8" w:themeColor="text2" w:themeTint="80" w:themeShade="FF"/>
+          <w:sz w:val="32"/>
+          <w:szCs w:val="32"/>
+          <w:lang w:val="en-GB"/>
+        </w:rPr>
+        <w:t>php artisan permission:cache-reset</w:t>
+      </w:r>
+    </w:p>
+    <w:p>
+      <w:pPr>
+        <w:spacing w:before="180" w:beforeAutospacing="off" w:after="240" w:afterAutospacing="off"/>
+        <w:rPr>
+          <w:rFonts w:ascii="Calibri" w:hAnsi="Calibri" w:eastAsia="Calibri" w:cs="Calibri" w:asciiTheme="minorAscii" w:hAnsiTheme="minorAscii" w:eastAsiaTheme="minorAscii" w:cstheme="minorAscii"/>
+          <w:b w:val="0"/>
+          <w:bCs w:val="0"/>
+          <w:strike w:val="0"/>
+          <w:dstrike w:val="0"/>
+          <w:noProof w:val="0"/>
+          <w:sz w:val="24"/>
+          <w:szCs w:val="24"/>
+          <w:u w:val="none"/>
+          <w:lang w:val="en-GB"/>
+        </w:rPr>
+      </w:pPr>
+      <w:r>
+        <w:rPr>
+          <w:rFonts w:ascii="Calibri" w:hAnsi="Calibri" w:eastAsia="Calibri" w:cs="Calibri" w:asciiTheme="minorAscii" w:hAnsiTheme="minorAscii" w:eastAsiaTheme="minorAscii" w:cstheme="minorAscii"/>
+          <w:b w:val="0"/>
+          <w:bCs w:val="0"/>
+          <w:strike w:val="0"/>
+          <w:dstrike w:val="0"/>
+          <w:noProof w:val="0"/>
+          <w:sz w:val="24"/>
+          <w:szCs w:val="24"/>
+          <w:u w:val="none"/>
+          <w:lang w:val="en-GB"/>
+        </w:rPr>
+        <w:t xml:space="preserve">this command </w:t>
+      </w:r>
+      <w:r>
+        <w:rPr>
+          <w:rFonts w:ascii="Calibri" w:hAnsi="Calibri" w:eastAsia="Calibri" w:cs="Calibri" w:asciiTheme="minorAscii" w:hAnsiTheme="minorAscii" w:eastAsiaTheme="minorAscii" w:cstheme="minorAscii"/>
+          <w:b w:val="1"/>
+          <w:bCs w:val="1"/>
+          <w:strike w:val="0"/>
+          <w:dstrike w:val="0"/>
+          <w:noProof w:val="0"/>
+          <w:sz w:val="24"/>
+          <w:szCs w:val="24"/>
+          <w:u w:val="none"/>
+          <w:lang w:val="en-GB"/>
+        </w:rPr>
+        <w:t>refreshes the memory</w:t>
+      </w:r>
+      <w:r>
+        <w:rPr>
+          <w:rFonts w:ascii="Calibri" w:hAnsi="Calibri" w:eastAsia="Calibri" w:cs="Calibri" w:asciiTheme="minorAscii" w:hAnsiTheme="minorAscii" w:eastAsiaTheme="minorAscii" w:cstheme="minorAscii"/>
+          <w:b w:val="0"/>
+          <w:bCs w:val="0"/>
+          <w:strike w:val="0"/>
+          <w:dstrike w:val="0"/>
+          <w:noProof w:val="0"/>
+          <w:sz w:val="24"/>
+          <w:szCs w:val="24"/>
+          <w:u w:val="none"/>
+          <w:lang w:val="en-GB"/>
+        </w:rPr>
+        <w:t xml:space="preserve"> of your permissions system.</w:t>
+      </w:r>
+    </w:p>
+    <w:p>
+      <w:pPr>
+        <w:spacing w:before="180" w:beforeAutospacing="off" w:after="240" w:afterAutospacing="off"/>
+        <w:rPr>
+          <w:rFonts w:ascii="Calibri" w:hAnsi="Calibri" w:eastAsia="Calibri" w:cs="Calibri" w:asciiTheme="minorAscii" w:hAnsiTheme="minorAscii" w:eastAsiaTheme="minorAscii" w:cstheme="minorAscii"/>
+          <w:b w:val="0"/>
+          <w:bCs w:val="0"/>
+          <w:strike w:val="0"/>
+          <w:dstrike w:val="0"/>
+          <w:noProof w:val="0"/>
+          <w:sz w:val="24"/>
+          <w:szCs w:val="24"/>
+          <w:u w:val="none"/>
+          <w:lang w:val="en-GB"/>
+        </w:rPr>
+      </w:pPr>
+      <w:r>
+        <w:rPr>
+          <w:rFonts w:ascii="Calibri" w:hAnsi="Calibri" w:eastAsia="Calibri" w:cs="Calibri" w:asciiTheme="minorAscii" w:hAnsiTheme="minorAscii" w:eastAsiaTheme="minorAscii" w:cstheme="minorAscii"/>
+          <w:b w:val="0"/>
+          <w:bCs w:val="0"/>
+          <w:strike w:val="0"/>
+          <w:dstrike w:val="0"/>
+          <w:noProof w:val="0"/>
+          <w:sz w:val="24"/>
+          <w:szCs w:val="24"/>
+          <w:u w:val="none"/>
+          <w:lang w:val="en-GB"/>
+        </w:rPr>
+        <w:t>Laravel saves your user roles and permissions in a "temporary memory" (cache) so your website runs faster. But sometimes, this memory gets outdated, and changes you make won't show up.</w:t>
+      </w:r>
+    </w:p>
+    <w:p>
+      <w:pPr>
+        <w:spacing w:before="180" w:beforeAutospacing="off" w:after="240" w:afterAutospacing="off"/>
+        <w:rPr>
+          <w:rFonts w:ascii="Calibri" w:hAnsi="Calibri" w:eastAsia="Calibri" w:cs="Calibri" w:asciiTheme="minorAscii" w:hAnsiTheme="minorAscii" w:eastAsiaTheme="minorAscii" w:cstheme="minorAscii"/>
+          <w:b w:val="0"/>
+          <w:bCs w:val="0"/>
+          <w:strike w:val="0"/>
+          <w:dstrike w:val="0"/>
+          <w:noProof w:val="0"/>
+          <w:sz w:val="24"/>
+          <w:szCs w:val="24"/>
+          <w:u w:val="none"/>
+          <w:lang w:val="en-GB"/>
+        </w:rPr>
+      </w:pPr>
+      <w:r>
+        <w:rPr>
+          <w:rFonts w:ascii="Calibri" w:hAnsi="Calibri" w:eastAsia="Calibri" w:cs="Calibri" w:asciiTheme="minorAscii" w:hAnsiTheme="minorAscii" w:eastAsiaTheme="minorAscii" w:cstheme="minorAscii"/>
+          <w:b w:val="0"/>
+          <w:bCs w:val="0"/>
+          <w:strike w:val="0"/>
+          <w:dstrike w:val="0"/>
+          <w:noProof w:val="0"/>
+          <w:sz w:val="24"/>
+          <w:szCs w:val="24"/>
+          <w:u w:val="none"/>
+          <w:lang w:val="en-GB"/>
+        </w:rPr>
+        <w:t xml:space="preserve">Running this command </w:t>
+      </w:r>
+      <w:r>
+        <w:rPr>
+          <w:rFonts w:ascii="Calibri" w:hAnsi="Calibri" w:eastAsia="Calibri" w:cs="Calibri" w:asciiTheme="minorAscii" w:hAnsiTheme="minorAscii" w:eastAsiaTheme="minorAscii" w:cstheme="minorAscii"/>
+          <w:b w:val="1"/>
+          <w:bCs w:val="1"/>
+          <w:strike w:val="0"/>
+          <w:dstrike w:val="0"/>
+          <w:noProof w:val="0"/>
+          <w:sz w:val="24"/>
+          <w:szCs w:val="24"/>
+          <w:u w:val="none"/>
+          <w:lang w:val="en-GB"/>
+        </w:rPr>
+        <w:t>erases the old memory</w:t>
+      </w:r>
+      <w:r>
+        <w:rPr>
+          <w:rFonts w:ascii="Calibri" w:hAnsi="Calibri" w:eastAsia="Calibri" w:cs="Calibri" w:asciiTheme="minorAscii" w:hAnsiTheme="minorAscii" w:eastAsiaTheme="minorAscii" w:cstheme="minorAscii"/>
+          <w:b w:val="0"/>
+          <w:bCs w:val="0"/>
+          <w:strike w:val="0"/>
+          <w:dstrike w:val="0"/>
+          <w:noProof w:val="0"/>
+          <w:sz w:val="24"/>
+          <w:szCs w:val="24"/>
+          <w:u w:val="none"/>
+          <w:lang w:val="en-GB"/>
+        </w:rPr>
+        <w:t xml:space="preserve"> and forces Laravel to read the latest, correct roles and permissions straight from your database.</w:t>
+      </w:r>
+    </w:p>
+    <w:p>
+      <w:pPr>
+        <w:pStyle w:val="Normal"/>
+        <w:spacing w:before="240" w:beforeAutospacing="off" w:after="240" w:afterAutospacing="off"/>
+        <w:rPr>
+          <w:rFonts w:ascii="Calibri" w:hAnsi="Calibri" w:eastAsia="Calibri" w:cs="Calibri" w:asciiTheme="minorAscii" w:hAnsiTheme="minorAscii" w:eastAsiaTheme="minorAscii" w:cstheme="minorAscii"/>
+          <w:b w:val="1"/>
+          <w:bCs w:val="1"/>
+          <w:noProof w:val="0"/>
+          <w:color w:val="4C94D8" w:themeColor="text2" w:themeTint="80" w:themeShade="FF"/>
+          <w:sz w:val="32"/>
+          <w:szCs w:val="32"/>
+          <w:lang w:val="en-GB"/>
+        </w:rPr>
+      </w:pPr>
+    </w:p>
+    <w:p>
+      <w:pPr>
+        <w:pStyle w:val="Normal"/>
+        <w:spacing w:before="240" w:beforeAutospacing="off" w:after="240" w:afterAutospacing="off"/>
+        <w:rPr>
+          <w:rFonts w:ascii="Calibri" w:hAnsi="Calibri" w:eastAsia="Calibri" w:cs="Calibri" w:asciiTheme="minorAscii" w:hAnsiTheme="minorAscii" w:eastAsiaTheme="minorAscii" w:cstheme="minorAscii"/>
+          <w:b w:val="1"/>
+          <w:bCs w:val="1"/>
+          <w:noProof w:val="0"/>
+          <w:color w:val="0E2740"/>
+          <w:sz w:val="22"/>
+          <w:szCs w:val="22"/>
+          <w:lang w:val="en-GB"/>
+        </w:rPr>
+      </w:pPr>
     </w:p>
     <w:p>
       <w:pPr>

</xml_diff>